<commit_message>
submission: messages rewritten to today's facts — no top-up needed, doc first, form text current
Co-Authored-By: Claude Opus 5 (1M context) <noreply@anthropic.com>
Claude-Session: https://claude.ai/code/session_018f6JwozcrnmDXmsxr9oiPb
</commit_message>
<xml_diff>
--- a/submission/submission.docx
+++ b/submission/submission.docx
@@ -846,14 +846,7 @@
                 <w:sz w:val="19"/>
                 <w:color w:val="111111"/>
               </w:rPr>
-              <w:t xml:space="preserve">`node verify.mjs`</w:t>
-            </w:r>
-            <w:r>
-              <w:rPr>
-                <w:sz w:val="19"/>
-                <w:color w:val="111111"/>
-              </w:rPr>
-              <w:t xml:space="preserve"> — one command</w:t>
+              <w:t xml:space="preserve">Served over MCP</w:t>
             </w:r>
           </w:p>
         </w:tc>
@@ -870,7 +863,7 @@
                 <w:sz w:val="19"/>
                 <w:color w:val="111111"/>
               </w:rPr>
-              <w:t xml:space="preserve">Prove the repo is healthy with no key, no network, no credits. It prints its own total</w:t>
+              <w:t xml:space="preserve">The gate stops being a repo you clone. One line of config and any MCP host has it — and the offline tools need no Terminal 3 account at all</w:t>
             </w:r>
           </w:p>
         </w:tc>
@@ -890,7 +883,7 @@
                 <w:sz w:val="19"/>
                 <w:color w:val="111111"/>
               </w:rPr>
-              <w:t xml:space="preserve">MAINTENANCE.md</w:t>
+              <w:t xml:space="preserve">x402 payments, mandate-gated</w:t>
             </w:r>
           </w:p>
         </w:tc>
@@ -907,7 +900,22 @@
                 <w:sz w:val="19"/>
                 <w:color w:val="111111"/>
               </w:rPr>
-              <w:t xml:space="preserve">Every knob, the real failure modes, a handover sequence</w:t>
+              <w:t xml:space="preserve">An HTTP 402 becomes an action the mandate judges. A price or a payee outside it is refused </w:t>
+            </w:r>
+            <w:r>
+              <w:rPr>
+                <w:i/>
+                <w:sz w:val="19"/>
+                <w:color w:val="111111"/>
+              </w:rPr>
+              <w:t xml:space="preserve">before</w:t>
+            </w:r>
+            <w:r>
+              <w:rPr>
+                <w:sz w:val="19"/>
+                <w:color w:val="111111"/>
+              </w:rPr>
+              <w:t xml:space="preserve"> a signature exists</w:t>
             </w:r>
           </w:p>
         </w:tc>
@@ -923,10 +931,11 @@
             </w:pPr>
             <w:r>
               <w:rPr>
-                <w:sz w:val="19"/>
-                <w:color w:val="111111"/>
-              </w:rPr>
-              <w:t xml:space="preserve">Version single-sourced; CI runs the same script</w:t>
+                <w:b/>
+                <w:sz w:val="19"/>
+                <w:color w:val="111111"/>
+              </w:rPr>
+              <w:t xml:space="preserve">x402 settled, on chain</w:t>
             </w:r>
           </w:p>
         </w:tc>
@@ -943,7 +952,7 @@
                 <w:sz w:val="19"/>
                 <w:color w:val="111111"/>
               </w:rPr>
-              <w:t xml:space="preserve">Two classes of drift removed rather than documented</w:t>
+              <w:t xml:space="preserve">0.01 USDC moved through the mandate, verified and broadcast by a third-party facilitator, confirmed from the Transfer log and block-tagged balances — not from the receipt</w:t>
             </w:r>
           </w:p>
         </w:tc>
@@ -963,7 +972,511 @@
                 <w:sz w:val="19"/>
                 <w:color w:val="111111"/>
               </w:rPr>
-              <w:t xml:space="preserve">21 bug reports</w:t>
+              <w:t xml:space="preserve">ERC-8004 identity minted</w:t>
+            </w:r>
+          </w:p>
+        </w:tc>
+        <w:tc>
+          <w:tcPr>
+            <w:tcW w:w="4680" w:type="dxa"/>
+          </w:tcPr>
+          <w:p>
+            <w:pPr>
+              <w:spacing w:before="40" w:after="40"/>
+            </w:pPr>
+            <w:r>
+              <w:rPr>
+                <w:sz w:val="19"/>
+                <w:color w:val="111111"/>
+              </w:rPr>
+              <w:t xml:space="preserve">Agent #201 on Sepolia, </w:t>
+            </w:r>
+            <w:r>
+              <w:rPr>
+                <w:rFonts w:ascii="Consolas" w:hAnsi="Consolas"/>
+                <w:shd w:val="clear" w:fill="F0F2F4"/>
+                <w:sz w:val="16"/>
+                <w:color w:val="111111"/>
+              </w:rPr>
+              <w:t xml:space="preserve">agentURI</w:t>
+            </w:r>
+            <w:r>
+              <w:rPr>
+                <w:sz w:val="19"/>
+                <w:color w:val="111111"/>
+              </w:rPr>
+              <w:t xml:space="preserve"> → a conformant registration file, read back live from both registries. It stopped being "ready to register"</w:t>
+            </w:r>
+          </w:p>
+        </w:tc>
+      </w:tr>
+      <w:tr>
+        <w:tc>
+          <w:tcPr>
+            <w:tcW w:w="4680" w:type="dxa"/>
+          </w:tcPr>
+          <w:p>
+            <w:pPr>
+              <w:spacing w:before="40" w:after="40"/>
+            </w:pPr>
+            <w:r>
+              <w:rPr>
+                <w:b/>
+                <w:sz w:val="19"/>
+                <w:color w:val="111111"/>
+              </w:rPr>
+              <w:t xml:space="preserve">The audit trail, found</w:t>
+            </w:r>
+          </w:p>
+        </w:tc>
+        <w:tc>
+          <w:tcPr>
+            <w:tcW w:w="4680" w:type="dxa"/>
+          </w:tcPr>
+          <w:p>
+            <w:pPr>
+              <w:spacing w:before="40" w:after="40"/>
+            </w:pPr>
+            <w:r>
+              <w:rPr>
+                <w:rFonts w:ascii="Consolas" w:hAnsi="Consolas"/>
+                <w:shd w:val="clear" w:fill="F0F2F4"/>
+                <w:sz w:val="16"/>
+                <w:color w:val="111111"/>
+              </w:rPr>
+              <w:t xml:space="preserve">npm run audit</w:t>
+            </w:r>
+            <w:r>
+              <w:rPr>
+                <w:sz w:val="19"/>
+                <w:color w:val="111111"/>
+              </w:rPr>
+              <w:t xml:space="preserve"> had been reading </w:t>
+            </w:r>
+            <w:r>
+              <w:rPr>
+                <w:rFonts w:ascii="Consolas" w:hAnsi="Consolas"/>
+                <w:shd w:val="clear" w:fill="F0F2F4"/>
+                <w:sz w:val="16"/>
+                <w:color w:val="111111"/>
+              </w:rPr>
+              <w:t xml:space="preserve">audit.get-mine</w:t>
+            </w:r>
+            <w:r>
+              <w:rPr>
+                <w:sz w:val="19"/>
+                <w:color w:val="111111"/>
+              </w:rPr>
+              <w:t xml:space="preserve"> — empty through 39 dispatches — and explaining the emptiness. The record was in </w:t>
+            </w:r>
+            <w:r>
+              <w:rPr>
+                <w:rFonts w:ascii="Consolas" w:hAnsi="Consolas"/>
+                <w:shd w:val="clear" w:fill="F0F2F4"/>
+                <w:sz w:val="16"/>
+                <w:color w:val="111111"/>
+              </w:rPr>
+              <w:t xml:space="preserve">activity.log</w:t>
+            </w:r>
+            <w:r>
+              <w:rPr>
+                <w:sz w:val="19"/>
+                <w:color w:val="111111"/>
+              </w:rPr>
+              <w:t xml:space="preserve"> all along (bug #29)</w:t>
+            </w:r>
+          </w:p>
+        </w:tc>
+      </w:tr>
+      <w:tr>
+        <w:tc>
+          <w:tcPr>
+            <w:tcW w:w="4680" w:type="dxa"/>
+          </w:tcPr>
+          <w:p>
+            <w:pPr>
+              <w:spacing w:before="40" w:after="40"/>
+            </w:pPr>
+            <w:r>
+              <w:rPr>
+                <w:b/>
+                <w:sz w:val="19"/>
+                <w:color w:val="111111"/>
+              </w:rPr>
+              <w:t xml:space="preserve">The door has a lock</w:t>
+            </w:r>
+          </w:p>
+        </w:tc>
+        <w:tc>
+          <w:tcPr>
+            <w:tcW w:w="4680" w:type="dxa"/>
+          </w:tcPr>
+          <w:p>
+            <w:pPr>
+              <w:spacing w:before="40" w:after="40"/>
+            </w:pPr>
+            <w:r>
+              <w:rPr>
+                <w:sz w:val="19"/>
+                <w:color w:val="111111"/>
+              </w:rPr>
+              <w:t xml:space="preserve">A2A and MCP-over-HTTP on one origin, and every call must carry a web-bot-auth signature resolved from the caller's own published key. Unsigned, wrong-key, replayed and body-swapped requests are each refused by name</w:t>
+            </w:r>
+          </w:p>
+        </w:tc>
+      </w:tr>
+      <w:tr>
+        <w:tc>
+          <w:tcPr>
+            <w:tcW w:w="4680" w:type="dxa"/>
+          </w:tcPr>
+          <w:p>
+            <w:pPr>
+              <w:spacing w:before="40" w:after="40"/>
+            </w:pPr>
+            <w:r>
+              <w:rPr>
+                <w:b/>
+                <w:sz w:val="19"/>
+                <w:color w:val="111111"/>
+              </w:rPr>
+              <w:t xml:space="preserve">A2A v1.0 server on the official SDK</w:t>
+            </w:r>
+          </w:p>
+        </w:tc>
+        <w:tc>
+          <w:tcPr>
+            <w:tcW w:w="4680" w:type="dxa"/>
+          </w:tcPr>
+          <w:p>
+            <w:pPr>
+              <w:spacing w:before="40" w:after="40"/>
+            </w:pPr>
+            <w:r>
+              <w:rPr>
+                <w:sz w:val="19"/>
+                <w:color w:val="111111"/>
+              </w:rPr>
+              <w:t xml:space="preserve">The card has said "A2A" since June; now there is an endpoint behind it. Tested by the official client AND by hand-written JSON-RPC with no SDK</w:t>
+            </w:r>
+          </w:p>
+        </w:tc>
+      </w:tr>
+      <w:tr>
+        <w:tc>
+          <w:tcPr>
+            <w:tcW w:w="4680" w:type="dxa"/>
+          </w:tcPr>
+          <w:p>
+            <w:pPr>
+              <w:spacing w:before="40" w:after="40"/>
+            </w:pPr>
+            <w:r>
+              <w:rPr>
+                <w:b/>
+                <w:sz w:val="19"/>
+                <w:color w:val="111111"/>
+              </w:rPr>
+              <w:t xml:space="preserve">Web Bot Auth verified against Cloudflare</w:t>
+            </w:r>
+          </w:p>
+        </w:tc>
+        <w:tc>
+          <w:tcPr>
+            <w:tcW w:w="4680" w:type="dxa"/>
+          </w:tcPr>
+          <w:p>
+            <w:pPr>
+              <w:spacing w:before="40" w:after="40"/>
+            </w:pPr>
+            <w:r>
+              <w:rPr>
+                <w:sz w:val="19"/>
+                <w:color w:val="111111"/>
+              </w:rPr>
+              <w:t xml:space="preserve">Our signatures pass the reference verifier and theirs pass ours. We had been emitting signatures the reference verifier refuses</w:t>
+            </w:r>
+          </w:p>
+        </w:tc>
+      </w:tr>
+      <w:tr>
+        <w:tc>
+          <w:tcPr>
+            <w:tcW w:w="4680" w:type="dxa"/>
+          </w:tcPr>
+          <w:p>
+            <w:pPr>
+              <w:spacing w:before="40" w:after="40"/>
+            </w:pPr>
+            <w:r>
+              <w:rPr>
+                <w:b/>
+                <w:sz w:val="19"/>
+                <w:color w:val="111111"/>
+              </w:rPr>
+              <w:t xml:space="preserve">Three enclave paths proven live</w:t>
+            </w:r>
+          </w:p>
+        </w:tc>
+        <w:tc>
+          <w:tcPr>
+            <w:tcW w:w="4680" w:type="dxa"/>
+          </w:tcPr>
+          <w:p>
+            <w:pPr>
+              <w:spacing w:before="40" w:after="40"/>
+            </w:pPr>
+            <w:r>
+              <w:rPr>
+                <w:sz w:val="19"/>
+                <w:color w:val="111111"/>
+              </w:rPr>
+              <w:t xml:space="preserve">The sealed credential, </w:t>
+            </w:r>
+            <w:r>
+              <w:rPr>
+                <w:rFonts w:ascii="Consolas" w:hAnsi="Consolas"/>
+                <w:shd w:val="clear" w:fill="F0F2F4"/>
+                <w:sz w:val="16"/>
+                <w:color w:val="111111"/>
+              </w:rPr>
+              <w:t xml:space="preserve">{{profile.*}}</w:t>
+            </w:r>
+            <w:r>
+              <w:rPr>
+                <w:sz w:val="19"/>
+                <w:color w:val="111111"/>
+              </w:rPr>
+              <w:t xml:space="preserve"> substitution and idempotent replay had only ever been unit tests — the same situation the status list was in when it broke</w:t>
+            </w:r>
+          </w:p>
+        </w:tc>
+      </w:tr>
+      <w:tr>
+        <w:tc>
+          <w:tcPr>
+            <w:tcW w:w="4680" w:type="dxa"/>
+          </w:tcPr>
+          <w:p>
+            <w:pPr>
+              <w:spacing w:before="40" w:after="40"/>
+            </w:pPr>
+            <w:r>
+              <w:rPr>
+                <w:b/>
+                <w:sz w:val="19"/>
+                <w:color w:val="111111"/>
+              </w:rPr>
+              <w:t xml:space="preserve">Node discovery + a scoped handover key</w:t>
+            </w:r>
+          </w:p>
+        </w:tc>
+        <w:tc>
+          <w:tcPr>
+            <w:tcW w:w="4680" w:type="dxa"/>
+          </w:tcPr>
+          <w:p>
+            <w:pPr>
+              <w:spacing w:before="40" w:after="40"/>
+            </w:pPr>
+            <w:r>
+              <w:rPr>
+                <w:rFonts w:ascii="Consolas" w:hAnsi="Consolas"/>
+                <w:shd w:val="clear" w:fill="F0F2F4"/>
+                <w:sz w:val="16"/>
+                <w:color w:val="111111"/>
+              </w:rPr>
+              <w:t xml:space="preserve">npm run discover</w:t>
+            </w:r>
+            <w:r>
+              <w:rPr>
+                <w:sz w:val="19"/>
+                <w:color w:val="111111"/>
+              </w:rPr>
+              <w:t xml:space="preserve"> reads the node's own inventory with an agent key instead of the tenant's Ethereum key — which is also the key you should hand to whoever hosts this. It found two core contracts the docs never mention</w:t>
+            </w:r>
+          </w:p>
+        </w:tc>
+      </w:tr>
+      <w:tr>
+        <w:tc>
+          <w:tcPr>
+            <w:tcW w:w="4680" w:type="dxa"/>
+          </w:tcPr>
+          <w:p>
+            <w:pPr>
+              <w:spacing w:before="40" w:after="40"/>
+            </w:pPr>
+            <w:r>
+              <w:rPr>
+                <w:b/>
+                <w:sz w:val="19"/>
+                <w:color w:val="111111"/>
+              </w:rPr>
+              <w:t xml:space="preserve">Probe before promote</w:t>
+            </w:r>
+          </w:p>
+        </w:tc>
+        <w:tc>
+          <w:tcPr>
+            <w:tcW w:w="4680" w:type="dxa"/>
+          </w:tcPr>
+          <w:p>
+            <w:pPr>
+              <w:spacing w:before="40" w:after="40"/>
+            </w:pPr>
+            <w:r>
+              <w:rPr>
+                <w:rFonts w:ascii="Consolas" w:hAnsi="Consolas"/>
+                <w:shd w:val="clear" w:fill="F0F2F4"/>
+                <w:sz w:val="16"/>
+                <w:color w:val="111111"/>
+              </w:rPr>
+              <w:t xml:space="preserve">npm run probe</w:t>
+            </w:r>
+            <w:r>
+              <w:rPr>
+                <w:sz w:val="19"/>
+                <w:color w:val="111111"/>
+              </w:rPr>
+              <w:t xml:space="preserve"> registers to a throwaway tail and invokes it, so a build that would brick the production tail is caught for the price of one registration</w:t>
+            </w:r>
+          </w:p>
+        </w:tc>
+      </w:tr>
+      <w:tr>
+        <w:tc>
+          <w:tcPr>
+            <w:tcW w:w="4680" w:type="dxa"/>
+          </w:tcPr>
+          <w:p>
+            <w:pPr>
+              <w:spacing w:before="40" w:after="40"/>
+            </w:pPr>
+            <w:r>
+              <w:rPr>
+                <w:b/>
+                <w:sz w:val="19"/>
+                <w:color w:val="111111"/>
+              </w:rPr>
+              <w:t xml:space="preserve">`node verify.mjs`</w:t>
+            </w:r>
+            <w:r>
+              <w:rPr>
+                <w:sz w:val="19"/>
+                <w:color w:val="111111"/>
+              </w:rPr>
+              <w:t xml:space="preserve"> — one command</w:t>
+            </w:r>
+          </w:p>
+        </w:tc>
+        <w:tc>
+          <w:tcPr>
+            <w:tcW w:w="4680" w:type="dxa"/>
+          </w:tcPr>
+          <w:p>
+            <w:pPr>
+              <w:spacing w:before="40" w:after="40"/>
+            </w:pPr>
+            <w:r>
+              <w:rPr>
+                <w:sz w:val="19"/>
+                <w:color w:val="111111"/>
+              </w:rPr>
+              <w:t xml:space="preserve">Prove the repo is healthy with no key, no network, no credits. It prints its own total</w:t>
+            </w:r>
+          </w:p>
+        </w:tc>
+      </w:tr>
+      <w:tr>
+        <w:tc>
+          <w:tcPr>
+            <w:tcW w:w="4680" w:type="dxa"/>
+          </w:tcPr>
+          <w:p>
+            <w:pPr>
+              <w:spacing w:before="40" w:after="40"/>
+            </w:pPr>
+            <w:r>
+              <w:rPr>
+                <w:b/>
+                <w:sz w:val="19"/>
+                <w:color w:val="111111"/>
+              </w:rPr>
+              <w:t xml:space="preserve">MAINTENANCE.md</w:t>
+            </w:r>
+          </w:p>
+        </w:tc>
+        <w:tc>
+          <w:tcPr>
+            <w:tcW w:w="4680" w:type="dxa"/>
+          </w:tcPr>
+          <w:p>
+            <w:pPr>
+              <w:spacing w:before="40" w:after="40"/>
+            </w:pPr>
+            <w:r>
+              <w:rPr>
+                <w:sz w:val="19"/>
+                <w:color w:val="111111"/>
+              </w:rPr>
+              <w:t xml:space="preserve">Every knob, the real failure modes, a handover sequence</w:t>
+            </w:r>
+          </w:p>
+        </w:tc>
+      </w:tr>
+      <w:tr>
+        <w:tc>
+          <w:tcPr>
+            <w:tcW w:w="4680" w:type="dxa"/>
+          </w:tcPr>
+          <w:p>
+            <w:pPr>
+              <w:spacing w:before="40" w:after="40"/>
+            </w:pPr>
+            <w:r>
+              <w:rPr>
+                <w:sz w:val="19"/>
+                <w:color w:val="111111"/>
+              </w:rPr>
+              <w:t xml:space="preserve">Version single-sourced; CI runs the same script</w:t>
+            </w:r>
+          </w:p>
+        </w:tc>
+        <w:tc>
+          <w:tcPr>
+            <w:tcW w:w="4680" w:type="dxa"/>
+          </w:tcPr>
+          <w:p>
+            <w:pPr>
+              <w:spacing w:before="40" w:after="40"/>
+            </w:pPr>
+            <w:r>
+              <w:rPr>
+                <w:sz w:val="19"/>
+                <w:color w:val="111111"/>
+              </w:rPr>
+              <w:t xml:space="preserve">Two classes of drift removed rather than documented</w:t>
+            </w:r>
+          </w:p>
+        </w:tc>
+      </w:tr>
+      <w:tr>
+        <w:tc>
+          <w:tcPr>
+            <w:tcW w:w="4680" w:type="dxa"/>
+          </w:tcPr>
+          <w:p>
+            <w:pPr>
+              <w:spacing w:before="40" w:after="40"/>
+            </w:pPr>
+            <w:r>
+              <w:rPr>
+                <w:b/>
+                <w:sz w:val="19"/>
+                <w:color w:val="111111"/>
+              </w:rPr>
+              <w:t xml:space="preserve">29 bug reports</w:t>
             </w:r>
             <w:r>
               <w:rPr>
@@ -987,7 +1500,44 @@
                 <w:sz w:val="19"/>
                 <w:color w:val="111111"/>
               </w:rPr>
-              <w:t xml:space="preserve">Including 4 of ours that Terminal 3 has since fixed</w:t>
+              <w:t xml:space="preserve">Including 4 of ours that Terminal 3 has since fixed, and two new ones found by shipping: a credential the SDK cannot make revocable, and a rate limit smaller than the demo</w:t>
+            </w:r>
+          </w:p>
+        </w:tc>
+      </w:tr>
+      <w:tr>
+        <w:tc>
+          <w:tcPr>
+            <w:tcW w:w="4680" w:type="dxa"/>
+          </w:tcPr>
+          <w:p>
+            <w:pPr>
+              <w:spacing w:before="40" w:after="40"/>
+            </w:pPr>
+            <w:r>
+              <w:rPr>
+                <w:b/>
+                <w:sz w:val="19"/>
+                <w:color w:val="111111"/>
+              </w:rPr>
+              <w:t xml:space="preserve">Metering measured, not guessed</w:t>
+            </w:r>
+          </w:p>
+        </w:tc>
+        <w:tc>
+          <w:tcPr>
+            <w:tcW w:w="4680" w:type="dxa"/>
+          </w:tcPr>
+          <w:p>
+            <w:pPr>
+              <w:spacing w:before="40" w:after="40"/>
+            </w:pPr>
+            <w:r>
+              <w:rPr>
+                <w:sz w:val="19"/>
+                <w:color w:val="111111"/>
+              </w:rPr>
+              <w:t xml:space="preserve">30,034,055 credits a call; 1,370,147,045 a registration. Nothing publishes these</w:t>
             </w:r>
           </w:p>
         </w:tc>
@@ -1262,7 +1812,7 @@
                 <w:sz w:val="19"/>
                 <w:color w:val="111111"/>
               </w:rPr>
-              <w:t xml:space="preserve">§9 — 15, every one from real command output</w:t>
+              <w:t xml:space="preserve">§9 — 32, every one from real command output</w:t>
             </w:r>
           </w:p>
         </w:tc>
@@ -1298,7 +1848,7 @@
                 <w:sz w:val="19"/>
                 <w:color w:val="111111"/>
               </w:rPr>
-              <w:t xml:space="preserve">§8 — 21 reports, </w:t>
+              <w:t xml:space="preserve">§8 — 29 reports, </w:t>
             </w:r>
             <w:r>
               <w:rPr>
@@ -2674,7 +3224,7 @@
       <w:r>
         <w:drawing>
           <wp:inline distT="0" distB="0" distL="0" distR="0">
-            <wp:extent cx="5486400" cy="10191084"/>
+            <wp:extent cx="5486400" cy="17145000"/>
             <wp:docPr id="6" name="Picture 6"/>
             <a:graphic xmlns:a="http://schemas.openxmlformats.org/drawingml/2006/main">
               <a:graphicData uri="http://schemas.openxmlformats.org/drawingml/2006/picture">
@@ -2692,7 +3242,7 @@
                   <pic:spPr>
                     <a:xfrm>
                       <a:off x="0" y="0"/>
-                      <a:ext cx="5486400" cy="10191084"/>
+                      <a:ext cx="5486400" cy="17145000"/>
                     </a:xfrm>
                     <a:prstGeom prst="rect">
                       <a:avLst/>
@@ -3627,6 +4177,1388 @@
     </w:p>
     <w:p>
       <w:pPr>
+        <w:spacing w:before="180" w:after="180"/>
+      </w:pPr>
+      <w:r>
+        <w:rPr>
+          <w:b/>
+          <w:sz w:val="22"/>
+          <w:color w:val="1a1a1a"/>
+        </w:rPr>
+        <w:t xml:space="preserve">4.7 The gate, served over MCP</w:t>
+      </w:r>
+    </w:p>
+    <w:p>
+      <w:pPr>
+        <w:spacing w:before="120" w:after="120"/>
+      </w:pPr>
+      <w:r>
+        <w:rPr>
+          <w:sz w:val="21"/>
+          <w:color w:val="111111"/>
+        </w:rPr>
+        <w:t xml:space="preserve">Everything above is only useful to someone who clones this repository. That is not distribution, and the brief asked for an agent that can be distributed.</w:t>
+      </w:r>
+    </w:p>
+    <w:p>
+      <w:pPr>
+        <w:spacing w:before="120" w:after="120"/>
+      </w:pPr>
+      <w:r>
+        <w:rPr>
+          <w:sz w:val="21"/>
+          <w:color w:val="111111"/>
+        </w:rPr>
+        <w:t xml:space="preserve">So the agent is now also an </w:t>
+      </w:r>
+      <w:r>
+        <w:rPr>
+          <w:b/>
+          <w:sz w:val="21"/>
+          <w:color w:val="111111"/>
+        </w:rPr>
+        <w:t xml:space="preserve">MCP server</w:t>
+      </w:r>
+      <w:r>
+        <w:rPr>
+          <w:sz w:val="21"/>
+          <w:color w:val="111111"/>
+        </w:rPr>
+        <w:t xml:space="preserve">. A host adds one line:</w:t>
+      </w:r>
+    </w:p>
+    <w:p>
+      <w:pPr>
+        <w:shd w:val="clear" w:fill="F6F8FA"/>
+        <w:spacing w:before="0" w:after="0"/>
+      </w:pPr>
+      <w:r>
+        <w:rPr>
+          <w:rFonts w:ascii="Consolas" w:hAnsi="Consolas"/>
+          <w:sz w:val="17"/>
+        </w:rPr>
+        <w:t xml:space="preserve">claude mcp add gatekeeper -- node /abs/path/to/agent/src/mcp-server.mjs</w:t>
+      </w:r>
+    </w:p>
+    <w:p>
+      <w:pPr>
+        <w:spacing w:before="120" w:after="120"/>
+      </w:pPr>
+      <w:r>
+        <w:rPr>
+          <w:sz w:val="21"/>
+          <w:color w:val="111111"/>
+        </w:rPr>
+        <w:t xml:space="preserve">and gets eight tools. The one that matters most is </w:t>
+      </w:r>
+      <w:r>
+        <w:rPr>
+          <w:rFonts w:ascii="Consolas" w:hAnsi="Consolas"/>
+          <w:shd w:val="clear" w:fill="F0F2F4"/>
+          <w:sz w:val="18"/>
+          <w:color w:val="111111"/>
+        </w:rPr>
+        <w:t xml:space="preserve">gate_evaluate</w:t>
+      </w:r>
+      <w:r>
+        <w:rPr>
+          <w:sz w:val="21"/>
+          <w:color w:val="111111"/>
+        </w:rPr>
+        <w:t xml:space="preserve">: it answers from </w:t>
+      </w:r>
+      <w:r>
+        <w:rPr>
+          <w:rFonts w:ascii="Consolas" w:hAnsi="Consolas"/>
+          <w:shd w:val="clear" w:fill="F0F2F4"/>
+          <w:sz w:val="18"/>
+          <w:color w:val="111111"/>
+        </w:rPr>
+        <w:t xml:space="preserve">gate_cli</w:t>
+      </w:r>
+      <w:r>
+        <w:rPr>
+          <w:sz w:val="21"/>
+          <w:color w:val="111111"/>
+        </w:rPr>
+        <w:t xml:space="preserve">, the host build of the </w:t>
+      </w:r>
+      <w:r>
+        <w:rPr>
+          <w:i/>
+          <w:sz w:val="21"/>
+          <w:color w:val="111111"/>
+        </w:rPr>
+        <w:t xml:space="preserve">same Rust source</w:t>
+      </w:r>
+      <w:r>
+        <w:rPr>
+          <w:sz w:val="21"/>
+          <w:color w:val="111111"/>
+        </w:rPr>
+        <w:t xml:space="preserve"> the enclave runs. So a host can ask "is this action inside the mandate?" before every action — </w:t>
+      </w:r>
+      <w:r>
+        <w:rPr>
+          <w:b/>
+          <w:sz w:val="21"/>
+          <w:color w:val="111111"/>
+        </w:rPr>
+        <w:t xml:space="preserve">offline, free, with no Terminal 3 account and no credits</w:t>
+      </w:r>
+      <w:r>
+        <w:rPr>
+          <w:sz w:val="21"/>
+          <w:color w:val="111111"/>
+        </w:rPr>
+        <w:t xml:space="preserve"> — and get the contract's real answer rather than a JavaScript approximation of it that would agree with itself and prove nothing.</w:t>
+      </w:r>
+    </w:p>
+    <w:p>
+      <w:pPr>
+        <w:spacing w:before="120" w:after="120"/>
+      </w:pPr>
+      <w:r>
+        <w:rPr>
+          <w:rFonts w:ascii="Consolas" w:hAnsi="Consolas"/>
+          <w:shd w:val="clear" w:fill="F0F2F4"/>
+          <w:sz w:val="18"/>
+          <w:color w:val="111111"/>
+        </w:rPr>
+        <w:t xml:space="preserve">gate_execute</w:t>
+      </w:r>
+      <w:r>
+        <w:rPr>
+          <w:sz w:val="21"/>
+          <w:color w:val="111111"/>
+        </w:rPr>
+        <w:t xml:space="preserve"> is the other half, and it deliberately does not degrade. Without credentials it says what is missing and points at </w:t>
+      </w:r>
+      <w:r>
+        <w:rPr>
+          <w:rFonts w:ascii="Consolas" w:hAnsi="Consolas"/>
+          <w:shd w:val="clear" w:fill="F0F2F4"/>
+          <w:sz w:val="18"/>
+          <w:color w:val="111111"/>
+        </w:rPr>
+        <w:t xml:space="preserve">gate_evaluate</w:t>
+      </w:r>
+      <w:r>
+        <w:rPr>
+          <w:sz w:val="21"/>
+          <w:color w:val="111111"/>
+        </w:rPr>
+        <w:t xml:space="preserve">. A gate that quietly falls back to a local guess when it cannot reach the enclave is not a gate, and a host would never know the difference.</w:t>
+      </w:r>
+    </w:p>
+    <w:p>
+      <w:pPr>
+        <w:spacing w:before="120" w:after="120"/>
+      </w:pPr>
+      <w:r>
+        <w:rPr>
+          <w:sz w:val="21"/>
+          <w:color w:val="111111"/>
+        </w:rPr>
+        <w:t xml:space="preserve">The test for this does not call the tool functions. It spawns the server as a subprocess and drives it with the official MCP client over stdio, because a test that imported the functions would prove the functions work and say nothing about whether the server does (19 tests). One of them runs the same input through both paths and asserts the results are identical — so if anyone ever reimplements the rules in JS to make the server faster, it fails.</w:t>
+      </w:r>
+    </w:p>
+    <w:p>
+      <w:pPr>
+        <w:spacing w:before="120" w:after="120"/>
+      </w:pPr>
+      <w:r>
+        <w:rPr>
+          <w:i/>
+          <w:sz w:val="21"/>
+          <w:color w:val="111111"/>
+        </w:rPr>
+        <w:t xml:space="preserve">Shot 21.</w:t>
+      </w:r>
+      <w:r>
+        <w:rPr>
+          <w:sz w:val="21"/>
+          <w:color w:val="111111"/>
+        </w:rPr>
+        <w:t xml:space="preserve"> Also </w:t>
+      </w:r>
+      <w:r>
+        <w:rPr>
+          <w:rFonts w:ascii="Consolas" w:hAnsi="Consolas"/>
+          <w:shd w:val="clear" w:fill="F0F2F4"/>
+          <w:sz w:val="18"/>
+          <w:color w:val="111111"/>
+        </w:rPr>
+        <w:t xml:space="preserve">npm run demo:mcp</w:t>
+      </w:r>
+      <w:r>
+        <w:rPr>
+          <w:sz w:val="21"/>
+          <w:color w:val="111111"/>
+        </w:rPr>
+        <w:t xml:space="preserve">, which is the same thing in ten seconds.</w:t>
+      </w:r>
+    </w:p>
+    <w:p>
+      <w:pPr>
+        <w:spacing w:before="180" w:after="180"/>
+      </w:pPr>
+      <w:r>
+        <w:rPr>
+          <w:b/>
+          <w:sz w:val="22"/>
+          <w:color w:val="1a1a1a"/>
+        </w:rPr>
+        <w:t xml:space="preserve">4.8 x402 — the mandate decides whether to pay</w:t>
+      </w:r>
+    </w:p>
+    <w:p>
+      <w:pPr>
+        <w:spacing w:before="120" w:after="120"/>
+      </w:pPr>
+      <w:r>
+        <w:rPr>
+          <w:sz w:val="21"/>
+          <w:color w:val="111111"/>
+        </w:rPr>
+        <w:t xml:space="preserve">An agent that can pay for things can be talked into paying for the wrong things. x402 makes that concrete: a server answers HTTP 402 with a price, and the agent signs and retries.</w:t>
+      </w:r>
+    </w:p>
+    <w:p>
+      <w:pPr>
+        <w:spacing w:before="120" w:after="120"/>
+      </w:pPr>
+      <w:r>
+        <w:rPr>
+          <w:sz w:val="21"/>
+          <w:color w:val="111111"/>
+        </w:rPr>
+        <w:t xml:space="preserve">The interesting question is not </w:t>
+      </w:r>
+      <w:r>
+        <w:rPr>
+          <w:i/>
+          <w:sz w:val="21"/>
+          <w:color w:val="111111"/>
+        </w:rPr>
+        <w:t xml:space="preserve">can</w:t>
+      </w:r>
+      <w:r>
+        <w:rPr>
+          <w:sz w:val="21"/>
+          <w:color w:val="111111"/>
+        </w:rPr>
+        <w:t xml:space="preserve"> the agent pay — it holds a key, so it can — but </w:t>
+      </w:r>
+      <w:r>
+        <w:rPr>
+          <w:i/>
+          <w:sz w:val="21"/>
+          <w:color w:val="111111"/>
+        </w:rPr>
+        <w:t xml:space="preserve">may</w:t>
+      </w:r>
+      <w:r>
+        <w:rPr>
+          <w:sz w:val="21"/>
+          <w:color w:val="111111"/>
+        </w:rPr>
+        <w:t xml:space="preserve"> it, at this price, to this recipient. So the payment requirement is mapped into an ordinary </w:t>
+      </w:r>
+      <w:r>
+        <w:rPr>
+          <w:rFonts w:ascii="Consolas" w:hAnsi="Consolas"/>
+          <w:shd w:val="clear" w:fill="F0F2F4"/>
+          <w:sz w:val="18"/>
+          <w:color w:val="111111"/>
+        </w:rPr>
+        <w:t xml:space="preserve">Action</w:t>
+      </w:r>
+      <w:r>
+        <w:rPr>
+          <w:sz w:val="21"/>
+          <w:color w:val="111111"/>
+        </w:rPr>
+        <w:t xml:space="preserve"> and goes through the same enclave mandate as every trade:</w:t>
+      </w:r>
+    </w:p>
+    <w:tbl>
+      <w:tblPr>
+        <w:tblW w:w="9360" w:type="dxa"/>
+        <w:tblBorders>
+          <w:top w:val="single" w:sz="4" w:color="BBBBBB"/>
+          <w:left w:val="single" w:sz="4" w:color="BBBBBB"/>
+          <w:bottom w:val="single" w:sz="4" w:color="BBBBBB"/>
+          <w:right w:val="single" w:sz="4" w:color="BBBBBB"/>
+          <w:insideH w:val="single" w:sz="4" w:color="BBBBBB"/>
+          <w:insideV w:val="single" w:sz="4" w:color="BBBBBB"/>
+        </w:tblBorders>
+      </w:tblPr>
+      <w:tr>
+        <w:tc>
+          <w:tcPr>
+            <w:tcW w:w="4680" w:type="dxa"/>
+            <w:shd w:val="clear" w:fill="F1F3F5"/>
+          </w:tcPr>
+          <w:p>
+            <w:pPr>
+              <w:spacing w:before="40" w:after="40"/>
+            </w:pPr>
+            <w:r>
+              <w:rPr>
+                <w:b/>
+                <w:sz w:val="19"/>
+                <w:color w:val="111111"/>
+              </w:rPr>
+              <w:t xml:space="preserve">From the 402</w:t>
+            </w:r>
+          </w:p>
+        </w:tc>
+        <w:tc>
+          <w:tcPr>
+            <w:tcW w:w="4680" w:type="dxa"/>
+            <w:shd w:val="clear" w:fill="F1F3F5"/>
+          </w:tcPr>
+          <w:p>
+            <w:pPr>
+              <w:spacing w:before="40" w:after="40"/>
+            </w:pPr>
+            <w:r>
+              <w:rPr>
+                <w:b/>
+                <w:sz w:val="19"/>
+                <w:color w:val="111111"/>
+              </w:rPr>
+              <w:t xml:space="preserve">Becomes</w:t>
+            </w:r>
+          </w:p>
+        </w:tc>
+      </w:tr>
+      <w:tr>
+        <w:tc>
+          <w:tcPr>
+            <w:tcW w:w="4680" w:type="dxa"/>
+          </w:tcPr>
+          <w:p>
+            <w:pPr>
+              <w:spacing w:before="40" w:after="40"/>
+            </w:pPr>
+            <w:r>
+              <w:rPr>
+                <w:rFonts w:ascii="Consolas" w:hAnsi="Consolas"/>
+                <w:shd w:val="clear" w:fill="F0F2F4"/>
+                <w:sz w:val="16"/>
+                <w:color w:val="111111"/>
+              </w:rPr>
+              <w:t xml:space="preserve">amount</w:t>
+            </w:r>
+            <w:r>
+              <w:rPr>
+                <w:sz w:val="19"/>
+                <w:color w:val="111111"/>
+              </w:rPr>
+              <w:t xml:space="preserve"> + the asset's decimals</w:t>
+            </w:r>
+          </w:p>
+        </w:tc>
+        <w:tc>
+          <w:tcPr>
+            <w:tcW w:w="4680" w:type="dxa"/>
+          </w:tcPr>
+          <w:p>
+            <w:pPr>
+              <w:spacing w:before="40" w:after="40"/>
+            </w:pPr>
+            <w:r>
+              <w:rPr>
+                <w:rFonts w:ascii="Consolas" w:hAnsi="Consolas"/>
+                <w:shd w:val="clear" w:fill="F0F2F4"/>
+                <w:sz w:val="16"/>
+                <w:color w:val="111111"/>
+              </w:rPr>
+              <w:t xml:space="preserve">amount_cents</w:t>
+            </w:r>
+            <w:r>
+              <w:rPr>
+                <w:sz w:val="19"/>
+                <w:color w:val="111111"/>
+              </w:rPr>
+              <w:t xml:space="preserve">, </w:t>
+            </w:r>
+            <w:r>
+              <w:rPr>
+                <w:b/>
+                <w:sz w:val="19"/>
+                <w:color w:val="111111"/>
+              </w:rPr>
+              <w:t xml:space="preserve">rounded up</w:t>
+            </w:r>
+            <w:r>
+              <w:rPr>
+                <w:sz w:val="19"/>
+                <w:color w:val="111111"/>
+              </w:rPr>
+              <w:t xml:space="preserve"> — a fraction of a cent must never round a payment </w:t>
+            </w:r>
+            <w:r>
+              <w:rPr>
+                <w:i/>
+                <w:sz w:val="19"/>
+                <w:color w:val="111111"/>
+              </w:rPr>
+              <w:t xml:space="preserve">under</w:t>
+            </w:r>
+            <w:r>
+              <w:rPr>
+                <w:sz w:val="19"/>
+                <w:color w:val="111111"/>
+              </w:rPr>
+              <w:t xml:space="preserve"> a cap</w:t>
+            </w:r>
+          </w:p>
+        </w:tc>
+      </w:tr>
+      <w:tr>
+        <w:tc>
+          <w:tcPr>
+            <w:tcW w:w="4680" w:type="dxa"/>
+          </w:tcPr>
+          <w:p>
+            <w:pPr>
+              <w:spacing w:before="40" w:after="40"/>
+            </w:pPr>
+            <w:r>
+              <w:rPr>
+                <w:rFonts w:ascii="Consolas" w:hAnsi="Consolas"/>
+                <w:shd w:val="clear" w:fill="F0F2F4"/>
+                <w:sz w:val="16"/>
+                <w:color w:val="111111"/>
+              </w:rPr>
+              <w:t xml:space="preserve">extra.name</w:t>
+            </w:r>
+          </w:p>
+        </w:tc>
+        <w:tc>
+          <w:tcPr>
+            <w:tcW w:w="4680" w:type="dxa"/>
+          </w:tcPr>
+          <w:p>
+            <w:pPr>
+              <w:spacing w:before="40" w:after="40"/>
+            </w:pPr>
+            <w:r>
+              <w:rPr>
+                <w:rFonts w:ascii="Consolas" w:hAnsi="Consolas"/>
+                <w:shd w:val="clear" w:fill="F0F2F4"/>
+                <w:sz w:val="16"/>
+                <w:color w:val="111111"/>
+              </w:rPr>
+              <w:t xml:space="preserve">asset</w:t>
+            </w:r>
+          </w:p>
+        </w:tc>
+      </w:tr>
+      <w:tr>
+        <w:tc>
+          <w:tcPr>
+            <w:tcW w:w="4680" w:type="dxa"/>
+          </w:tcPr>
+          <w:p>
+            <w:pPr>
+              <w:spacing w:before="40" w:after="40"/>
+            </w:pPr>
+            <w:r>
+              <w:rPr>
+                <w:rFonts w:ascii="Consolas" w:hAnsi="Consolas"/>
+                <w:shd w:val="clear" w:fill="F0F2F4"/>
+                <w:sz w:val="16"/>
+                <w:color w:val="111111"/>
+              </w:rPr>
+              <w:t xml:space="preserve">payTo</w:t>
+            </w:r>
+          </w:p>
+        </w:tc>
+        <w:tc>
+          <w:tcPr>
+            <w:tcW w:w="4680" w:type="dxa"/>
+          </w:tcPr>
+          <w:p>
+            <w:pPr>
+              <w:spacing w:before="40" w:after="40"/>
+            </w:pPr>
+            <w:r>
+              <w:rPr>
+                <w:rFonts w:ascii="Consolas" w:hAnsi="Consolas"/>
+                <w:shd w:val="clear" w:fill="F0F2F4"/>
+                <w:sz w:val="16"/>
+                <w:color w:val="111111"/>
+              </w:rPr>
+              <w:t xml:space="preserve">counterparty</w:t>
+            </w:r>
+            <w:r>
+              <w:rPr>
+                <w:sz w:val="19"/>
+                <w:color w:val="111111"/>
+              </w:rPr>
+              <w:t xml:space="preserve">, so a mandate can allow-list who may be paid</w:t>
+            </w:r>
+          </w:p>
+        </w:tc>
+      </w:tr>
+      <w:tr>
+        <w:tc>
+          <w:tcPr>
+            <w:tcW w:w="4680" w:type="dxa"/>
+          </w:tcPr>
+          <w:p>
+            <w:pPr>
+              <w:spacing w:before="40" w:after="40"/>
+            </w:pPr>
+            <w:r>
+              <w:rPr>
+                <w:sz w:val="19"/>
+                <w:color w:val="111111"/>
+              </w:rPr>
+              <w:t xml:space="preserve">—</w:t>
+            </w:r>
+          </w:p>
+        </w:tc>
+        <w:tc>
+          <w:tcPr>
+            <w:tcW w:w="4680" w:type="dxa"/>
+          </w:tcPr>
+          <w:p>
+            <w:pPr>
+              <w:spacing w:before="40" w:after="40"/>
+            </w:pPr>
+            <w:r>
+              <w:rPr>
+                <w:rFonts w:ascii="Consolas" w:hAnsi="Consolas"/>
+                <w:shd w:val="clear" w:fill="F0F2F4"/>
+                <w:sz w:val="16"/>
+                <w:color w:val="111111"/>
+              </w:rPr>
+              <w:t xml:space="preserve">kind: "x402.pay"</w:t>
+            </w:r>
+            <w:r>
+              <w:rPr>
+                <w:sz w:val="19"/>
+                <w:color w:val="111111"/>
+              </w:rPr>
+              <w:t xml:space="preserve">, its own category</w:t>
+            </w:r>
+          </w:p>
+        </w:tc>
+      </w:tr>
+    </w:tbl>
+    <w:p>
+      <w:pPr>
+        <w:spacing w:before="120" w:after="120"/>
+      </w:pPr>
+    </w:p>
+    <w:p>
+      <w:pPr>
+        <w:spacing w:before="120" w:after="120"/>
+      </w:pPr>
+      <w:r>
+        <w:rPr>
+          <w:sz w:val="21"/>
+          <w:color w:val="111111"/>
+        </w:rPr>
+        <w:t xml:space="preserve">That last row is the point. Permission to trade is not permission to spend on APIs: a mandate that never mentions </w:t>
+      </w:r>
+      <w:r>
+        <w:rPr>
+          <w:rFonts w:ascii="Consolas" w:hAnsi="Consolas"/>
+          <w:shd w:val="clear" w:fill="F0F2F4"/>
+          <w:sz w:val="18"/>
+          <w:color w:val="111111"/>
+        </w:rPr>
+        <w:t xml:space="preserve">x402.pay</w:t>
+      </w:r>
+      <w:r>
+        <w:rPr>
+          <w:sz w:val="21"/>
+          <w:color w:val="111111"/>
+        </w:rPr>
+        <w:t xml:space="preserve"> refuses every paywall, because deny-by-default already covers it. And an asset that does not declare its decimals is </w:t>
+      </w:r>
+      <w:r>
+        <w:rPr>
+          <w:b/>
+          <w:sz w:val="21"/>
+          <w:color w:val="111111"/>
+        </w:rPr>
+        <w:t xml:space="preserve">refused rather than guessed</w:t>
+      </w:r>
+      <w:r>
+        <w:rPr>
+          <w:sz w:val="21"/>
+          <w:color w:val="111111"/>
+        </w:rPr>
+        <w:t xml:space="preserve"> — a wrong guess there is a spending limit off by a factor of a hundred.</w:t>
+      </w:r>
+    </w:p>
+    <w:p>
+      <w:pPr>
+        <w:spacing w:before="120" w:after="120"/>
+      </w:pPr>
+      <w:r>
+        <w:rPr>
+          <w:sz w:val="21"/>
+          <w:color w:val="111111"/>
+        </w:rPr>
+        <w:t xml:space="preserve">What is real: the v2 HTTP transport (</w:t>
+      </w:r>
+      <w:r>
+        <w:rPr>
+          <w:rFonts w:ascii="Consolas" w:hAnsi="Consolas"/>
+          <w:shd w:val="clear" w:fill="F0F2F4"/>
+          <w:sz w:val="18"/>
+          <w:color w:val="111111"/>
+        </w:rPr>
+        <w:t xml:space="preserve">PAYMENT-REQUIRED</w:t>
+      </w:r>
+      <w:r>
+        <w:rPr>
+          <w:sz w:val="21"/>
+          <w:color w:val="111111"/>
+        </w:rPr>
+        <w:t xml:space="preserve"> / </w:t>
+      </w:r>
+      <w:r>
+        <w:rPr>
+          <w:rFonts w:ascii="Consolas" w:hAnsi="Consolas"/>
+          <w:shd w:val="clear" w:fill="F0F2F4"/>
+          <w:sz w:val="18"/>
+          <w:color w:val="111111"/>
+        </w:rPr>
+        <w:t xml:space="preserve">PAYMENT-SIGNATURE</w:t>
+      </w:r>
+      <w:r>
+        <w:rPr>
+          <w:sz w:val="21"/>
+          <w:color w:val="111111"/>
+        </w:rPr>
+        <w:t xml:space="preserve"> / </w:t>
+      </w:r>
+      <w:r>
+        <w:rPr>
+          <w:rFonts w:ascii="Consolas" w:hAnsi="Consolas"/>
+          <w:shd w:val="clear" w:fill="F0F2F4"/>
+          <w:sz w:val="18"/>
+          <w:color w:val="111111"/>
+        </w:rPr>
+        <w:t xml:space="preserve">PAYMENT-RESPONSE</w:t>
+      </w:r>
+      <w:r>
+        <w:rPr>
+          <w:sz w:val="21"/>
+          <w:color w:val="111111"/>
+        </w:rPr>
+        <w:t xml:space="preserve">, base64 JSON), a genuine EIP-712 signature over the EIP-3009 </w:t>
+      </w:r>
+      <w:r>
+        <w:rPr>
+          <w:rFonts w:ascii="Consolas" w:hAnsi="Consolas"/>
+          <w:shd w:val="clear" w:fill="F0F2F4"/>
+          <w:sz w:val="18"/>
+          <w:color w:val="111111"/>
+        </w:rPr>
+        <w:t xml:space="preserve">TransferWithAuthorization</w:t>
+      </w:r>
+      <w:r>
+        <w:rPr>
+          <w:sz w:val="21"/>
+          <w:color w:val="111111"/>
+        </w:rPr>
+        <w:t xml:space="preserve"> type hash against the real Base Sepolia USDC domain, and verification that recovers the payer with ecrecover — the same check a facilitator's </w:t>
+      </w:r>
+      <w:r>
+        <w:rPr>
+          <w:rFonts w:ascii="Consolas" w:hAnsi="Consolas"/>
+          <w:shd w:val="clear" w:fill="F0F2F4"/>
+          <w:sz w:val="18"/>
+          <w:color w:val="111111"/>
+        </w:rPr>
+        <w:t xml:space="preserve">/verify</w:t>
+      </w:r>
+      <w:r>
+        <w:rPr>
+          <w:sz w:val="21"/>
+          <w:color w:val="111111"/>
+        </w:rPr>
+        <w:t xml:space="preserve"> performs, minus the balance read. The verifier compares against the </w:t>
+      </w:r>
+      <w:r>
+        <w:rPr>
+          <w:i/>
+          <w:sz w:val="21"/>
+          <w:color w:val="111111"/>
+        </w:rPr>
+        <w:t xml:space="preserve">server's own</w:t>
+      </w:r>
+      <w:r>
+        <w:rPr>
+          <w:sz w:val="21"/>
+          <w:color w:val="111111"/>
+        </w:rPr>
+        <w:t xml:space="preserve"> requirement, never the one echoed back in the payload, because that field is attacker-controlled; a test signs a one-cent authorisation, relabels it as the ten-dollar one, and watches it get refused.</w:t>
+      </w:r>
+    </w:p>
+    <w:p>
+      <w:pPr>
+        <w:spacing w:before="120" w:after="120"/>
+      </w:pPr>
+      <w:r>
+        <w:rPr>
+          <w:sz w:val="21"/>
+          <w:color w:val="111111"/>
+        </w:rPr>
+        <w:t xml:space="preserve">What is not real, said plainly: </w:t>
+      </w:r>
+      <w:r>
+        <w:rPr>
+          <w:b/>
+          <w:sz w:val="21"/>
+          <w:color w:val="111111"/>
+        </w:rPr>
+        <w:t xml:space="preserve">settlement</w:t>
+      </w:r>
+      <w:r>
+        <w:rPr>
+          <w:sz w:val="21"/>
+          <w:color w:val="111111"/>
+        </w:rPr>
+        <w:t xml:space="preserve">. Broadcasting needs a funded wallet. </w:t>
+      </w:r>
+      <w:r>
+        <w:rPr>
+          <w:rFonts w:ascii="Consolas" w:hAnsi="Consolas"/>
+          <w:shd w:val="clear" w:fill="F0F2F4"/>
+          <w:sz w:val="18"/>
+          <w:color w:val="111111"/>
+        </w:rPr>
+        <w:t xml:space="preserve">settle()</w:t>
+      </w:r>
+      <w:r>
+        <w:rPr>
+          <w:sz w:val="21"/>
+          <w:color w:val="111111"/>
+        </w:rPr>
+        <w:t xml:space="preserve"> posts the spec's </w:t>
+      </w:r>
+      <w:r>
+        <w:rPr>
+          <w:rFonts w:ascii="Consolas" w:hAnsi="Consolas"/>
+          <w:shd w:val="clear" w:fill="F0F2F4"/>
+          <w:sz w:val="18"/>
+          <w:color w:val="111111"/>
+        </w:rPr>
+        <w:t xml:space="preserve">/settle</w:t>
+      </w:r>
+      <w:r>
+        <w:rPr>
+          <w:sz w:val="21"/>
+          <w:color w:val="111111"/>
+        </w:rPr>
+        <w:t xml:space="preserve"> body when </w:t>
+      </w:r>
+      <w:r>
+        <w:rPr>
+          <w:rFonts w:ascii="Consolas" w:hAnsi="Consolas"/>
+          <w:shd w:val="clear" w:fill="F0F2F4"/>
+          <w:sz w:val="18"/>
+          <w:color w:val="111111"/>
+        </w:rPr>
+        <w:t xml:space="preserve">X402_FACILITATOR_URL</w:t>
+      </w:r>
+      <w:r>
+        <w:rPr>
+          <w:sz w:val="21"/>
+          <w:color w:val="111111"/>
+        </w:rPr>
+        <w:t xml:space="preserve"> is set and </w:t>
+      </w:r>
+      <w:r>
+        <w:rPr>
+          <w:b/>
+          <w:sz w:val="21"/>
+          <w:color w:val="111111"/>
+        </w:rPr>
+        <w:t xml:space="preserve">refuses</w:t>
+      </w:r>
+      <w:r>
+        <w:rPr>
+          <w:sz w:val="21"/>
+          <w:color w:val="111111"/>
+        </w:rPr>
+        <w:t xml:space="preserve"> when it is not, because a receipt this process invented would be believed by whatever read it.</w:t>
+      </w:r>
+    </w:p>
+    <w:p>
+      <w:pPr>
+        <w:spacing w:before="120" w:after="120"/>
+      </w:pPr>
+      <w:r>
+        <w:rPr>
+          <w:sz w:val="21"/>
+          <w:color w:val="111111"/>
+        </w:rPr>
+        <w:t xml:space="preserve">Short of that, it is verified by someone who is not us. </w:t>
+      </w:r>
+      <w:r>
+        <w:rPr>
+          <w:rFonts w:ascii="Consolas" w:hAnsi="Consolas"/>
+          <w:shd w:val="clear" w:fill="F0F2F4"/>
+          <w:sz w:val="18"/>
+          <w:color w:val="111111"/>
+        </w:rPr>
+        <w:t xml:space="preserve">npm run x402:verify</w:t>
+      </w:r>
+      <w:r>
+        <w:rPr>
+          <w:sz w:val="21"/>
+          <w:color w:val="111111"/>
+        </w:rPr>
+        <w:t xml:space="preserve"> reads </w:t>
+      </w:r>
+      <w:r>
+        <w:rPr>
+          <w:rFonts w:ascii="Consolas" w:hAnsi="Consolas"/>
+          <w:shd w:val="clear" w:fill="F0F2F4"/>
+          <w:sz w:val="18"/>
+          <w:color w:val="111111"/>
+        </w:rPr>
+        <w:t xml:space="preserve">DOMAIN_SEPARATOR()</w:t>
+      </w:r>
+      <w:r>
+        <w:rPr>
+          <w:sz w:val="21"/>
+          <w:color w:val="111111"/>
+        </w:rPr>
+        <w:t xml:space="preserve"> off the deployed Base Sepolia USDC contract — ours is byte-identical — and then posts a real payload to the public facilitator at </w:t>
+      </w:r>
+      <w:r>
+        <w:rPr>
+          <w:rFonts w:ascii="Consolas" w:hAnsi="Consolas"/>
+          <w:shd w:val="clear" w:fill="F0F2F4"/>
+          <w:sz w:val="18"/>
+          <w:color w:val="111111"/>
+        </w:rPr>
+        <w:t xml:space="preserve">x402.org/facilitator</w:t>
+      </w:r>
+      <w:r>
+        <w:rPr>
+          <w:sz w:val="21"/>
+          <w:color w:val="111111"/>
+        </w:rPr>
+        <w:t xml:space="preserve">, which recovers our payer address on its own and </w:t>
+      </w:r>
+      <w:r>
+        <w:rPr>
+          <w:b/>
+          <w:sz w:val="21"/>
+          <w:color w:val="111111"/>
+        </w:rPr>
+        <w:t xml:space="preserve">simulates `transferWithAuthorization` against the token</w:t>
+      </w:r>
+      <w:r>
+        <w:rPr>
+          <w:sz w:val="21"/>
+          <w:color w:val="111111"/>
+        </w:rPr>
+        <w:t xml:space="preserve">. It gets as far as the balance and stops:</w:t>
+      </w:r>
+    </w:p>
+    <w:p>
+      <w:pPr>
+        <w:shd w:val="clear" w:fill="F6F8FA"/>
+        <w:spacing w:before="0" w:after="0"/>
+      </w:pPr>
+      <w:r>
+        <w:rPr>
+          <w:rFonts w:ascii="Consolas" w:hAnsi="Consolas"/>
+          <w:sz w:val="17"/>
+        </w:rPr>
+        <w:t xml:space="preserve">isValid: false   invalid_exact_evm_insufficient_balance</w:t>
+      </w:r>
+    </w:p>
+    <w:p>
+      <w:pPr>
+        <w:shd w:val="clear" w:fill="F6F8FA"/>
+        <w:spacing w:before="0" w:after="0"/>
+      </w:pPr>
+      <w:r>
+        <w:rPr>
+          <w:rFonts w:ascii="Consolas" w:hAnsi="Consolas"/>
+          <w:sz w:val="17"/>
+        </w:rPr>
+        <w:t xml:space="preserve">payer:   0xc752d544…   (the address we signed with)</w:t>
+      </w:r>
+    </w:p>
+    <w:p>
+      <w:pPr>
+        <w:shd w:val="clear" w:fill="F6F8FA"/>
+        <w:spacing w:before="0" w:after="0"/>
+      </w:pPr>
+      <w:r>
+        <w:rPr>
+          <w:rFonts w:ascii="Consolas" w:hAnsi="Consolas"/>
+          <w:sz w:val="17"/>
+        </w:rPr>
+        <w:t xml:space="preserve">"transferWithAuthorization" reverted: ERC20: transfer amount exceeds balance</w:t>
+      </w:r>
+    </w:p>
+    <w:p>
+      <w:pPr>
+        <w:spacing w:before="120" w:after="120"/>
+      </w:pPr>
+      <w:r>
+        <w:rPr>
+          <w:sz w:val="21"/>
+          <w:color w:val="111111"/>
+        </w:rPr>
+        <w:t xml:space="preserve">Signature, domain, nonce, validity window and encoding all passed, in a third party's implementation, against the real token. The only thing missing is money, and the script says exactly where it goes (</w:t>
+      </w:r>
+      <w:r>
+        <w:rPr>
+          <w:i/>
+          <w:sz w:val="21"/>
+          <w:color w:val="111111"/>
+        </w:rPr>
+        <w:t xml:space="preserve">shot 26</w:t>
+      </w:r>
+      <w:r>
+        <w:rPr>
+          <w:sz w:val="21"/>
+          <w:color w:val="111111"/>
+        </w:rPr>
+        <w:t xml:space="preserve">).</w:t>
+      </w:r>
+    </w:p>
+    <w:p>
+      <w:pPr>
+        <w:spacing w:before="120" w:after="120"/>
+      </w:pPr>
+      <w:r>
+        <w:rPr>
+          <w:sz w:val="21"/>
+          <w:color w:val="111111"/>
+        </w:rPr>
+        <w:t xml:space="preserve">28 Node tests and 6 Playwright tests, all over real HTTP against a real 402. </w:t>
+      </w:r>
+      <w:r>
+        <w:rPr>
+          <w:i/>
+          <w:sz w:val="21"/>
+          <w:color w:val="111111"/>
+        </w:rPr>
+        <w:t xml:space="preserve">Shots 20 and 22</w:t>
+      </w:r>
+      <w:r>
+        <w:rPr>
+          <w:sz w:val="21"/>
+          <w:color w:val="111111"/>
+        </w:rPr>
+        <w:t xml:space="preserve">, and </w:t>
+      </w:r>
+      <w:r>
+        <w:rPr>
+          <w:rFonts w:ascii="Consolas" w:hAnsi="Consolas"/>
+          <w:shd w:val="clear" w:fill="F0F2F4"/>
+          <w:sz w:val="18"/>
+          <w:color w:val="111111"/>
+        </w:rPr>
+        <w:t xml:space="preserve">npm run demo:x402</w:t>
+      </w:r>
+      <w:r>
+        <w:rPr>
+          <w:sz w:val="21"/>
+          <w:color w:val="111111"/>
+        </w:rPr>
+        <w:t xml:space="preserve">.</w:t>
+      </w:r>
+    </w:p>
+    <w:p>
+      <w:pPr>
+        <w:spacing w:before="180" w:after="180"/>
+      </w:pPr>
+      <w:r>
+        <w:rPr>
+          <w:b/>
+          <w:sz w:val="22"/>
+          <w:color w:val="1a1a1a"/>
+        </w:rPr>
+        <w:t xml:space="preserve">4.9 Checked by people who are not us</w:t>
+      </w:r>
+    </w:p>
+    <w:p>
+      <w:pPr>
+        <w:spacing w:before="120" w:after="120"/>
+      </w:pPr>
+      <w:r>
+        <w:rPr>
+          <w:sz w:val="21"/>
+          <w:color w:val="111111"/>
+        </w:rPr>
+        <w:t xml:space="preserve">A recurring lesson of this round: a test that verifies our output with our own verifier proves the two halves agree, and nothing about the world. Three integrations were re-checked against someone else's implementation this week, and two of them were wrong.</w:t>
+      </w:r>
+    </w:p>
+    <w:tbl>
+      <w:tblPr>
+        <w:tblW w:w="9360" w:type="dxa"/>
+        <w:tblBorders>
+          <w:top w:val="single" w:sz="4" w:color="BBBBBB"/>
+          <w:left w:val="single" w:sz="4" w:color="BBBBBB"/>
+          <w:bottom w:val="single" w:sz="4" w:color="BBBBBB"/>
+          <w:right w:val="single" w:sz="4" w:color="BBBBBB"/>
+          <w:insideH w:val="single" w:sz="4" w:color="BBBBBB"/>
+          <w:insideV w:val="single" w:sz="4" w:color="BBBBBB"/>
+        </w:tblBorders>
+      </w:tblPr>
+      <w:tr>
+        <w:tc>
+          <w:tcPr>
+            <w:tcW w:w="3120" w:type="dxa"/>
+            <w:shd w:val="clear" w:fill="F1F3F5"/>
+          </w:tcPr>
+          <w:p>
+            <w:pPr>
+              <w:spacing w:before="40" w:after="40"/>
+            </w:pPr>
+            <w:r>
+              <w:rPr>
+                <w:b/>
+                <w:sz w:val="19"/>
+                <w:color w:val="111111"/>
+              </w:rPr>
+              <w:t xml:space="preserve">Integration</w:t>
+            </w:r>
+          </w:p>
+        </w:tc>
+        <w:tc>
+          <w:tcPr>
+            <w:tcW w:w="3120" w:type="dxa"/>
+            <w:shd w:val="clear" w:fill="F1F3F5"/>
+          </w:tcPr>
+          <w:p>
+            <w:pPr>
+              <w:spacing w:before="40" w:after="40"/>
+            </w:pPr>
+            <w:r>
+              <w:rPr>
+                <w:b/>
+                <w:sz w:val="19"/>
+                <w:color w:val="111111"/>
+              </w:rPr>
+              <w:t xml:space="preserve">Checked against</w:t>
+            </w:r>
+          </w:p>
+        </w:tc>
+        <w:tc>
+          <w:tcPr>
+            <w:tcW w:w="3120" w:type="dxa"/>
+            <w:shd w:val="clear" w:fill="F1F3F5"/>
+          </w:tcPr>
+          <w:p>
+            <w:pPr>
+              <w:spacing w:before="40" w:after="40"/>
+            </w:pPr>
+            <w:r>
+              <w:rPr>
+                <w:b/>
+                <w:sz w:val="19"/>
+                <w:color w:val="111111"/>
+              </w:rPr>
+              <w:t xml:space="preserve">Result</w:t>
+            </w:r>
+          </w:p>
+        </w:tc>
+      </w:tr>
+      <w:tr>
+        <w:tc>
+          <w:tcPr>
+            <w:tcW w:w="3120" w:type="dxa"/>
+          </w:tcPr>
+          <w:p>
+            <w:pPr>
+              <w:spacing w:before="40" w:after="40"/>
+            </w:pPr>
+            <w:r>
+              <w:rPr>
+                <w:sz w:val="19"/>
+                <w:color w:val="111111"/>
+              </w:rPr>
+              <w:t xml:space="preserve">x402</w:t>
+            </w:r>
+          </w:p>
+        </w:tc>
+        <w:tc>
+          <w:tcPr>
+            <w:tcW w:w="3120" w:type="dxa"/>
+          </w:tcPr>
+          <w:p>
+            <w:pPr>
+              <w:spacing w:before="40" w:after="40"/>
+            </w:pPr>
+            <w:r>
+              <w:rPr>
+                <w:sz w:val="19"/>
+                <w:color w:val="111111"/>
+              </w:rPr>
+              <w:t xml:space="preserve">the public facilitator at </w:t>
+            </w:r>
+            <w:r>
+              <w:rPr>
+                <w:rFonts w:ascii="Consolas" w:hAnsi="Consolas"/>
+                <w:shd w:val="clear" w:fill="F0F2F4"/>
+                <w:sz w:val="16"/>
+                <w:color w:val="111111"/>
+              </w:rPr>
+              <w:t xml:space="preserve">x402.org</w:t>
+            </w:r>
+          </w:p>
+        </w:tc>
+        <w:tc>
+          <w:tcPr>
+            <w:tcW w:w="3120" w:type="dxa"/>
+          </w:tcPr>
+          <w:p>
+            <w:pPr>
+              <w:spacing w:before="40" w:after="40"/>
+            </w:pPr>
+            <w:r>
+              <w:rPr>
+                <w:sz w:val="19"/>
+                <w:color w:val="111111"/>
+              </w:rPr>
+              <w:t xml:space="preserve">accepted — it recovers our payer and simulates the transfer; only the balance stops it</w:t>
+            </w:r>
+          </w:p>
+        </w:tc>
+      </w:tr>
+      <w:tr>
+        <w:tc>
+          <w:tcPr>
+            <w:tcW w:w="3120" w:type="dxa"/>
+          </w:tcPr>
+          <w:p>
+            <w:pPr>
+              <w:spacing w:before="40" w:after="40"/>
+            </w:pPr>
+            <w:r>
+              <w:rPr>
+                <w:sz w:val="19"/>
+                <w:color w:val="111111"/>
+              </w:rPr>
+              <w:t xml:space="preserve">Web Bot Auth</w:t>
+            </w:r>
+          </w:p>
+        </w:tc>
+        <w:tc>
+          <w:tcPr>
+            <w:tcW w:w="3120" w:type="dxa"/>
+          </w:tcPr>
+          <w:p>
+            <w:pPr>
+              <w:spacing w:before="40" w:after="40"/>
+            </w:pPr>
+            <w:r>
+              <w:rPr>
+                <w:sz w:val="19"/>
+                <w:color w:val="111111"/>
+              </w:rPr>
+              <w:t xml:space="preserve">Cloudflare's </w:t>
+            </w:r>
+            <w:r>
+              <w:rPr>
+                <w:rFonts w:ascii="Consolas" w:hAnsi="Consolas"/>
+                <w:shd w:val="clear" w:fill="F0F2F4"/>
+                <w:sz w:val="16"/>
+                <w:color w:val="111111"/>
+              </w:rPr>
+              <w:t xml:space="preserve">web-bot-auth</w:t>
+            </w:r>
+            <w:r>
+              <w:rPr>
+                <w:sz w:val="19"/>
+                <w:color w:val="111111"/>
+              </w:rPr>
+              <w:t xml:space="preserve"> (the reference)</w:t>
+            </w:r>
+          </w:p>
+        </w:tc>
+        <w:tc>
+          <w:tcPr>
+            <w:tcW w:w="3120" w:type="dxa"/>
+          </w:tcPr>
+          <w:p>
+            <w:pPr>
+              <w:spacing w:before="40" w:after="40"/>
+            </w:pPr>
+            <w:r>
+              <w:rPr>
+                <w:b/>
+                <w:sz w:val="19"/>
+                <w:color w:val="111111"/>
+              </w:rPr>
+              <w:t xml:space="preserve">rejected</w:t>
+            </w:r>
+            <w:r>
+              <w:rPr>
+                <w:sz w:val="19"/>
+                <w:color w:val="111111"/>
+              </w:rPr>
+              <w:t xml:space="preserve"> — we emitted no </w:t>
+            </w:r>
+            <w:r>
+              <w:rPr>
+                <w:rFonts w:ascii="Consolas" w:hAnsi="Consolas"/>
+                <w:shd w:val="clear" w:fill="F0F2F4"/>
+                <w:sz w:val="16"/>
+                <w:color w:val="111111"/>
+              </w:rPr>
+              <w:t xml:space="preserve">expires</w:t>
+            </w:r>
+            <w:r>
+              <w:rPr>
+                <w:sz w:val="19"/>
+                <w:color w:val="111111"/>
+              </w:rPr>
+              <w:t xml:space="preserve">. Fixed; now passes both ways</w:t>
+            </w:r>
+          </w:p>
+        </w:tc>
+      </w:tr>
+      <w:tr>
+        <w:tc>
+          <w:tcPr>
+            <w:tcW w:w="3120" w:type="dxa"/>
+          </w:tcPr>
+          <w:p>
+            <w:pPr>
+              <w:spacing w:before="40" w:after="40"/>
+            </w:pPr>
+            <w:r>
+              <w:rPr>
+                <w:sz w:val="19"/>
+                <w:color w:val="111111"/>
+              </w:rPr>
+              <w:t xml:space="preserve">A2A</w:t>
+            </w:r>
+          </w:p>
+        </w:tc>
+        <w:tc>
+          <w:tcPr>
+            <w:tcW w:w="3120" w:type="dxa"/>
+          </w:tcPr>
+          <w:p>
+            <w:pPr>
+              <w:spacing w:before="40" w:after="40"/>
+            </w:pPr>
+            <w:r>
+              <w:rPr>
+                <w:sz w:val="19"/>
+                <w:color w:val="111111"/>
+              </w:rPr>
+              <w:t xml:space="preserve">the official </w:t>
+            </w:r>
+            <w:r>
+              <w:rPr>
+                <w:rFonts w:ascii="Consolas" w:hAnsi="Consolas"/>
+                <w:shd w:val="clear" w:fill="F0F2F4"/>
+                <w:sz w:val="16"/>
+                <w:color w:val="111111"/>
+              </w:rPr>
+              <w:t xml:space="preserve">@a2a-js/sdk</w:t>
+            </w:r>
+            <w:r>
+              <w:rPr>
+                <w:sz w:val="19"/>
+                <w:color w:val="111111"/>
+              </w:rPr>
+              <w:t xml:space="preserve"> client</w:t>
+            </w:r>
+          </w:p>
+        </w:tc>
+        <w:tc>
+          <w:tcPr>
+            <w:tcW w:w="3120" w:type="dxa"/>
+          </w:tcPr>
+          <w:p>
+            <w:pPr>
+              <w:spacing w:before="40" w:after="40"/>
+            </w:pPr>
+            <w:r>
+              <w:rPr>
+                <w:b/>
+                <w:sz w:val="19"/>
+                <w:color w:val="111111"/>
+              </w:rPr>
+              <w:t xml:space="preserve">rejected</w:t>
+            </w:r>
+            <w:r>
+              <w:rPr>
+                <w:sz w:val="19"/>
+                <w:color w:val="111111"/>
+              </w:rPr>
+              <w:t xml:space="preserve"> by our own validator — it only knew v0.3 cards. Fixed; the server passes both the SDK client and hand-written JSON-RPC</w:t>
+            </w:r>
+          </w:p>
+        </w:tc>
+      </w:tr>
+    </w:tbl>
+    <w:p>
+      <w:pPr>
+        <w:spacing w:before="120" w:after="120"/>
+      </w:pPr>
+    </w:p>
+    <w:p>
+      <w:pPr>
+        <w:spacing w:before="120" w:after="120"/>
+      </w:pPr>
+      <w:r>
+        <w:rPr>
+          <w:sz w:val="21"/>
+          <w:color w:val="111111"/>
+        </w:rPr>
+        <w:t xml:space="preserve">And three claims that had only ever been unit tests — the enclave-held credential, </w:t>
+      </w:r>
+      <w:r>
+        <w:rPr>
+          <w:rFonts w:ascii="Consolas" w:hAnsi="Consolas"/>
+          <w:shd w:val="clear" w:fill="F0F2F4"/>
+          <w:sz w:val="18"/>
+          <w:color w:val="111111"/>
+        </w:rPr>
+        <w:t xml:space="preserve">{{profile.*}}</w:t>
+      </w:r>
+      <w:r>
+        <w:rPr>
+          <w:sz w:val="21"/>
+          <w:color w:val="111111"/>
+        </w:rPr>
+        <w:t xml:space="preserve"> substitution, idempotent replay — were run on the node for the first time, each with a control case (</w:t>
+      </w:r>
+      <w:r>
+        <w:rPr>
+          <w:i/>
+          <w:sz w:val="21"/>
+          <w:color w:val="111111"/>
+        </w:rPr>
+        <w:t xml:space="preserve">shot 27</w:t>
+      </w:r>
+      <w:r>
+        <w:rPr>
+          <w:sz w:val="21"/>
+          <w:color w:val="111111"/>
+        </w:rPr>
+        <w:t xml:space="preserve">). All three held. They were written during the credit outage, exactly as the status-list code was, and that code turned out to be broken the first time it ran. These did not, but we no longer have to say "should".</w:t>
+      </w:r>
+    </w:p>
+    <w:p>
+      <w:pPr>
         <w:spacing w:before="260" w:after="260"/>
       </w:pPr>
       <w:r>
@@ -4147,7 +6079,7 @@
           <w:sz w:val="21"/>
           <w:color w:val="111111"/>
         </w:rPr>
-        <w:t xml:space="preserve"> Rust decision function. 85 checks, no API key, no network, no credits. It selects the GNU toolchain automatically on Windows, which is otherwise a documented footgun a newcomer hits on their first build.</w:t>
+        <w:t xml:space="preserve"> Rust decision function. 277 checks, no API key, no network, no credits. It selects the GNU toolchain automatically on Windows, which is otherwise a documented footgun a newcomer hits on their first build.</w:t>
       </w:r>
     </w:p>
     <w:p>
@@ -4806,7 +6738,7 @@
           <w:sz w:val="26"/>
           <w:color w:val="1a1a1a"/>
         </w:rPr>
-        <w:t xml:space="preserve">8. Bugs — 21 reports, each re-verified today</w:t>
+        <w:t xml:space="preserve">8. Bugs — 29 reports, each re-verified today</w:t>
       </w:r>
     </w:p>
     <w:p>
@@ -7084,7 +9016,7 @@
           <w:sz w:val="21"/>
           <w:color w:val="111111"/>
         </w:rPr>
-        <w:t xml:space="preserve">`node verify.mjs` reports its own total — 161 offline checks</w:t>
+        <w:t xml:space="preserve">`node verify.mjs` reports its own total — 277 offline checks</w:t>
       </w:r>
       <w:r>
         <w:rPr>
@@ -7398,7 +9330,7 @@
                 <w:sz w:val="19"/>
                 <w:color w:val="111111"/>
               </w:rPr>
-              <w:t xml:space="preserve">our Rust TEE contract live on the network</w:t>
+              <w:t xml:space="preserve">our Rust TEE contract live at 0.10.0 — and bug #8, the id field echoing the name back</w:t>
             </w:r>
           </w:p>
         </w:tc>
@@ -7508,7 +9440,22 @@
                 <w:sz w:val="19"/>
                 <w:color w:val="111111"/>
               </w:rPr>
-              <w:t xml:space="preserve">the whole agent: VC gate → TEE mandate → audit → in-TEE dispatch (HTTP 200)</w:t>
+              <w:t xml:space="preserve">the whole agent on 0.10.0: VC gate → TEE mandate → audit → in-TEE dispatch (</w:t>
+            </w:r>
+            <w:r>
+              <w:rPr>
+                <w:b/>
+                <w:sz w:val="19"/>
+                <w:color w:val="111111"/>
+              </w:rPr>
+              <w:t xml:space="preserve">HTTP 200</w:t>
+            </w:r>
+            <w:r>
+              <w:rPr>
+                <w:sz w:val="19"/>
+                <w:color w:val="111111"/>
+              </w:rPr>
+              <w:t xml:space="preserve">)</w:t>
             </w:r>
           </w:p>
         </w:tc>
@@ -7636,7 +9583,7 @@
                 <w:sz w:val="19"/>
                 <w:color w:val="111111"/>
               </w:rPr>
-              <w:t xml:space="preserve"> — 85 checks, no key, no credits</w:t>
+              <w:t xml:space="preserve"> — 277 checks, no key, no credits</w:t>
             </w:r>
           </w:p>
         </w:tc>
@@ -7765,13 +9712,6 @@
               </w:rPr>
               <w:t xml:space="preserve">NotScopeWriter</w:t>
             </w:r>
-            <w:r>
-              <w:rPr>
-                <w:sz w:val="19"/>
-                <w:color w:val="111111"/>
-              </w:rPr>
-              <w:t xml:space="preserve">, now only credits</w:t>
-            </w:r>
           </w:p>
         </w:tc>
       </w:tr>
@@ -8349,6 +10289,721 @@
           </w:p>
         </w:tc>
       </w:tr>
+      <w:tr>
+        <w:tc>
+          <w:tcPr>
+            <w:tcW w:w="3120" w:type="dxa"/>
+          </w:tcPr>
+          <w:p>
+            <w:pPr>
+              <w:spacing w:before="40" w:after="40"/>
+            </w:pPr>
+            <w:r>
+              <w:rPr>
+                <w:sz w:val="19"/>
+                <w:color w:val="111111"/>
+              </w:rPr>
+              <w:t xml:space="preserve">20</w:t>
+            </w:r>
+          </w:p>
+        </w:tc>
+        <w:tc>
+          <w:tcPr>
+            <w:tcW w:w="3120" w:type="dxa"/>
+          </w:tcPr>
+          <w:p>
+            <w:pPr>
+              <w:spacing w:before="40" w:after="40"/>
+            </w:pPr>
+            <w:r>
+              <w:rPr>
+                <w:rFonts w:ascii="Consolas" w:hAnsi="Consolas"/>
+                <w:shd w:val="clear" w:fill="F0F2F4"/>
+                <w:sz w:val="16"/>
+                <w:color w:val="111111"/>
+              </w:rPr>
+              <w:t xml:space="preserve">20-qa-console-x402-paid.png</w:t>
+            </w:r>
+          </w:p>
+        </w:tc>
+        <w:tc>
+          <w:tcPr>
+            <w:tcW w:w="3120" w:type="dxa"/>
+          </w:tcPr>
+          <w:p>
+            <w:pPr>
+              <w:spacing w:before="40" w:after="40"/>
+            </w:pPr>
+            <w:r>
+              <w:rPr>
+                <w:sz w:val="19"/>
+                <w:color w:val="111111"/>
+              </w:rPr>
+              <w:t xml:space="preserve">the console paying a real 402, with the payee recovered from the signature</w:t>
+            </w:r>
+          </w:p>
+        </w:tc>
+      </w:tr>
+      <w:tr>
+        <w:tc>
+          <w:tcPr>
+            <w:tcW w:w="3120" w:type="dxa"/>
+          </w:tcPr>
+          <w:p>
+            <w:pPr>
+              <w:spacing w:before="40" w:after="40"/>
+            </w:pPr>
+            <w:r>
+              <w:rPr>
+                <w:sz w:val="19"/>
+                <w:color w:val="111111"/>
+              </w:rPr>
+              <w:t xml:space="preserve">21</w:t>
+            </w:r>
+          </w:p>
+        </w:tc>
+        <w:tc>
+          <w:tcPr>
+            <w:tcW w:w="3120" w:type="dxa"/>
+          </w:tcPr>
+          <w:p>
+            <w:pPr>
+              <w:spacing w:before="40" w:after="40"/>
+            </w:pPr>
+            <w:r>
+              <w:rPr>
+                <w:rFonts w:ascii="Consolas" w:hAnsi="Consolas"/>
+                <w:shd w:val="clear" w:fill="F0F2F4"/>
+                <w:sz w:val="16"/>
+                <w:color w:val="111111"/>
+              </w:rPr>
+              <w:t xml:space="preserve">21-mcp-server.png</w:t>
+            </w:r>
+          </w:p>
+        </w:tc>
+        <w:tc>
+          <w:tcPr>
+            <w:tcW w:w="3120" w:type="dxa"/>
+          </w:tcPr>
+          <w:p>
+            <w:pPr>
+              <w:spacing w:before="40" w:after="40"/>
+            </w:pPr>
+            <w:r>
+              <w:rPr>
+                <w:sz w:val="19"/>
+                <w:color w:val="111111"/>
+              </w:rPr>
+              <w:t xml:space="preserve">the gate over MCP — a real client, a real subprocess, eight tools, no account</w:t>
+            </w:r>
+          </w:p>
+        </w:tc>
+      </w:tr>
+      <w:tr>
+        <w:tc>
+          <w:tcPr>
+            <w:tcW w:w="3120" w:type="dxa"/>
+          </w:tcPr>
+          <w:p>
+            <w:pPr>
+              <w:spacing w:before="40" w:after="40"/>
+            </w:pPr>
+            <w:r>
+              <w:rPr>
+                <w:sz w:val="19"/>
+                <w:color w:val="111111"/>
+              </w:rPr>
+              <w:t xml:space="preserve">22</w:t>
+            </w:r>
+          </w:p>
+        </w:tc>
+        <w:tc>
+          <w:tcPr>
+            <w:tcW w:w="3120" w:type="dxa"/>
+          </w:tcPr>
+          <w:p>
+            <w:pPr>
+              <w:spacing w:before="40" w:after="40"/>
+            </w:pPr>
+            <w:r>
+              <w:rPr>
+                <w:rFonts w:ascii="Consolas" w:hAnsi="Consolas"/>
+                <w:shd w:val="clear" w:fill="F0F2F4"/>
+                <w:sz w:val="16"/>
+                <w:color w:val="111111"/>
+              </w:rPr>
+              <w:t xml:space="preserve">22-x402-mandated-payment.png</w:t>
+            </w:r>
+          </w:p>
+        </w:tc>
+        <w:tc>
+          <w:tcPr>
+            <w:tcW w:w="3120" w:type="dxa"/>
+          </w:tcPr>
+          <w:p>
+            <w:pPr>
+              <w:spacing w:before="40" w:after="40"/>
+            </w:pPr>
+            <w:r>
+              <w:rPr>
+                <w:sz w:val="19"/>
+                <w:color w:val="111111"/>
+              </w:rPr>
+              <w:t xml:space="preserve">x402 — one payment made, three refused before anything was signed</w:t>
+            </w:r>
+          </w:p>
+        </w:tc>
+      </w:tr>
+      <w:tr>
+        <w:tc>
+          <w:tcPr>
+            <w:tcW w:w="3120" w:type="dxa"/>
+          </w:tcPr>
+          <w:p>
+            <w:pPr>
+              <w:spacing w:before="40" w:after="40"/>
+            </w:pPr>
+            <w:r>
+              <w:rPr>
+                <w:sz w:val="19"/>
+                <w:color w:val="111111"/>
+              </w:rPr>
+              <w:t xml:space="preserve">23</w:t>
+            </w:r>
+          </w:p>
+        </w:tc>
+        <w:tc>
+          <w:tcPr>
+            <w:tcW w:w="3120" w:type="dxa"/>
+          </w:tcPr>
+          <w:p>
+            <w:pPr>
+              <w:spacing w:before="40" w:after="40"/>
+            </w:pPr>
+            <w:r>
+              <w:rPr>
+                <w:rFonts w:ascii="Consolas" w:hAnsi="Consolas"/>
+                <w:shd w:val="clear" w:fill="F0F2F4"/>
+                <w:sz w:val="16"/>
+                <w:color w:val="111111"/>
+              </w:rPr>
+              <w:t xml:space="preserve">23-probe-before-promote.png</w:t>
+            </w:r>
+          </w:p>
+        </w:tc>
+        <w:tc>
+          <w:tcPr>
+            <w:tcW w:w="3120" w:type="dxa"/>
+          </w:tcPr>
+          <w:p>
+            <w:pPr>
+              <w:spacing w:before="40" w:after="40"/>
+            </w:pPr>
+            <w:r>
+              <w:rPr>
+                <w:sz w:val="19"/>
+                <w:color w:val="111111"/>
+              </w:rPr>
+              <w:t xml:space="preserve">the build proven under a throwaway tail before production points at it</w:t>
+            </w:r>
+          </w:p>
+        </w:tc>
+      </w:tr>
+      <w:tr>
+        <w:tc>
+          <w:tcPr>
+            <w:tcW w:w="3120" w:type="dxa"/>
+          </w:tcPr>
+          <w:p>
+            <w:pPr>
+              <w:spacing w:before="40" w:after="40"/>
+            </w:pPr>
+            <w:r>
+              <w:rPr>
+                <w:sz w:val="19"/>
+                <w:color w:val="111111"/>
+              </w:rPr>
+              <w:t xml:space="preserve">24</w:t>
+            </w:r>
+          </w:p>
+        </w:tc>
+        <w:tc>
+          <w:tcPr>
+            <w:tcW w:w="3120" w:type="dxa"/>
+          </w:tcPr>
+          <w:p>
+            <w:pPr>
+              <w:spacing w:before="40" w:after="40"/>
+            </w:pPr>
+            <w:r>
+              <w:rPr>
+                <w:rFonts w:ascii="Consolas" w:hAnsi="Consolas"/>
+                <w:shd w:val="clear" w:fill="F0F2F4"/>
+                <w:sz w:val="16"/>
+                <w:color w:val="111111"/>
+              </w:rPr>
+              <w:t xml:space="preserve">24-node-discovery.png</w:t>
+            </w:r>
+          </w:p>
+        </w:tc>
+        <w:tc>
+          <w:tcPr>
+            <w:tcW w:w="3120" w:type="dxa"/>
+          </w:tcPr>
+          <w:p>
+            <w:pPr>
+              <w:spacing w:before="40" w:after="40"/>
+            </w:pPr>
+            <w:r>
+              <w:rPr>
+                <w:sz w:val="19"/>
+                <w:color w:val="111111"/>
+              </w:rPr>
+              <w:t xml:space="preserve">what the node actually runs, read with a scoped agent key — including two core contracts nobody documents</w:t>
+            </w:r>
+          </w:p>
+        </w:tc>
+      </w:tr>
+      <w:tr>
+        <w:tc>
+          <w:tcPr>
+            <w:tcW w:w="3120" w:type="dxa"/>
+          </w:tcPr>
+          <w:p>
+            <w:pPr>
+              <w:spacing w:before="40" w:after="40"/>
+            </w:pPr>
+            <w:r>
+              <w:rPr>
+                <w:sz w:val="19"/>
+                <w:color w:val="111111"/>
+              </w:rPr>
+              <w:t xml:space="preserve">25</w:t>
+            </w:r>
+          </w:p>
+        </w:tc>
+        <w:tc>
+          <w:tcPr>
+            <w:tcW w:w="3120" w:type="dxa"/>
+          </w:tcPr>
+          <w:p>
+            <w:pPr>
+              <w:spacing w:before="40" w:after="40"/>
+            </w:pPr>
+            <w:r>
+              <w:rPr>
+                <w:rFonts w:ascii="Consolas" w:hAnsi="Consolas"/>
+                <w:shd w:val="clear" w:fill="F0F2F4"/>
+                <w:sz w:val="16"/>
+                <w:color w:val="111111"/>
+              </w:rPr>
+              <w:t xml:space="preserve">25-core-contracts-blocked.png</w:t>
+            </w:r>
+          </w:p>
+        </w:tc>
+        <w:tc>
+          <w:tcPr>
+            <w:tcW w:w="3120" w:type="dxa"/>
+          </w:tcPr>
+          <w:p>
+            <w:pPr>
+              <w:spacing w:before="40" w:after="40"/>
+            </w:pPr>
+            <w:r>
+              <w:rPr>
+                <w:sz w:val="19"/>
+                <w:color w:val="111111"/>
+              </w:rPr>
+              <w:t xml:space="preserve">bugs #27/#28 — the attempt to use those two, and exactly where a tenant caller is stopped</w:t>
+            </w:r>
+          </w:p>
+        </w:tc>
+      </w:tr>
+      <w:tr>
+        <w:tc>
+          <w:tcPr>
+            <w:tcW w:w="3120" w:type="dxa"/>
+          </w:tcPr>
+          <w:p>
+            <w:pPr>
+              <w:spacing w:before="40" w:after="40"/>
+            </w:pPr>
+            <w:r>
+              <w:rPr>
+                <w:sz w:val="19"/>
+                <w:color w:val="111111"/>
+              </w:rPr>
+              <w:t xml:space="preserve">26</w:t>
+            </w:r>
+          </w:p>
+        </w:tc>
+        <w:tc>
+          <w:tcPr>
+            <w:tcW w:w="3120" w:type="dxa"/>
+          </w:tcPr>
+          <w:p>
+            <w:pPr>
+              <w:spacing w:before="40" w:after="40"/>
+            </w:pPr>
+            <w:r>
+              <w:rPr>
+                <w:rFonts w:ascii="Consolas" w:hAnsi="Consolas"/>
+                <w:shd w:val="clear" w:fill="F0F2F4"/>
+                <w:sz w:val="16"/>
+                <w:color w:val="111111"/>
+              </w:rPr>
+              <w:t xml:space="preserve">26-x402-facilitator.png</w:t>
+            </w:r>
+          </w:p>
+        </w:tc>
+        <w:tc>
+          <w:tcPr>
+            <w:tcW w:w="3120" w:type="dxa"/>
+          </w:tcPr>
+          <w:p>
+            <w:pPr>
+              <w:spacing w:before="40" w:after="40"/>
+            </w:pPr>
+            <w:r>
+              <w:rPr>
+                <w:sz w:val="19"/>
+                <w:color w:val="111111"/>
+              </w:rPr>
+              <w:t xml:space="preserve">an independent x402 facilitator recovering our payer and simulating the transfer on chain — everything but the money</w:t>
+            </w:r>
+          </w:p>
+        </w:tc>
+      </w:tr>
+      <w:tr>
+        <w:tc>
+          <w:tcPr>
+            <w:tcW w:w="3120" w:type="dxa"/>
+          </w:tcPr>
+          <w:p>
+            <w:pPr>
+              <w:spacing w:before="40" w:after="40"/>
+            </w:pPr>
+            <w:r>
+              <w:rPr>
+                <w:sz w:val="19"/>
+                <w:color w:val="111111"/>
+              </w:rPr>
+              <w:t xml:space="preserve">27</w:t>
+            </w:r>
+          </w:p>
+        </w:tc>
+        <w:tc>
+          <w:tcPr>
+            <w:tcW w:w="3120" w:type="dxa"/>
+          </w:tcPr>
+          <w:p>
+            <w:pPr>
+              <w:spacing w:before="40" w:after="40"/>
+            </w:pPr>
+            <w:r>
+              <w:rPr>
+                <w:rFonts w:ascii="Consolas" w:hAnsi="Consolas"/>
+                <w:shd w:val="clear" w:fill="F0F2F4"/>
+                <w:sz w:val="16"/>
+                <w:color w:val="111111"/>
+              </w:rPr>
+              <w:t xml:space="preserve">27-prove-enclave.png</w:t>
+            </w:r>
+          </w:p>
+        </w:tc>
+        <w:tc>
+          <w:tcPr>
+            <w:tcW w:w="3120" w:type="dxa"/>
+          </w:tcPr>
+          <w:p>
+            <w:pPr>
+              <w:spacing w:before="40" w:after="40"/>
+            </w:pPr>
+            <w:r>
+              <w:rPr>
+                <w:sz w:val="19"/>
+                <w:color w:val="111111"/>
+              </w:rPr>
+              <w:t xml:space="preserve">the sealed credential, placeholder substitution and idempotent replay, each proven live with a control</w:t>
+            </w:r>
+          </w:p>
+        </w:tc>
+      </w:tr>
+      <w:tr>
+        <w:tc>
+          <w:tcPr>
+            <w:tcW w:w="3120" w:type="dxa"/>
+          </w:tcPr>
+          <w:p>
+            <w:pPr>
+              <w:spacing w:before="40" w:after="40"/>
+            </w:pPr>
+            <w:r>
+              <w:rPr>
+                <w:sz w:val="19"/>
+                <w:color w:val="111111"/>
+              </w:rPr>
+              <w:t xml:space="preserve">28</w:t>
+            </w:r>
+          </w:p>
+        </w:tc>
+        <w:tc>
+          <w:tcPr>
+            <w:tcW w:w="3120" w:type="dxa"/>
+          </w:tcPr>
+          <w:p>
+            <w:pPr>
+              <w:spacing w:before="40" w:after="40"/>
+            </w:pPr>
+            <w:r>
+              <w:rPr>
+                <w:rFonts w:ascii="Consolas" w:hAnsi="Consolas"/>
+                <w:shd w:val="clear" w:fill="F0F2F4"/>
+                <w:sz w:val="16"/>
+                <w:color w:val="111111"/>
+              </w:rPr>
+              <w:t xml:space="preserve">28-a2a-official-client.png</w:t>
+            </w:r>
+          </w:p>
+        </w:tc>
+        <w:tc>
+          <w:tcPr>
+            <w:tcW w:w="3120" w:type="dxa"/>
+          </w:tcPr>
+          <w:p>
+            <w:pPr>
+              <w:spacing w:before="40" w:after="40"/>
+            </w:pPr>
+            <w:r>
+              <w:rPr>
+                <w:sz w:val="19"/>
+                <w:color w:val="111111"/>
+              </w:rPr>
+              <w:t xml:space="preserve">the official A2A client discovering the card, sending messages, reading tasks back</w:t>
+            </w:r>
+          </w:p>
+        </w:tc>
+      </w:tr>
+      <w:tr>
+        <w:tc>
+          <w:tcPr>
+            <w:tcW w:w="3120" w:type="dxa"/>
+          </w:tcPr>
+          <w:p>
+            <w:pPr>
+              <w:spacing w:before="40" w:after="40"/>
+            </w:pPr>
+            <w:r>
+              <w:rPr>
+                <w:sz w:val="19"/>
+                <w:color w:val="111111"/>
+              </w:rPr>
+              <w:t xml:space="preserve">29</w:t>
+            </w:r>
+          </w:p>
+        </w:tc>
+        <w:tc>
+          <w:tcPr>
+            <w:tcW w:w="3120" w:type="dxa"/>
+          </w:tcPr>
+          <w:p>
+            <w:pPr>
+              <w:spacing w:before="40" w:after="40"/>
+            </w:pPr>
+            <w:r>
+              <w:rPr>
+                <w:rFonts w:ascii="Consolas" w:hAnsi="Consolas"/>
+                <w:shd w:val="clear" w:fill="F0F2F4"/>
+                <w:sz w:val="16"/>
+                <w:color w:val="111111"/>
+              </w:rPr>
+              <w:t xml:space="preserve">29-web-bot-auth-interop.png</w:t>
+            </w:r>
+          </w:p>
+        </w:tc>
+        <w:tc>
+          <w:tcPr>
+            <w:tcW w:w="3120" w:type="dxa"/>
+          </w:tcPr>
+          <w:p>
+            <w:pPr>
+              <w:spacing w:before="40" w:after="40"/>
+            </w:pPr>
+            <w:r>
+              <w:rPr>
+                <w:sz w:val="19"/>
+                <w:color w:val="111111"/>
+              </w:rPr>
+              <w:t xml:space="preserve">Web Bot Auth verified both ways against Cloudflare's reference implementation</w:t>
+            </w:r>
+          </w:p>
+        </w:tc>
+      </w:tr>
+      <w:tr>
+        <w:tc>
+          <w:tcPr>
+            <w:tcW w:w="3120" w:type="dxa"/>
+          </w:tcPr>
+          <w:p>
+            <w:pPr>
+              <w:spacing w:before="40" w:after="40"/>
+            </w:pPr>
+            <w:r>
+              <w:rPr>
+                <w:sz w:val="19"/>
+                <w:color w:val="111111"/>
+              </w:rPr>
+              <w:t xml:space="preserve">30</w:t>
+            </w:r>
+          </w:p>
+        </w:tc>
+        <w:tc>
+          <w:tcPr>
+            <w:tcW w:w="3120" w:type="dxa"/>
+          </w:tcPr>
+          <w:p>
+            <w:pPr>
+              <w:spacing w:before="40" w:after="40"/>
+            </w:pPr>
+            <w:r>
+              <w:rPr>
+                <w:rFonts w:ascii="Consolas" w:hAnsi="Consolas"/>
+                <w:shd w:val="clear" w:fill="F0F2F4"/>
+                <w:sz w:val="16"/>
+                <w:color w:val="111111"/>
+              </w:rPr>
+              <w:t xml:space="preserve">30-erc8004-minted.png</w:t>
+            </w:r>
+          </w:p>
+        </w:tc>
+        <w:tc>
+          <w:tcPr>
+            <w:tcW w:w="3120" w:type="dxa"/>
+          </w:tcPr>
+          <w:p>
+            <w:pPr>
+              <w:spacing w:before="40" w:after="40"/>
+            </w:pPr>
+            <w:r>
+              <w:rPr>
+                <w:sz w:val="19"/>
+                <w:color w:val="111111"/>
+              </w:rPr>
+              <w:t xml:space="preserve">ERC-8004 agent #201 read back through both registries — token, URI, document, registrations</w:t>
+            </w:r>
+          </w:p>
+        </w:tc>
+      </w:tr>
+      <w:tr>
+        <w:tc>
+          <w:tcPr>
+            <w:tcW w:w="3120" w:type="dxa"/>
+          </w:tcPr>
+          <w:p>
+            <w:pPr>
+              <w:spacing w:before="40" w:after="40"/>
+            </w:pPr>
+            <w:r>
+              <w:rPr>
+                <w:sz w:val="19"/>
+                <w:color w:val="111111"/>
+              </w:rPr>
+              <w:t xml:space="preserve">31</w:t>
+            </w:r>
+          </w:p>
+        </w:tc>
+        <w:tc>
+          <w:tcPr>
+            <w:tcW w:w="3120" w:type="dxa"/>
+          </w:tcPr>
+          <w:p>
+            <w:pPr>
+              <w:spacing w:before="40" w:after="40"/>
+            </w:pPr>
+            <w:r>
+              <w:rPr>
+                <w:rFonts w:ascii="Consolas" w:hAnsi="Consolas"/>
+                <w:shd w:val="clear" w:fill="F0F2F4"/>
+                <w:sz w:val="16"/>
+                <w:color w:val="111111"/>
+              </w:rPr>
+              <w:t xml:space="preserve">31-activity-ledger.png</w:t>
+            </w:r>
+          </w:p>
+        </w:tc>
+        <w:tc>
+          <w:tcPr>
+            <w:tcW w:w="3120" w:type="dxa"/>
+          </w:tcPr>
+          <w:p>
+            <w:pPr>
+              <w:spacing w:before="40" w:after="40"/>
+            </w:pPr>
+            <w:r>
+              <w:rPr>
+                <w:sz w:val="19"/>
+                <w:color w:val="111111"/>
+              </w:rPr>
+              <w:t xml:space="preserve">bug #29 — the node's activity ledger, tallied, beside the empty documented audit read</w:t>
+            </w:r>
+          </w:p>
+        </w:tc>
+      </w:tr>
+      <w:tr>
+        <w:tc>
+          <w:tcPr>
+            <w:tcW w:w="3120" w:type="dxa"/>
+          </w:tcPr>
+          <w:p>
+            <w:pPr>
+              <w:spacing w:before="40" w:after="40"/>
+            </w:pPr>
+            <w:r>
+              <w:rPr>
+                <w:sz w:val="19"/>
+                <w:color w:val="111111"/>
+              </w:rPr>
+              <w:t xml:space="preserve">32</w:t>
+            </w:r>
+          </w:p>
+        </w:tc>
+        <w:tc>
+          <w:tcPr>
+            <w:tcW w:w="3120" w:type="dxa"/>
+          </w:tcPr>
+          <w:p>
+            <w:pPr>
+              <w:spacing w:before="40" w:after="40"/>
+            </w:pPr>
+            <w:r>
+              <w:rPr>
+                <w:rFonts w:ascii="Consolas" w:hAnsi="Consolas"/>
+                <w:shd w:val="clear" w:fill="F0F2F4"/>
+                <w:sz w:val="16"/>
+                <w:color w:val="111111"/>
+              </w:rPr>
+              <w:t xml:space="preserve">32-x402-settled.png</w:t>
+            </w:r>
+          </w:p>
+        </w:tc>
+        <w:tc>
+          <w:tcPr>
+            <w:tcW w:w="3120" w:type="dxa"/>
+          </w:tcPr>
+          <w:p>
+            <w:pPr>
+              <w:spacing w:before="40" w:after="40"/>
+            </w:pPr>
+            <w:r>
+              <w:rPr>
+                <w:sz w:val="19"/>
+                <w:color w:val="111111"/>
+              </w:rPr>
+              <w:t xml:space="preserve">the x402 settlement re-checked on chain: Transfer log, block-tagged balances, facilitator as sender</w:t>
+            </w:r>
+          </w:p>
+        </w:tc>
+      </w:tr>
     </w:tbl>
     <w:p>
       <w:pPr>
@@ -8364,7 +11019,49 @@
           <w:sz w:val="21"/>
           <w:color w:val="111111"/>
         </w:rPr>
-        <w:t xml:space="preserve">Shots 05 and 06 were captured live on 8 August against v0.6.0. They are not re-run here: the account is at zero credits, so re-running would replace a real working flow with a 403. </w:t>
+        <w:t xml:space="preserve">Shots 05 and 06 were </w:t>
+      </w:r>
+      <w:r>
+        <w:rPr>
+          <w:b/>
+          <w:sz w:val="21"/>
+          <w:color w:val="111111"/>
+        </w:rPr>
+        <w:t xml:space="preserve">re-captured live on 2026-08-27</w:t>
+      </w:r>
+      <w:r>
+        <w:rPr>
+          <w:sz w:val="21"/>
+          <w:color w:val="111111"/>
+        </w:rPr>
+        <w:t xml:space="preserve"> against gate@0.10.0, once the account was topped up — so the working flow in shot 05 is the current contract, not a remembered one. It also shows the revocation pre-gate doing something for the first time: a control credential at the list index we publish as revoked comes back </w:t>
+      </w:r>
+      <w:r>
+        <w:rPr>
+          <w:b/>
+          <w:sz w:val="21"/>
+          <w:color w:val="111111"/>
+        </w:rPr>
+        <w:t xml:space="preserve">REVOKED and blocked</w:t>
+      </w:r>
+      <w:r>
+        <w:rPr>
+          <w:sz w:val="21"/>
+          <w:color w:val="111111"/>
+        </w:rPr>
+        <w:t xml:space="preserve">, next to a healthy one that does not. Until the status list was actually served, that check could only report "not checked", which is what it correctly did.</w:t>
+      </w:r>
+    </w:p>
+    <w:p>
+      <w:pPr>
+        <w:spacing w:before="120" w:after="120"/>
+      </w:pPr>
+      <w:r>
+        <w:rPr>
+          <w:sz w:val="21"/>
+          <w:color w:val="111111"/>
+        </w:rPr>
+        <w:t xml:space="preserve">Everything above is live at https://gatekeeper-evidence.vercel.app — all 23 shots, the A2A agent card, the Web Bot Auth key directory and the revocation status list. </w:t>
       </w:r>
       <w:r>
         <w:rPr>
@@ -8373,26 +11070,14 @@
           <w:sz w:val="18"/>
           <w:color w:val="111111"/>
         </w:rPr>
-        <w:t xml:space="preserve">capture.mjs --live</w:t>
-      </w:r>
-      <w:r>
-        <w:rPr>
-          <w:sz w:val="21"/>
-          <w:color w:val="111111"/>
-        </w:rPr>
-        <w:t xml:space="preserve"> refreshes them once credits exist.</w:t>
-      </w:r>
-    </w:p>
-    <w:p>
-      <w:pPr>
-        <w:spacing w:before="120" w:after="120"/>
-      </w:pPr>
-      <w:r>
-        <w:rPr>
-          <w:sz w:val="21"/>
-          <w:color w:val="111111"/>
-        </w:rPr>
-        <w:t xml:space="preserve">Shots 14–19 are new and are in the repo; the evidence site is one deploy behind them, because Vercel's free tier refused further deployments ("more than 100 per day"). The same deploy publishes the A2A agent card and the revocation status list, so their live assertions are red until it goes out — the paths are proven against the identical files served locally. </w:t>
+        <w:t xml:space="preserve">capture.mjs</w:t>
+      </w:r>
+      <w:r>
+        <w:rPr>
+          <w:sz w:val="21"/>
+          <w:color w:val="111111"/>
+        </w:rPr>
+        <w:t xml:space="preserve"> syncs the PNGs into </w:t>
       </w:r>
       <w:r>
         <w:rPr>
@@ -8401,14 +11086,14 @@
           <w:sz w:val="18"/>
           <w:color w:val="111111"/>
         </w:rPr>
-        <w:t xml:space="preserve">capture.mjs</w:t>
-      </w:r>
-      <w:r>
-        <w:rPr>
-          <w:sz w:val="21"/>
-          <w:color w:val="111111"/>
-        </w:rPr>
-        <w:t xml:space="preserve"> syncs the PNGs into </w:t>
+        <w:t xml:space="preserve">site/shots/</w:t>
+      </w:r>
+      <w:r>
+        <w:rPr>
+          <w:sz w:val="21"/>
+          <w:color w:val="111111"/>
+        </w:rPr>
+        <w:t xml:space="preserve"> itself, and </w:t>
       </w:r>
       <w:r>
         <w:rPr>
@@ -8417,14 +11102,14 @@
           <w:sz w:val="18"/>
           <w:color w:val="111111"/>
         </w:rPr>
-        <w:t xml:space="preserve">site/shots/</w:t>
-      </w:r>
-      <w:r>
-        <w:rPr>
-          <w:sz w:val="21"/>
-          <w:color w:val="111111"/>
-        </w:rPr>
-        <w:t xml:space="preserve"> itself now, rather than leaving that as a manual step to forget.</w:t>
+        <w:t xml:space="preserve">npm run status-list</w:t>
+      </w:r>
+      <w:r>
+        <w:rPr>
+          <w:sz w:val="21"/>
+          <w:color w:val="111111"/>
+        </w:rPr>
+        <w:t xml:space="preserve"> republishes the agent card, so neither is a manual step to forget.</w:t>
       </w:r>
     </w:p>
     <w:p>
@@ -8524,10 +11209,70 @@
             </w:pPr>
             <w:r>
               <w:rPr>
-                <w:sz w:val="19"/>
-                <w:color w:val="111111"/>
-              </w:rPr>
-              <w:t xml:space="preserve">v0.7.0, </w:t>
+                <w:b/>
+                <w:sz w:val="19"/>
+                <w:color w:val="111111"/>
+              </w:rPr>
+              <w:t xml:space="preserve">v0.10.0, `contract_id 749`</w:t>
+            </w:r>
+            <w:r>
+              <w:rPr>
+                <w:sz w:val="19"/>
+                <w:color w:val="111111"/>
+              </w:rPr>
+              <w:t xml:space="preserve">, registered 2026-08-27</w:t>
+            </w:r>
+          </w:p>
+        </w:tc>
+      </w:tr>
+      <w:tr>
+        <w:tc>
+          <w:tcPr>
+            <w:tcW w:w="4680" w:type="dxa"/>
+          </w:tcPr>
+          <w:p>
+            <w:pPr>
+              <w:spacing w:before="40" w:after="40"/>
+            </w:pPr>
+            <w:r>
+              <w:rPr>
+                <w:b/>
+                <w:sz w:val="19"/>
+                <w:color w:val="111111"/>
+              </w:rPr>
+              <w:t xml:space="preserve">Proven live</w:t>
+            </w:r>
+          </w:p>
+        </w:tc>
+        <w:tc>
+          <w:tcPr>
+            <w:tcW w:w="4680" w:type="dxa"/>
+          </w:tcPr>
+          <w:p>
+            <w:pPr>
+              <w:spacing w:before="40" w:after="40"/>
+            </w:pPr>
+            <w:r>
+              <w:rPr>
+                <w:sz w:val="19"/>
+                <w:color w:val="111111"/>
+              </w:rPr>
+              <w:t xml:space="preserve">the KV mandate read, the credential/action binding, idempotent dispatch, in-enclave outbound HTTP (</w:t>
+            </w:r>
+            <w:r>
+              <w:rPr>
+                <w:b/>
+                <w:sz w:val="19"/>
+                <w:color w:val="111111"/>
+              </w:rPr>
+              <w:t xml:space="preserve">200</w:t>
+            </w:r>
+            <w:r>
+              <w:rPr>
+                <w:sz w:val="19"/>
+                <w:color w:val="111111"/>
+              </w:rPr>
+              <w:t xml:space="preserve">), and </w:t>
             </w:r>
             <w:r>
               <w:rPr>
@@ -8536,7 +11281,14 @@
                 <w:sz w:val="16"/>
                 <w:color w:val="111111"/>
               </w:rPr>
-              <w:t xml:space="preserve">contract_id 479</w:t>
+              <w:t xml:space="preserve">http-with-placeholders</w:t>
+            </w:r>
+            <w:r>
+              <w:rPr>
+                <w:sz w:val="19"/>
+                <w:color w:val="111111"/>
+              </w:rPr>
+              <w:t xml:space="preserve"> — which until this week had only ever been compiled in</w:t>
             </w:r>
           </w:p>
         </w:tc>
@@ -8556,7 +11308,7 @@
                 <w:sz w:val="19"/>
                 <w:color w:val="111111"/>
               </w:rPr>
-              <w:t xml:space="preserve">Built, tested, not registered</w:t>
+              <w:t xml:space="preserve">Also live</w:t>
             </w:r>
           </w:p>
         </w:tc>
@@ -8573,7 +11325,7 @@
                 <w:sz w:val="19"/>
                 <w:color w:val="111111"/>
               </w:rPr>
-              <w:t xml:space="preserve">v0.9.0 — trusted issuers, per-counterparty sub-limits, the enclave-held credential</w:t>
+              <w:t xml:space="preserve">the evidence site, the A2A agent card, the Web Bot Auth key directory and the W3C revocation status list — every live assertion in the suite passes (17/17)</w:t>
             </w:r>
           </w:p>
         </w:tc>
@@ -8593,7 +11345,7 @@
                 <w:sz w:val="19"/>
                 <w:color w:val="111111"/>
               </w:rPr>
-              <w:t xml:space="preserve">Why</w:t>
+              <w:t xml:space="preserve">On chain</w:t>
             </w:r>
           </w:p>
         </w:tc>
@@ -8610,7 +11362,22 @@
                 <w:sz w:val="19"/>
                 <w:color w:val="111111"/>
               </w:rPr>
-              <w:t xml:space="preserve">balance is 0. Registering v0.7.0's 204 KB wasm consumed the whole grant (bug #16), and every write since returns </w:t>
+              <w:t xml:space="preserve">ERC-8004 agent </w:t>
+            </w:r>
+            <w:r>
+              <w:rPr>
+                <w:b/>
+                <w:sz w:val="19"/>
+                <w:color w:val="111111"/>
+              </w:rPr>
+              <w:t xml:space="preserve">#201</w:t>
+            </w:r>
+            <w:r>
+              <w:rPr>
+                <w:sz w:val="19"/>
+                <w:color w:val="111111"/>
+              </w:rPr>
+              <w:t xml:space="preserve">, Sepolia, tx </w:t>
             </w:r>
             <w:r>
               <w:rPr>
@@ -8619,7 +11386,146 @@
                 <w:sz w:val="16"/>
                 <w:color w:val="111111"/>
               </w:rPr>
-              <w:t xml:space="preserve">required=10000000000, available=0</w:t>
+              <w:t xml:space="preserve">0x37965ccd…</w:t>
+            </w:r>
+            <w:r>
+              <w:rPr>
+                <w:sz w:val="19"/>
+                <w:color w:val="111111"/>
+              </w:rPr>
+              <w:t xml:space="preserve"> — </w:t>
+            </w:r>
+            <w:r>
+              <w:rPr>
+                <w:rFonts w:ascii="Consolas" w:hAnsi="Consolas"/>
+                <w:shd w:val="clear" w:fill="F0F2F4"/>
+                <w:sz w:val="16"/>
+                <w:color w:val="111111"/>
+              </w:rPr>
+              <w:t xml:space="preserve">npm run erc8004</w:t>
+            </w:r>
+            <w:r>
+              <w:rPr>
+                <w:sz w:val="19"/>
+                <w:color w:val="111111"/>
+              </w:rPr>
+              <w:t xml:space="preserve"> reads it back through both registries. And an x402 payment </w:t>
+            </w:r>
+            <w:r>
+              <w:rPr>
+                <w:b/>
+                <w:sz w:val="19"/>
+                <w:color w:val="111111"/>
+              </w:rPr>
+              <w:t xml:space="preserve">settled</w:t>
+            </w:r>
+            <w:r>
+              <w:rPr>
+                <w:sz w:val="19"/>
+                <w:color w:val="111111"/>
+              </w:rPr>
+              <w:t xml:space="preserve">: 0.01 USDC on Base Sepolia through the mandate and the public facilitator, tx </w:t>
+            </w:r>
+            <w:r>
+              <w:rPr>
+                <w:rFonts w:ascii="Consolas" w:hAnsi="Consolas"/>
+                <w:shd w:val="clear" w:fill="F0F2F4"/>
+                <w:sz w:val="16"/>
+                <w:color w:val="111111"/>
+              </w:rPr>
+              <w:t xml:space="preserve">0x52b164d133…</w:t>
+            </w:r>
+            <w:r>
+              <w:rPr>
+                <w:sz w:val="19"/>
+                <w:color w:val="111111"/>
+              </w:rPr>
+              <w:t xml:space="preserve">, both balances checked at the block</w:t>
+            </w:r>
+          </w:p>
+        </w:tc>
+      </w:tr>
+      <w:tr>
+        <w:tc>
+          <w:tcPr>
+            <w:tcW w:w="4680" w:type="dxa"/>
+          </w:tcPr>
+          <w:p>
+            <w:pPr>
+              <w:spacing w:before="40" w:after="40"/>
+            </w:pPr>
+            <w:r>
+              <w:rPr>
+                <w:b/>
+                <w:sz w:val="19"/>
+                <w:color w:val="111111"/>
+              </w:rPr>
+              <w:t xml:space="preserve">Still not live</w:t>
+            </w:r>
+          </w:p>
+        </w:tc>
+        <w:tc>
+          <w:tcPr>
+            <w:tcW w:w="4680" w:type="dxa"/>
+          </w:tcPr>
+          <w:p>
+            <w:pPr>
+              <w:spacing w:before="40" w:after="40"/>
+            </w:pPr>
+            <w:r>
+              <w:rPr>
+                <w:sz w:val="19"/>
+                <w:color w:val="111111"/>
+              </w:rPr>
+              <w:t xml:space="preserve">nothing in this catalogue that a funded wallet could fix. What remains is the platform's: </w:t>
+            </w:r>
+            <w:r>
+              <w:rPr>
+                <w:rFonts w:ascii="Consolas" w:hAnsi="Consolas"/>
+                <w:shd w:val="clear" w:fill="F0F2F4"/>
+                <w:sz w:val="16"/>
+                <w:color w:val="111111"/>
+              </w:rPr>
+              <w:t xml:space="preserve">vp.verify</w:t>
+            </w:r>
+            <w:r>
+              <w:rPr>
+                <w:sz w:val="19"/>
+                <w:color w:val="111111"/>
+              </w:rPr>
+              <w:t xml:space="preserve"> (bug #7), </w:t>
+            </w:r>
+            <w:r>
+              <w:rPr>
+                <w:rFonts w:ascii="Consolas" w:hAnsi="Consolas"/>
+                <w:shd w:val="clear" w:fill="F0F2F4"/>
+                <w:sz w:val="16"/>
+                <w:color w:val="111111"/>
+              </w:rPr>
+              <w:t xml:space="preserve">tee:agent-connect</w:t>
+            </w:r>
+            <w:r>
+              <w:rPr>
+                <w:sz w:val="19"/>
+                <w:color w:val="111111"/>
+              </w:rPr>
+              <w:t xml:space="preserve"> (#27), </w:t>
+            </w:r>
+            <w:r>
+              <w:rPr>
+                <w:rFonts w:ascii="Consolas" w:hAnsi="Consolas"/>
+                <w:shd w:val="clear" w:fill="F0F2F4"/>
+                <w:sz w:val="16"/>
+                <w:color w:val="111111"/>
+              </w:rPr>
+              <w:t xml:space="preserve">tee:vc</w:t>
+            </w:r>
+            <w:r>
+              <w:rPr>
+                <w:sz w:val="19"/>
+                <w:color w:val="111111"/>
+              </w:rPr>
+              <w:t xml:space="preserve"> issuance (#28)</w:t>
             </w:r>
           </w:p>
         </w:tc>
@@ -8639,7 +11545,19 @@
           <w:sz w:val="21"/>
           <w:color w:val="111111"/>
         </w:rPr>
-        <w:t xml:space="preserve">v0.9.0's Rust logic is covered by 32 unit tests and its decision path is exercised end to end through </w:t>
+        <w:t xml:space="preserve">An earlier draft of this section said v0.9.0 was built but unregistered because the balance was zero. A top-up landed on 2026-08-27, so that is no longer true and the live evidence in §9 is from this week.</w:t>
+      </w:r>
+    </w:p>
+    <w:p>
+      <w:pPr>
+        <w:spacing w:before="120" w:after="120"/>
+      </w:pPr>
+      <w:r>
+        <w:rPr>
+          <w:sz w:val="21"/>
+          <w:color w:val="111111"/>
+        </w:rPr>
+        <w:t xml:space="preserve">Getting there taught the two newest bug reports. The build was promoted only after </w:t>
       </w:r>
       <w:r>
         <w:rPr>
@@ -8648,14 +11566,14 @@
           <w:sz w:val="18"/>
           <w:color w:val="111111"/>
         </w:rPr>
-        <w:t xml:space="preserve">gate_cli</w:t>
-      </w:r>
-      <w:r>
-        <w:rPr>
-          <w:sz w:val="21"/>
-          <w:color w:val="111111"/>
-        </w:rPr>
-        <w:t xml:space="preserve"> by the Playwright suite, so the logic is tested — but the KV-mandate read and the enclave credential fetch are wasm-only and have not run on a node. With a top-up, </w:t>
+        <w:t xml:space="preserve">npm run probe</w:t>
+      </w:r>
+      <w:r>
+        <w:rPr>
+          <w:sz w:val="21"/>
+          <w:color w:val="111111"/>
+        </w:rPr>
+        <w:t xml:space="preserve"> registered it to a throwaway tail and invoked it — which is how we learned the node really does serve </w:t>
       </w:r>
       <w:r>
         <w:rPr>
@@ -8664,14 +11582,61 @@
           <w:sz w:val="18"/>
           <w:color w:val="111111"/>
         </w:rPr>
-        <w:t xml:space="preserve">npm run setup</w:t>
-      </w:r>
-      <w:r>
-        <w:rPr>
-          <w:sz w:val="21"/>
-          <w:color w:val="111111"/>
-        </w:rPr>
-        <w:t xml:space="preserve"> registers it and the remaining live evidence follows in one pass.</w:t>
+        <w:t xml:space="preserve">http-with-placeholders</w:t>
+      </w:r>
+      <w:r>
+        <w:rPr>
+          <w:sz w:val="21"/>
+          <w:color w:val="111111"/>
+        </w:rPr>
+        <w:t xml:space="preserve">, rather than assuming it. And the first funded run of the demo failed at the eligibility gate with </w:t>
+      </w:r>
+      <w:r>
+        <w:rPr>
+          <w:rFonts w:ascii="Consolas" w:hAnsi="Consolas"/>
+          <w:shd w:val="clear" w:fill="F0F2F4"/>
+          <w:sz w:val="18"/>
+          <w:color w:val="111111"/>
+        </w:rPr>
+        <w:t xml:space="preserve">verify=false</w:t>
+      </w:r>
+      <w:r>
+        <w:rPr>
+          <w:sz w:val="21"/>
+          <w:color w:val="111111"/>
+        </w:rPr>
+        <w:t xml:space="preserve">, because the status-list work written during the credit outage had been attaching </w:t>
+      </w:r>
+      <w:r>
+        <w:rPr>
+          <w:rFonts w:ascii="Consolas" w:hAnsi="Consolas"/>
+          <w:shd w:val="clear" w:fill="F0F2F4"/>
+          <w:sz w:val="18"/>
+          <w:color w:val="111111"/>
+        </w:rPr>
+        <w:t xml:space="preserve">credentialStatus</w:t>
+      </w:r>
+      <w:r>
+        <w:rPr>
+          <w:sz w:val="21"/>
+          <w:color w:val="111111"/>
+        </w:rPr>
+        <w:t xml:space="preserve"> </w:t>
+      </w:r>
+      <w:r>
+        <w:rPr>
+          <w:i/>
+          <w:sz w:val="21"/>
+          <w:color w:val="111111"/>
+        </w:rPr>
+        <w:t xml:space="preserve">after</w:t>
+      </w:r>
+      <w:r>
+        <w:rPr>
+          <w:sz w:val="21"/>
+          <w:color w:val="111111"/>
+        </w:rPr>
+        <w:t xml:space="preserve"> signing; the SDK offers no way to sign one at all (bug #22). Code written while it cannot be run is code that has not been tested, and this is what that costs.</w:t>
       </w:r>
     </w:p>
     <w:p>
@@ -8838,7 +11803,7 @@
           <w:rFonts w:ascii="Consolas" w:hAnsi="Consolas"/>
           <w:sz w:val="17"/>
         </w:rPr>
-        <w:t xml:space="preserve">node verify.mjs                  # 85 checks</w:t>
+        <w:t xml:space="preserve">node verify.mjs                  # 277 checks</w:t>
       </w:r>
     </w:p>
     <w:p>

</xml_diff>

<commit_message>
submission: the doc says what is true today - minted, settled, the ledger found, the door locked
Co-Authored-By: Claude Opus 5 (1M context) <noreply@anthropic.com>
Claude-Session: https://claude.ai/code/session_018f6JwozcrnmDXmsxr9oiPb
</commit_message>
<xml_diff>
--- a/submission/submission.docx
+++ b/submission/submission.docx
@@ -353,7 +353,7 @@
                 <w:sz w:val="19"/>
                 <w:color w:val="111111"/>
               </w:rPr>
-              <w:t xml:space="preserve">27 August 2026</w:t>
+              <w:t xml:space="preserve">28 August 2026</w:t>
             </w:r>
           </w:p>
         </w:tc>
@@ -2031,18 +2031,93 @@
       </w:r>
       <w:r>
         <w:rPr>
+          <w:sz w:val="21"/>
+          <w:color w:val="111111"/>
+        </w:rPr>
+        <w:t xml:space="preserve">Balance at the time of writing: ~3.4e10 credits, after a top-up on 27 August. Before it the account sat at 0 with </w:t>
+      </w:r>
+      <w:r>
+        <w:rPr>
+          <w:rFonts w:ascii="Consolas" w:hAnsi="Consolas"/>
+          <w:shd w:val="clear" w:fill="F0F2F4"/>
+          <w:sz w:val="18"/>
+          <w:color w:val="111111"/>
+        </w:rPr>
+        <w:t xml:space="preserve">credit_exhausted: true</w:t>
+      </w:r>
+      <w:r>
+        <w:rPr>
+          <w:sz w:val="21"/>
+          <w:color w:val="111111"/>
+        </w:rPr>
+        <w:t xml:space="preserve"> for three weeks — one contract registration had consumed the entire initial grant (bug #16). The costs are now measured rather than guessed: 30,034,055 per contract call, 1,370,147,045 per registration (§8).</w:t>
+      </w:r>
+    </w:p>
+    <w:p>
+      <w:pPr>
+        <w:ind w:left="360"/>
+        <w:spacing w:before="60" w:after="60"/>
+      </w:pPr>
+      <w:r>
+        <w:rPr>
+          <w:sz w:val="21"/>
+          <w:color w:val="111111"/>
+        </w:rPr>
+        <w:t xml:space="preserve">• </w:t>
+      </w:r>
+      <w:r>
+        <w:rPr>
+          <w:sz w:val="21"/>
+          <w:color w:val="111111"/>
+        </w:rPr>
+        <w:t xml:space="preserve">A second, scoped credential exists for whoever hosts this: an </w:t>
+      </w:r>
+      <w:r>
+        <w:rPr>
           <w:b/>
           <w:sz w:val="21"/>
           <w:color w:val="111111"/>
         </w:rPr>
-        <w:t xml:space="preserve">Balance: 0, `credit_exhausted: true`</w:t>
-      </w:r>
-      <w:r>
-        <w:rPr>
-          <w:sz w:val="21"/>
-          <w:color w:val="111111"/>
-        </w:rPr>
-        <w:t xml:space="preserve"> — see §10. One contract registration consumed the entire grant, which is bug #16 and is the reason two things in this submission are marked "built, not yet live".</w:t>
+        <w:t xml:space="preserve">agent key</w:t>
+      </w:r>
+      <w:r>
+        <w:rPr>
+          <w:sz w:val="21"/>
+          <w:color w:val="111111"/>
+        </w:rPr>
+        <w:t xml:space="preserve"> (</w:t>
+      </w:r>
+      <w:r>
+        <w:rPr>
+          <w:rFonts w:ascii="Consolas" w:hAnsi="Consolas"/>
+          <w:shd w:val="clear" w:fill="F0F2F4"/>
+          <w:sz w:val="18"/>
+          <w:color w:val="111111"/>
+        </w:rPr>
+        <w:t xml:space="preserve">t3n_key_…</w:t>
+      </w:r>
+      <w:r>
+        <w:rPr>
+          <w:sz w:val="21"/>
+          <w:color w:val="111111"/>
+        </w:rPr>
+        <w:t xml:space="preserve">), provisioned with </w:t>
+      </w:r>
+      <w:r>
+        <w:rPr>
+          <w:rFonts w:ascii="Consolas" w:hAnsi="Consolas"/>
+          <w:shd w:val="clear" w:fill="F0F2F4"/>
+          <w:sz w:val="18"/>
+          <w:color w:val="111111"/>
+        </w:rPr>
+        <w:t xml:space="preserve">agent create</w:t>
+      </w:r>
+      <w:r>
+        <w:rPr>
+          <w:sz w:val="21"/>
+          <w:color w:val="111111"/>
+        </w:rPr>
+        <w:t xml:space="preserve">, which the discovery reads accept and which cannot spend credits or register contracts. That, not the Ethereum key above, is what a handover transfers (§5).</w:t>
       </w:r>
     </w:p>
     <w:p>
@@ -2568,7 +2643,7 @@
                 <w:sz w:val="19"/>
                 <w:color w:val="111111"/>
               </w:rPr>
-              <w:t xml:space="preserve"> — 32 Rust unit tests</w:t>
+              <w:t xml:space="preserve"> — 47 Rust unit tests</w:t>
             </w:r>
           </w:p>
         </w:tc>
@@ -2658,37 +2733,23 @@
                 <w:sz w:val="19"/>
                 <w:color w:val="111111"/>
               </w:rPr>
-              <w:t xml:space="preserve"> → v0.6.0 = id 175, v0.7.0 = id 479</w:t>
-            </w:r>
-          </w:p>
-        </w:tc>
-      </w:tr>
-      <w:tr>
-        <w:tc>
-          <w:tcPr>
-            <w:tcW w:w="4680" w:type="dxa"/>
-          </w:tcPr>
-          <w:p>
-            <w:pPr>
-              <w:spacing w:before="40" w:after="40"/>
-            </w:pPr>
-            <w:r>
-              <w:rPr>
-                <w:sz w:val="19"/>
-                <w:color w:val="111111"/>
-              </w:rPr>
-              <w:t xml:space="preserve">Invoke</w:t>
-            </w:r>
-          </w:p>
-        </w:tc>
-        <w:tc>
-          <w:tcPr>
-            <w:tcW w:w="4680" w:type="dxa"/>
-          </w:tcPr>
-          <w:p>
-            <w:pPr>
-              <w:spacing w:before="40" w:after="40"/>
-            </w:pPr>
+              <w:t xml:space="preserve"> → </w:t>
+            </w:r>
+            <w:r>
+              <w:rPr>
+                <w:b/>
+                <w:sz w:val="19"/>
+                <w:color w:val="111111"/>
+              </w:rPr>
+              <w:t xml:space="preserve">v0.10.0 = contract_id 749</w:t>
+            </w:r>
+            <w:r>
+              <w:rPr>
+                <w:sz w:val="19"/>
+                <w:color w:val="111111"/>
+              </w:rPr>
+              <w:t xml:space="preserve">, promoted only after </w:t>
+            </w:r>
             <w:r>
               <w:rPr>
                 <w:rFonts w:ascii="Consolas" w:hAnsi="Consolas"/>
@@ -2696,14 +2757,14 @@
                 <w:sz w:val="16"/>
                 <w:color w:val="111111"/>
               </w:rPr>
-              <w:t xml:space="preserve">contracts.execute("gate", …)</w:t>
-            </w:r>
-            <w:r>
-              <w:rPr>
-                <w:sz w:val="19"/>
-                <w:color w:val="111111"/>
-              </w:rPr>
-              <w:t xml:space="preserve"> → approved/rejected, decided inside the TEE</w:t>
+              <w:t xml:space="preserve">npm run probe</w:t>
+            </w:r>
+            <w:r>
+              <w:rPr>
+                <w:sz w:val="19"/>
+                <w:color w:val="111111"/>
+              </w:rPr>
+              <w:t xml:space="preserve"> proved the build under a throwaway tail (v0.7.0 = 479 and v0.6.0 = 175 before it)</w:t>
             </w:r>
           </w:p>
         </w:tc>
@@ -2722,6 +2783,51 @@
                 <w:sz w:val="19"/>
                 <w:color w:val="111111"/>
               </w:rPr>
+              <w:t xml:space="preserve">Invoke</w:t>
+            </w:r>
+          </w:p>
+        </w:tc>
+        <w:tc>
+          <w:tcPr>
+            <w:tcW w:w="4680" w:type="dxa"/>
+          </w:tcPr>
+          <w:p>
+            <w:pPr>
+              <w:spacing w:before="40" w:after="40"/>
+            </w:pPr>
+            <w:r>
+              <w:rPr>
+                <w:rFonts w:ascii="Consolas" w:hAnsi="Consolas"/>
+                <w:shd w:val="clear" w:fill="F0F2F4"/>
+                <w:sz w:val="16"/>
+                <w:color w:val="111111"/>
+              </w:rPr>
+              <w:t xml:space="preserve">contracts.execute("gate", …)</w:t>
+            </w:r>
+            <w:r>
+              <w:rPr>
+                <w:sz w:val="19"/>
+                <w:color w:val="111111"/>
+              </w:rPr>
+              <w:t xml:space="preserve"> → approved/rejected, decided inside the TEE</w:t>
+            </w:r>
+          </w:p>
+        </w:tc>
+      </w:tr>
+      <w:tr>
+        <w:tc>
+          <w:tcPr>
+            <w:tcW w:w="4680" w:type="dxa"/>
+          </w:tcPr>
+          <w:p>
+            <w:pPr>
+              <w:spacing w:before="40" w:after="40"/>
+            </w:pPr>
+            <w:r>
+              <w:rPr>
+                <w:sz w:val="19"/>
+                <w:color w:val="111111"/>
+              </w:rPr>
               <w:t xml:space="preserve">Test</w:t>
             </w:r>
           </w:p>
@@ -2739,7 +2845,23 @@
                 <w:sz w:val="19"/>
                 <w:color w:val="111111"/>
               </w:rPr>
-              <w:t xml:space="preserve">32 Rust + 40 Node + 13 Playwright, all green</w:t>
+              <w:t xml:space="preserve">47 Rust + 191 Node + 38 Playwright, all green — </w:t>
+            </w:r>
+            <w:r>
+              <w:rPr>
+                <w:rFonts w:ascii="Consolas" w:hAnsi="Consolas"/>
+                <w:shd w:val="clear" w:fill="F0F2F4"/>
+                <w:sz w:val="16"/>
+                <w:color w:val="111111"/>
+              </w:rPr>
+              <w:t xml:space="preserve">node verify.mjs</w:t>
+            </w:r>
+            <w:r>
+              <w:rPr>
+                <w:sz w:val="19"/>
+                <w:color w:val="111111"/>
+              </w:rPr>
+              <w:t xml:space="preserve"> counts them itself</w:t>
             </w:r>
           </w:p>
         </w:tc>
@@ -3036,7 +3158,7 @@
           <w:rFonts w:ascii="Consolas" w:hAnsi="Consolas"/>
           <w:sz w:val="17"/>
         </w:rPr>
-        <w:t xml:space="preserve">[2b] REVOCATION  on-chain kill-switch (revoke_vc)       → blocks a revoked holder</w:t>
+        <w:t xml:space="preserve">[2b] REVOCATION  W3C Bitstring Status List over HTTPS  → blocks a revoked holder</w:t>
       </w:r>
     </w:p>
     <w:p>
@@ -3075,7 +3197,20 @@
           <w:rFonts w:ascii="Consolas" w:hAnsi="Consolas"/>
           <w:sz w:val="17"/>
         </w:rPr>
-        <w:t xml:space="preserve">[5]  DISPATCH    Web Bot Auth signature + in-TEE POST   → HTTP 200 from the enclave</w:t>
+        <w:t xml:space="preserve">[5]  DISPATCH    Web Bot Auth signature + in-TEE POST   → HTTP 200 from the enclave,</w:t>
+      </w:r>
+    </w:p>
+    <w:p>
+      <w:pPr>
+        <w:shd w:val="clear" w:fill="F6F8FA"/>
+        <w:spacing w:before="0" w:after="0"/>
+      </w:pPr>
+      <w:r>
+        <w:rPr>
+          <w:rFonts w:ascii="Consolas" w:hAnsi="Consolas"/>
+          <w:sz w:val="17"/>
+        </w:rPr>
+        <w:t xml:space="preserve">                 broker credential injected inside it</w:t>
       </w:r>
     </w:p>
     <w:p>
@@ -3700,7 +3835,22 @@
           <w:sz w:val="21"/>
           <w:color w:val="111111"/>
         </w:rPr>
-        <w:t xml:space="preserve">Previously this was a script with the right ABI that had never been pointed at a registry. The reference deployment is live on Sepolia at </w:t>
+        <w:t xml:space="preserve">Previously this was a script with the right ABI that had never been pointed at a registry. Now: </w:t>
+      </w:r>
+      <w:r>
+        <w:rPr>
+          <w:b/>
+          <w:sz w:val="21"/>
+          <w:color w:val="111111"/>
+        </w:rPr>
+        <w:t xml:space="preserve">agent #201</w:t>
+      </w:r>
+      <w:r>
+        <w:rPr>
+          <w:sz w:val="21"/>
+          <w:color w:val="111111"/>
+        </w:rPr>
+        <w:t xml:space="preserve"> on the reference IdentityRegistry on Sepolia (</w:t>
       </w:r>
       <w:r>
         <w:rPr>
@@ -3716,7 +3866,147 @@
           <w:sz w:val="21"/>
           <w:color w:val="111111"/>
         </w:rPr>
-        <w:t xml:space="preserve">, and the read side works today with </w:t>
+        <w:t xml:space="preserve">), tx </w:t>
+      </w:r>
+      <w:r>
+        <w:rPr>
+          <w:rFonts w:ascii="Consolas" w:hAnsi="Consolas"/>
+          <w:shd w:val="clear" w:fill="F0F2F4"/>
+          <w:sz w:val="18"/>
+          <w:color w:val="111111"/>
+        </w:rPr>
+        <w:t xml:space="preserve">0x37965ccd…</w:t>
+      </w:r>
+      <w:r>
+        <w:rPr>
+          <w:sz w:val="21"/>
+          <w:color w:val="111111"/>
+        </w:rPr>
+        <w:t xml:space="preserve">, block 11581941. </w:t>
+      </w:r>
+      <w:r>
+        <w:rPr>
+          <w:rFonts w:ascii="Consolas" w:hAnsi="Consolas"/>
+          <w:shd w:val="clear" w:fill="F0F2F4"/>
+          <w:sz w:val="18"/>
+          <w:color w:val="111111"/>
+        </w:rPr>
+        <w:t xml:space="preserve">npm run erc8004</w:t>
+      </w:r>
+      <w:r>
+        <w:rPr>
+          <w:sz w:val="21"/>
+          <w:color w:val="111111"/>
+        </w:rPr>
+        <w:t xml:space="preserve"> reads the whole loop back with no wallet and no gas — registry → token → owner and URI → the document the URI resolves to → its </w:t>
+      </w:r>
+      <w:r>
+        <w:rPr>
+          <w:rFonts w:ascii="Consolas" w:hAnsi="Consolas"/>
+          <w:shd w:val="clear" w:fill="F0F2F4"/>
+          <w:sz w:val="18"/>
+          <w:color w:val="111111"/>
+        </w:rPr>
+        <w:t xml:space="preserve">registrations[201]</w:t>
+      </w:r>
+      <w:r>
+        <w:rPr>
+          <w:sz w:val="21"/>
+          <w:color w:val="111111"/>
+        </w:rPr>
+        <w:t xml:space="preserve"> naming the token back → the Reputation Registry for the same id.</w:t>
+      </w:r>
+    </w:p>
+    <w:p>
+      <w:pPr>
+        <w:spacing w:before="120" w:after="120"/>
+      </w:pPr>
+      <w:r>
+        <w:rPr>
+          <w:sz w:val="21"/>
+          <w:color w:val="111111"/>
+        </w:rPr>
+        <w:t xml:space="preserve">The mint nearly went wrong first, and the way it nearly went wrong is the useful part. The script had defaulted </w:t>
+      </w:r>
+      <w:r>
+        <w:rPr>
+          <w:rFonts w:ascii="Consolas" w:hAnsi="Consolas"/>
+          <w:shd w:val="clear" w:fill="F0F2F4"/>
+          <w:sz w:val="18"/>
+          <w:color w:val="111111"/>
+        </w:rPr>
+        <w:t xml:space="preserve">agentURI</w:t>
+      </w:r>
+      <w:r>
+        <w:rPr>
+          <w:sz w:val="21"/>
+          <w:color w:val="111111"/>
+        </w:rPr>
+        <w:t xml:space="preserve"> to our A2A card. ERC-8004 fixes a different document for that URI — </w:t>
+      </w:r>
+      <w:r>
+        <w:rPr>
+          <w:rFonts w:ascii="Consolas" w:hAnsi="Consolas"/>
+          <w:shd w:val="clear" w:fill="F0F2F4"/>
+          <w:sz w:val="18"/>
+          <w:color w:val="111111"/>
+        </w:rPr>
+        <w:t xml:space="preserve">type: …#registration-v1</w:t>
+      </w:r>
+      <w:r>
+        <w:rPr>
+          <w:sz w:val="21"/>
+          <w:color w:val="111111"/>
+        </w:rPr>
+        <w:t xml:space="preserve">, </w:t>
+      </w:r>
+      <w:r>
+        <w:rPr>
+          <w:rFonts w:ascii="Consolas" w:hAnsi="Consolas"/>
+          <w:shd w:val="clear" w:fill="F0F2F4"/>
+          <w:sz w:val="18"/>
+          <w:color w:val="111111"/>
+        </w:rPr>
+        <w:t xml:space="preserve">services</w:t>
+      </w:r>
+      <w:r>
+        <w:rPr>
+          <w:sz w:val="21"/>
+          <w:color w:val="111111"/>
+        </w:rPr>
+        <w:t xml:space="preserve">, </w:t>
+      </w:r>
+      <w:r>
+        <w:rPr>
+          <w:rFonts w:ascii="Consolas" w:hAnsi="Consolas"/>
+          <w:shd w:val="clear" w:fill="F0F2F4"/>
+          <w:sz w:val="18"/>
+          <w:color w:val="111111"/>
+        </w:rPr>
+        <w:t xml:space="preserve">image</w:t>
+      </w:r>
+      <w:r>
+        <w:rPr>
+          <w:sz w:val="21"/>
+          <w:color w:val="111111"/>
+        </w:rPr>
+        <w:t xml:space="preserve">, </w:t>
+      </w:r>
+      <w:r>
+        <w:rPr>
+          <w:rFonts w:ascii="Consolas" w:hAnsi="Consolas"/>
+          <w:shd w:val="clear" w:fill="F0F2F4"/>
+          <w:sz w:val="18"/>
+          <w:color w:val="111111"/>
+        </w:rPr>
+        <w:t xml:space="preserve">active</w:t>
+      </w:r>
+      <w:r>
+        <w:rPr>
+          <w:sz w:val="21"/>
+          <w:color w:val="111111"/>
+        </w:rPr>
+        <w:t xml:space="preserve"> — and a mint pointing at the card would have registered an identity every conformant resolver rejects, with the URI written on chain. The registration file is now generated from the card (one source for what the agent is called), served with the right content type, validated by the rules a resolver applies, and the register script fetches and validates the live URI </w:t>
       </w:r>
       <w:r>
         <w:rPr>
@@ -3724,14 +4014,89 @@
           <w:sz w:val="21"/>
           <w:color w:val="111111"/>
         </w:rPr>
-        <w:t xml:space="preserve">no wallet and no gas</w:t>
-      </w:r>
-      <w:r>
-        <w:rPr>
-          <w:sz w:val="21"/>
-          <w:color w:val="111111"/>
-        </w:rPr>
-        <w:t xml:space="preserve">: resolve any agent's owner and URI, and check whether an address owns one (ours does not — a mint needs funding, and the script still refuses rather than faking it).</w:t>
+        <w:t xml:space="preserve">before it will send</w:t>
+      </w:r>
+      <w:r>
+        <w:rPr>
+          <w:sz w:val="21"/>
+          <w:color w:val="111111"/>
+        </w:rPr>
+        <w:t xml:space="preserve">.</w:t>
+      </w:r>
+    </w:p>
+    <w:p>
+      <w:pPr>
+        <w:spacing w:before="120" w:after="120"/>
+      </w:pPr>
+      <w:r>
+        <w:rPr>
+          <w:sz w:val="21"/>
+          <w:color w:val="111111"/>
+        </w:rPr>
+        <w:t xml:space="preserve">The Reputation Registry deployment, read by selector, turns out to </w:t>
+      </w:r>
+      <w:r>
+        <w:rPr>
+          <w:b/>
+          <w:sz w:val="21"/>
+          <w:color w:val="111111"/>
+        </w:rPr>
+        <w:t xml:space="preserve">predate the EIP's final interface</w:t>
+      </w:r>
+      <w:r>
+        <w:rPr>
+          <w:sz w:val="21"/>
+          <w:color w:val="111111"/>
+        </w:rPr>
+        <w:t xml:space="preserve">: no </w:t>
+      </w:r>
+      <w:r>
+        <w:rPr>
+          <w:rFonts w:ascii="Consolas" w:hAnsi="Consolas"/>
+          <w:shd w:val="clear" w:fill="F0F2F4"/>
+          <w:sz w:val="18"/>
+          <w:color w:val="111111"/>
+        </w:rPr>
+        <w:t xml:space="preserve">getSummary</w:t>
+      </w:r>
+      <w:r>
+        <w:rPr>
+          <w:sz w:val="21"/>
+          <w:color w:val="111111"/>
+        </w:rPr>
+        <w:t xml:space="preserve">, </w:t>
+      </w:r>
+      <w:r>
+        <w:rPr>
+          <w:rFonts w:ascii="Consolas" w:hAnsi="Consolas"/>
+          <w:shd w:val="clear" w:fill="F0F2F4"/>
+          <w:sz w:val="18"/>
+          <w:color w:val="111111"/>
+        </w:rPr>
+        <w:t xml:space="preserve">readAllFeedback</w:t>
+      </w:r>
+      <w:r>
+        <w:rPr>
+          <w:sz w:val="21"/>
+          <w:color w:val="111111"/>
+        </w:rPr>
+        <w:t xml:space="preserve"> or final </w:t>
+      </w:r>
+      <w:r>
+        <w:rPr>
+          <w:rFonts w:ascii="Consolas" w:hAnsi="Consolas"/>
+          <w:shd w:val="clear" w:fill="F0F2F4"/>
+          <w:sz w:val="18"/>
+          <w:color w:val="111111"/>
+        </w:rPr>
+        <w:t xml:space="preserve">giveFeedback</w:t>
+      </w:r>
+      <w:r>
+        <w:rPr>
+          <w:sz w:val="21"/>
+          <w:color w:val="111111"/>
+        </w:rPr>
+        <w:t xml:space="preserve"> in the bytecode. The read computes the aggregate from the per-client functions that exist and prints what is absent, instead of letting "missing revert data" stand in for a score. Agent #201 has none yet, and zero is what it reports.</w:t>
       </w:r>
     </w:p>
     <w:p>
@@ -3883,7 +4248,28 @@
           <w:sz w:val="21"/>
           <w:color w:val="111111"/>
         </w:rPr>
-        <w:t xml:space="preserve"> account of events, exactly the thing this project argues you should not have to take on faith. </w:t>
+        <w:t xml:space="preserve"> account of events, exactly the thing this project argues you should not have to take on faith. The node keeps its own record, and finding it became a bug report.</w:t>
+      </w:r>
+    </w:p>
+    <w:p>
+      <w:pPr>
+        <w:spacing w:before="120" w:after="120"/>
+      </w:pPr>
+      <w:r>
+        <w:rPr>
+          <w:rFonts w:ascii="Consolas" w:hAnsi="Consolas"/>
+          <w:shd w:val="clear" w:fill="F0F2F4"/>
+          <w:sz w:val="18"/>
+          <w:color w:val="111111"/>
+        </w:rPr>
+        <w:t xml:space="preserve">npm run audit</w:t>
+      </w:r>
+      <w:r>
+        <w:rPr>
+          <w:sz w:val="21"/>
+          <w:color w:val="111111"/>
+        </w:rPr>
+        <w:t xml:space="preserve"> read </w:t>
       </w:r>
       <w:r>
         <w:rPr>
@@ -3899,51 +4285,55 @@
           <w:sz w:val="21"/>
           <w:color w:val="111111"/>
         </w:rPr>
-        <w:t xml:space="preserve"> returns the host's record of the same dispatches, and it works at a zero balance.</w:t>
-      </w:r>
-    </w:p>
-    <w:p>
-      <w:pPr>
-        <w:spacing w:before="120" w:after="120"/>
-      </w:pPr>
-      <w:r>
-        <w:rPr>
-          <w:sz w:val="21"/>
-          <w:color w:val="111111"/>
-        </w:rPr>
-        <w:t xml:space="preserve">The field that makes it worth reading is </w:t>
-      </w:r>
-      <w:r>
-        <w:rPr>
-          <w:rFonts w:ascii="Consolas" w:hAnsi="Consolas"/>
-          <w:shd w:val="clear" w:fill="F0F2F4"/>
-          <w:sz w:val="18"/>
-          <w:color w:val="111111"/>
-        </w:rPr>
-        <w:t xml:space="preserve">committed</w:t>
-      </w:r>
-      <w:r>
-        <w:rPr>
-          <w:sz w:val="21"/>
-          <w:color w:val="111111"/>
-        </w:rPr>
-        <w:t xml:space="preserve">. An event can carry </w:t>
-      </w:r>
-      <w:r>
-        <w:rPr>
-          <w:rFonts w:ascii="Consolas" w:hAnsi="Consolas"/>
-          <w:shd w:val="clear" w:fill="F0F2F4"/>
-          <w:sz w:val="18"/>
-          <w:color w:val="111111"/>
-        </w:rPr>
-        <w:t xml:space="preserve">outcome: "success"</w:t>
-      </w:r>
-      <w:r>
-        <w:rPr>
-          <w:sz w:val="21"/>
-          <w:color w:val="111111"/>
-        </w:rPr>
-        <w:t xml:space="preserve"> inside a batch that never committed — the call said it worked and then rolled back. The reconciliation keeps those apart and corroborates a dispatch only against committed events.</w:t>
+        <w:t xml:space="preserve"> — the documented audit read — for a month, and printed an explanation for why it was empty. It is still empty, after 39 real dispatches. The record is in </w:t>
+      </w:r>
+      <w:r>
+        <w:rPr>
+          <w:rFonts w:ascii="Consolas" w:hAnsi="Consolas"/>
+          <w:shd w:val="clear" w:fill="F0F2F4"/>
+          <w:sz w:val="18"/>
+          <w:color w:val="111111"/>
+        </w:rPr>
+        <w:t xml:space="preserve">activity.log</w:t>
+      </w:r>
+      <w:r>
+        <w:rPr>
+          <w:sz w:val="21"/>
+          <w:color w:val="111111"/>
+        </w:rPr>
+        <w:t xml:space="preserve">: every call this DID made, with contract, function, outcome, a sequence number and a hash the node assigned — the fuel-quota errors, the probes against the undocumented core contracts, the registration of the contract itself. That is bug #29. </w:t>
+      </w:r>
+      <w:r>
+        <w:rPr>
+          <w:rFonts w:ascii="Consolas" w:hAnsi="Consolas"/>
+          <w:shd w:val="clear" w:fill="F0F2F4"/>
+          <w:sz w:val="18"/>
+          <w:color w:val="111111"/>
+        </w:rPr>
+        <w:t xml:space="preserve">npm run audit</w:t>
+      </w:r>
+      <w:r>
+        <w:rPr>
+          <w:sz w:val="21"/>
+          <w:color w:val="111111"/>
+        </w:rPr>
+        <w:t xml:space="preserve"> now tallies the ledger that exists, keeps </w:t>
+      </w:r>
+      <w:r>
+        <w:rPr>
+          <w:rFonts w:ascii="Consolas" w:hAnsi="Consolas"/>
+          <w:shd w:val="clear" w:fill="F0F2F4"/>
+          <w:sz w:val="18"/>
+          <w:color w:val="111111"/>
+        </w:rPr>
+        <w:t xml:space="preserve">execute_action</w:t>
+      </w:r>
+      <w:r>
+        <w:rPr>
+          <w:sz w:val="21"/>
+          <w:color w:val="111111"/>
+        </w:rPr>
+        <w:t xml:space="preserve"> errors beside its successes rather than under them, reconciles the agent's claimed dispatches against it as a necessary condition rather than a verdict, and reports the documented read beside it, empty.</w:t>
       </w:r>
     </w:p>
     <w:p>
@@ -4369,6 +4759,65 @@
       </w:pPr>
       <w:r>
         <w:rPr>
+          <w:sz w:val="21"/>
+          <w:color w:val="111111"/>
+        </w:rPr>
+        <w:t xml:space="preserve">The same tools are served over </w:t>
+      </w:r>
+      <w:r>
+        <w:rPr>
+          <w:b/>
+          <w:sz w:val="21"/>
+          <w:color w:val="111111"/>
+        </w:rPr>
+        <w:t xml:space="preserve">Streamable HTTP</w:t>
+      </w:r>
+      <w:r>
+        <w:rPr>
+          <w:sz w:val="21"/>
+          <w:color w:val="111111"/>
+        </w:rPr>
+        <w:t xml:space="preserve"> at </w:t>
+      </w:r>
+      <w:r>
+        <w:rPr>
+          <w:rFonts w:ascii="Consolas" w:hAnsi="Consolas"/>
+          <w:shd w:val="clear" w:fill="F0F2F4"/>
+          <w:sz w:val="18"/>
+          <w:color w:val="111111"/>
+        </w:rPr>
+        <w:t xml:space="preserve">/mcp</w:t>
+      </w:r>
+      <w:r>
+        <w:rPr>
+          <w:sz w:val="21"/>
+          <w:color w:val="111111"/>
+        </w:rPr>
+        <w:t xml:space="preserve"> by </w:t>
+      </w:r>
+      <w:r>
+        <w:rPr>
+          <w:rFonts w:ascii="Consolas" w:hAnsi="Consolas"/>
+          <w:shd w:val="clear" w:fill="F0F2F4"/>
+          <w:sz w:val="18"/>
+          <w:color w:val="111111"/>
+        </w:rPr>
+        <w:t xml:space="preserve">npm run a2a</w:t>
+      </w:r>
+      <w:r>
+        <w:rPr>
+          <w:sz w:val="21"/>
+          <w:color w:val="111111"/>
+        </w:rPr>
+        <w:t xml:space="preserve"> — stateless, one server per request as the SDK documents — which is the remote adoption path: an MCP host anywhere points at a URL. Driven by the official MCP client over HTTP and by hand-written JSON-RPC from Playwright, and refused without a signature (§4.10).</w:t>
+      </w:r>
+    </w:p>
+    <w:p>
+      <w:pPr>
+        <w:spacing w:before="120" w:after="120"/>
+      </w:pPr>
+      <w:r>
+        <w:rPr>
           <w:i/>
           <w:sz w:val="21"/>
           <w:color w:val="111111"/>
@@ -4915,7 +5364,23 @@
           <w:sz w:val="21"/>
           <w:color w:val="111111"/>
         </w:rPr>
-        <w:t xml:space="preserve">What is not real, said plainly: </w:t>
+        <w:t xml:space="preserve">And it settled. </w:t>
+      </w:r>
+      <w:r>
+        <w:rPr>
+          <w:rFonts w:ascii="Consolas" w:hAnsi="Consolas"/>
+          <w:shd w:val="clear" w:fill="F0F2F4"/>
+          <w:sz w:val="18"/>
+          <w:color w:val="111111"/>
+        </w:rPr>
+        <w:t xml:space="preserve">npm run x402:settle</w:t>
+      </w:r>
+      <w:r>
+        <w:rPr>
+          <w:sz w:val="21"/>
+          <w:color w:val="111111"/>
+        </w:rPr>
+        <w:t xml:space="preserve"> stands up a paywall wired the way x402 is meant to be — the </w:t>
       </w:r>
       <w:r>
         <w:rPr>
@@ -4923,62 +5388,30 @@
           <w:sz w:val="21"/>
           <w:color w:val="111111"/>
         </w:rPr>
-        <w:t xml:space="preserve">settlement</w:t>
-      </w:r>
-      <w:r>
-        <w:rPr>
-          <w:sz w:val="21"/>
-          <w:color w:val="111111"/>
-        </w:rPr>
-        <w:t xml:space="preserve">. Broadcasting needs a funded wallet. </w:t>
-      </w:r>
-      <w:r>
-        <w:rPr>
-          <w:rFonts w:ascii="Consolas" w:hAnsi="Consolas"/>
-          <w:shd w:val="clear" w:fill="F0F2F4"/>
-          <w:sz w:val="18"/>
-          <w:color w:val="111111"/>
-        </w:rPr>
-        <w:t xml:space="preserve">settle()</w:t>
-      </w:r>
-      <w:r>
-        <w:rPr>
-          <w:sz w:val="21"/>
-          <w:color w:val="111111"/>
-        </w:rPr>
-        <w:t xml:space="preserve"> posts the spec's </w:t>
-      </w:r>
-      <w:r>
-        <w:rPr>
-          <w:rFonts w:ascii="Consolas" w:hAnsi="Consolas"/>
-          <w:shd w:val="clear" w:fill="F0F2F4"/>
-          <w:sz w:val="18"/>
-          <w:color w:val="111111"/>
-        </w:rPr>
-        <w:t xml:space="preserve">/settle</w:t>
-      </w:r>
-      <w:r>
-        <w:rPr>
-          <w:sz w:val="21"/>
-          <w:color w:val="111111"/>
-        </w:rPr>
-        <w:t xml:space="preserve"> body when </w:t>
-      </w:r>
-      <w:r>
-        <w:rPr>
-          <w:rFonts w:ascii="Consolas" w:hAnsi="Consolas"/>
-          <w:shd w:val="clear" w:fill="F0F2F4"/>
-          <w:sz w:val="18"/>
-          <w:color w:val="111111"/>
-        </w:rPr>
-        <w:t xml:space="preserve">X402_FACILITATOR_URL</w:t>
-      </w:r>
-      <w:r>
-        <w:rPr>
-          <w:sz w:val="21"/>
-          <w:color w:val="111111"/>
-        </w:rPr>
-        <w:t xml:space="preserve"> is set and </w:t>
+        <w:t xml:space="preserve">resource server</w:t>
+      </w:r>
+      <w:r>
+        <w:rPr>
+          <w:sz w:val="21"/>
+          <w:color w:val="111111"/>
+        </w:rPr>
+        <w:t xml:space="preserve"> verifies and settles through the public facilitator at </w:t>
+      </w:r>
+      <w:r>
+        <w:rPr>
+          <w:rFonts w:ascii="Consolas" w:hAnsi="Consolas"/>
+          <w:shd w:val="clear" w:fill="F0F2F4"/>
+          <w:sz w:val="18"/>
+          <w:color w:val="111111"/>
+        </w:rPr>
+        <w:t xml:space="preserve">x402.org</w:t>
+      </w:r>
+      <w:r>
+        <w:rPr>
+          <w:sz w:val="21"/>
+          <w:color w:val="111111"/>
+        </w:rPr>
+        <w:t xml:space="preserve">, the agent only signs — and moved </w:t>
       </w:r>
       <w:r>
         <w:rPr>
@@ -4986,14 +5419,30 @@
           <w:sz w:val="21"/>
           <w:color w:val="111111"/>
         </w:rPr>
-        <w:t xml:space="preserve">refuses</w:t>
-      </w:r>
-      <w:r>
-        <w:rPr>
-          <w:sz w:val="21"/>
-          <w:color w:val="111111"/>
-        </w:rPr>
-        <w:t xml:space="preserve"> when it is not, because a receipt this process invented would be believed by whatever read it.</w:t>
+        <w:t xml:space="preserve">0.01 USDC on Base Sepolia</w:t>
+      </w:r>
+      <w:r>
+        <w:rPr>
+          <w:sz w:val="21"/>
+          <w:color w:val="111111"/>
+        </w:rPr>
+        <w:t xml:space="preserve"> from the payment wallet to the ERC-8004 owner wallet, through the mandate. Facilitator transaction </w:t>
+      </w:r>
+      <w:r>
+        <w:rPr>
+          <w:rFonts w:ascii="Consolas" w:hAnsi="Consolas"/>
+          <w:shd w:val="clear" w:fill="F0F2F4"/>
+          <w:sz w:val="18"/>
+          <w:color w:val="111111"/>
+        </w:rPr>
+        <w:t xml:space="preserve">0x52b164d1…</w:t>
+      </w:r>
+      <w:r>
+        <w:rPr>
+          <w:sz w:val="21"/>
+          <w:color w:val="111111"/>
+        </w:rPr>
+        <w:t xml:space="preserve">, block 46058792, broadcast by the facilitator: the payer paid no gas.</w:t>
       </w:r>
     </w:p>
     <w:p>
@@ -5005,7 +5454,7 @@
           <w:sz w:val="21"/>
           <w:color w:val="111111"/>
         </w:rPr>
-        <w:t xml:space="preserve">Short of that, it is verified by someone who is not us. </w:t>
+        <w:t xml:space="preserve">Before that, </w:t>
       </w:r>
       <w:r>
         <w:rPr>
@@ -5021,7 +5470,7 @@
           <w:sz w:val="21"/>
           <w:color w:val="111111"/>
         </w:rPr>
-        <w:t xml:space="preserve"> reads </w:t>
+        <w:t xml:space="preserve"> had established the signature was right without spending anything: </w:t>
       </w:r>
       <w:r>
         <w:rPr>
@@ -5037,77 +5486,38 @@
           <w:sz w:val="21"/>
           <w:color w:val="111111"/>
         </w:rPr>
-        <w:t xml:space="preserve"> off the deployed Base Sepolia USDC contract — ours is byte-identical — and then posts a real payload to the public facilitator at </w:t>
-      </w:r>
-      <w:r>
-        <w:rPr>
-          <w:rFonts w:ascii="Consolas" w:hAnsi="Consolas"/>
-          <w:shd w:val="clear" w:fill="F0F2F4"/>
-          <w:sz w:val="18"/>
-          <w:color w:val="111111"/>
-        </w:rPr>
-        <w:t xml:space="preserve">x402.org/facilitator</w:t>
-      </w:r>
-      <w:r>
-        <w:rPr>
-          <w:sz w:val="21"/>
-          <w:color w:val="111111"/>
-        </w:rPr>
-        <w:t xml:space="preserve">, which recovers our payer address on its own and </w:t>
-      </w:r>
-      <w:r>
-        <w:rPr>
-          <w:b/>
-          <w:sz w:val="21"/>
-          <w:color w:val="111111"/>
-        </w:rPr>
-        <w:t xml:space="preserve">simulates `transferWithAuthorization` against the token</w:t>
-      </w:r>
-      <w:r>
-        <w:rPr>
-          <w:sz w:val="21"/>
-          <w:color w:val="111111"/>
-        </w:rPr>
-        <w:t xml:space="preserve">. It gets as far as the balance and stops:</w:t>
-      </w:r>
-    </w:p>
-    <w:p>
-      <w:pPr>
-        <w:shd w:val="clear" w:fill="F6F8FA"/>
-        <w:spacing w:before="0" w:after="0"/>
-      </w:pPr>
-      <w:r>
-        <w:rPr>
-          <w:rFonts w:ascii="Consolas" w:hAnsi="Consolas"/>
-          <w:sz w:val="17"/>
-        </w:rPr>
-        <w:t xml:space="preserve">isValid: false   invalid_exact_evm_insufficient_balance</w:t>
-      </w:r>
-    </w:p>
-    <w:p>
-      <w:pPr>
-        <w:shd w:val="clear" w:fill="F6F8FA"/>
-        <w:spacing w:before="0" w:after="0"/>
-      </w:pPr>
-      <w:r>
-        <w:rPr>
-          <w:rFonts w:ascii="Consolas" w:hAnsi="Consolas"/>
-          <w:sz w:val="17"/>
-        </w:rPr>
-        <w:t xml:space="preserve">payer:   0xc752d544…   (the address we signed with)</w:t>
-      </w:r>
-    </w:p>
-    <w:p>
-      <w:pPr>
-        <w:shd w:val="clear" w:fill="F6F8FA"/>
-        <w:spacing w:before="0" w:after="0"/>
-      </w:pPr>
-      <w:r>
-        <w:rPr>
-          <w:rFonts w:ascii="Consolas" w:hAnsi="Consolas"/>
-          <w:sz w:val="17"/>
-        </w:rPr>
-        <w:t xml:space="preserve">"transferWithAuthorization" reverted: ERC20: transfer amount exceeds balance</w:t>
+        <w:t xml:space="preserve"> read off the deployed USDC contract is byte-identical to the domain we sign under, and the facilitator's </w:t>
+      </w:r>
+      <w:r>
+        <w:rPr>
+          <w:rFonts w:ascii="Consolas" w:hAnsi="Consolas"/>
+          <w:shd w:val="clear" w:fill="F0F2F4"/>
+          <w:sz w:val="18"/>
+          <w:color w:val="111111"/>
+        </w:rPr>
+        <w:t xml:space="preserve">/verify</w:t>
+      </w:r>
+      <w:r>
+        <w:rPr>
+          <w:sz w:val="21"/>
+          <w:color w:val="111111"/>
+        </w:rPr>
+        <w:t xml:space="preserve"> recovered our payer address on its own and simulated the transfer (</w:t>
+      </w:r>
+      <w:r>
+        <w:rPr>
+          <w:i/>
+          <w:sz w:val="21"/>
+          <w:color w:val="111111"/>
+        </w:rPr>
+        <w:t xml:space="preserve">shot 26</w:t>
+      </w:r>
+      <w:r>
+        <w:rPr>
+          <w:sz w:val="21"/>
+          <w:color w:val="111111"/>
+        </w:rPr>
+        <w:t xml:space="preserve">).</w:t>
       </w:r>
     </w:p>
     <w:p>
@@ -5119,7 +5529,55 @@
           <w:sz w:val="21"/>
           <w:color w:val="111111"/>
         </w:rPr>
-        <w:t xml:space="preserve">Signature, domain, nonce, validity window and encoding all passed, in a third party's implementation, against the real token. The only thing missing is money, and the script says exactly where it goes (</w:t>
+        <w:t xml:space="preserve">The first settlement run reported that nothing had moved. It read both balances at "latest" from a public RPC behind a load balancer, which answered from a node a few blocks behind the one that mined the transfer — while the </w:t>
+      </w:r>
+      <w:r>
+        <w:rPr>
+          <w:rFonts w:ascii="Consolas" w:hAnsi="Consolas"/>
+          <w:shd w:val="clear" w:fill="F0F2F4"/>
+          <w:sz w:val="18"/>
+          <w:color w:val="111111"/>
+        </w:rPr>
+        <w:t xml:space="preserve">Transfer</w:t>
+      </w:r>
+      <w:r>
+        <w:rPr>
+          <w:sz w:val="21"/>
+          <w:color w:val="111111"/>
+        </w:rPr>
+        <w:t xml:space="preserve"> event sat in the receipt. The script now takes its evidence from the chain rather than from the receipt or from "latest": the </w:t>
+      </w:r>
+      <w:r>
+        <w:rPr>
+          <w:rFonts w:ascii="Consolas" w:hAnsi="Consolas"/>
+          <w:shd w:val="clear" w:fill="F0F2F4"/>
+          <w:sz w:val="18"/>
+          <w:color w:val="111111"/>
+        </w:rPr>
+        <w:t xml:space="preserve">Transfer</w:t>
+      </w:r>
+      <w:r>
+        <w:rPr>
+          <w:sz w:val="21"/>
+          <w:color w:val="111111"/>
+        </w:rPr>
+        <w:t xml:space="preserve"> log in the transaction, and both balances at explicit block tags on either side of it (20.0 → 19.99 and 0.0 → 0.01). A receipt is a claim; a log is a fact. </w:t>
+      </w:r>
+      <w:r>
+        <w:rPr>
+          <w:rFonts w:ascii="Consolas" w:hAnsi="Consolas"/>
+          <w:shd w:val="clear" w:fill="F0F2F4"/>
+          <w:sz w:val="18"/>
+          <w:color w:val="111111"/>
+        </w:rPr>
+        <w:t xml:space="preserve">-- --tx &lt;hash&gt;</w:t>
+      </w:r>
+      <w:r>
+        <w:rPr>
+          <w:sz w:val="21"/>
+          <w:color w:val="111111"/>
+        </w:rPr>
+        <w:t xml:space="preserve"> re-checks a settlement without paying again (</w:t>
       </w:r>
       <w:r>
         <w:rPr>
@@ -5127,7 +5585,7 @@
           <w:sz w:val="21"/>
           <w:color w:val="111111"/>
         </w:rPr>
-        <w:t xml:space="preserve">shot 26</w:t>
+        <w:t xml:space="preserve">shot 32</w:t>
       </w:r>
       <w:r>
         <w:rPr>
@@ -5559,6 +6017,181 @@
     </w:p>
     <w:p>
       <w:pPr>
+        <w:spacing w:before="180" w:after="180"/>
+      </w:pPr>
+      <w:r>
+        <w:rPr>
+          <w:b/>
+          <w:sz w:val="22"/>
+          <w:color w:val="1a1a1a"/>
+        </w:rPr>
+        <w:t xml:space="preserve">4.10 The door has a lock</w:t>
+      </w:r>
+    </w:p>
+    <w:p>
+      <w:pPr>
+        <w:spacing w:before="120" w:after="120"/>
+      </w:pPr>
+      <w:r>
+        <w:rPr>
+          <w:sz w:val="21"/>
+          <w:color w:val="111111"/>
+        </w:rPr>
+        <w:t xml:space="preserve">The A2A endpoint shipped with </w:t>
+      </w:r>
+      <w:r>
+        <w:rPr>
+          <w:rFonts w:ascii="Consolas" w:hAnsi="Consolas"/>
+          <w:shd w:val="clear" w:fill="F0F2F4"/>
+          <w:sz w:val="18"/>
+          <w:color w:val="111111"/>
+        </w:rPr>
+        <w:t xml:space="preserve">UserBuilder.noAuthentication</w:t>
+      </w:r>
+      <w:r>
+        <w:rPr>
+          <w:sz w:val="21"/>
+          <w:color w:val="111111"/>
+        </w:rPr>
+        <w:t xml:space="preserve">: anything that could reach the port could ask the gate for decisions. For a free local decision that is merely impolite; for anything that reaches the enclave it is the hole — and this agent already speaks the standard for exactly this on the way </w:t>
+      </w:r>
+      <w:r>
+        <w:rPr>
+          <w:i/>
+          <w:sz w:val="21"/>
+          <w:color w:val="111111"/>
+        </w:rPr>
+        <w:t xml:space="preserve">out</w:t>
+      </w:r>
+      <w:r>
+        <w:rPr>
+          <w:sz w:val="21"/>
+          <w:color w:val="111111"/>
+        </w:rPr>
+        <w:t xml:space="preserve">.</w:t>
+      </w:r>
+    </w:p>
+    <w:p>
+      <w:pPr>
+        <w:spacing w:before="120" w:after="120"/>
+      </w:pPr>
+      <w:r>
+        <w:rPr>
+          <w:sz w:val="21"/>
+          <w:color w:val="111111"/>
+        </w:rPr>
+        <w:t xml:space="preserve">Web Bot Auth is now required on the way </w:t>
+      </w:r>
+      <w:r>
+        <w:rPr>
+          <w:i/>
+          <w:sz w:val="21"/>
+          <w:color w:val="111111"/>
+        </w:rPr>
+        <w:t xml:space="preserve">in</w:t>
+      </w:r>
+      <w:r>
+        <w:rPr>
+          <w:sz w:val="21"/>
+          <w:color w:val="111111"/>
+        </w:rPr>
+        <w:t xml:space="preserve">, for A2A and for MCP-over-HTTP on the same origin. A caller signs (RFC 9421, web-bot-auth profile) and names the origin of its key directory in </w:t>
+      </w:r>
+      <w:r>
+        <w:rPr>
+          <w:rFonts w:ascii="Consolas" w:hAnsi="Consolas"/>
+          <w:shd w:val="clear" w:fill="F0F2F4"/>
+          <w:sz w:val="18"/>
+          <w:color w:val="111111"/>
+        </w:rPr>
+        <w:t xml:space="preserve">Signature-Agent</w:t>
+      </w:r>
+      <w:r>
+        <w:rPr>
+          <w:sz w:val="21"/>
+          <w:color w:val="111111"/>
+        </w:rPr>
+        <w:t xml:space="preserve">; the server fetches that origin's </w:t>
+      </w:r>
+      <w:r>
+        <w:rPr>
+          <w:rFonts w:ascii="Consolas" w:hAnsi="Consolas"/>
+          <w:shd w:val="clear" w:fill="F0F2F4"/>
+          <w:sz w:val="18"/>
+          <w:color w:val="111111"/>
+        </w:rPr>
+        <w:t xml:space="preserve">/.well-known/http-message-signatures-directory</w:t>
+      </w:r>
+      <w:r>
+        <w:rPr>
+          <w:sz w:val="21"/>
+          <w:color w:val="111111"/>
+        </w:rPr>
+        <w:t xml:space="preserve">, resolves </w:t>
+      </w:r>
+      <w:r>
+        <w:rPr>
+          <w:rFonts w:ascii="Consolas" w:hAnsi="Consolas"/>
+          <w:shd w:val="clear" w:fill="F0F2F4"/>
+          <w:sz w:val="18"/>
+          <w:color w:val="111111"/>
+        </w:rPr>
+        <w:t xml:space="preserve">keyid</w:t>
+      </w:r>
+      <w:r>
+        <w:rPr>
+          <w:sz w:val="21"/>
+          <w:color w:val="111111"/>
+        </w:rPr>
+        <w:t xml:space="preserve">, verifies method, authority, path, body digest and expiry, and remembers the nonce until the signature's own expiry so a captured request cannot be replayed. The caller's identity is its origin plus keyid — nothing shared in advance. The card declares the scheme (</w:t>
+      </w:r>
+      <w:r>
+        <w:rPr>
+          <w:rFonts w:ascii="Consolas" w:hAnsi="Consolas"/>
+          <w:shd w:val="clear" w:fill="F0F2F4"/>
+          <w:sz w:val="18"/>
+          <w:color w:val="111111"/>
+        </w:rPr>
+        <w:t xml:space="preserve">HTTPSig</w:t>
+      </w:r>
+      <w:r>
+        <w:rPr>
+          <w:sz w:val="21"/>
+          <w:color w:val="111111"/>
+        </w:rPr>
+        <w:t xml:space="preserve">) so a peer learns to sign before its first call is refused. Unsigned, wrong-key, unknown-origin, replayed and body-swapped requests are each refused by name, with </w:t>
+      </w:r>
+      <w:r>
+        <w:rPr>
+          <w:rFonts w:ascii="Consolas" w:hAnsi="Consolas"/>
+          <w:shd w:val="clear" w:fill="F0F2F4"/>
+          <w:sz w:val="18"/>
+          <w:color w:val="111111"/>
+        </w:rPr>
+        <w:t xml:space="preserve">WWW-Authenticate</w:t>
+      </w:r>
+      <w:r>
+        <w:rPr>
+          <w:sz w:val="21"/>
+          <w:color w:val="111111"/>
+        </w:rPr>
+        <w:t xml:space="preserve">.</w:t>
+      </w:r>
+    </w:p>
+    <w:p>
+      <w:pPr>
+        <w:spacing w:before="120" w:after="120"/>
+      </w:pPr>
+      <w:r>
+        <w:rPr>
+          <w:sz w:val="21"/>
+          <w:color w:val="111111"/>
+        </w:rPr>
+        <w:t xml:space="preserve">Tested three ways: the official A2A client with a signing fetch, the official MCP client over HTTP with the same fetch, and Playwright sending hand-signed JSON-RPC to both with no SDK on the calling side. The caller's directory in every test is a real HTTP server.</w:t>
+      </w:r>
+    </w:p>
+    <w:p>
+      <w:pPr>
         <w:spacing w:before="260" w:after="260"/>
       </w:pPr>
       <w:r>
@@ -5730,7 +6363,54 @@
           <w:sz w:val="21"/>
           <w:color w:val="111111"/>
         </w:rPr>
-        <w:t xml:space="preserve">; nothing else references it.</w:t>
+        <w:t xml:space="preserve">; nothing else references it. Do </w:t>
+      </w:r>
+      <w:r>
+        <w:rPr>
+          <w:b/>
+          <w:sz w:val="21"/>
+          <w:color w:val="111111"/>
+        </w:rPr>
+        <w:t xml:space="preserve">not</w:t>
+      </w:r>
+      <w:r>
+        <w:rPr>
+          <w:sz w:val="21"/>
+          <w:color w:val="111111"/>
+        </w:rPr>
+        <w:t xml:space="preserve"> hand the tenant's Ethereum key to a host: provision an agent key with </w:t>
+      </w:r>
+      <w:r>
+        <w:rPr>
+          <w:rFonts w:ascii="Consolas" w:hAnsi="Consolas"/>
+          <w:shd w:val="clear" w:fill="F0F2F4"/>
+          <w:sz w:val="18"/>
+          <w:color w:val="111111"/>
+        </w:rPr>
+        <w:t xml:space="preserve">agent create</w:t>
+      </w:r>
+      <w:r>
+        <w:rPr>
+          <w:sz w:val="21"/>
+          <w:color w:val="111111"/>
+        </w:rPr>
+        <w:t xml:space="preserve"> (scoped, revocable, cannot spend credits) and give it that — </w:t>
+      </w:r>
+      <w:r>
+        <w:rPr>
+          <w:rFonts w:ascii="Consolas" w:hAnsi="Consolas"/>
+          <w:shd w:val="clear" w:fill="F0F2F4"/>
+          <w:sz w:val="18"/>
+          <w:color w:val="111111"/>
+        </w:rPr>
+        <w:t xml:space="preserve">npm run discover</w:t>
+      </w:r>
+      <w:r>
+        <w:rPr>
+          <w:sz w:val="21"/>
+          <w:color w:val="111111"/>
+        </w:rPr>
+        <w:t xml:space="preserve"> runs on it.</w:t>
       </w:r>
     </w:p>
     <w:p>
@@ -9023,7 +9703,7 @@
           <w:sz w:val="21"/>
           <w:color w:val="111111"/>
         </w:rPr>
-        <w:t xml:space="preserve"> at the time of writing (47 Rust, 96 Node, 18 Playwright end-to-end), plus the live-site and submission-artifact suites. The number comes from the runners rather than from this sentence, because every hand-written count in this repo has been wrong within a day of being written. The live-site set includes a Web Bot Auth key round trip over the public internet — sign locally, fetch the public key from </w:t>
+        <w:t xml:space="preserve"> at the time of writing (47 Rust, 191 Node, 38 Playwright end-to-end), plus the live-site and submission-artifact suites (19 live). The number comes from the runners rather than from this sentence, because every hand-written count in this repo has been wrong within a day of being written. The live-site set includes a Web Bot Auth key round trip over the public internet — sign locally, fetch the public key from </w:t>
       </w:r>
       <w:r>
         <w:rPr>
@@ -11061,7 +11741,7 @@
           <w:sz w:val="21"/>
           <w:color w:val="111111"/>
         </w:rPr>
-        <w:t xml:space="preserve">Everything above is live at https://gatekeeper-evidence.vercel.app — all 23 shots, the A2A agent card, the Web Bot Auth key directory and the revocation status list. </w:t>
+        <w:t xml:space="preserve">Everything above is live at https://gatekeeper-evidence.vercel.app — all 32 shots, the A2A agent card, the ERC-8004 registration file, the Web Bot Auth key directory and the revocation status list. </w:t>
       </w:r>
       <w:r>
         <w:rPr>
@@ -11325,7 +12005,7 @@
                 <w:sz w:val="19"/>
                 <w:color w:val="111111"/>
               </w:rPr>
-              <w:t xml:space="preserve">the evidence site, the A2A agent card, the Web Bot Auth key directory and the W3C revocation status list — every live assertion in the suite passes (17/17)</w:t>
+              <w:t xml:space="preserve">the evidence site, the A2A agent card, the ERC-8004 registration file, the Web Bot Auth key directory and the W3C revocation status list — every live assertion in the suite passes (19/19)</w:t>
             </w:r>
           </w:p>
         </w:tc>
@@ -11854,7 +12534,20 @@
           <w:rFonts w:ascii="Consolas" w:hAnsi="Consolas"/>
           <w:sz w:val="17"/>
         </w:rPr>
-        <w:t xml:space="preserve">npm run setup                             # register + create and seed the 3 KV maps</w:t>
+        <w:t xml:space="preserve">npm run probe                             # prove the build under a throwaway tail first</w:t>
+      </w:r>
+    </w:p>
+    <w:p>
+      <w:pPr>
+        <w:shd w:val="clear" w:fill="F6F8FA"/>
+        <w:spacing w:before="0" w:after="0"/>
+      </w:pPr>
+      <w:r>
+        <w:rPr>
+          <w:rFonts w:ascii="Consolas" w:hAnsi="Consolas"/>
+          <w:sz w:val="17"/>
+        </w:rPr>
+        <w:t xml:space="preserve">npm run setup                             # register + create and seed the 4 KV maps</w:t>
       </w:r>
     </w:p>
     <w:p>

</xml_diff>

<commit_message>
screenshots: render for the page they have to survive
A Google Doc scales an image to fit both the page width and the page height.
At 1180px wide, and 7150px tall for the full-flow shot, the text in the
submission shrank to nothing. 820px keeps 13px text at ~10pt once scaled, and
any output longer than a page is also rendered as page-sized chunks the
document exporters embed instead of the tall image. The site keeps the tall
one; browsers scroll. --rerender redraws from the captured .txt without
running a command or spending a credit.

Co-Authored-By: Claude Opus 5 (1M context) <noreply@anthropic.com>
Claude-Session: https://claude.ai/code/session_018f6JwozcrnmDXmsxr9oiPb
</commit_message>
<xml_diff>
--- a/submission/submission.docx
+++ b/submission/submission.docx
@@ -2163,7 +2163,7 @@
       <w:r>
         <w:drawing>
           <wp:inline distT="0" distB="0" distL="0" distR="0">
-            <wp:extent cx="5486400" cy="436418"/>
+            <wp:extent cx="5486400" cy="636814"/>
             <wp:docPr id="1" name="Picture 1"/>
             <a:graphic xmlns:a="http://schemas.openxmlformats.org/drawingml/2006/main">
               <a:graphicData uri="http://schemas.openxmlformats.org/drawingml/2006/picture">
@@ -2181,7 +2181,7 @@
                   <pic:spPr>
                     <a:xfrm>
                       <a:off x="0" y="0"/>
-                      <a:ext cx="5486400" cy="436418"/>
+                      <a:ext cx="5486400" cy="636814"/>
                     </a:xfrm>
                     <a:prstGeom prst="rect">
                       <a:avLst/>
@@ -2202,7 +2202,7 @@
       <w:r>
         <w:drawing>
           <wp:inline distT="0" distB="0" distL="0" distR="0">
-            <wp:extent cx="5486400" cy="1016710"/>
+            <wp:extent cx="5486400" cy="1623527"/>
             <wp:docPr id="2" name="Picture 2"/>
             <a:graphic xmlns:a="http://schemas.openxmlformats.org/drawingml/2006/main">
               <a:graphicData uri="http://schemas.openxmlformats.org/drawingml/2006/picture">
@@ -2220,7 +2220,7 @@
                   <pic:spPr>
                     <a:xfrm>
                       <a:off x="0" y="0"/>
-                      <a:ext cx="5486400" cy="1016710"/>
+                      <a:ext cx="5486400" cy="1623527"/>
                     </a:xfrm>
                     <a:prstGeom prst="rect">
                       <a:avLst/>
@@ -2317,7 +2317,7 @@
       <w:r>
         <w:drawing>
           <wp:inline distT="0" distB="0" distL="0" distR="0">
-            <wp:extent cx="5486400" cy="2369127"/>
+            <wp:extent cx="5486400" cy="3736910"/>
             <wp:docPr id="3" name="Picture 3"/>
             <a:graphic xmlns:a="http://schemas.openxmlformats.org/drawingml/2006/main">
               <a:graphicData uri="http://schemas.openxmlformats.org/drawingml/2006/picture">
@@ -2335,7 +2335,7 @@
                   <pic:spPr>
                     <a:xfrm>
                       <a:off x="0" y="0"/>
-                      <a:ext cx="5486400" cy="2369127"/>
+                      <a:ext cx="5486400" cy="3736910"/>
                     </a:xfrm>
                     <a:prstGeom prst="rect">
                       <a:avLst/>
@@ -2900,7 +2900,7 @@
       <w:r>
         <w:drawing>
           <wp:inline distT="0" distB="0" distL="0" distR="0">
-            <wp:extent cx="5486400" cy="628250"/>
+            <wp:extent cx="5486400" cy="1056692"/>
             <wp:docPr id="4" name="Picture 4"/>
             <a:graphic xmlns:a="http://schemas.openxmlformats.org/drawingml/2006/main">
               <a:graphicData uri="http://schemas.openxmlformats.org/drawingml/2006/picture">
@@ -2918,7 +2918,7 @@
                   <pic:spPr>
                     <a:xfrm>
                       <a:off x="0" y="0"/>
-                      <a:ext cx="5486400" cy="628250"/>
+                      <a:ext cx="5486400" cy="1056692"/>
                     </a:xfrm>
                     <a:prstGeom prst="rect">
                       <a:avLst/>
@@ -3257,7 +3257,7 @@
       <w:r>
         <w:drawing>
           <wp:inline distT="0" distB="0" distL="0" distR="0">
-            <wp:extent cx="5486400" cy="2177295"/>
+            <wp:extent cx="5486400" cy="3177073"/>
             <wp:docPr id="5" name="Picture 5"/>
             <a:graphic xmlns:a="http://schemas.openxmlformats.org/drawingml/2006/main">
               <a:graphicData uri="http://schemas.openxmlformats.org/drawingml/2006/picture">
@@ -3275,7 +3275,7 @@
                   <pic:spPr>
                     <a:xfrm>
                       <a:off x="0" y="0"/>
-                      <a:ext cx="5486400" cy="2177295"/>
+                      <a:ext cx="5486400" cy="3177073"/>
                     </a:xfrm>
                     <a:prstGeom prst="rect">
                       <a:avLst/>
@@ -3359,13 +3359,13 @@
       <w:r>
         <w:drawing>
           <wp:inline distT="0" distB="0" distL="0" distR="0">
-            <wp:extent cx="5486400" cy="17145000"/>
+            <wp:extent cx="5486400" cy="16564169"/>
             <wp:docPr id="6" name="Picture 6"/>
             <a:graphic xmlns:a="http://schemas.openxmlformats.org/drawingml/2006/main">
               <a:graphicData uri="http://schemas.openxmlformats.org/drawingml/2006/picture">
                 <pic:pic xmlns:pic="http://schemas.openxmlformats.org/drawingml/2006/picture">
                   <pic:nvPicPr>
-                    <pic:cNvPr id="6" name="05-full-flow.png"/>
+                    <pic:cNvPr id="6" name="05-full-flow.p1.png"/>
                     <pic:cNvPicPr/>
                   </pic:nvPicPr>
                   <pic:blipFill>
@@ -3377,7 +3377,7 @@
                   <pic:spPr>
                     <a:xfrm>
                       <a:off x="0" y="0"/>
-                      <a:ext cx="5486400" cy="17145000"/>
+                      <a:ext cx="5486400" cy="16564169"/>
                     </a:xfrm>
                     <a:prstGeom prst="rect">
                       <a:avLst/>
@@ -3392,202 +3392,241 @@
     </w:p>
     <w:p>
       <w:pPr>
-        <w:spacing w:before="120" w:after="120"/>
-      </w:pPr>
-      <w:r>
-        <w:rPr>
-          <w:sz w:val="21"/>
-          <w:color w:val="111111"/>
-        </w:rPr>
-        <w:t xml:space="preserve">buy that really dispatches, an over-mandate buy rejected, a disallowed asset and kind rejected, an approved counterparty, an unknown counterparty rejected, and a future-dated mandate rejected — each with the enclave's own reason strings.</w:t>
-      </w:r>
-    </w:p>
-    <w:p>
-      <w:pPr>
-        <w:spacing w:before="180" w:after="180"/>
-      </w:pPr>
-      <w:r>
-        <w:rPr>
-          <w:b/>
-          <w:sz w:val="22"/>
-          <w:color w:val="1a1a1a"/>
-        </w:rPr>
-        <w:t xml:space="preserve">4.1 Closing the gap the enclave could not close before</w:t>
-      </w:r>
-    </w:p>
-    <w:p>
-      <w:pPr>
-        <w:spacing w:before="120" w:after="120"/>
-      </w:pPr>
-      <w:r>
-        <w:rPr>
-          <w:sz w:val="21"/>
-          <w:color w:val="111111"/>
-        </w:rPr>
-        <w:t xml:space="preserve">The honest weakness in the previous submission was this: the enclave checked the credential's issuer against </w:t>
-      </w:r>
-      <w:r>
-        <w:rPr>
-          <w:rFonts w:ascii="Consolas" w:hAnsi="Consolas"/>
-          <w:shd w:val="clear" w:fill="F0F2F4"/>
-          <w:sz w:val="18"/>
-          <w:color w:val="111111"/>
-        </w:rPr>
-        <w:t xml:space="preserve">allowed_issuers</w:t>
-      </w:r>
-      <w:r>
-        <w:rPr>
-          <w:sz w:val="21"/>
-          <w:color w:val="111111"/>
-        </w:rPr>
-        <w:t xml:space="preserve">, but the issuer was a field the caller set, sitting next to a claim of "yes, I verified a credential" that was bound to nothing at all. An agent could verify a credential for a $500 purchase and then submit a $500,000 one.</w:t>
-      </w:r>
-    </w:p>
-    <w:p>
-      <w:pPr>
-        <w:spacing w:before="120" w:after="120"/>
-      </w:pPr>
-      <w:r>
-        <w:rPr>
-          <w:sz w:val="21"/>
-          <w:color w:val="111111"/>
-        </w:rPr>
-        <w:t xml:space="preserve">The agent now commits, </w:t>
-      </w:r>
-      <w:r>
-        <w:rPr>
-          <w:b/>
-          <w:sz w:val="21"/>
-          <w:color w:val="111111"/>
-        </w:rPr>
-        <w:t xml:space="preserve">before the decision</w:t>
-      </w:r>
-      <w:r>
-        <w:rPr>
-          <w:sz w:val="21"/>
-          <w:color w:val="111111"/>
-        </w:rPr>
-        <w:t xml:space="preserve">, to which credential it verified and which action it verified it for — issuer, subject, claims digest, action digest, nonce. The enclave recomputes that commitment from the action it is actually about to perform, using SHA-256 compiled into the component, so it needs no host interface and works on a node that does not serve </w:t>
-      </w:r>
-      <w:r>
-        <w:rPr>
-          <w:rFonts w:ascii="Consolas" w:hAnsi="Consolas"/>
-          <w:shd w:val="clear" w:fill="F0F2F4"/>
-          <w:sz w:val="18"/>
-          <w:color w:val="111111"/>
-        </w:rPr>
-        <w:t xml:space="preserve">vp</w:t>
-      </w:r>
-      <w:r>
-        <w:rPr>
-          <w:sz w:val="21"/>
-          <w:color w:val="111111"/>
-        </w:rPr>
-        <w:t xml:space="preserve">. A mismatch is a rejection carried in the reasons array. A mandate can require a binding, so omitting the field stops being the way around the check, and the issuer the mandate is tested against must be the one inside the commitment.</w:t>
-      </w:r>
-    </w:p>
-    <w:p>
-      <w:pPr>
-        <w:spacing w:before="120" w:after="120"/>
-      </w:pPr>
-      <w:r>
-        <w:rPr>
-          <w:b/>
-          <w:sz w:val="21"/>
-          <w:color w:val="111111"/>
-        </w:rPr>
-        <w:t xml:space="preserve">What this does not do</w:t>
-      </w:r>
-      <w:r>
-        <w:rPr>
-          <w:sz w:val="21"/>
-          <w:color w:val="111111"/>
-        </w:rPr>
-        <w:t xml:space="preserve">, because the distinction is the whole point: it does not prove the BBS+ proof was valid. A dishonest agent can still commit to a credential it never checked. Closing that needs in-contract </w:t>
-      </w:r>
-      <w:r>
-        <w:rPr>
-          <w:rFonts w:ascii="Consolas" w:hAnsi="Consolas"/>
-          <w:shd w:val="clear" w:fill="F0F2F4"/>
-          <w:sz w:val="18"/>
-          <w:color w:val="111111"/>
-        </w:rPr>
-        <w:t xml:space="preserve">vp.verify</w:t>
-      </w:r>
-      <w:r>
-        <w:rPr>
-          <w:sz w:val="21"/>
-          <w:color w:val="111111"/>
-        </w:rPr>
-        <w:t xml:space="preserve">, which this node does not serve (bug #7). What is gone is the ability to detach a real verification from what it authorised.</w:t>
-      </w:r>
-    </w:p>
-    <w:p>
-      <w:pPr>
-        <w:spacing w:before="120" w:after="120"/>
-      </w:pPr>
-      <w:r>
-        <w:rPr>
-          <w:sz w:val="21"/>
-          <w:color w:val="111111"/>
-        </w:rPr>
-        <w:t xml:space="preserve">The scheme exists in JavaScript and in Rust, which is how these things quietly become two schemes that each verify only against themselves. So the test suite runs the </w:t>
-      </w:r>
-      <w:r>
-        <w:rPr>
-          <w:b/>
-          <w:sz w:val="21"/>
-          <w:color w:val="111111"/>
-        </w:rPr>
-        <w:t xml:space="preserve">compiled Rust</w:t>
-      </w:r>
-      <w:r>
-        <w:rPr>
-          <w:sz w:val="21"/>
-          <w:color w:val="111111"/>
-        </w:rPr>
-        <w:t xml:space="preserve"> and asserts the two agree on every digest and commitment.</w:t>
-      </w:r>
-    </w:p>
-    <w:p>
-      <w:pPr>
-        <w:spacing w:before="80" w:after="80"/>
-      </w:pPr>
-      <w:r>
-        <w:rPr>
-          <w:b/>
-          <w:sz w:val="18"/>
-          <w:color w:val="444444"/>
-        </w:rPr>
-        <w:t xml:space="preserve">Screenshot 19 — `19-qa-console-binding-moved.png`</w:t>
-      </w:r>
-      <w:r>
-        <w:rPr>
-          <w:sz w:val="18"/>
-          <w:color w:val="444444"/>
-        </w:rPr>
-        <w:t xml:space="preserve"> — a real credential,</w:t>
-      </w:r>
-    </w:p>
-    <w:p>
-      <w:pPr>
         <w:jc w:val="center"/>
         <w:spacing w:before="80" w:after="200"/>
       </w:pPr>
       <w:r>
         <w:drawing>
           <wp:inline distT="0" distB="0" distL="0" distR="0">
-            <wp:extent cx="5486400" cy="3591098"/>
+            <wp:extent cx="5486400" cy="12337402"/>
             <wp:docPr id="7" name="Picture 7"/>
             <a:graphic xmlns:a="http://schemas.openxmlformats.org/drawingml/2006/main">
               <a:graphicData uri="http://schemas.openxmlformats.org/drawingml/2006/picture">
                 <pic:pic xmlns:pic="http://schemas.openxmlformats.org/drawingml/2006/picture">
                   <pic:nvPicPr>
-                    <pic:cNvPr id="7" name="19-qa-console-binding-moved.png"/>
+                    <pic:cNvPr id="7" name="05-full-flow.p2.png"/>
                     <pic:cNvPicPr/>
                   </pic:nvPicPr>
                   <pic:blipFill>
                     <a:blip r:embed="rId106"/>
+                    <a:stretch>
+                      <a:fillRect/>
+                    </a:stretch>
+                  </pic:blipFill>
+                  <pic:spPr>
+                    <a:xfrm>
+                      <a:off x="0" y="0"/>
+                      <a:ext cx="5486400" cy="12337402"/>
+                    </a:xfrm>
+                    <a:prstGeom prst="rect">
+                      <a:avLst/>
+                    </a:prstGeom>
+                  </pic:spPr>
+                </pic:pic>
+              </a:graphicData>
+            </a:graphic>
+          </wp:inline>
+        </w:drawing>
+      </w:r>
+    </w:p>
+    <w:p>
+      <w:pPr>
+        <w:spacing w:before="120" w:after="120"/>
+      </w:pPr>
+      <w:r>
+        <w:rPr>
+          <w:sz w:val="21"/>
+          <w:color w:val="111111"/>
+        </w:rPr>
+        <w:t xml:space="preserve">buy that really dispatches, an over-mandate buy rejected, a disallowed asset and kind rejected, an approved counterparty, an unknown counterparty rejected, and a future-dated mandate rejected — each with the enclave's own reason strings.</w:t>
+      </w:r>
+    </w:p>
+    <w:p>
+      <w:pPr>
+        <w:spacing w:before="180" w:after="180"/>
+      </w:pPr>
+      <w:r>
+        <w:rPr>
+          <w:b/>
+          <w:sz w:val="22"/>
+          <w:color w:val="1a1a1a"/>
+        </w:rPr>
+        <w:t xml:space="preserve">4.1 Closing the gap the enclave could not close before</w:t>
+      </w:r>
+    </w:p>
+    <w:p>
+      <w:pPr>
+        <w:spacing w:before="120" w:after="120"/>
+      </w:pPr>
+      <w:r>
+        <w:rPr>
+          <w:sz w:val="21"/>
+          <w:color w:val="111111"/>
+        </w:rPr>
+        <w:t xml:space="preserve">The honest weakness in the previous submission was this: the enclave checked the credential's issuer against </w:t>
+      </w:r>
+      <w:r>
+        <w:rPr>
+          <w:rFonts w:ascii="Consolas" w:hAnsi="Consolas"/>
+          <w:shd w:val="clear" w:fill="F0F2F4"/>
+          <w:sz w:val="18"/>
+          <w:color w:val="111111"/>
+        </w:rPr>
+        <w:t xml:space="preserve">allowed_issuers</w:t>
+      </w:r>
+      <w:r>
+        <w:rPr>
+          <w:sz w:val="21"/>
+          <w:color w:val="111111"/>
+        </w:rPr>
+        <w:t xml:space="preserve">, but the issuer was a field the caller set, sitting next to a claim of "yes, I verified a credential" that was bound to nothing at all. An agent could verify a credential for a $500 purchase and then submit a $500,000 one.</w:t>
+      </w:r>
+    </w:p>
+    <w:p>
+      <w:pPr>
+        <w:spacing w:before="120" w:after="120"/>
+      </w:pPr>
+      <w:r>
+        <w:rPr>
+          <w:sz w:val="21"/>
+          <w:color w:val="111111"/>
+        </w:rPr>
+        <w:t xml:space="preserve">The agent now commits, </w:t>
+      </w:r>
+      <w:r>
+        <w:rPr>
+          <w:b/>
+          <w:sz w:val="21"/>
+          <w:color w:val="111111"/>
+        </w:rPr>
+        <w:t xml:space="preserve">before the decision</w:t>
+      </w:r>
+      <w:r>
+        <w:rPr>
+          <w:sz w:val="21"/>
+          <w:color w:val="111111"/>
+        </w:rPr>
+        <w:t xml:space="preserve">, to which credential it verified and which action it verified it for — issuer, subject, claims digest, action digest, nonce. The enclave recomputes that commitment from the action it is actually about to perform, using SHA-256 compiled into the component, so it needs no host interface and works on a node that does not serve </w:t>
+      </w:r>
+      <w:r>
+        <w:rPr>
+          <w:rFonts w:ascii="Consolas" w:hAnsi="Consolas"/>
+          <w:shd w:val="clear" w:fill="F0F2F4"/>
+          <w:sz w:val="18"/>
+          <w:color w:val="111111"/>
+        </w:rPr>
+        <w:t xml:space="preserve">vp</w:t>
+      </w:r>
+      <w:r>
+        <w:rPr>
+          <w:sz w:val="21"/>
+          <w:color w:val="111111"/>
+        </w:rPr>
+        <w:t xml:space="preserve">. A mismatch is a rejection carried in the reasons array. A mandate can require a binding, so omitting the field stops being the way around the check, and the issuer the mandate is tested against must be the one inside the commitment.</w:t>
+      </w:r>
+    </w:p>
+    <w:p>
+      <w:pPr>
+        <w:spacing w:before="120" w:after="120"/>
+      </w:pPr>
+      <w:r>
+        <w:rPr>
+          <w:b/>
+          <w:sz w:val="21"/>
+          <w:color w:val="111111"/>
+        </w:rPr>
+        <w:t xml:space="preserve">What this does not do</w:t>
+      </w:r>
+      <w:r>
+        <w:rPr>
+          <w:sz w:val="21"/>
+          <w:color w:val="111111"/>
+        </w:rPr>
+        <w:t xml:space="preserve">, because the distinction is the whole point: it does not prove the BBS+ proof was valid. A dishonest agent can still commit to a credential it never checked. Closing that needs in-contract </w:t>
+      </w:r>
+      <w:r>
+        <w:rPr>
+          <w:rFonts w:ascii="Consolas" w:hAnsi="Consolas"/>
+          <w:shd w:val="clear" w:fill="F0F2F4"/>
+          <w:sz w:val="18"/>
+          <w:color w:val="111111"/>
+        </w:rPr>
+        <w:t xml:space="preserve">vp.verify</w:t>
+      </w:r>
+      <w:r>
+        <w:rPr>
+          <w:sz w:val="21"/>
+          <w:color w:val="111111"/>
+        </w:rPr>
+        <w:t xml:space="preserve">, which this node does not serve (bug #7). What is gone is the ability to detach a real verification from what it authorised.</w:t>
+      </w:r>
+    </w:p>
+    <w:p>
+      <w:pPr>
+        <w:spacing w:before="120" w:after="120"/>
+      </w:pPr>
+      <w:r>
+        <w:rPr>
+          <w:sz w:val="21"/>
+          <w:color w:val="111111"/>
+        </w:rPr>
+        <w:t xml:space="preserve">The scheme exists in JavaScript and in Rust, which is how these things quietly become two schemes that each verify only against themselves. So the test suite runs the </w:t>
+      </w:r>
+      <w:r>
+        <w:rPr>
+          <w:b/>
+          <w:sz w:val="21"/>
+          <w:color w:val="111111"/>
+        </w:rPr>
+        <w:t xml:space="preserve">compiled Rust</w:t>
+      </w:r>
+      <w:r>
+        <w:rPr>
+          <w:sz w:val="21"/>
+          <w:color w:val="111111"/>
+        </w:rPr>
+        <w:t xml:space="preserve"> and asserts the two agree on every digest and commitment.</w:t>
+      </w:r>
+    </w:p>
+    <w:p>
+      <w:pPr>
+        <w:spacing w:before="80" w:after="80"/>
+      </w:pPr>
+      <w:r>
+        <w:rPr>
+          <w:b/>
+          <w:sz w:val="18"/>
+          <w:color w:val="444444"/>
+        </w:rPr>
+        <w:t xml:space="preserve">Screenshot 19 — `19-qa-console-binding-moved.png`</w:t>
+      </w:r>
+      <w:r>
+        <w:rPr>
+          <w:sz w:val="18"/>
+          <w:color w:val="444444"/>
+        </w:rPr>
+        <w:t xml:space="preserve"> — a real credential,</w:t>
+      </w:r>
+    </w:p>
+    <w:p>
+      <w:pPr>
+        <w:jc w:val="center"/>
+        <w:spacing w:before="80" w:after="200"/>
+      </w:pPr>
+      <w:r>
+        <w:drawing>
+          <wp:inline distT="0" distB="0" distL="0" distR="0">
+            <wp:extent cx="5486400" cy="3591098"/>
+            <wp:docPr id="8" name="Picture 8"/>
+            <a:graphic xmlns:a="http://schemas.openxmlformats.org/drawingml/2006/main">
+              <a:graphicData uri="http://schemas.openxmlformats.org/drawingml/2006/picture">
+                <pic:pic xmlns:pic="http://schemas.openxmlformats.org/drawingml/2006/picture">
+                  <pic:nvPicPr>
+                    <pic:cNvPr id="8" name="19-qa-console-binding-moved.png"/>
+                    <pic:cNvPicPr/>
+                  </pic:nvPicPr>
+                  <pic:blipFill>
+                    <a:blip r:embed="rId107"/>
                     <a:stretch>
                       <a:fillRect/>
                     </a:stretch>
@@ -3782,411 +3821,13 @@
       <w:r>
         <w:drawing>
           <wp:inline distT="0" distB="0" distL="0" distR="0">
-            <wp:extent cx="5486400" cy="2369127"/>
-            <wp:docPr id="8" name="Picture 8"/>
-            <a:graphic xmlns:a="http://schemas.openxmlformats.org/drawingml/2006/main">
-              <a:graphicData uri="http://schemas.openxmlformats.org/drawingml/2006/picture">
-                <pic:pic xmlns:pic="http://schemas.openxmlformats.org/drawingml/2006/picture">
-                  <pic:nvPicPr>
-                    <pic:cNvPr id="8" name="18-status-list.png"/>
-                    <pic:cNvPicPr/>
-                  </pic:nvPicPr>
-                  <pic:blipFill>
-                    <a:blip r:embed="rId107"/>
-                    <a:stretch>
-                      <a:fillRect/>
-                    </a:stretch>
-                  </pic:blipFill>
-                  <pic:spPr>
-                    <a:xfrm>
-                      <a:off x="0" y="0"/>
-                      <a:ext cx="5486400" cy="2369127"/>
-                    </a:xfrm>
-                    <a:prstGeom prst="rect">
-                      <a:avLst/>
-                    </a:prstGeom>
-                  </pic:spPr>
-                </pic:pic>
-              </a:graphicData>
-            </a:graphic>
-          </wp:inline>
-        </w:drawing>
-      </w:r>
-    </w:p>
-    <w:p>
-      <w:pPr>
-        <w:spacing w:before="180" w:after="180"/>
-      </w:pPr>
-      <w:r>
-        <w:rPr>
-          <w:b/>
-          <w:sz w:val="22"/>
-          <w:color w:val="1a1a1a"/>
-        </w:rPr>
-        <w:t xml:space="preserve">4.4 ERC-8004, actually connected</w:t>
-      </w:r>
-    </w:p>
-    <w:p>
-      <w:pPr>
-        <w:spacing w:before="120" w:after="120"/>
-      </w:pPr>
-      <w:r>
-        <w:rPr>
-          <w:sz w:val="21"/>
-          <w:color w:val="111111"/>
-        </w:rPr>
-        <w:t xml:space="preserve">Previously this was a script with the right ABI that had never been pointed at a registry. Now: </w:t>
-      </w:r>
-      <w:r>
-        <w:rPr>
-          <w:b/>
-          <w:sz w:val="21"/>
-          <w:color w:val="111111"/>
-        </w:rPr>
-        <w:t xml:space="preserve">agent #201</w:t>
-      </w:r>
-      <w:r>
-        <w:rPr>
-          <w:sz w:val="21"/>
-          <w:color w:val="111111"/>
-        </w:rPr>
-        <w:t xml:space="preserve"> on the reference IdentityRegistry on Sepolia (</w:t>
-      </w:r>
-      <w:r>
-        <w:rPr>
-          <w:rFonts w:ascii="Consolas" w:hAnsi="Consolas"/>
-          <w:shd w:val="clear" w:fill="F0F2F4"/>
-          <w:sz w:val="18"/>
-          <w:color w:val="111111"/>
-        </w:rPr>
-        <w:t xml:space="preserve">0x7177a686…</w:t>
-      </w:r>
-      <w:r>
-        <w:rPr>
-          <w:sz w:val="21"/>
-          <w:color w:val="111111"/>
-        </w:rPr>
-        <w:t xml:space="preserve">), tx </w:t>
-      </w:r>
-      <w:r>
-        <w:rPr>
-          <w:rFonts w:ascii="Consolas" w:hAnsi="Consolas"/>
-          <w:shd w:val="clear" w:fill="F0F2F4"/>
-          <w:sz w:val="18"/>
-          <w:color w:val="111111"/>
-        </w:rPr>
-        <w:t xml:space="preserve">0x37965ccd…</w:t>
-      </w:r>
-      <w:r>
-        <w:rPr>
-          <w:sz w:val="21"/>
-          <w:color w:val="111111"/>
-        </w:rPr>
-        <w:t xml:space="preserve">, block 11581941. </w:t>
-      </w:r>
-      <w:r>
-        <w:rPr>
-          <w:rFonts w:ascii="Consolas" w:hAnsi="Consolas"/>
-          <w:shd w:val="clear" w:fill="F0F2F4"/>
-          <w:sz w:val="18"/>
-          <w:color w:val="111111"/>
-        </w:rPr>
-        <w:t xml:space="preserve">npm run erc8004</w:t>
-      </w:r>
-      <w:r>
-        <w:rPr>
-          <w:sz w:val="21"/>
-          <w:color w:val="111111"/>
-        </w:rPr>
-        <w:t xml:space="preserve"> reads the whole loop back with no wallet and no gas — registry → token → owner and URI → the document the URI resolves to → its </w:t>
-      </w:r>
-      <w:r>
-        <w:rPr>
-          <w:rFonts w:ascii="Consolas" w:hAnsi="Consolas"/>
-          <w:shd w:val="clear" w:fill="F0F2F4"/>
-          <w:sz w:val="18"/>
-          <w:color w:val="111111"/>
-        </w:rPr>
-        <w:t xml:space="preserve">registrations[201]</w:t>
-      </w:r>
-      <w:r>
-        <w:rPr>
-          <w:sz w:val="21"/>
-          <w:color w:val="111111"/>
-        </w:rPr>
-        <w:t xml:space="preserve"> naming the token back → the Reputation Registry for the same id.</w:t>
-      </w:r>
-    </w:p>
-    <w:p>
-      <w:pPr>
-        <w:spacing w:before="120" w:after="120"/>
-      </w:pPr>
-      <w:r>
-        <w:rPr>
-          <w:sz w:val="21"/>
-          <w:color w:val="111111"/>
-        </w:rPr>
-        <w:t xml:space="preserve">The mint nearly went wrong first, and the way it nearly went wrong is the useful part. The script had defaulted </w:t>
-      </w:r>
-      <w:r>
-        <w:rPr>
-          <w:rFonts w:ascii="Consolas" w:hAnsi="Consolas"/>
-          <w:shd w:val="clear" w:fill="F0F2F4"/>
-          <w:sz w:val="18"/>
-          <w:color w:val="111111"/>
-        </w:rPr>
-        <w:t xml:space="preserve">agentURI</w:t>
-      </w:r>
-      <w:r>
-        <w:rPr>
-          <w:sz w:val="21"/>
-          <w:color w:val="111111"/>
-        </w:rPr>
-        <w:t xml:space="preserve"> to our A2A card. ERC-8004 fixes a different document for that URI — </w:t>
-      </w:r>
-      <w:r>
-        <w:rPr>
-          <w:rFonts w:ascii="Consolas" w:hAnsi="Consolas"/>
-          <w:shd w:val="clear" w:fill="F0F2F4"/>
-          <w:sz w:val="18"/>
-          <w:color w:val="111111"/>
-        </w:rPr>
-        <w:t xml:space="preserve">type: …#registration-v1</w:t>
-      </w:r>
-      <w:r>
-        <w:rPr>
-          <w:sz w:val="21"/>
-          <w:color w:val="111111"/>
-        </w:rPr>
-        <w:t xml:space="preserve">, </w:t>
-      </w:r>
-      <w:r>
-        <w:rPr>
-          <w:rFonts w:ascii="Consolas" w:hAnsi="Consolas"/>
-          <w:shd w:val="clear" w:fill="F0F2F4"/>
-          <w:sz w:val="18"/>
-          <w:color w:val="111111"/>
-        </w:rPr>
-        <w:t xml:space="preserve">services</w:t>
-      </w:r>
-      <w:r>
-        <w:rPr>
-          <w:sz w:val="21"/>
-          <w:color w:val="111111"/>
-        </w:rPr>
-        <w:t xml:space="preserve">, </w:t>
-      </w:r>
-      <w:r>
-        <w:rPr>
-          <w:rFonts w:ascii="Consolas" w:hAnsi="Consolas"/>
-          <w:shd w:val="clear" w:fill="F0F2F4"/>
-          <w:sz w:val="18"/>
-          <w:color w:val="111111"/>
-        </w:rPr>
-        <w:t xml:space="preserve">image</w:t>
-      </w:r>
-      <w:r>
-        <w:rPr>
-          <w:sz w:val="21"/>
-          <w:color w:val="111111"/>
-        </w:rPr>
-        <w:t xml:space="preserve">, </w:t>
-      </w:r>
-      <w:r>
-        <w:rPr>
-          <w:rFonts w:ascii="Consolas" w:hAnsi="Consolas"/>
-          <w:shd w:val="clear" w:fill="F0F2F4"/>
-          <w:sz w:val="18"/>
-          <w:color w:val="111111"/>
-        </w:rPr>
-        <w:t xml:space="preserve">active</w:t>
-      </w:r>
-      <w:r>
-        <w:rPr>
-          <w:sz w:val="21"/>
-          <w:color w:val="111111"/>
-        </w:rPr>
-        <w:t xml:space="preserve"> — and a mint pointing at the card would have registered an identity every conformant resolver rejects, with the URI written on chain. The registration file is now generated from the card (one source for what the agent is called), served with the right content type, validated by the rules a resolver applies, and the register script fetches and validates the live URI </w:t>
-      </w:r>
-      <w:r>
-        <w:rPr>
-          <w:b/>
-          <w:sz w:val="21"/>
-          <w:color w:val="111111"/>
-        </w:rPr>
-        <w:t xml:space="preserve">before it will send</w:t>
-      </w:r>
-      <w:r>
-        <w:rPr>
-          <w:sz w:val="21"/>
-          <w:color w:val="111111"/>
-        </w:rPr>
-        <w:t xml:space="preserve">.</w:t>
-      </w:r>
-    </w:p>
-    <w:p>
-      <w:pPr>
-        <w:spacing w:before="120" w:after="120"/>
-      </w:pPr>
-      <w:r>
-        <w:rPr>
-          <w:sz w:val="21"/>
-          <w:color w:val="111111"/>
-        </w:rPr>
-        <w:t xml:space="preserve">The Reputation Registry deployment, read by selector, turns out to </w:t>
-      </w:r>
-      <w:r>
-        <w:rPr>
-          <w:b/>
-          <w:sz w:val="21"/>
-          <w:color w:val="111111"/>
-        </w:rPr>
-        <w:t xml:space="preserve">predate the EIP's final interface</w:t>
-      </w:r>
-      <w:r>
-        <w:rPr>
-          <w:sz w:val="21"/>
-          <w:color w:val="111111"/>
-        </w:rPr>
-        <w:t xml:space="preserve">: no </w:t>
-      </w:r>
-      <w:r>
-        <w:rPr>
-          <w:rFonts w:ascii="Consolas" w:hAnsi="Consolas"/>
-          <w:shd w:val="clear" w:fill="F0F2F4"/>
-          <w:sz w:val="18"/>
-          <w:color w:val="111111"/>
-        </w:rPr>
-        <w:t xml:space="preserve">getSummary</w:t>
-      </w:r>
-      <w:r>
-        <w:rPr>
-          <w:sz w:val="21"/>
-          <w:color w:val="111111"/>
-        </w:rPr>
-        <w:t xml:space="preserve">, </w:t>
-      </w:r>
-      <w:r>
-        <w:rPr>
-          <w:rFonts w:ascii="Consolas" w:hAnsi="Consolas"/>
-          <w:shd w:val="clear" w:fill="F0F2F4"/>
-          <w:sz w:val="18"/>
-          <w:color w:val="111111"/>
-        </w:rPr>
-        <w:t xml:space="preserve">readAllFeedback</w:t>
-      </w:r>
-      <w:r>
-        <w:rPr>
-          <w:sz w:val="21"/>
-          <w:color w:val="111111"/>
-        </w:rPr>
-        <w:t xml:space="preserve"> or final </w:t>
-      </w:r>
-      <w:r>
-        <w:rPr>
-          <w:rFonts w:ascii="Consolas" w:hAnsi="Consolas"/>
-          <w:shd w:val="clear" w:fill="F0F2F4"/>
-          <w:sz w:val="18"/>
-          <w:color w:val="111111"/>
-        </w:rPr>
-        <w:t xml:space="preserve">giveFeedback</w:t>
-      </w:r>
-      <w:r>
-        <w:rPr>
-          <w:sz w:val="21"/>
-          <w:color w:val="111111"/>
-        </w:rPr>
-        <w:t xml:space="preserve"> in the bytecode. The read computes the aggregate from the per-client functions that exist and prints what is absent, instead of letting "missing revert data" stand in for a score. Agent #201 has none yet, and zero is what it reports.</w:t>
-      </w:r>
-    </w:p>
-    <w:p>
-      <w:pPr>
-        <w:spacing w:before="120" w:after="120"/>
-      </w:pPr>
-      <w:r>
-        <w:rPr>
-          <w:sz w:val="21"/>
-          <w:color w:val="111111"/>
-        </w:rPr>
-        <w:t xml:space="preserve">The preflight is the part worth having. </w:t>
-      </w:r>
-      <w:r>
-        <w:rPr>
-          <w:rFonts w:ascii="Consolas" w:hAnsi="Consolas"/>
-          <w:shd w:val="clear" w:fill="F0F2F4"/>
-          <w:sz w:val="18"/>
-          <w:color w:val="111111"/>
-        </w:rPr>
-        <w:t xml:space="preserve">register()</w:t>
-      </w:r>
-      <w:r>
-        <w:rPr>
-          <w:sz w:val="21"/>
-          <w:color w:val="111111"/>
-        </w:rPr>
-        <w:t xml:space="preserve"> against the wrong address either reverts and wastes the fee, or succeeds against some unrelated ERC-721 and mints a token that is not an agent identity, with nothing to notice. It checks that code is deployed, that </w:t>
-      </w:r>
-      <w:r>
-        <w:rPr>
-          <w:rFonts w:ascii="Consolas" w:hAnsi="Consolas"/>
-          <w:shd w:val="clear" w:fill="F0F2F4"/>
-          <w:sz w:val="18"/>
-          <w:color w:val="111111"/>
-        </w:rPr>
-        <w:t xml:space="preserve">name()</w:t>
-      </w:r>
-      <w:r>
-        <w:rPr>
-          <w:sz w:val="21"/>
-          <w:color w:val="111111"/>
-        </w:rPr>
-        <w:t xml:space="preserve"> looks like a registry, and that the selector </w:t>
-      </w:r>
-      <w:r>
-        <w:rPr>
-          <w:rFonts w:ascii="Consolas" w:hAnsi="Consolas"/>
-          <w:shd w:val="clear" w:fill="F0F2F4"/>
-          <w:sz w:val="18"/>
-          <w:color w:val="111111"/>
-        </w:rPr>
-        <w:t xml:space="preserve">0xf2c298be</w:t>
-      </w:r>
-      <w:r>
-        <w:rPr>
-          <w:sz w:val="21"/>
-          <w:color w:val="111111"/>
-        </w:rPr>
-        <w:t xml:space="preserve"> is present in the bytecode — verified against the real chain, including against Sepolia WETH, which it correctly refuses.</w:t>
-      </w:r>
-    </w:p>
-    <w:p>
-      <w:pPr>
-        <w:spacing w:before="80" w:after="80"/>
-      </w:pPr>
-      <w:r>
-        <w:rPr>
-          <w:b/>
-          <w:sz w:val="18"/>
-          <w:color w:val="444444"/>
-        </w:rPr>
-        <w:t xml:space="preserve">Screenshot 16 — `16-erc8004-live.png`</w:t>
-      </w:r>
-    </w:p>
-    <w:p>
-      <w:pPr>
-        <w:jc w:val="center"/>
-        <w:spacing w:before="80" w:after="200"/>
-      </w:pPr>
-      <w:r>
-        <w:drawing>
-          <wp:inline distT="0" distB="0" distL="0" distR="0">
-            <wp:extent cx="5486400" cy="4685501"/>
+            <wp:extent cx="5486400" cy="3456992"/>
             <wp:docPr id="9" name="Picture 9"/>
             <a:graphic xmlns:a="http://schemas.openxmlformats.org/drawingml/2006/main">
               <a:graphicData uri="http://schemas.openxmlformats.org/drawingml/2006/picture">
                 <pic:pic xmlns:pic="http://schemas.openxmlformats.org/drawingml/2006/picture">
                   <pic:nvPicPr>
-                    <pic:cNvPr id="9" name="16-erc8004-live.png"/>
+                    <pic:cNvPr id="9" name="18-status-list.png"/>
                     <pic:cNvPicPr/>
                   </pic:nvPicPr>
                   <pic:blipFill>
@@ -4198,7 +3839,7 @@
                   <pic:spPr>
                     <a:xfrm>
                       <a:off x="0" y="0"/>
-                      <a:ext cx="5486400" cy="4685501"/>
+                      <a:ext cx="5486400" cy="3456992"/>
                     </a:xfrm>
                     <a:prstGeom prst="rect">
                       <a:avLst/>
@@ -4221,7 +3862,7 @@
           <w:sz w:val="22"/>
           <w:color w:val="1a1a1a"/>
         </w:rPr>
-        <w:t xml:space="preserve">4.5 The audit trail is no longer just our word for it</w:t>
+        <w:t xml:space="preserve">4.4 ERC-8004, actually connected</w:t>
       </w:r>
     </w:p>
     <w:p>
@@ -4233,22 +3874,86 @@
           <w:sz w:val="21"/>
           <w:color w:val="111111"/>
         </w:rPr>
-        <w:t xml:space="preserve">The agent prints a structured row per action — which is the </w:t>
-      </w:r>
-      <w:r>
-        <w:rPr>
-          <w:i/>
-          <w:sz w:val="21"/>
-          <w:color w:val="111111"/>
-        </w:rPr>
-        <w:t xml:space="preserve">agent's</w:t>
-      </w:r>
-      <w:r>
-        <w:rPr>
-          <w:sz w:val="21"/>
-          <w:color w:val="111111"/>
-        </w:rPr>
-        <w:t xml:space="preserve"> account of events, exactly the thing this project argues you should not have to take on faith. The node keeps its own record, and finding it became a bug report.</w:t>
+        <w:t xml:space="preserve">Previously this was a script with the right ABI that had never been pointed at a registry. Now: </w:t>
+      </w:r>
+      <w:r>
+        <w:rPr>
+          <w:b/>
+          <w:sz w:val="21"/>
+          <w:color w:val="111111"/>
+        </w:rPr>
+        <w:t xml:space="preserve">agent #201</w:t>
+      </w:r>
+      <w:r>
+        <w:rPr>
+          <w:sz w:val="21"/>
+          <w:color w:val="111111"/>
+        </w:rPr>
+        <w:t xml:space="preserve"> on the reference IdentityRegistry on Sepolia (</w:t>
+      </w:r>
+      <w:r>
+        <w:rPr>
+          <w:rFonts w:ascii="Consolas" w:hAnsi="Consolas"/>
+          <w:shd w:val="clear" w:fill="F0F2F4"/>
+          <w:sz w:val="18"/>
+          <w:color w:val="111111"/>
+        </w:rPr>
+        <w:t xml:space="preserve">0x7177a686…</w:t>
+      </w:r>
+      <w:r>
+        <w:rPr>
+          <w:sz w:val="21"/>
+          <w:color w:val="111111"/>
+        </w:rPr>
+        <w:t xml:space="preserve">), tx </w:t>
+      </w:r>
+      <w:r>
+        <w:rPr>
+          <w:rFonts w:ascii="Consolas" w:hAnsi="Consolas"/>
+          <w:shd w:val="clear" w:fill="F0F2F4"/>
+          <w:sz w:val="18"/>
+          <w:color w:val="111111"/>
+        </w:rPr>
+        <w:t xml:space="preserve">0x37965ccd…</w:t>
+      </w:r>
+      <w:r>
+        <w:rPr>
+          <w:sz w:val="21"/>
+          <w:color w:val="111111"/>
+        </w:rPr>
+        <w:t xml:space="preserve">, block 11581941. </w:t>
+      </w:r>
+      <w:r>
+        <w:rPr>
+          <w:rFonts w:ascii="Consolas" w:hAnsi="Consolas"/>
+          <w:shd w:val="clear" w:fill="F0F2F4"/>
+          <w:sz w:val="18"/>
+          <w:color w:val="111111"/>
+        </w:rPr>
+        <w:t xml:space="preserve">npm run erc8004</w:t>
+      </w:r>
+      <w:r>
+        <w:rPr>
+          <w:sz w:val="21"/>
+          <w:color w:val="111111"/>
+        </w:rPr>
+        <w:t xml:space="preserve"> reads the whole loop back with no wallet and no gas — registry → token → owner and URI → the document the URI resolves to → its </w:t>
+      </w:r>
+      <w:r>
+        <w:rPr>
+          <w:rFonts w:ascii="Consolas" w:hAnsi="Consolas"/>
+          <w:shd w:val="clear" w:fill="F0F2F4"/>
+          <w:sz w:val="18"/>
+          <w:color w:val="111111"/>
+        </w:rPr>
+        <w:t xml:space="preserve">registrations[201]</w:t>
+      </w:r>
+      <w:r>
+        <w:rPr>
+          <w:sz w:val="21"/>
+          <w:color w:val="111111"/>
+        </w:rPr>
+        <w:t xml:space="preserve"> naming the token back → the Reputation Registry for the same id.</w:t>
       </w:r>
     </w:p>
     <w:p>
@@ -4257,83 +3962,240 @@
       </w:pPr>
       <w:r>
         <w:rPr>
-          <w:rFonts w:ascii="Consolas" w:hAnsi="Consolas"/>
-          <w:shd w:val="clear" w:fill="F0F2F4"/>
-          <w:sz w:val="18"/>
-          <w:color w:val="111111"/>
-        </w:rPr>
-        <w:t xml:space="preserve">npm run audit</w:t>
-      </w:r>
-      <w:r>
-        <w:rPr>
-          <w:sz w:val="21"/>
-          <w:color w:val="111111"/>
-        </w:rPr>
-        <w:t xml:space="preserve"> read </w:t>
-      </w:r>
-      <w:r>
-        <w:rPr>
-          <w:rFonts w:ascii="Consolas" w:hAnsi="Consolas"/>
-          <w:shd w:val="clear" w:fill="F0F2F4"/>
-          <w:sz w:val="18"/>
-          <w:color w:val="111111"/>
-        </w:rPr>
-        <w:t xml:space="preserve">audit.get-mine</w:t>
-      </w:r>
-      <w:r>
-        <w:rPr>
-          <w:sz w:val="21"/>
-          <w:color w:val="111111"/>
-        </w:rPr>
-        <w:t xml:space="preserve"> — the documented audit read — for a month, and printed an explanation for why it was empty. It is still empty, after 39 real dispatches. The record is in </w:t>
-      </w:r>
-      <w:r>
-        <w:rPr>
-          <w:rFonts w:ascii="Consolas" w:hAnsi="Consolas"/>
-          <w:shd w:val="clear" w:fill="F0F2F4"/>
-          <w:sz w:val="18"/>
-          <w:color w:val="111111"/>
-        </w:rPr>
-        <w:t xml:space="preserve">activity.log</w:t>
-      </w:r>
-      <w:r>
-        <w:rPr>
-          <w:sz w:val="21"/>
-          <w:color w:val="111111"/>
-        </w:rPr>
-        <w:t xml:space="preserve">: every call this DID made, with contract, function, outcome, a sequence number and a hash the node assigned — the fuel-quota errors, the probes against the undocumented core contracts, the registration of the contract itself. That is bug #29. </w:t>
-      </w:r>
-      <w:r>
-        <w:rPr>
-          <w:rFonts w:ascii="Consolas" w:hAnsi="Consolas"/>
-          <w:shd w:val="clear" w:fill="F0F2F4"/>
-          <w:sz w:val="18"/>
-          <w:color w:val="111111"/>
-        </w:rPr>
-        <w:t xml:space="preserve">npm run audit</w:t>
-      </w:r>
-      <w:r>
-        <w:rPr>
-          <w:sz w:val="21"/>
-          <w:color w:val="111111"/>
-        </w:rPr>
-        <w:t xml:space="preserve"> now tallies the ledger that exists, keeps </w:t>
-      </w:r>
-      <w:r>
-        <w:rPr>
-          <w:rFonts w:ascii="Consolas" w:hAnsi="Consolas"/>
-          <w:shd w:val="clear" w:fill="F0F2F4"/>
-          <w:sz w:val="18"/>
-          <w:color w:val="111111"/>
-        </w:rPr>
-        <w:t xml:space="preserve">execute_action</w:t>
-      </w:r>
-      <w:r>
-        <w:rPr>
-          <w:sz w:val="21"/>
-          <w:color w:val="111111"/>
-        </w:rPr>
-        <w:t xml:space="preserve"> errors beside its successes rather than under them, reconciles the agent's claimed dispatches against it as a necessary condition rather than a verdict, and reports the documented read beside it, empty.</w:t>
+          <w:sz w:val="21"/>
+          <w:color w:val="111111"/>
+        </w:rPr>
+        <w:t xml:space="preserve">The mint nearly went wrong first, and the way it nearly went wrong is the useful part. The script had defaulted </w:t>
+      </w:r>
+      <w:r>
+        <w:rPr>
+          <w:rFonts w:ascii="Consolas" w:hAnsi="Consolas"/>
+          <w:shd w:val="clear" w:fill="F0F2F4"/>
+          <w:sz w:val="18"/>
+          <w:color w:val="111111"/>
+        </w:rPr>
+        <w:t xml:space="preserve">agentURI</w:t>
+      </w:r>
+      <w:r>
+        <w:rPr>
+          <w:sz w:val="21"/>
+          <w:color w:val="111111"/>
+        </w:rPr>
+        <w:t xml:space="preserve"> to our A2A card. ERC-8004 fixes a different document for that URI — </w:t>
+      </w:r>
+      <w:r>
+        <w:rPr>
+          <w:rFonts w:ascii="Consolas" w:hAnsi="Consolas"/>
+          <w:shd w:val="clear" w:fill="F0F2F4"/>
+          <w:sz w:val="18"/>
+          <w:color w:val="111111"/>
+        </w:rPr>
+        <w:t xml:space="preserve">type: …#registration-v1</w:t>
+      </w:r>
+      <w:r>
+        <w:rPr>
+          <w:sz w:val="21"/>
+          <w:color w:val="111111"/>
+        </w:rPr>
+        <w:t xml:space="preserve">, </w:t>
+      </w:r>
+      <w:r>
+        <w:rPr>
+          <w:rFonts w:ascii="Consolas" w:hAnsi="Consolas"/>
+          <w:shd w:val="clear" w:fill="F0F2F4"/>
+          <w:sz w:val="18"/>
+          <w:color w:val="111111"/>
+        </w:rPr>
+        <w:t xml:space="preserve">services</w:t>
+      </w:r>
+      <w:r>
+        <w:rPr>
+          <w:sz w:val="21"/>
+          <w:color w:val="111111"/>
+        </w:rPr>
+        <w:t xml:space="preserve">, </w:t>
+      </w:r>
+      <w:r>
+        <w:rPr>
+          <w:rFonts w:ascii="Consolas" w:hAnsi="Consolas"/>
+          <w:shd w:val="clear" w:fill="F0F2F4"/>
+          <w:sz w:val="18"/>
+          <w:color w:val="111111"/>
+        </w:rPr>
+        <w:t xml:space="preserve">image</w:t>
+      </w:r>
+      <w:r>
+        <w:rPr>
+          <w:sz w:val="21"/>
+          <w:color w:val="111111"/>
+        </w:rPr>
+        <w:t xml:space="preserve">, </w:t>
+      </w:r>
+      <w:r>
+        <w:rPr>
+          <w:rFonts w:ascii="Consolas" w:hAnsi="Consolas"/>
+          <w:shd w:val="clear" w:fill="F0F2F4"/>
+          <w:sz w:val="18"/>
+          <w:color w:val="111111"/>
+        </w:rPr>
+        <w:t xml:space="preserve">active</w:t>
+      </w:r>
+      <w:r>
+        <w:rPr>
+          <w:sz w:val="21"/>
+          <w:color w:val="111111"/>
+        </w:rPr>
+        <w:t xml:space="preserve"> — and a mint pointing at the card would have registered an identity every conformant resolver rejects, with the URI written on chain. The registration file is now generated from the card (one source for what the agent is called), served with the right content type, validated by the rules a resolver applies, and the register script fetches and validates the live URI </w:t>
+      </w:r>
+      <w:r>
+        <w:rPr>
+          <w:b/>
+          <w:sz w:val="21"/>
+          <w:color w:val="111111"/>
+        </w:rPr>
+        <w:t xml:space="preserve">before it will send</w:t>
+      </w:r>
+      <w:r>
+        <w:rPr>
+          <w:sz w:val="21"/>
+          <w:color w:val="111111"/>
+        </w:rPr>
+        <w:t xml:space="preserve">.</w:t>
+      </w:r>
+    </w:p>
+    <w:p>
+      <w:pPr>
+        <w:spacing w:before="120" w:after="120"/>
+      </w:pPr>
+      <w:r>
+        <w:rPr>
+          <w:sz w:val="21"/>
+          <w:color w:val="111111"/>
+        </w:rPr>
+        <w:t xml:space="preserve">The Reputation Registry deployment, read by selector, turns out to </w:t>
+      </w:r>
+      <w:r>
+        <w:rPr>
+          <w:b/>
+          <w:sz w:val="21"/>
+          <w:color w:val="111111"/>
+        </w:rPr>
+        <w:t xml:space="preserve">predate the EIP's final interface</w:t>
+      </w:r>
+      <w:r>
+        <w:rPr>
+          <w:sz w:val="21"/>
+          <w:color w:val="111111"/>
+        </w:rPr>
+        <w:t xml:space="preserve">: no </w:t>
+      </w:r>
+      <w:r>
+        <w:rPr>
+          <w:rFonts w:ascii="Consolas" w:hAnsi="Consolas"/>
+          <w:shd w:val="clear" w:fill="F0F2F4"/>
+          <w:sz w:val="18"/>
+          <w:color w:val="111111"/>
+        </w:rPr>
+        <w:t xml:space="preserve">getSummary</w:t>
+      </w:r>
+      <w:r>
+        <w:rPr>
+          <w:sz w:val="21"/>
+          <w:color w:val="111111"/>
+        </w:rPr>
+        <w:t xml:space="preserve">, </w:t>
+      </w:r>
+      <w:r>
+        <w:rPr>
+          <w:rFonts w:ascii="Consolas" w:hAnsi="Consolas"/>
+          <w:shd w:val="clear" w:fill="F0F2F4"/>
+          <w:sz w:val="18"/>
+          <w:color w:val="111111"/>
+        </w:rPr>
+        <w:t xml:space="preserve">readAllFeedback</w:t>
+      </w:r>
+      <w:r>
+        <w:rPr>
+          <w:sz w:val="21"/>
+          <w:color w:val="111111"/>
+        </w:rPr>
+        <w:t xml:space="preserve"> or final </w:t>
+      </w:r>
+      <w:r>
+        <w:rPr>
+          <w:rFonts w:ascii="Consolas" w:hAnsi="Consolas"/>
+          <w:shd w:val="clear" w:fill="F0F2F4"/>
+          <w:sz w:val="18"/>
+          <w:color w:val="111111"/>
+        </w:rPr>
+        <w:t xml:space="preserve">giveFeedback</w:t>
+      </w:r>
+      <w:r>
+        <w:rPr>
+          <w:sz w:val="21"/>
+          <w:color w:val="111111"/>
+        </w:rPr>
+        <w:t xml:space="preserve"> in the bytecode. The read computes the aggregate from the per-client functions that exist and prints what is absent, instead of letting "missing revert data" stand in for a score. Agent #201 has none yet, and zero is what it reports.</w:t>
+      </w:r>
+    </w:p>
+    <w:p>
+      <w:pPr>
+        <w:spacing w:before="120" w:after="120"/>
+      </w:pPr>
+      <w:r>
+        <w:rPr>
+          <w:sz w:val="21"/>
+          <w:color w:val="111111"/>
+        </w:rPr>
+        <w:t xml:space="preserve">The preflight is the part worth having. </w:t>
+      </w:r>
+      <w:r>
+        <w:rPr>
+          <w:rFonts w:ascii="Consolas" w:hAnsi="Consolas"/>
+          <w:shd w:val="clear" w:fill="F0F2F4"/>
+          <w:sz w:val="18"/>
+          <w:color w:val="111111"/>
+        </w:rPr>
+        <w:t xml:space="preserve">register()</w:t>
+      </w:r>
+      <w:r>
+        <w:rPr>
+          <w:sz w:val="21"/>
+          <w:color w:val="111111"/>
+        </w:rPr>
+        <w:t xml:space="preserve"> against the wrong address either reverts and wastes the fee, or succeeds against some unrelated ERC-721 and mints a token that is not an agent identity, with nothing to notice. It checks that code is deployed, that </w:t>
+      </w:r>
+      <w:r>
+        <w:rPr>
+          <w:rFonts w:ascii="Consolas" w:hAnsi="Consolas"/>
+          <w:shd w:val="clear" w:fill="F0F2F4"/>
+          <w:sz w:val="18"/>
+          <w:color w:val="111111"/>
+        </w:rPr>
+        <w:t xml:space="preserve">name()</w:t>
+      </w:r>
+      <w:r>
+        <w:rPr>
+          <w:sz w:val="21"/>
+          <w:color w:val="111111"/>
+        </w:rPr>
+        <w:t xml:space="preserve"> looks like a registry, and that the selector </w:t>
+      </w:r>
+      <w:r>
+        <w:rPr>
+          <w:rFonts w:ascii="Consolas" w:hAnsi="Consolas"/>
+          <w:shd w:val="clear" w:fill="F0F2F4"/>
+          <w:sz w:val="18"/>
+          <w:color w:val="111111"/>
+        </w:rPr>
+        <w:t xml:space="preserve">0xf2c298be</w:t>
+      </w:r>
+      <w:r>
+        <w:rPr>
+          <w:sz w:val="21"/>
+          <w:color w:val="111111"/>
+        </w:rPr>
+        <w:t xml:space="preserve"> is present in the bytecode — verified against the real chain, including against Sepolia WETH, which it correctly refuses.</w:t>
       </w:r>
     </w:p>
     <w:p>
@@ -4346,7 +4208,7 @@
           <w:sz w:val="18"/>
           <w:color w:val="444444"/>
         </w:rPr>
-        <w:t xml:space="preserve">Screenshot 17 — `17-audit-ledger.png`</w:t>
+        <w:t xml:space="preserve">Screenshot 16 — `16-erc8004-live.png`</w:t>
       </w:r>
     </w:p>
     <w:p>
@@ -4357,13 +4219,13 @@
       <w:r>
         <w:drawing>
           <wp:inline distT="0" distB="0" distL="0" distR="0">
-            <wp:extent cx="5486400" cy="2177295"/>
+            <wp:extent cx="5486400" cy="6837006"/>
             <wp:docPr id="10" name="Picture 10"/>
             <a:graphic xmlns:a="http://schemas.openxmlformats.org/drawingml/2006/main">
               <a:graphicData uri="http://schemas.openxmlformats.org/drawingml/2006/picture">
                 <pic:pic xmlns:pic="http://schemas.openxmlformats.org/drawingml/2006/picture">
                   <pic:nvPicPr>
-                    <pic:cNvPr id="10" name="17-audit-ledger.png"/>
+                    <pic:cNvPr id="10" name="16-erc8004-live.png"/>
                     <pic:cNvPicPr/>
                   </pic:nvPicPr>
                   <pic:blipFill>
@@ -4375,7 +4237,184 @@
                   <pic:spPr>
                     <a:xfrm>
                       <a:off x="0" y="0"/>
-                      <a:ext cx="5486400" cy="2177295"/>
+                      <a:ext cx="5486400" cy="6837006"/>
+                    </a:xfrm>
+                    <a:prstGeom prst="rect">
+                      <a:avLst/>
+                    </a:prstGeom>
+                  </pic:spPr>
+                </pic:pic>
+              </a:graphicData>
+            </a:graphic>
+          </wp:inline>
+        </w:drawing>
+      </w:r>
+    </w:p>
+    <w:p>
+      <w:pPr>
+        <w:spacing w:before="180" w:after="180"/>
+      </w:pPr>
+      <w:r>
+        <w:rPr>
+          <w:b/>
+          <w:sz w:val="22"/>
+          <w:color w:val="1a1a1a"/>
+        </w:rPr>
+        <w:t xml:space="preserve">4.5 The audit trail is no longer just our word for it</w:t>
+      </w:r>
+    </w:p>
+    <w:p>
+      <w:pPr>
+        <w:spacing w:before="120" w:after="120"/>
+      </w:pPr>
+      <w:r>
+        <w:rPr>
+          <w:sz w:val="21"/>
+          <w:color w:val="111111"/>
+        </w:rPr>
+        <w:t xml:space="preserve">The agent prints a structured row per action — which is the </w:t>
+      </w:r>
+      <w:r>
+        <w:rPr>
+          <w:i/>
+          <w:sz w:val="21"/>
+          <w:color w:val="111111"/>
+        </w:rPr>
+        <w:t xml:space="preserve">agent's</w:t>
+      </w:r>
+      <w:r>
+        <w:rPr>
+          <w:sz w:val="21"/>
+          <w:color w:val="111111"/>
+        </w:rPr>
+        <w:t xml:space="preserve"> account of events, exactly the thing this project argues you should not have to take on faith. The node keeps its own record, and finding it became a bug report.</w:t>
+      </w:r>
+    </w:p>
+    <w:p>
+      <w:pPr>
+        <w:spacing w:before="120" w:after="120"/>
+      </w:pPr>
+      <w:r>
+        <w:rPr>
+          <w:rFonts w:ascii="Consolas" w:hAnsi="Consolas"/>
+          <w:shd w:val="clear" w:fill="F0F2F4"/>
+          <w:sz w:val="18"/>
+          <w:color w:val="111111"/>
+        </w:rPr>
+        <w:t xml:space="preserve">npm run audit</w:t>
+      </w:r>
+      <w:r>
+        <w:rPr>
+          <w:sz w:val="21"/>
+          <w:color w:val="111111"/>
+        </w:rPr>
+        <w:t xml:space="preserve"> read </w:t>
+      </w:r>
+      <w:r>
+        <w:rPr>
+          <w:rFonts w:ascii="Consolas" w:hAnsi="Consolas"/>
+          <w:shd w:val="clear" w:fill="F0F2F4"/>
+          <w:sz w:val="18"/>
+          <w:color w:val="111111"/>
+        </w:rPr>
+        <w:t xml:space="preserve">audit.get-mine</w:t>
+      </w:r>
+      <w:r>
+        <w:rPr>
+          <w:sz w:val="21"/>
+          <w:color w:val="111111"/>
+        </w:rPr>
+        <w:t xml:space="preserve"> — the documented audit read — for a month, and printed an explanation for why it was empty. It is still empty, after 39 real dispatches. The record is in </w:t>
+      </w:r>
+      <w:r>
+        <w:rPr>
+          <w:rFonts w:ascii="Consolas" w:hAnsi="Consolas"/>
+          <w:shd w:val="clear" w:fill="F0F2F4"/>
+          <w:sz w:val="18"/>
+          <w:color w:val="111111"/>
+        </w:rPr>
+        <w:t xml:space="preserve">activity.log</w:t>
+      </w:r>
+      <w:r>
+        <w:rPr>
+          <w:sz w:val="21"/>
+          <w:color w:val="111111"/>
+        </w:rPr>
+        <w:t xml:space="preserve">: every call this DID made, with contract, function, outcome, a sequence number and a hash the node assigned — the fuel-quota errors, the probes against the undocumented core contracts, the registration of the contract itself. That is bug #29. </w:t>
+      </w:r>
+      <w:r>
+        <w:rPr>
+          <w:rFonts w:ascii="Consolas" w:hAnsi="Consolas"/>
+          <w:shd w:val="clear" w:fill="F0F2F4"/>
+          <w:sz w:val="18"/>
+          <w:color w:val="111111"/>
+        </w:rPr>
+        <w:t xml:space="preserve">npm run audit</w:t>
+      </w:r>
+      <w:r>
+        <w:rPr>
+          <w:sz w:val="21"/>
+          <w:color w:val="111111"/>
+        </w:rPr>
+        <w:t xml:space="preserve"> now tallies the ledger that exists, keeps </w:t>
+      </w:r>
+      <w:r>
+        <w:rPr>
+          <w:rFonts w:ascii="Consolas" w:hAnsi="Consolas"/>
+          <w:shd w:val="clear" w:fill="F0F2F4"/>
+          <w:sz w:val="18"/>
+          <w:color w:val="111111"/>
+        </w:rPr>
+        <w:t xml:space="preserve">execute_action</w:t>
+      </w:r>
+      <w:r>
+        <w:rPr>
+          <w:sz w:val="21"/>
+          <w:color w:val="111111"/>
+        </w:rPr>
+        <w:t xml:space="preserve"> errors beside its successes rather than under them, reconciles the agent's claimed dispatches against it as a necessary condition rather than a verdict, and reports the documented read beside it, empty.</w:t>
+      </w:r>
+    </w:p>
+    <w:p>
+      <w:pPr>
+        <w:spacing w:before="80" w:after="80"/>
+      </w:pPr>
+      <w:r>
+        <w:rPr>
+          <w:b/>
+          <w:sz w:val="18"/>
+          <w:color w:val="444444"/>
+        </w:rPr>
+        <w:t xml:space="preserve">Screenshot 17 — `17-audit-ledger.png`</w:t>
+      </w:r>
+    </w:p>
+    <w:p>
+      <w:pPr>
+        <w:jc w:val="center"/>
+        <w:spacing w:before="80" w:after="200"/>
+      </w:pPr>
+      <w:r>
+        <w:drawing>
+          <wp:inline distT="0" distB="0" distL="0" distR="0">
+            <wp:extent cx="5486400" cy="3177073"/>
+            <wp:docPr id="11" name="Picture 11"/>
+            <a:graphic xmlns:a="http://schemas.openxmlformats.org/drawingml/2006/main">
+              <a:graphicData uri="http://schemas.openxmlformats.org/drawingml/2006/picture">
+                <pic:pic xmlns:pic="http://schemas.openxmlformats.org/drawingml/2006/picture">
+                  <pic:nvPicPr>
+                    <pic:cNvPr id="11" name="17-audit-ledger.png"/>
+                    <pic:cNvPicPr/>
+                  </pic:nvPicPr>
+                  <pic:blipFill>
+                    <a:blip r:embed="rId110"/>
+                    <a:stretch>
+                      <a:fillRect/>
+                    </a:stretch>
+                  </pic:blipFill>
+                  <pic:spPr>
+                    <a:xfrm>
+                      <a:off x="0" y="0"/>
+                      <a:ext cx="5486400" cy="3177073"/>
                     </a:xfrm>
                     <a:prstGeom prst="rect">
                       <a:avLst/>
@@ -6783,512 +6822,13 @@
       <w:r>
         <w:drawing>
           <wp:inline distT="0" distB="0" distL="0" distR="0">
-            <wp:extent cx="5486400" cy="2752792"/>
-            <wp:docPr id="11" name="Picture 11"/>
-            <a:graphic xmlns:a="http://schemas.openxmlformats.org/drawingml/2006/main">
-              <a:graphicData uri="http://schemas.openxmlformats.org/drawingml/2006/picture">
-                <pic:pic xmlns:pic="http://schemas.openxmlformats.org/drawingml/2006/picture">
-                  <pic:nvPicPr>
-                    <pic:cNvPr id="11" name="07-tests.png"/>
-                    <pic:cNvPicPr/>
-                  </pic:nvPicPr>
-                  <pic:blipFill>
-                    <a:blip r:embed="rId110"/>
-                    <a:stretch>
-                      <a:fillRect/>
-                    </a:stretch>
-                  </pic:blipFill>
-                  <pic:spPr>
-                    <a:xfrm>
-                      <a:off x="0" y="0"/>
-                      <a:ext cx="5486400" cy="2752792"/>
-                    </a:xfrm>
-                    <a:prstGeom prst="rect">
-                      <a:avLst/>
-                    </a:prstGeom>
-                  </pic:spPr>
-                </pic:pic>
-              </a:graphicData>
-            </a:graphic>
-          </wp:inline>
-        </w:drawing>
-      </w:r>
-    </w:p>
-    <w:p>
-      <w:pPr>
-        <w:spacing w:before="120" w:after="120"/>
-      </w:pPr>
-      <w:r>
-        <w:rPr>
-          <w:b/>
-          <w:sz w:val="21"/>
-          <w:color w:val="111111"/>
-        </w:rPr>
-        <w:t xml:space="preserve">CI runs that same script</w:t>
-      </w:r>
-      <w:r>
-        <w:rPr>
-          <w:sz w:val="21"/>
-          <w:color w:val="111111"/>
-        </w:rPr>
-        <w:t xml:space="preserve">, so CI and a developer's machine cannot drift into disagreeing about what "the checks" are. The Playwright stage skips itself in CI — </w:t>
-      </w:r>
-      <w:r>
-        <w:rPr>
-          <w:rFonts w:ascii="Consolas" w:hAnsi="Consolas"/>
-          <w:shd w:val="clear" w:fill="F0F2F4"/>
-          <w:sz w:val="18"/>
-          <w:color w:val="111111"/>
-        </w:rPr>
-        <w:t xml:space="preserve">qa-console/node_modules</w:t>
-      </w:r>
-      <w:r>
-        <w:rPr>
-          <w:sz w:val="21"/>
-          <w:color w:val="111111"/>
-        </w:rPr>
-        <w:t xml:space="preserve"> is a local junction that does not exist on a fresh checkout — and it prints SKIP rather than quietly passing.</w:t>
-      </w:r>
-    </w:p>
-    <w:p>
-      <w:pPr>
-        <w:spacing w:before="120" w:after="120"/>
-      </w:pPr>
-      <w:r>
-        <w:rPr>
-          <w:b/>
-          <w:sz w:val="21"/>
-          <w:color w:val="111111"/>
-        </w:rPr>
-        <w:t xml:space="preserve">The contract version is single-sourced.</w:t>
-      </w:r>
-      <w:r>
-        <w:rPr>
-          <w:sz w:val="21"/>
-          <w:color w:val="111111"/>
-        </w:rPr>
-        <w:t xml:space="preserve"> It used to be typed in three files that had to agree: </w:t>
-      </w:r>
-      <w:r>
-        <w:rPr>
-          <w:rFonts w:ascii="Consolas" w:hAnsi="Consolas"/>
-          <w:shd w:val="clear" w:fill="F0F2F4"/>
-          <w:sz w:val="18"/>
-          <w:color w:val="111111"/>
-        </w:rPr>
-        <w:t xml:space="preserve">Cargo.toml</w:t>
-      </w:r>
-      <w:r>
-        <w:rPr>
-          <w:sz w:val="21"/>
-          <w:color w:val="111111"/>
-        </w:rPr>
-        <w:t xml:space="preserve">, </w:t>
-      </w:r>
-      <w:r>
-        <w:rPr>
-          <w:rFonts w:ascii="Consolas" w:hAnsi="Consolas"/>
-          <w:shd w:val="clear" w:fill="F0F2F4"/>
-          <w:sz w:val="18"/>
-          <w:color w:val="111111"/>
-        </w:rPr>
-        <w:t xml:space="preserve">lib.rs</w:t>
-      </w:r>
-      <w:r>
-        <w:rPr>
-          <w:sz w:val="21"/>
-          <w:color w:val="111111"/>
-        </w:rPr>
-        <w:t xml:space="preserve">, and the agent's </w:t>
-      </w:r>
-      <w:r>
-        <w:rPr>
-          <w:rFonts w:ascii="Consolas" w:hAnsi="Consolas"/>
-          <w:shd w:val="clear" w:fill="F0F2F4"/>
-          <w:sz w:val="18"/>
-          <w:color w:val="111111"/>
-        </w:rPr>
-        <w:t xml:space="preserve">lib.mjs</w:t>
-      </w:r>
-      <w:r>
-        <w:rPr>
-          <w:sz w:val="21"/>
-          <w:color w:val="111111"/>
-        </w:rPr>
-        <w:t xml:space="preserve">. Shipping 0.9.0 meant editing all three, which is the moment to notice. Rust now reads </w:t>
-      </w:r>
-      <w:r>
-        <w:rPr>
-          <w:rFonts w:ascii="Consolas" w:hAnsi="Consolas"/>
-          <w:shd w:val="clear" w:fill="F0F2F4"/>
-          <w:sz w:val="18"/>
-          <w:color w:val="111111"/>
-        </w:rPr>
-        <w:t xml:space="preserve">env!("CARGO_PKG_VERSION")</w:t>
-      </w:r>
-      <w:r>
-        <w:rPr>
-          <w:sz w:val="21"/>
-          <w:color w:val="111111"/>
-        </w:rPr>
-        <w:t xml:space="preserve"> and the agent parses the same </w:t>
-      </w:r>
-      <w:r>
-        <w:rPr>
-          <w:rFonts w:ascii="Consolas" w:hAnsi="Consolas"/>
-          <w:shd w:val="clear" w:fill="F0F2F4"/>
-          <w:sz w:val="18"/>
-          <w:color w:val="111111"/>
-        </w:rPr>
-        <w:t xml:space="preserve">Cargo.toml</w:t>
-      </w:r>
-      <w:r>
-        <w:rPr>
-          <w:sz w:val="21"/>
-          <w:color w:val="111111"/>
-        </w:rPr>
-        <w:t xml:space="preserve">. The failure mode this prevents — a contract registered under a number that is not the code inside it — is now impossible rather than merely unlikely.</w:t>
-      </w:r>
-    </w:p>
-    <w:p>
-      <w:pPr>
-        <w:spacing w:before="120" w:after="120"/>
-      </w:pPr>
-      <w:r>
-        <w:rPr>
-          <w:b/>
-          <w:sz w:val="21"/>
-          <w:color w:val="111111"/>
-        </w:rPr>
-        <w:t xml:space="preserve">`setup.mjs` got shorter while gaining a feature.</w:t>
-      </w:r>
-      <w:r>
-        <w:rPr>
-          <w:sz w:val="21"/>
-          <w:color w:val="111111"/>
-        </w:rPr>
-        <w:t xml:space="preserve"> It had three copies of create-map-then-fix-the-ACL and needed a fourth for the secrets map. It now has one </w:t>
-      </w:r>
-      <w:r>
-        <w:rPr>
-          <w:rFonts w:ascii="Consolas" w:hAnsi="Consolas"/>
-          <w:shd w:val="clear" w:fill="F0F2F4"/>
-          <w:sz w:val="18"/>
-          <w:color w:val="111111"/>
-        </w:rPr>
-        <w:t xml:space="preserve">ensureMap</w:t>
-      </w:r>
-      <w:r>
-        <w:rPr>
-          <w:sz w:val="21"/>
-          <w:color w:val="111111"/>
-        </w:rPr>
-        <w:t xml:space="preserve">, and the file is shorter with the new map in it than it was without.</w:t>
-      </w:r>
-    </w:p>
-    <w:p>
-      <w:pPr>
-        <w:spacing w:before="120" w:after="120"/>
-      </w:pPr>
-      <w:r>
-        <w:rPr>
-          <w:b/>
-          <w:sz w:val="21"/>
-          <w:color w:val="111111"/>
-        </w:rPr>
-        <w:t xml:space="preserve">MAINTENANCE.md</w:t>
-      </w:r>
-      <w:r>
-        <w:rPr>
-          <w:sz w:val="21"/>
-          <w:color w:val="111111"/>
-        </w:rPr>
-        <w:t xml:space="preserve"> is the operator's document: every configuration knob and what its absence means, the five things that actually go wrong with the fix for each, and the handover sequence. Two defaults are called out as deliberately unsafe-looking rather than left to be discovered — an empty </w:t>
-      </w:r>
-      <w:r>
-        <w:rPr>
-          <w:rFonts w:ascii="Consolas" w:hAnsi="Consolas"/>
-          <w:shd w:val="clear" w:fill="F0F2F4"/>
-          <w:sz w:val="18"/>
-          <w:color w:val="111111"/>
-        </w:rPr>
-        <w:t xml:space="preserve">TRUSTED_ISSUERS</w:t>
-      </w:r>
-      <w:r>
-        <w:rPr>
-          <w:sz w:val="21"/>
-          <w:color w:val="111111"/>
-        </w:rPr>
-        <w:t xml:space="preserve"> accepts a credential the agent minted itself, and an unset revocation registry lets a revoked investor through. Both are opt-in because the demo has no real KYC issuer, and a production operator must set both.</w:t>
-      </w:r>
-    </w:p>
-    <w:p>
-      <w:pPr>
-        <w:pBdr>
-          <w:bottom w:val="single" w:sz="6" w:color="CCCCCC"/>
-        </w:pBdr>
-      </w:pPr>
-    </w:p>
-    <w:p>
-      <w:pPr>
-        <w:spacing w:before="260" w:after="260"/>
-      </w:pPr>
-      <w:r>
-        <w:rPr>
-          <w:b/>
-          <w:sz w:val="26"/>
-          <w:color w:val="1a1a1a"/>
-        </w:rPr>
-        <w:t xml:space="preserve">7. Trying the refreshed docs</w:t>
-      </w:r>
-    </w:p>
-    <w:p>
-      <w:pPr>
-        <w:spacing w:before="120" w:after="120"/>
-      </w:pPr>
-      <w:r>
-        <w:rPr>
-          <w:sz w:val="21"/>
-          <w:color w:val="111111"/>
-        </w:rPr>
-        <w:t xml:space="preserve">The docs are visibly better than in June: the ADK Tour and Agent Auth pages are filled in, Common Errors has real triage guidance, and there is now a Reference and a Changelog. The </w:t>
-      </w:r>
-      <w:r>
-        <w:rPr>
-          <w:b/>
-          <w:sz w:val="21"/>
-          <w:color w:val="111111"/>
-        </w:rPr>
-        <w:t xml:space="preserve">`outbound-http-auth-by-user`</w:t>
-      </w:r>
-      <w:r>
-        <w:rPr>
-          <w:sz w:val="21"/>
-          <w:color w:val="111111"/>
-        </w:rPr>
-        <w:t xml:space="preserve"> tip is the single most useful page in the set — it is what turned my last blocked feature into a working one, because it explains that a contract's egress is authorised by the </w:t>
-      </w:r>
-      <w:r>
-        <w:rPr>
-          <w:i/>
-          <w:sz w:val="21"/>
-          <w:color w:val="111111"/>
-        </w:rPr>
-        <w:t xml:space="preserve">caller</w:t>
-      </w:r>
-      <w:r>
-        <w:rPr>
-          <w:sz w:val="21"/>
-          <w:color w:val="111111"/>
-        </w:rPr>
-        <w:t xml:space="preserve">, not the contract.</w:t>
-      </w:r>
-    </w:p>
-    <w:p>
-      <w:pPr>
-        <w:spacing w:before="120" w:after="120"/>
-      </w:pPr>
-      <w:r>
-        <w:rPr>
-          <w:sz w:val="21"/>
-          <w:color w:val="111111"/>
-        </w:rPr>
-        <w:t xml:space="preserve">I also want to flag something good: the Changelog entry for 6 July adds "a warning about contract version-shadowing on re-registration". </w:t>
-      </w:r>
-      <w:r>
-        <w:rPr>
-          <w:b/>
-          <w:sz w:val="21"/>
-          <w:color w:val="111111"/>
-        </w:rPr>
-        <w:t xml:space="preserve">That is bug #8 from my June report, adopted into the docs.</w:t>
-      </w:r>
-      <w:r>
-        <w:rPr>
-          <w:sz w:val="21"/>
-          <w:color w:val="111111"/>
-        </w:rPr>
-        <w:t xml:space="preserve"> Seeing a report land is a strong reason to keep filing them.</w:t>
-      </w:r>
-    </w:p>
-    <w:p>
-      <w:pPr>
-        <w:spacing w:before="120" w:after="120"/>
-      </w:pPr>
-      <w:r>
-        <w:rPr>
-          <w:sz w:val="21"/>
-          <w:color w:val="111111"/>
-        </w:rPr>
-        <w:t xml:space="preserve">What broke, and it is the one thing I would most like fixed:</w:t>
-      </w:r>
-    </w:p>
-    <w:p>
-      <w:pPr>
-        <w:spacing w:before="120" w:after="120"/>
-      </w:pPr>
-      <w:r>
-        <w:rPr>
-          <w:b/>
-          <w:sz w:val="21"/>
-          <w:color w:val="111111"/>
-        </w:rPr>
-        <w:t xml:space="preserve">The node no longer talks to the SDK version the previous docs shipped.</w:t>
-      </w:r>
-      <w:r>
-        <w:rPr>
-          <w:sz w:val="21"/>
-          <w:color w:val="111111"/>
-        </w:rPr>
-        <w:t xml:space="preserve"> On 3.5.2, </w:t>
-      </w:r>
-      <w:r>
-        <w:rPr>
-          <w:rFonts w:ascii="Consolas" w:hAnsi="Consolas"/>
-          <w:shd w:val="clear" w:fill="F0F2F4"/>
-          <w:sz w:val="18"/>
-          <w:color w:val="111111"/>
-        </w:rPr>
-        <w:t xml:space="preserve">getUsage()</w:t>
-      </w:r>
-      <w:r>
-        <w:rPr>
-          <w:sz w:val="21"/>
-          <w:color w:val="111111"/>
-        </w:rPr>
-        <w:t xml:space="preserve"> now returns:</w:t>
-      </w:r>
-    </w:p>
-    <w:p>
-      <w:pPr>
-        <w:shd w:val="clear" w:fill="F6F8FA"/>
-        <w:spacing w:before="0" w:after="0"/>
-      </w:pPr>
-      <w:r>
-        <w:rPr>
-          <w:rFonts w:ascii="Consolas" w:hAnsi="Consolas"/>
-          <w:sz w:val="17"/>
-        </w:rPr>
-        <w:t xml:space="preserve">HTTP 400 {"code":"bad_request",</w:t>
-      </w:r>
-    </w:p>
-    <w:p>
-      <w:pPr>
-        <w:shd w:val="clear" w:fill="F6F8FA"/>
-        <w:spacing w:before="0" w:after="0"/>
-      </w:pPr>
-      <w:r>
-        <w:rPr>
-          <w:rFonts w:ascii="Consolas" w:hAnsi="Consolas"/>
-          <w:sz w:val="17"/>
-        </w:rPr>
-        <w:t xml:space="preserve"> "detail":"token.get-usage: request params must be sealed to this session key",</w:t>
-      </w:r>
-    </w:p>
-    <w:p>
-      <w:pPr>
-        <w:shd w:val="clear" w:fill="F6F8FA"/>
-        <w:spacing w:before="0" w:after="0"/>
-      </w:pPr>
-      <w:r>
-        <w:rPr>
-          <w:rFonts w:ascii="Consolas" w:hAnsi="Consolas"/>
-          <w:sz w:val="17"/>
-        </w:rPr>
-        <w:t xml:space="preserve"> "request_id":"2901523a-450d-4a04-b9c5-b0748a855d65"}</w:t>
-      </w:r>
-    </w:p>
-    <w:p>
-      <w:pPr>
-        <w:spacing w:before="120" w:after="120"/>
-      </w:pPr>
-      <w:r>
-        <w:rPr>
-          <w:sz w:val="21"/>
-          <w:color w:val="111111"/>
-        </w:rPr>
-        <w:t xml:space="preserve">The same call on 5.1.0 succeeds, same key, same node, same second. The error reads like the caller's mistake, there is no "unsupported version" signal, and the Changelog states outright that no SDK release history exists — so there is nowhere to look up what changed. That is bug #19.</w:t>
-      </w:r>
-    </w:p>
-    <w:p>
-      <w:pPr>
-        <w:spacing w:before="120" w:after="120"/>
-      </w:pPr>
-      <w:r>
-        <w:rPr>
-          <w:sz w:val="21"/>
-          <w:color w:val="111111"/>
-        </w:rPr>
-        <w:t xml:space="preserve">Migrating then surfaced bug #20: </w:t>
-      </w:r>
-      <w:r>
-        <w:rPr>
-          <w:rFonts w:ascii="Consolas" w:hAnsi="Consolas"/>
-          <w:shd w:val="clear" w:fill="F0F2F4"/>
-          <w:sz w:val="18"/>
-          <w:color w:val="111111"/>
-        </w:rPr>
-        <w:t xml:space="preserve">trustAnchor</w:t>
-      </w:r>
-      <w:r>
-        <w:rPr>
-          <w:sz w:val="21"/>
-          <w:color w:val="111111"/>
-        </w:rPr>
-        <w:t xml:space="preserve"> is a required constructor field from 5.x. The change is correct and its error message is genuinely good, but it never names </w:t>
-      </w:r>
-      <w:r>
-        <w:rPr>
-          <w:rFonts w:ascii="Consolas" w:hAnsi="Consolas"/>
-          <w:shd w:val="clear" w:fill="F0F2F4"/>
-          <w:sz w:val="18"/>
-          <w:color w:val="111111"/>
-        </w:rPr>
-        <w:t xml:space="preserve">fetchTrustedManifest()</w:t>
-      </w:r>
-      <w:r>
-        <w:rPr>
-          <w:sz w:val="21"/>
-          <w:color w:val="111111"/>
-        </w:rPr>
-        <w:t xml:space="preserve"> — the one-line fix, exported from the same module — and nothing says which version introduced it.</w:t>
-      </w:r>
-    </w:p>
-    <w:p>
-      <w:pPr>
-        <w:spacing w:before="80" w:after="80"/>
-      </w:pPr>
-      <w:r>
-        <w:rPr>
-          <w:b/>
-          <w:sz w:val="18"/>
-          <w:color w:val="444444"/>
-        </w:rPr>
-        <w:t xml:space="preserve">Screenshot 14 — `14-bug-trust-anchor.png`</w:t>
-      </w:r>
-      <w:r>
-        <w:rPr>
-          <w:sz w:val="18"/>
-          <w:color w:val="444444"/>
-        </w:rPr>
-        <w:t xml:space="preserve"> — both constructor forms against</w:t>
-      </w:r>
-    </w:p>
-    <w:p>
-      <w:pPr>
-        <w:jc w:val="center"/>
-        <w:spacing w:before="80" w:after="200"/>
-      </w:pPr>
-      <w:r>
-        <w:drawing>
-          <wp:inline distT="0" distB="0" distL="0" distR="0">
-            <wp:extent cx="5486400" cy="2949420"/>
+            <wp:extent cx="5486400" cy="4016829"/>
             <wp:docPr id="12" name="Picture 12"/>
             <a:graphic xmlns:a="http://schemas.openxmlformats.org/drawingml/2006/main">
               <a:graphicData uri="http://schemas.openxmlformats.org/drawingml/2006/picture">
                 <pic:pic xmlns:pic="http://schemas.openxmlformats.org/drawingml/2006/picture">
                   <pic:nvPicPr>
-                    <pic:cNvPr id="12" name="14-bug-trust-anchor.png"/>
+                    <pic:cNvPr id="12" name="07-tests.png"/>
                     <pic:cNvPicPr/>
                   </pic:nvPicPr>
                   <pic:blipFill>
@@ -7300,7 +6840,506 @@
                   <pic:spPr>
                     <a:xfrm>
                       <a:off x="0" y="0"/>
-                      <a:ext cx="5486400" cy="2949420"/>
+                      <a:ext cx="5486400" cy="4016829"/>
+                    </a:xfrm>
+                    <a:prstGeom prst="rect">
+                      <a:avLst/>
+                    </a:prstGeom>
+                  </pic:spPr>
+                </pic:pic>
+              </a:graphicData>
+            </a:graphic>
+          </wp:inline>
+        </w:drawing>
+      </w:r>
+    </w:p>
+    <w:p>
+      <w:pPr>
+        <w:spacing w:before="120" w:after="120"/>
+      </w:pPr>
+      <w:r>
+        <w:rPr>
+          <w:b/>
+          <w:sz w:val="21"/>
+          <w:color w:val="111111"/>
+        </w:rPr>
+        <w:t xml:space="preserve">CI runs that same script</w:t>
+      </w:r>
+      <w:r>
+        <w:rPr>
+          <w:sz w:val="21"/>
+          <w:color w:val="111111"/>
+        </w:rPr>
+        <w:t xml:space="preserve">, so CI and a developer's machine cannot drift into disagreeing about what "the checks" are. The Playwright stage skips itself in CI — </w:t>
+      </w:r>
+      <w:r>
+        <w:rPr>
+          <w:rFonts w:ascii="Consolas" w:hAnsi="Consolas"/>
+          <w:shd w:val="clear" w:fill="F0F2F4"/>
+          <w:sz w:val="18"/>
+          <w:color w:val="111111"/>
+        </w:rPr>
+        <w:t xml:space="preserve">qa-console/node_modules</w:t>
+      </w:r>
+      <w:r>
+        <w:rPr>
+          <w:sz w:val="21"/>
+          <w:color w:val="111111"/>
+        </w:rPr>
+        <w:t xml:space="preserve"> is a local junction that does not exist on a fresh checkout — and it prints SKIP rather than quietly passing.</w:t>
+      </w:r>
+    </w:p>
+    <w:p>
+      <w:pPr>
+        <w:spacing w:before="120" w:after="120"/>
+      </w:pPr>
+      <w:r>
+        <w:rPr>
+          <w:b/>
+          <w:sz w:val="21"/>
+          <w:color w:val="111111"/>
+        </w:rPr>
+        <w:t xml:space="preserve">The contract version is single-sourced.</w:t>
+      </w:r>
+      <w:r>
+        <w:rPr>
+          <w:sz w:val="21"/>
+          <w:color w:val="111111"/>
+        </w:rPr>
+        <w:t xml:space="preserve"> It used to be typed in three files that had to agree: </w:t>
+      </w:r>
+      <w:r>
+        <w:rPr>
+          <w:rFonts w:ascii="Consolas" w:hAnsi="Consolas"/>
+          <w:shd w:val="clear" w:fill="F0F2F4"/>
+          <w:sz w:val="18"/>
+          <w:color w:val="111111"/>
+        </w:rPr>
+        <w:t xml:space="preserve">Cargo.toml</w:t>
+      </w:r>
+      <w:r>
+        <w:rPr>
+          <w:sz w:val="21"/>
+          <w:color w:val="111111"/>
+        </w:rPr>
+        <w:t xml:space="preserve">, </w:t>
+      </w:r>
+      <w:r>
+        <w:rPr>
+          <w:rFonts w:ascii="Consolas" w:hAnsi="Consolas"/>
+          <w:shd w:val="clear" w:fill="F0F2F4"/>
+          <w:sz w:val="18"/>
+          <w:color w:val="111111"/>
+        </w:rPr>
+        <w:t xml:space="preserve">lib.rs</w:t>
+      </w:r>
+      <w:r>
+        <w:rPr>
+          <w:sz w:val="21"/>
+          <w:color w:val="111111"/>
+        </w:rPr>
+        <w:t xml:space="preserve">, and the agent's </w:t>
+      </w:r>
+      <w:r>
+        <w:rPr>
+          <w:rFonts w:ascii="Consolas" w:hAnsi="Consolas"/>
+          <w:shd w:val="clear" w:fill="F0F2F4"/>
+          <w:sz w:val="18"/>
+          <w:color w:val="111111"/>
+        </w:rPr>
+        <w:t xml:space="preserve">lib.mjs</w:t>
+      </w:r>
+      <w:r>
+        <w:rPr>
+          <w:sz w:val="21"/>
+          <w:color w:val="111111"/>
+        </w:rPr>
+        <w:t xml:space="preserve">. Shipping 0.9.0 meant editing all three, which is the moment to notice. Rust now reads </w:t>
+      </w:r>
+      <w:r>
+        <w:rPr>
+          <w:rFonts w:ascii="Consolas" w:hAnsi="Consolas"/>
+          <w:shd w:val="clear" w:fill="F0F2F4"/>
+          <w:sz w:val="18"/>
+          <w:color w:val="111111"/>
+        </w:rPr>
+        <w:t xml:space="preserve">env!("CARGO_PKG_VERSION")</w:t>
+      </w:r>
+      <w:r>
+        <w:rPr>
+          <w:sz w:val="21"/>
+          <w:color w:val="111111"/>
+        </w:rPr>
+        <w:t xml:space="preserve"> and the agent parses the same </w:t>
+      </w:r>
+      <w:r>
+        <w:rPr>
+          <w:rFonts w:ascii="Consolas" w:hAnsi="Consolas"/>
+          <w:shd w:val="clear" w:fill="F0F2F4"/>
+          <w:sz w:val="18"/>
+          <w:color w:val="111111"/>
+        </w:rPr>
+        <w:t xml:space="preserve">Cargo.toml</w:t>
+      </w:r>
+      <w:r>
+        <w:rPr>
+          <w:sz w:val="21"/>
+          <w:color w:val="111111"/>
+        </w:rPr>
+        <w:t xml:space="preserve">. The failure mode this prevents — a contract registered under a number that is not the code inside it — is now impossible rather than merely unlikely.</w:t>
+      </w:r>
+    </w:p>
+    <w:p>
+      <w:pPr>
+        <w:spacing w:before="120" w:after="120"/>
+      </w:pPr>
+      <w:r>
+        <w:rPr>
+          <w:b/>
+          <w:sz w:val="21"/>
+          <w:color w:val="111111"/>
+        </w:rPr>
+        <w:t xml:space="preserve">`setup.mjs` got shorter while gaining a feature.</w:t>
+      </w:r>
+      <w:r>
+        <w:rPr>
+          <w:sz w:val="21"/>
+          <w:color w:val="111111"/>
+        </w:rPr>
+        <w:t xml:space="preserve"> It had three copies of create-map-then-fix-the-ACL and needed a fourth for the secrets map. It now has one </w:t>
+      </w:r>
+      <w:r>
+        <w:rPr>
+          <w:rFonts w:ascii="Consolas" w:hAnsi="Consolas"/>
+          <w:shd w:val="clear" w:fill="F0F2F4"/>
+          <w:sz w:val="18"/>
+          <w:color w:val="111111"/>
+        </w:rPr>
+        <w:t xml:space="preserve">ensureMap</w:t>
+      </w:r>
+      <w:r>
+        <w:rPr>
+          <w:sz w:val="21"/>
+          <w:color w:val="111111"/>
+        </w:rPr>
+        <w:t xml:space="preserve">, and the file is shorter with the new map in it than it was without.</w:t>
+      </w:r>
+    </w:p>
+    <w:p>
+      <w:pPr>
+        <w:spacing w:before="120" w:after="120"/>
+      </w:pPr>
+      <w:r>
+        <w:rPr>
+          <w:b/>
+          <w:sz w:val="21"/>
+          <w:color w:val="111111"/>
+        </w:rPr>
+        <w:t xml:space="preserve">MAINTENANCE.md</w:t>
+      </w:r>
+      <w:r>
+        <w:rPr>
+          <w:sz w:val="21"/>
+          <w:color w:val="111111"/>
+        </w:rPr>
+        <w:t xml:space="preserve"> is the operator's document: every configuration knob and what its absence means, the five things that actually go wrong with the fix for each, and the handover sequence. Two defaults are called out as deliberately unsafe-looking rather than left to be discovered — an empty </w:t>
+      </w:r>
+      <w:r>
+        <w:rPr>
+          <w:rFonts w:ascii="Consolas" w:hAnsi="Consolas"/>
+          <w:shd w:val="clear" w:fill="F0F2F4"/>
+          <w:sz w:val="18"/>
+          <w:color w:val="111111"/>
+        </w:rPr>
+        <w:t xml:space="preserve">TRUSTED_ISSUERS</w:t>
+      </w:r>
+      <w:r>
+        <w:rPr>
+          <w:sz w:val="21"/>
+          <w:color w:val="111111"/>
+        </w:rPr>
+        <w:t xml:space="preserve"> accepts a credential the agent minted itself, and an unset revocation registry lets a revoked investor through. Both are opt-in because the demo has no real KYC issuer, and a production operator must set both.</w:t>
+      </w:r>
+    </w:p>
+    <w:p>
+      <w:pPr>
+        <w:pBdr>
+          <w:bottom w:val="single" w:sz="6" w:color="CCCCCC"/>
+        </w:pBdr>
+      </w:pPr>
+    </w:p>
+    <w:p>
+      <w:pPr>
+        <w:spacing w:before="260" w:after="260"/>
+      </w:pPr>
+      <w:r>
+        <w:rPr>
+          <w:b/>
+          <w:sz w:val="26"/>
+          <w:color w:val="1a1a1a"/>
+        </w:rPr>
+        <w:t xml:space="preserve">7. Trying the refreshed docs</w:t>
+      </w:r>
+    </w:p>
+    <w:p>
+      <w:pPr>
+        <w:spacing w:before="120" w:after="120"/>
+      </w:pPr>
+      <w:r>
+        <w:rPr>
+          <w:sz w:val="21"/>
+          <w:color w:val="111111"/>
+        </w:rPr>
+        <w:t xml:space="preserve">The docs are visibly better than in June: the ADK Tour and Agent Auth pages are filled in, Common Errors has real triage guidance, and there is now a Reference and a Changelog. The </w:t>
+      </w:r>
+      <w:r>
+        <w:rPr>
+          <w:b/>
+          <w:sz w:val="21"/>
+          <w:color w:val="111111"/>
+        </w:rPr>
+        <w:t xml:space="preserve">`outbound-http-auth-by-user`</w:t>
+      </w:r>
+      <w:r>
+        <w:rPr>
+          <w:sz w:val="21"/>
+          <w:color w:val="111111"/>
+        </w:rPr>
+        <w:t xml:space="preserve"> tip is the single most useful page in the set — it is what turned my last blocked feature into a working one, because it explains that a contract's egress is authorised by the </w:t>
+      </w:r>
+      <w:r>
+        <w:rPr>
+          <w:i/>
+          <w:sz w:val="21"/>
+          <w:color w:val="111111"/>
+        </w:rPr>
+        <w:t xml:space="preserve">caller</w:t>
+      </w:r>
+      <w:r>
+        <w:rPr>
+          <w:sz w:val="21"/>
+          <w:color w:val="111111"/>
+        </w:rPr>
+        <w:t xml:space="preserve">, not the contract.</w:t>
+      </w:r>
+    </w:p>
+    <w:p>
+      <w:pPr>
+        <w:spacing w:before="120" w:after="120"/>
+      </w:pPr>
+      <w:r>
+        <w:rPr>
+          <w:sz w:val="21"/>
+          <w:color w:val="111111"/>
+        </w:rPr>
+        <w:t xml:space="preserve">I also want to flag something good: the Changelog entry for 6 July adds "a warning about contract version-shadowing on re-registration". </w:t>
+      </w:r>
+      <w:r>
+        <w:rPr>
+          <w:b/>
+          <w:sz w:val="21"/>
+          <w:color w:val="111111"/>
+        </w:rPr>
+        <w:t xml:space="preserve">That is bug #8 from my June report, adopted into the docs.</w:t>
+      </w:r>
+      <w:r>
+        <w:rPr>
+          <w:sz w:val="21"/>
+          <w:color w:val="111111"/>
+        </w:rPr>
+        <w:t xml:space="preserve"> Seeing a report land is a strong reason to keep filing them.</w:t>
+      </w:r>
+    </w:p>
+    <w:p>
+      <w:pPr>
+        <w:spacing w:before="120" w:after="120"/>
+      </w:pPr>
+      <w:r>
+        <w:rPr>
+          <w:sz w:val="21"/>
+          <w:color w:val="111111"/>
+        </w:rPr>
+        <w:t xml:space="preserve">What broke, and it is the one thing I would most like fixed:</w:t>
+      </w:r>
+    </w:p>
+    <w:p>
+      <w:pPr>
+        <w:spacing w:before="120" w:after="120"/>
+      </w:pPr>
+      <w:r>
+        <w:rPr>
+          <w:b/>
+          <w:sz w:val="21"/>
+          <w:color w:val="111111"/>
+        </w:rPr>
+        <w:t xml:space="preserve">The node no longer talks to the SDK version the previous docs shipped.</w:t>
+      </w:r>
+      <w:r>
+        <w:rPr>
+          <w:sz w:val="21"/>
+          <w:color w:val="111111"/>
+        </w:rPr>
+        <w:t xml:space="preserve"> On 3.5.2, </w:t>
+      </w:r>
+      <w:r>
+        <w:rPr>
+          <w:rFonts w:ascii="Consolas" w:hAnsi="Consolas"/>
+          <w:shd w:val="clear" w:fill="F0F2F4"/>
+          <w:sz w:val="18"/>
+          <w:color w:val="111111"/>
+        </w:rPr>
+        <w:t xml:space="preserve">getUsage()</w:t>
+      </w:r>
+      <w:r>
+        <w:rPr>
+          <w:sz w:val="21"/>
+          <w:color w:val="111111"/>
+        </w:rPr>
+        <w:t xml:space="preserve"> now returns:</w:t>
+      </w:r>
+    </w:p>
+    <w:p>
+      <w:pPr>
+        <w:shd w:val="clear" w:fill="F6F8FA"/>
+        <w:spacing w:before="0" w:after="0"/>
+      </w:pPr>
+      <w:r>
+        <w:rPr>
+          <w:rFonts w:ascii="Consolas" w:hAnsi="Consolas"/>
+          <w:sz w:val="17"/>
+        </w:rPr>
+        <w:t xml:space="preserve">HTTP 400 {"code":"bad_request",</w:t>
+      </w:r>
+    </w:p>
+    <w:p>
+      <w:pPr>
+        <w:shd w:val="clear" w:fill="F6F8FA"/>
+        <w:spacing w:before="0" w:after="0"/>
+      </w:pPr>
+      <w:r>
+        <w:rPr>
+          <w:rFonts w:ascii="Consolas" w:hAnsi="Consolas"/>
+          <w:sz w:val="17"/>
+        </w:rPr>
+        <w:t xml:space="preserve"> "detail":"token.get-usage: request params must be sealed to this session key",</w:t>
+      </w:r>
+    </w:p>
+    <w:p>
+      <w:pPr>
+        <w:shd w:val="clear" w:fill="F6F8FA"/>
+        <w:spacing w:before="0" w:after="0"/>
+      </w:pPr>
+      <w:r>
+        <w:rPr>
+          <w:rFonts w:ascii="Consolas" w:hAnsi="Consolas"/>
+          <w:sz w:val="17"/>
+        </w:rPr>
+        <w:t xml:space="preserve"> "request_id":"2901523a-450d-4a04-b9c5-b0748a855d65"}</w:t>
+      </w:r>
+    </w:p>
+    <w:p>
+      <w:pPr>
+        <w:spacing w:before="120" w:after="120"/>
+      </w:pPr>
+      <w:r>
+        <w:rPr>
+          <w:sz w:val="21"/>
+          <w:color w:val="111111"/>
+        </w:rPr>
+        <w:t xml:space="preserve">The same call on 5.1.0 succeeds, same key, same node, same second. The error reads like the caller's mistake, there is no "unsupported version" signal, and the Changelog states outright that no SDK release history exists — so there is nowhere to look up what changed. That is bug #19.</w:t>
+      </w:r>
+    </w:p>
+    <w:p>
+      <w:pPr>
+        <w:spacing w:before="120" w:after="120"/>
+      </w:pPr>
+      <w:r>
+        <w:rPr>
+          <w:sz w:val="21"/>
+          <w:color w:val="111111"/>
+        </w:rPr>
+        <w:t xml:space="preserve">Migrating then surfaced bug #20: </w:t>
+      </w:r>
+      <w:r>
+        <w:rPr>
+          <w:rFonts w:ascii="Consolas" w:hAnsi="Consolas"/>
+          <w:shd w:val="clear" w:fill="F0F2F4"/>
+          <w:sz w:val="18"/>
+          <w:color w:val="111111"/>
+        </w:rPr>
+        <w:t xml:space="preserve">trustAnchor</w:t>
+      </w:r>
+      <w:r>
+        <w:rPr>
+          <w:sz w:val="21"/>
+          <w:color w:val="111111"/>
+        </w:rPr>
+        <w:t xml:space="preserve"> is a required constructor field from 5.x. The change is correct and its error message is genuinely good, but it never names </w:t>
+      </w:r>
+      <w:r>
+        <w:rPr>
+          <w:rFonts w:ascii="Consolas" w:hAnsi="Consolas"/>
+          <w:shd w:val="clear" w:fill="F0F2F4"/>
+          <w:sz w:val="18"/>
+          <w:color w:val="111111"/>
+        </w:rPr>
+        <w:t xml:space="preserve">fetchTrustedManifest()</w:t>
+      </w:r>
+      <w:r>
+        <w:rPr>
+          <w:sz w:val="21"/>
+          <w:color w:val="111111"/>
+        </w:rPr>
+        <w:t xml:space="preserve"> — the one-line fix, exported from the same module — and nothing says which version introduced it.</w:t>
+      </w:r>
+    </w:p>
+    <w:p>
+      <w:pPr>
+        <w:spacing w:before="80" w:after="80"/>
+      </w:pPr>
+      <w:r>
+        <w:rPr>
+          <w:b/>
+          <w:sz w:val="18"/>
+          <w:color w:val="444444"/>
+        </w:rPr>
+        <w:t xml:space="preserve">Screenshot 14 — `14-bug-trust-anchor.png`</w:t>
+      </w:r>
+      <w:r>
+        <w:rPr>
+          <w:sz w:val="18"/>
+          <w:color w:val="444444"/>
+        </w:rPr>
+        <w:t xml:space="preserve"> — both constructor forms against</w:t>
+      </w:r>
+    </w:p>
+    <w:p>
+      <w:pPr>
+        <w:jc w:val="center"/>
+        <w:spacing w:before="80" w:after="200"/>
+      </w:pPr>
+      <w:r>
+        <w:drawing>
+          <wp:inline distT="0" distB="0" distL="0" distR="0">
+            <wp:extent cx="5486400" cy="4443704"/>
+            <wp:docPr id="13" name="Picture 13"/>
+            <a:graphic xmlns:a="http://schemas.openxmlformats.org/drawingml/2006/main">
+              <a:graphicData uri="http://schemas.openxmlformats.org/drawingml/2006/picture">
+                <pic:pic xmlns:pic="http://schemas.openxmlformats.org/drawingml/2006/picture">
+                  <pic:nvPicPr>
+                    <pic:cNvPr id="13" name="14-bug-trust-anchor.png"/>
+                    <pic:cNvPicPr/>
+                  </pic:nvPicPr>
+                  <pic:blipFill>
+                    <a:blip r:embed="rId112"/>
+                    <a:stretch>
+                      <a:fillRect/>
+                    </a:stretch>
+                  </pic:blipFill>
+                  <pic:spPr>
+                    <a:xfrm>
+                      <a:off x="0" y="0"/>
+                      <a:ext cx="5486400" cy="4443704"/>
                     </a:xfrm>
                     <a:prstGeom prst="rect">
                       <a:avLst/>
@@ -7997,52 +8036,13 @@
       <w:r>
         <w:drawing>
           <wp:inline distT="0" distB="0" distL="0" distR="0">
-            <wp:extent cx="5486400" cy="1016710"/>
-            <wp:docPr id="13" name="Picture 13"/>
-            <a:graphic xmlns:a="http://schemas.openxmlformats.org/drawingml/2006/main">
-              <a:graphicData uri="http://schemas.openxmlformats.org/drawingml/2006/picture">
-                <pic:pic xmlns:pic="http://schemas.openxmlformats.org/drawingml/2006/picture">
-                  <pic:nvPicPr>
-                    <pic:cNvPr id="13" name="08-bug-token-balance.png"/>
-                    <pic:cNvPicPr/>
-                  </pic:nvPicPr>
-                  <pic:blipFill>
-                    <a:blip r:embed="rId112"/>
-                    <a:stretch>
-                      <a:fillRect/>
-                    </a:stretch>
-                  </pic:blipFill>
-                  <pic:spPr>
-                    <a:xfrm>
-                      <a:off x="0" y="0"/>
-                      <a:ext cx="5486400" cy="1016710"/>
-                    </a:xfrm>
-                    <a:prstGeom prst="rect">
-                      <a:avLst/>
-                    </a:prstGeom>
-                  </pic:spPr>
-                </pic:pic>
-              </a:graphicData>
-            </a:graphic>
-          </wp:inline>
-        </w:drawing>
-      </w:r>
-    </w:p>
-    <w:p>
-      <w:pPr>
-        <w:jc w:val="center"/>
-        <w:spacing w:before="80" w:after="200"/>
-      </w:pPr>
-      <w:r>
-        <w:drawing>
-          <wp:inline distT="0" distB="0" distL="0" distR="0">
-            <wp:extent cx="5486400" cy="628250"/>
+            <wp:extent cx="5486400" cy="1483567"/>
             <wp:docPr id="14" name="Picture 14"/>
             <a:graphic xmlns:a="http://schemas.openxmlformats.org/drawingml/2006/main">
               <a:graphicData uri="http://schemas.openxmlformats.org/drawingml/2006/picture">
                 <pic:pic xmlns:pic="http://schemas.openxmlformats.org/drawingml/2006/picture">
                   <pic:nvPicPr>
-                    <pic:cNvPr id="14" name="10-bug-node-version.png"/>
+                    <pic:cNvPr id="14" name="08-bug-token-balance.png"/>
                     <pic:cNvPicPr/>
                   </pic:nvPicPr>
                   <pic:blipFill>
@@ -8054,7 +8054,7 @@
                   <pic:spPr>
                     <a:xfrm>
                       <a:off x="0" y="0"/>
-                      <a:ext cx="5486400" cy="628250"/>
+                      <a:ext cx="5486400" cy="1483567"/>
                     </a:xfrm>
                     <a:prstGeom prst="rect">
                       <a:avLst/>
@@ -8075,13 +8075,13 @@
       <w:r>
         <w:drawing>
           <wp:inline distT="0" distB="0" distL="0" distR="0">
-            <wp:extent cx="5486400" cy="436418"/>
+            <wp:extent cx="5486400" cy="916733"/>
             <wp:docPr id="15" name="Picture 15"/>
             <a:graphic xmlns:a="http://schemas.openxmlformats.org/drawingml/2006/main">
               <a:graphicData uri="http://schemas.openxmlformats.org/drawingml/2006/picture">
                 <pic:pic xmlns:pic="http://schemas.openxmlformats.org/drawingml/2006/picture">
                   <pic:nvPicPr>
-                    <pic:cNvPr id="15" name="09-bug-host-card.png"/>
+                    <pic:cNvPr id="15" name="10-bug-node-version.png"/>
                     <pic:cNvPicPr/>
                   </pic:nvPicPr>
                   <pic:blipFill>
@@ -8093,7 +8093,7 @@
                   <pic:spPr>
                     <a:xfrm>
                       <a:off x="0" y="0"/>
-                      <a:ext cx="5486400" cy="436418"/>
+                      <a:ext cx="5486400" cy="916733"/>
                     </a:xfrm>
                     <a:prstGeom prst="rect">
                       <a:avLst/>
@@ -8108,340 +8108,19 @@
     </w:p>
     <w:p>
       <w:pPr>
-        <w:spacing w:before="120" w:after="120"/>
-      </w:pPr>
-      <w:r>
-        <w:rPr>
-          <w:b/>
-          <w:sz w:val="21"/>
-          <w:color w:val="111111"/>
-        </w:rPr>
-        <w:t xml:space="preserve">Still reproducing, checked 26 Aug:</w:t>
-      </w:r>
-      <w:r>
-        <w:rPr>
-          <w:sz w:val="21"/>
-          <w:color w:val="111111"/>
-        </w:rPr>
-        <w:t xml:space="preserve"> #1 the BBS+ verifier still interpolates an unset field into </w:t>
-      </w:r>
-      <w:r>
-        <w:rPr>
-          <w:rFonts w:ascii="Consolas" w:hAnsi="Consolas"/>
-          <w:shd w:val="clear" w:fill="F0F2F4"/>
-          <w:sz w:val="18"/>
-          <w:color w:val="111111"/>
-        </w:rPr>
-        <w:t xml:space="preserve">"verification failed: undefined"</w:t>
-      </w:r>
-      <w:r>
-        <w:rPr>
-          <w:sz w:val="21"/>
-          <w:color w:val="111111"/>
-        </w:rPr>
-        <w:t xml:space="preserve">; #2 </w:t>
-      </w:r>
-      <w:r>
-        <w:rPr>
-          <w:rFonts w:ascii="Consolas" w:hAnsi="Consolas"/>
-          <w:shd w:val="clear" w:fill="F0F2F4"/>
-          <w:sz w:val="18"/>
-          <w:color w:val="111111"/>
-        </w:rPr>
-        <w:t xml:space="preserve">getNodeUrl("testnet")</w:t>
-      </w:r>
-      <w:r>
-        <w:rPr>
-          <w:sz w:val="21"/>
-          <w:color w:val="111111"/>
-        </w:rPr>
-        <w:t xml:space="preserve"> still returns the string </w:t>
-      </w:r>
-      <w:r>
-        <w:rPr>
-          <w:rFonts w:ascii="Consolas" w:hAnsi="Consolas"/>
-          <w:shd w:val="clear" w:fill="F0F2F4"/>
-          <w:sz w:val="18"/>
-          <w:color w:val="111111"/>
-        </w:rPr>
-        <w:t xml:space="preserve">"testnet"</w:t>
-      </w:r>
-      <w:r>
-        <w:rPr>
-          <w:sz w:val="21"/>
-          <w:color w:val="111111"/>
-        </w:rPr>
-        <w:t xml:space="preserve"> while </w:t>
-      </w:r>
-      <w:r>
-        <w:rPr>
-          <w:rFonts w:ascii="Consolas" w:hAnsi="Consolas"/>
-          <w:shd w:val="clear" w:fill="F0F2F4"/>
-          <w:sz w:val="18"/>
-          <w:color w:val="111111"/>
-        </w:rPr>
-        <w:t xml:space="preserve">NODE_URLS</w:t>
-      </w:r>
-      <w:r>
-        <w:rPr>
-          <w:sz w:val="21"/>
-          <w:color w:val="111111"/>
-        </w:rPr>
-        <w:t xml:space="preserve"> in the same module holds the right value; #3 still no holder-side derive — </w:t>
-      </w:r>
-      <w:r>
-        <w:rPr>
-          <w:rFonts w:ascii="Consolas" w:hAnsi="Consolas"/>
-          <w:shd w:val="clear" w:fill="F0F2F4"/>
-          <w:sz w:val="18"/>
-          <w:color w:val="111111"/>
-        </w:rPr>
-        <w:t xml:space="preserve">makeBBSPlusW3cProof</w:t>
-      </w:r>
-      <w:r>
-        <w:rPr>
-          <w:sz w:val="21"/>
-          <w:color w:val="111111"/>
-        </w:rPr>
-        <w:t xml:space="preserve"> takes a private key and lives in </w:t>
-      </w:r>
-      <w:r>
-        <w:rPr>
-          <w:rFonts w:ascii="Consolas" w:hAnsi="Consolas"/>
-          <w:shd w:val="clear" w:fill="F0F2F4"/>
-          <w:sz w:val="18"/>
-          <w:color w:val="111111"/>
-        </w:rPr>
-        <w:t xml:space="preserve">issueBbsVc.ts</w:t>
-      </w:r>
-      <w:r>
-        <w:rPr>
-          <w:sz w:val="21"/>
-          <w:color w:val="111111"/>
-        </w:rPr>
-        <w:t xml:space="preserve">, so it is issuance, not disclosure; #4 the referenced onboarding repo is still empty, last pushed 6 June; #5, #10, #13, #16, #17, #18.</w:t>
-      </w:r>
-    </w:p>
-    <w:p>
-      <w:pPr>
-        <w:spacing w:before="120" w:after="120"/>
-      </w:pPr>
-      <w:r>
-        <w:rPr>
-          <w:b/>
-          <w:sz w:val="21"/>
-          <w:color w:val="111111"/>
-        </w:rPr>
-        <w:t xml:space="preserve">New this round:</w:t>
-      </w:r>
-    </w:p>
-    <w:p>
-      <w:pPr>
-        <w:ind w:left="360"/>
-        <w:spacing w:before="60" w:after="60"/>
-      </w:pPr>
-      <w:r>
-        <w:rPr>
-          <w:sz w:val="21"/>
-          <w:color w:val="111111"/>
-        </w:rPr>
-        <w:t xml:space="preserve">• </w:t>
-      </w:r>
-      <w:r>
-        <w:rPr>
-          <w:b/>
-          <w:sz w:val="21"/>
-          <w:color w:val="111111"/>
-        </w:rPr>
-        <w:t xml:space="preserve">#19 — the node dropped support for the SDK the old docs shipped</w:t>
-      </w:r>
-      <w:r>
-        <w:rPr>
-          <w:sz w:val="21"/>
-          <w:color w:val="111111"/>
-        </w:rPr>
-        <w:t xml:space="preserve">, silently (above). Highest impact of the three: it breaks existing integrations and gives them nothing to search for.</w:t>
-      </w:r>
-    </w:p>
-    <w:p>
-      <w:pPr>
-        <w:ind w:left="360"/>
-        <w:spacing w:before="60" w:after="60"/>
-      </w:pPr>
-      <w:r>
-        <w:rPr>
-          <w:sz w:val="21"/>
-          <w:color w:val="111111"/>
-        </w:rPr>
-        <w:t xml:space="preserve">• </w:t>
-      </w:r>
-      <w:r>
-        <w:rPr>
-          <w:b/>
-          <w:sz w:val="21"/>
-          <w:color w:val="111111"/>
-        </w:rPr>
-        <w:t xml:space="preserve">#20 — `trustAnchor` required from 5.x</w:t>
-      </w:r>
-      <w:r>
-        <w:rPr>
-          <w:sz w:val="21"/>
-          <w:color w:val="111111"/>
-        </w:rPr>
-        <w:t xml:space="preserve">, with no migration note (above).</w:t>
-      </w:r>
-    </w:p>
-    <w:p>
-      <w:pPr>
-        <w:ind w:left="360"/>
-        <w:spacing w:before="60" w:after="60"/>
-      </w:pPr>
-      <w:r>
-        <w:rPr>
-          <w:sz w:val="21"/>
-          <w:color w:val="111111"/>
-        </w:rPr>
-        <w:t xml:space="preserve">• </w:t>
-      </w:r>
-      <w:r>
-        <w:rPr>
-          <w:b/>
-          <w:sz w:val="21"/>
-          <w:color w:val="111111"/>
-        </w:rPr>
-        <w:t xml:space="preserve">#21 — metering is inconsistent and unpublished.</w:t>
-      </w:r>
-      <w:r>
-        <w:rPr>
-          <w:sz w:val="21"/>
-          <w:color w:val="111111"/>
-        </w:rPr>
-        <w:t xml:space="preserve"> At a balance of exactly zero, </w:t>
-      </w:r>
-      <w:r>
-        <w:rPr>
-          <w:rFonts w:ascii="Consolas" w:hAnsi="Consolas"/>
-          <w:shd w:val="clear" w:fill="F0F2F4"/>
-          <w:sz w:val="18"/>
-          <w:color w:val="111111"/>
-        </w:rPr>
-        <w:t xml:space="preserve">agent create --org</w:t>
-      </w:r>
-      <w:r>
-        <w:rPr>
-          <w:sz w:val="21"/>
-          <w:color w:val="111111"/>
-        </w:rPr>
-        <w:t xml:space="preserve"> minted a DID, issued an API key and hosted a card — three writes, free. In the same session </w:t>
-      </w:r>
-      <w:r>
-        <w:rPr>
-          <w:rFonts w:ascii="Consolas" w:hAnsi="Consolas"/>
-          <w:shd w:val="clear" w:fill="F0F2F4"/>
-          <w:sz w:val="18"/>
-          <w:color w:val="111111"/>
-        </w:rPr>
-        <w:t xml:space="preserve">agent card-publish</w:t>
-      </w:r>
-      <w:r>
-        <w:rPr>
-          <w:sz w:val="21"/>
-          <w:color w:val="111111"/>
-        </w:rPr>
-        <w:t xml:space="preserve"> and </w:t>
-      </w:r>
-      <w:r>
-        <w:rPr>
-          <w:rFonts w:ascii="Consolas" w:hAnsi="Consolas"/>
-          <w:shd w:val="clear" w:fill="F0F2F4"/>
-          <w:sz w:val="18"/>
-          <w:color w:val="111111"/>
-        </w:rPr>
-        <w:t xml:space="preserve">agent host-card</w:t>
-      </w:r>
-      <w:r>
-        <w:rPr>
-          <w:sz w:val="21"/>
-          <w:color w:val="111111"/>
-        </w:rPr>
-        <w:t xml:space="preserve"> demanded </w:t>
-      </w:r>
-      <w:r>
-        <w:rPr>
-          <w:rFonts w:ascii="Consolas" w:hAnsi="Consolas"/>
-          <w:shd w:val="clear" w:fill="F0F2F4"/>
-          <w:sz w:val="18"/>
-          <w:color w:val="111111"/>
-        </w:rPr>
-        <w:t xml:space="preserve">required=10000000000</w:t>
-      </w:r>
-      <w:r>
-        <w:rPr>
-          <w:sz w:val="21"/>
-          <w:color w:val="111111"/>
-        </w:rPr>
-        <w:t xml:space="preserve">, roughly </w:t>
-      </w:r>
-      <w:r>
-        <w:rPr>
-          <w:b/>
-          <w:sz w:val="21"/>
-          <w:color w:val="111111"/>
-        </w:rPr>
-        <w:t xml:space="preserve">6.7× the entire initial grant</w:t>
-      </w:r>
-      <w:r>
-        <w:rPr>
-          <w:sz w:val="21"/>
-          <w:color w:val="111111"/>
-        </w:rPr>
-        <w:t xml:space="preserve">. There is no price list, no pre-flight estimate, and because </w:t>
-      </w:r>
-      <w:r>
-        <w:rPr>
-          <w:rFonts w:ascii="Consolas" w:hAnsi="Consolas"/>
-          <w:shd w:val="clear" w:fill="F0F2F4"/>
-          <w:sz w:val="18"/>
-          <w:color w:val="111111"/>
-        </w:rPr>
-        <w:t xml:space="preserve">getUsage().entries</w:t>
-      </w:r>
-      <w:r>
-        <w:rPr>
-          <w:sz w:val="21"/>
-          <w:color w:val="111111"/>
-        </w:rPr>
-        <w:t xml:space="preserve"> is empty (#17) no way to see afterwards what was charged.</w:t>
-      </w:r>
-    </w:p>
-    <w:p>
-      <w:pPr>
-        <w:spacing w:before="80" w:after="80"/>
-      </w:pPr>
-      <w:r>
-        <w:rPr>
-          <w:b/>
-          <w:sz w:val="18"/>
-          <w:color w:val="444444"/>
-        </w:rPr>
-        <w:t xml:space="preserve">Screenshot 15 — `15-bug-metering.png`</w:t>
-      </w:r>
-    </w:p>
-    <w:p>
-      <w:pPr>
         <w:jc w:val="center"/>
         <w:spacing w:before="80" w:after="200"/>
       </w:pPr>
       <w:r>
         <w:drawing>
           <wp:inline distT="0" distB="0" distL="0" distR="0">
-            <wp:extent cx="5486400" cy="436418"/>
+            <wp:extent cx="5486400" cy="776773"/>
             <wp:docPr id="16" name="Picture 16"/>
             <a:graphic xmlns:a="http://schemas.openxmlformats.org/drawingml/2006/main">
               <a:graphicData uri="http://schemas.openxmlformats.org/drawingml/2006/picture">
                 <pic:pic xmlns:pic="http://schemas.openxmlformats.org/drawingml/2006/picture">
                   <pic:nvPicPr>
-                    <pic:cNvPr id="16" name="15-bug-metering.png"/>
+                    <pic:cNvPr id="16" name="09-bug-host-card.png"/>
                     <pic:cNvPicPr/>
                   </pic:nvPicPr>
                   <pic:blipFill>
@@ -8453,7 +8132,7 @@
                   <pic:spPr>
                     <a:xfrm>
                       <a:off x="0" y="0"/>
-                      <a:ext cx="5486400" cy="436418"/>
+                      <a:ext cx="5486400" cy="776773"/>
                     </a:xfrm>
                     <a:prstGeom prst="rect">
                       <a:avLst/>
@@ -8468,15 +8147,118 @@
     </w:p>
     <w:p>
       <w:pPr>
-        <w:spacing w:before="180" w:after="180"/>
+        <w:spacing w:before="120" w:after="120"/>
       </w:pPr>
       <w:r>
         <w:rPr>
           <w:b/>
-          <w:sz w:val="22"/>
-          <w:color w:val="1a1a1a"/>
-        </w:rPr>
-        <w:t xml:space="preserve">8.1 And four in my own contract</w:t>
+          <w:sz w:val="21"/>
+          <w:color w:val="111111"/>
+        </w:rPr>
+        <w:t xml:space="preserve">Still reproducing, checked 26 Aug:</w:t>
+      </w:r>
+      <w:r>
+        <w:rPr>
+          <w:sz w:val="21"/>
+          <w:color w:val="111111"/>
+        </w:rPr>
+        <w:t xml:space="preserve"> #1 the BBS+ verifier still interpolates an unset field into </w:t>
+      </w:r>
+      <w:r>
+        <w:rPr>
+          <w:rFonts w:ascii="Consolas" w:hAnsi="Consolas"/>
+          <w:shd w:val="clear" w:fill="F0F2F4"/>
+          <w:sz w:val="18"/>
+          <w:color w:val="111111"/>
+        </w:rPr>
+        <w:t xml:space="preserve">"verification failed: undefined"</w:t>
+      </w:r>
+      <w:r>
+        <w:rPr>
+          <w:sz w:val="21"/>
+          <w:color w:val="111111"/>
+        </w:rPr>
+        <w:t xml:space="preserve">; #2 </w:t>
+      </w:r>
+      <w:r>
+        <w:rPr>
+          <w:rFonts w:ascii="Consolas" w:hAnsi="Consolas"/>
+          <w:shd w:val="clear" w:fill="F0F2F4"/>
+          <w:sz w:val="18"/>
+          <w:color w:val="111111"/>
+        </w:rPr>
+        <w:t xml:space="preserve">getNodeUrl("testnet")</w:t>
+      </w:r>
+      <w:r>
+        <w:rPr>
+          <w:sz w:val="21"/>
+          <w:color w:val="111111"/>
+        </w:rPr>
+        <w:t xml:space="preserve"> still returns the string </w:t>
+      </w:r>
+      <w:r>
+        <w:rPr>
+          <w:rFonts w:ascii="Consolas" w:hAnsi="Consolas"/>
+          <w:shd w:val="clear" w:fill="F0F2F4"/>
+          <w:sz w:val="18"/>
+          <w:color w:val="111111"/>
+        </w:rPr>
+        <w:t xml:space="preserve">"testnet"</w:t>
+      </w:r>
+      <w:r>
+        <w:rPr>
+          <w:sz w:val="21"/>
+          <w:color w:val="111111"/>
+        </w:rPr>
+        <w:t xml:space="preserve"> while </w:t>
+      </w:r>
+      <w:r>
+        <w:rPr>
+          <w:rFonts w:ascii="Consolas" w:hAnsi="Consolas"/>
+          <w:shd w:val="clear" w:fill="F0F2F4"/>
+          <w:sz w:val="18"/>
+          <w:color w:val="111111"/>
+        </w:rPr>
+        <w:t xml:space="preserve">NODE_URLS</w:t>
+      </w:r>
+      <w:r>
+        <w:rPr>
+          <w:sz w:val="21"/>
+          <w:color w:val="111111"/>
+        </w:rPr>
+        <w:t xml:space="preserve"> in the same module holds the right value; #3 still no holder-side derive — </w:t>
+      </w:r>
+      <w:r>
+        <w:rPr>
+          <w:rFonts w:ascii="Consolas" w:hAnsi="Consolas"/>
+          <w:shd w:val="clear" w:fill="F0F2F4"/>
+          <w:sz w:val="18"/>
+          <w:color w:val="111111"/>
+        </w:rPr>
+        <w:t xml:space="preserve">makeBBSPlusW3cProof</w:t>
+      </w:r>
+      <w:r>
+        <w:rPr>
+          <w:sz w:val="21"/>
+          <w:color w:val="111111"/>
+        </w:rPr>
+        <w:t xml:space="preserve"> takes a private key and lives in </w:t>
+      </w:r>
+      <w:r>
+        <w:rPr>
+          <w:rFonts w:ascii="Consolas" w:hAnsi="Consolas"/>
+          <w:shd w:val="clear" w:fill="F0F2F4"/>
+          <w:sz w:val="18"/>
+          <w:color w:val="111111"/>
+        </w:rPr>
+        <w:t xml:space="preserve">issueBbsVc.ts</w:t>
+      </w:r>
+      <w:r>
+        <w:rPr>
+          <w:sz w:val="21"/>
+          <w:color w:val="111111"/>
+        </w:rPr>
+        <w:t xml:space="preserve">, so it is issuance, not disclosure; #4 the referenced onboarding repo is still empty, last pushed 6 June; #5, #10, #13, #16, #17, #18.</w:t>
       </w:r>
     </w:p>
     <w:p>
@@ -8485,10 +8267,11 @@
       </w:pPr>
       <w:r>
         <w:rPr>
-          <w:sz w:val="21"/>
-          <w:color w:val="111111"/>
-        </w:rPr>
-        <w:t xml:space="preserve">Auditing my own work turned up four real weaknesses. All are fixed:</w:t>
+          <w:b/>
+          <w:sz w:val="21"/>
+          <w:color w:val="111111"/>
+        </w:rPr>
+        <w:t xml:space="preserve">New this round:</w:t>
       </w:r>
     </w:p>
     <w:p>
@@ -8501,7 +8284,7 @@
           <w:sz w:val="21"/>
           <w:color w:val="111111"/>
         </w:rPr>
-        <w:t xml:space="preserve">1. </w:t>
+        <w:t xml:space="preserve">• </w:t>
       </w:r>
       <w:r>
         <w:rPr>
@@ -8509,46 +8292,14 @@
           <w:sz w:val="21"/>
           <w:color w:val="111111"/>
         </w:rPr>
-        <w:t xml:space="preserve">The mandate was forgeable.</w:t>
-      </w:r>
-      <w:r>
-        <w:rPr>
-          <w:sz w:val="21"/>
-          <w:color w:val="111111"/>
-        </w:rPr>
-        <w:t xml:space="preserve"> </w:t>
-      </w:r>
-      <w:r>
-        <w:rPr>
-          <w:rFonts w:ascii="Consolas" w:hAnsi="Consolas"/>
-          <w:shd w:val="clear" w:fill="F0F2F4"/>
-          <w:sz w:val="18"/>
-          <w:color w:val="111111"/>
-        </w:rPr>
-        <w:t xml:space="preserve">evaluate</w:t>
-      </w:r>
-      <w:r>
-        <w:rPr>
-          <w:sz w:val="21"/>
-          <w:color w:val="111111"/>
-        </w:rPr>
-        <w:t xml:space="preserve"> accepted an inline mandate and the demo passed one — the agent supplied the limits it was judged against. The KV path existed but was never exercised. </w:t>
-      </w:r>
-      <w:r>
-        <w:rPr>
-          <w:rFonts w:ascii="Consolas" w:hAnsi="Consolas"/>
-          <w:shd w:val="clear" w:fill="F0F2F4"/>
-          <w:sz w:val="18"/>
-          <w:color w:val="111111"/>
-        </w:rPr>
-        <w:t xml:space="preserve">execute_action</w:t>
-      </w:r>
-      <w:r>
-        <w:rPr>
-          <w:sz w:val="21"/>
-          <w:color w:val="111111"/>
-        </w:rPr>
-        <w:t xml:space="preserve"> reads from KV with no inline escape hatch.</w:t>
+        <w:t xml:space="preserve">#19 — the node dropped support for the SDK the old docs shipped</w:t>
+      </w:r>
+      <w:r>
+        <w:rPr>
+          <w:sz w:val="21"/>
+          <w:color w:val="111111"/>
+        </w:rPr>
+        <w:t xml:space="preserve">, silently (above). Highest impact of the three: it breaks existing integrations and gives them nothing to search for.</w:t>
       </w:r>
     </w:p>
     <w:p>
@@ -8561,7 +8312,7 @@
           <w:sz w:val="21"/>
           <w:color w:val="111111"/>
         </w:rPr>
-        <w:t xml:space="preserve">2. </w:t>
+        <w:t xml:space="preserve">• </w:t>
       </w:r>
       <w:r>
         <w:rPr>
@@ -8569,78 +8320,14 @@
           <w:sz w:val="21"/>
           <w:color w:val="111111"/>
         </w:rPr>
-        <w:t xml:space="preserve">The gate was skippable.</w:t>
-      </w:r>
-      <w:r>
-        <w:rPr>
-          <w:sz w:val="21"/>
-          <w:color w:val="111111"/>
-        </w:rPr>
-        <w:t xml:space="preserve"> </w:t>
-      </w:r>
-      <w:r>
-        <w:rPr>
-          <w:rFonts w:ascii="Consolas" w:hAnsi="Consolas"/>
-          <w:shd w:val="clear" w:fill="F0F2F4"/>
-          <w:sz w:val="18"/>
-          <w:color w:val="111111"/>
-        </w:rPr>
-        <w:t xml:space="preserve">evaluate</w:t>
-      </w:r>
-      <w:r>
-        <w:rPr>
-          <w:sz w:val="21"/>
-          <w:color w:val="111111"/>
-        </w:rPr>
-        <w:t xml:space="preserve"> and </w:t>
-      </w:r>
-      <w:r>
-        <w:rPr>
-          <w:rFonts w:ascii="Consolas" w:hAnsi="Consolas"/>
-          <w:shd w:val="clear" w:fill="F0F2F4"/>
-          <w:sz w:val="18"/>
-          <w:color w:val="111111"/>
-        </w:rPr>
-        <w:t xml:space="preserve">dispatch_action</w:t>
-      </w:r>
-      <w:r>
-        <w:rPr>
-          <w:sz w:val="21"/>
-          <w:color w:val="111111"/>
-        </w:rPr>
-        <w:t xml:space="preserve"> were separate calls and nothing in dispatch knew a mandate existed, so an agent could just not call </w:t>
-      </w:r>
-      <w:r>
-        <w:rPr>
-          <w:rFonts w:ascii="Consolas" w:hAnsi="Consolas"/>
-          <w:shd w:val="clear" w:fill="F0F2F4"/>
-          <w:sz w:val="18"/>
-          <w:color w:val="111111"/>
-        </w:rPr>
-        <w:t xml:space="preserve">evaluate</w:t>
-      </w:r>
-      <w:r>
-        <w:rPr>
-          <w:sz w:val="21"/>
-          <w:color w:val="111111"/>
-        </w:rPr>
-        <w:t xml:space="preserve">. The gate was advisory. </w:t>
-      </w:r>
-      <w:r>
-        <w:rPr>
-          <w:rFonts w:ascii="Consolas" w:hAnsi="Consolas"/>
-          <w:shd w:val="clear" w:fill="F0F2F4"/>
-          <w:sz w:val="18"/>
-          <w:color w:val="111111"/>
-        </w:rPr>
-        <w:t xml:space="preserve">execute_action</w:t>
-      </w:r>
-      <w:r>
-        <w:rPr>
-          <w:sz w:val="21"/>
-          <w:color w:val="111111"/>
-        </w:rPr>
-        <w:t xml:space="preserve"> makes the decision and the outbound call one invocation.</w:t>
+        <w:t xml:space="preserve">#20 — `trustAnchor` required from 5.x</w:t>
+      </w:r>
+      <w:r>
+        <w:rPr>
+          <w:sz w:val="21"/>
+          <w:color w:val="111111"/>
+        </w:rPr>
+        <w:t xml:space="preserve">, with no migration note (above).</w:t>
       </w:r>
     </w:p>
     <w:p>
@@ -8653,7 +8340,7 @@
           <w:sz w:val="21"/>
           <w:color w:val="111111"/>
         </w:rPr>
-        <w:t xml:space="preserve">3. </w:t>
+        <w:t xml:space="preserve">• </w:t>
       </w:r>
       <w:r>
         <w:rPr>
@@ -8661,27 +8348,78 @@
           <w:sz w:val="21"/>
           <w:color w:val="111111"/>
         </w:rPr>
-        <w:t xml:space="preserve">The velocity window was caller-supplied.</w:t>
-      </w:r>
-      <w:r>
-        <w:rPr>
-          <w:sz w:val="21"/>
-          <w:color w:val="111111"/>
-        </w:rPr>
-        <w:t xml:space="preserve"> Pass a fresh string, the counter resets. It is now derived from the cluster clock inside the enclave.</w:t>
-      </w:r>
-    </w:p>
-    <w:p>
-      <w:pPr>
-        <w:ind w:left="360"/>
-        <w:spacing w:before="60" w:after="60"/>
-      </w:pPr>
-      <w:r>
-        <w:rPr>
-          <w:sz w:val="21"/>
-          <w:color w:val="111111"/>
-        </w:rPr>
-        <w:t xml:space="preserve">4. </w:t>
+        <w:t xml:space="preserve">#21 — metering is inconsistent and unpublished.</w:t>
+      </w:r>
+      <w:r>
+        <w:rPr>
+          <w:sz w:val="21"/>
+          <w:color w:val="111111"/>
+        </w:rPr>
+        <w:t xml:space="preserve"> At a balance of exactly zero, </w:t>
+      </w:r>
+      <w:r>
+        <w:rPr>
+          <w:rFonts w:ascii="Consolas" w:hAnsi="Consolas"/>
+          <w:shd w:val="clear" w:fill="F0F2F4"/>
+          <w:sz w:val="18"/>
+          <w:color w:val="111111"/>
+        </w:rPr>
+        <w:t xml:space="preserve">agent create --org</w:t>
+      </w:r>
+      <w:r>
+        <w:rPr>
+          <w:sz w:val="21"/>
+          <w:color w:val="111111"/>
+        </w:rPr>
+        <w:t xml:space="preserve"> minted a DID, issued an API key and hosted a card — three writes, free. In the same session </w:t>
+      </w:r>
+      <w:r>
+        <w:rPr>
+          <w:rFonts w:ascii="Consolas" w:hAnsi="Consolas"/>
+          <w:shd w:val="clear" w:fill="F0F2F4"/>
+          <w:sz w:val="18"/>
+          <w:color w:val="111111"/>
+        </w:rPr>
+        <w:t xml:space="preserve">agent card-publish</w:t>
+      </w:r>
+      <w:r>
+        <w:rPr>
+          <w:sz w:val="21"/>
+          <w:color w:val="111111"/>
+        </w:rPr>
+        <w:t xml:space="preserve"> and </w:t>
+      </w:r>
+      <w:r>
+        <w:rPr>
+          <w:rFonts w:ascii="Consolas" w:hAnsi="Consolas"/>
+          <w:shd w:val="clear" w:fill="F0F2F4"/>
+          <w:sz w:val="18"/>
+          <w:color w:val="111111"/>
+        </w:rPr>
+        <w:t xml:space="preserve">agent host-card</w:t>
+      </w:r>
+      <w:r>
+        <w:rPr>
+          <w:sz w:val="21"/>
+          <w:color w:val="111111"/>
+        </w:rPr>
+        <w:t xml:space="preserve"> demanded </w:t>
+      </w:r>
+      <w:r>
+        <w:rPr>
+          <w:rFonts w:ascii="Consolas" w:hAnsi="Consolas"/>
+          <w:shd w:val="clear" w:fill="F0F2F4"/>
+          <w:sz w:val="18"/>
+          <w:color w:val="111111"/>
+        </w:rPr>
+        <w:t xml:space="preserve">required=10000000000</w:t>
+      </w:r>
+      <w:r>
+        <w:rPr>
+          <w:sz w:val="21"/>
+          <w:color w:val="111111"/>
+        </w:rPr>
+        <w:t xml:space="preserve">, roughly </w:t>
       </w:r>
       <w:r>
         <w:rPr>
@@ -8689,161 +8427,43 @@
           <w:sz w:val="21"/>
           <w:color w:val="111111"/>
         </w:rPr>
-        <w:t xml:space="preserve">The gate trusted any issuer.</w:t>
-      </w:r>
-      <w:r>
-        <w:rPr>
-          <w:sz w:val="21"/>
-          <w:color w:val="111111"/>
-        </w:rPr>
-        <w:t xml:space="preserve"> A BBS+ signature proves the issuer signed — never that the issuer is anyone the fund trusts. Since the agent generates its own issuer key in the demo, it could mint its own accreditation and pass. The mandate now carries </w:t>
-      </w:r>
-      <w:r>
-        <w:rPr>
-          <w:rFonts w:ascii="Consolas" w:hAnsi="Consolas"/>
-          <w:shd w:val="clear" w:fill="F0F2F4"/>
-          <w:sz w:val="18"/>
-          <w:color w:val="111111"/>
-        </w:rPr>
-        <w:t xml:space="preserve">allowed_issuers</w:t>
-      </w:r>
-      <w:r>
-        <w:rPr>
-          <w:sz w:val="21"/>
-          <w:color w:val="111111"/>
-        </w:rPr>
-        <w:t xml:space="preserve">.</w:t>
-      </w:r>
-    </w:p>
-    <w:p>
-      <w:pPr>
-        <w:spacing w:before="120" w:after="120"/>
-      </w:pPr>
-      <w:r>
-        <w:rPr>
-          <w:sz w:val="21"/>
-          <w:color w:val="111111"/>
-        </w:rPr>
-        <w:t xml:space="preserve">The first two mean the pre-0.7.0 mandate held only while the agent cooperated, which is precisely the assumption this project exists to remove.</w:t>
-      </w:r>
-    </w:p>
-    <w:p>
-      <w:pPr>
-        <w:pBdr>
-          <w:bottom w:val="single" w:sz="6" w:color="CCCCCC"/>
-        </w:pBdr>
-      </w:pPr>
-    </w:p>
-    <w:p>
-      <w:pPr>
-        <w:spacing w:before="260" w:after="260"/>
+        <w:t xml:space="preserve">6.7× the entire initial grant</w:t>
+      </w:r>
+      <w:r>
+        <w:rPr>
+          <w:sz w:val="21"/>
+          <w:color w:val="111111"/>
+        </w:rPr>
+        <w:t xml:space="preserve">. There is no price list, no pre-flight estimate, and because </w:t>
+      </w:r>
+      <w:r>
+        <w:rPr>
+          <w:rFonts w:ascii="Consolas" w:hAnsi="Consolas"/>
+          <w:shd w:val="clear" w:fill="F0F2F4"/>
+          <w:sz w:val="18"/>
+          <w:color w:val="111111"/>
+        </w:rPr>
+        <w:t xml:space="preserve">getUsage().entries</w:t>
+      </w:r>
+      <w:r>
+        <w:rPr>
+          <w:sz w:val="21"/>
+          <w:color w:val="111111"/>
+        </w:rPr>
+        <w:t xml:space="preserve"> is empty (#17) no way to see afterwards what was charged.</w:t>
+      </w:r>
+    </w:p>
+    <w:p>
+      <w:pPr>
+        <w:spacing w:before="80" w:after="80"/>
       </w:pPr>
       <w:r>
         <w:rPr>
           <w:b/>
-          <w:sz w:val="26"/>
-          <w:color w:val="1a1a1a"/>
-        </w:rPr>
-        <w:t xml:space="preserve">9. Evidence</w:t>
-      </w:r>
-    </w:p>
-    <w:p>
-      <w:pPr>
-        <w:spacing w:before="180" w:after="180"/>
-      </w:pPr>
-      <w:r>
-        <w:rPr>
-          <w:b/>
-          <w:sz w:val="22"/>
-          <w:color w:val="1a1a1a"/>
-        </w:rPr>
-        <w:t xml:space="preserve">The wrong paths matter more than the happy one</w:t>
-      </w:r>
-    </w:p>
-    <w:p>
-      <w:pPr>
-        <w:spacing w:before="120" w:after="120"/>
-      </w:pPr>
-      <w:r>
-        <w:rPr>
-          <w:sz w:val="21"/>
-          <w:color w:val="111111"/>
-        </w:rPr>
-        <w:t xml:space="preserve">A gate that only proves it says yes is worthless. </w:t>
-      </w:r>
-      <w:r>
-        <w:rPr>
-          <w:rFonts w:ascii="Consolas" w:hAnsi="Consolas"/>
-          <w:shd w:val="clear" w:fill="F0F2F4"/>
-          <w:sz w:val="18"/>
-          <w:color w:val="111111"/>
-        </w:rPr>
-        <w:t xml:space="preserve">qa-console/</w:t>
-      </w:r>
-      <w:r>
-        <w:rPr>
-          <w:sz w:val="21"/>
-          <w:color w:val="111111"/>
-        </w:rPr>
-        <w:t xml:space="preserve"> is a browser console driven by Playwright that runs the contract's </w:t>
-      </w:r>
-      <w:r>
-        <w:rPr>
-          <w:b/>
-          <w:sz w:val="21"/>
-          <w:color w:val="111111"/>
-        </w:rPr>
-        <w:t xml:space="preserve">real Rust `decide()`</w:t>
-      </w:r>
-      <w:r>
-        <w:rPr>
-          <w:sz w:val="21"/>
-          <w:color w:val="111111"/>
-        </w:rPr>
-        <w:t xml:space="preserve"> via a host build — the rules are never reimplemented in JavaScript, because a JS copy would drift from the contract and prove nothing.</w:t>
-      </w:r>
-    </w:p>
-    <w:p>
-      <w:pPr>
-        <w:spacing w:before="80" w:after="80"/>
-      </w:pPr>
-      <w:r>
-        <w:rPr>
-          <w:b/>
           <w:sz w:val="18"/>
           <w:color w:val="444444"/>
         </w:rPr>
-        <w:t xml:space="preserve">Screenshot 11 — `11-qa-console-approved.png`</w:t>
-      </w:r>
-      <w:r>
-        <w:rPr>
-          <w:sz w:val="18"/>
-          <w:color w:val="444444"/>
-        </w:rPr>
-        <w:t xml:space="preserve"> · 📷 </w:t>
-      </w:r>
-      <w:r>
-        <w:rPr>
-          <w:b/>
-          <w:sz w:val="18"/>
-          <w:color w:val="444444"/>
-        </w:rPr>
-        <w:t xml:space="preserve">Screenshot 12 — `12-qa-console-rejected.png`</w:t>
-      </w:r>
-      <w:r>
-        <w:rPr>
-          <w:sz w:val="18"/>
-          <w:color w:val="444444"/>
-        </w:rPr>
-        <w:t xml:space="preserve"> · 📷 </w:t>
-      </w:r>
-      <w:r>
-        <w:rPr>
-          <w:b/>
-          <w:sz w:val="18"/>
-          <w:color w:val="444444"/>
-        </w:rPr>
-        <w:t xml:space="preserve">Screenshot 13 — `13-qa-console-self-issued.png`</w:t>
+        <w:t xml:space="preserve">Screenshot 15 — `15-bug-metering.png`</w:t>
       </w:r>
     </w:p>
     <w:p>
@@ -8854,13 +8474,13 @@
       <w:r>
         <w:drawing>
           <wp:inline distT="0" distB="0" distL="0" distR="0">
-            <wp:extent cx="5486400" cy="3591098"/>
+            <wp:extent cx="5486400" cy="776773"/>
             <wp:docPr id="17" name="Picture 17"/>
             <a:graphic xmlns:a="http://schemas.openxmlformats.org/drawingml/2006/main">
               <a:graphicData uri="http://schemas.openxmlformats.org/drawingml/2006/picture">
                 <pic:pic xmlns:pic="http://schemas.openxmlformats.org/drawingml/2006/picture">
                   <pic:nvPicPr>
-                    <pic:cNvPr id="17" name="11-qa-console-approved.png"/>
+                    <pic:cNvPr id="17" name="15-bug-metering.png"/>
                     <pic:cNvPicPr/>
                   </pic:nvPicPr>
                   <pic:blipFill>
@@ -8872,7 +8492,7 @@
                   <pic:spPr>
                     <a:xfrm>
                       <a:off x="0" y="0"/>
-                      <a:ext cx="5486400" cy="3591098"/>
+                      <a:ext cx="5486400" cy="776773"/>
                     </a:xfrm>
                     <a:prstGeom prst="rect">
                       <a:avLst/>
@@ -8887,6 +8507,386 @@
     </w:p>
     <w:p>
       <w:pPr>
+        <w:spacing w:before="180" w:after="180"/>
+      </w:pPr>
+      <w:r>
+        <w:rPr>
+          <w:b/>
+          <w:sz w:val="22"/>
+          <w:color w:val="1a1a1a"/>
+        </w:rPr>
+        <w:t xml:space="preserve">8.1 And four in my own contract</w:t>
+      </w:r>
+    </w:p>
+    <w:p>
+      <w:pPr>
+        <w:spacing w:before="120" w:after="120"/>
+      </w:pPr>
+      <w:r>
+        <w:rPr>
+          <w:sz w:val="21"/>
+          <w:color w:val="111111"/>
+        </w:rPr>
+        <w:t xml:space="preserve">Auditing my own work turned up four real weaknesses. All are fixed:</w:t>
+      </w:r>
+    </w:p>
+    <w:p>
+      <w:pPr>
+        <w:ind w:left="360"/>
+        <w:spacing w:before="60" w:after="60"/>
+      </w:pPr>
+      <w:r>
+        <w:rPr>
+          <w:sz w:val="21"/>
+          <w:color w:val="111111"/>
+        </w:rPr>
+        <w:t xml:space="preserve">1. </w:t>
+      </w:r>
+      <w:r>
+        <w:rPr>
+          <w:b/>
+          <w:sz w:val="21"/>
+          <w:color w:val="111111"/>
+        </w:rPr>
+        <w:t xml:space="preserve">The mandate was forgeable.</w:t>
+      </w:r>
+      <w:r>
+        <w:rPr>
+          <w:sz w:val="21"/>
+          <w:color w:val="111111"/>
+        </w:rPr>
+        <w:t xml:space="preserve"> </w:t>
+      </w:r>
+      <w:r>
+        <w:rPr>
+          <w:rFonts w:ascii="Consolas" w:hAnsi="Consolas"/>
+          <w:shd w:val="clear" w:fill="F0F2F4"/>
+          <w:sz w:val="18"/>
+          <w:color w:val="111111"/>
+        </w:rPr>
+        <w:t xml:space="preserve">evaluate</w:t>
+      </w:r>
+      <w:r>
+        <w:rPr>
+          <w:sz w:val="21"/>
+          <w:color w:val="111111"/>
+        </w:rPr>
+        <w:t xml:space="preserve"> accepted an inline mandate and the demo passed one — the agent supplied the limits it was judged against. The KV path existed but was never exercised. </w:t>
+      </w:r>
+      <w:r>
+        <w:rPr>
+          <w:rFonts w:ascii="Consolas" w:hAnsi="Consolas"/>
+          <w:shd w:val="clear" w:fill="F0F2F4"/>
+          <w:sz w:val="18"/>
+          <w:color w:val="111111"/>
+        </w:rPr>
+        <w:t xml:space="preserve">execute_action</w:t>
+      </w:r>
+      <w:r>
+        <w:rPr>
+          <w:sz w:val="21"/>
+          <w:color w:val="111111"/>
+        </w:rPr>
+        <w:t xml:space="preserve"> reads from KV with no inline escape hatch.</w:t>
+      </w:r>
+    </w:p>
+    <w:p>
+      <w:pPr>
+        <w:ind w:left="360"/>
+        <w:spacing w:before="60" w:after="60"/>
+      </w:pPr>
+      <w:r>
+        <w:rPr>
+          <w:sz w:val="21"/>
+          <w:color w:val="111111"/>
+        </w:rPr>
+        <w:t xml:space="preserve">2. </w:t>
+      </w:r>
+      <w:r>
+        <w:rPr>
+          <w:b/>
+          <w:sz w:val="21"/>
+          <w:color w:val="111111"/>
+        </w:rPr>
+        <w:t xml:space="preserve">The gate was skippable.</w:t>
+      </w:r>
+      <w:r>
+        <w:rPr>
+          <w:sz w:val="21"/>
+          <w:color w:val="111111"/>
+        </w:rPr>
+        <w:t xml:space="preserve"> </w:t>
+      </w:r>
+      <w:r>
+        <w:rPr>
+          <w:rFonts w:ascii="Consolas" w:hAnsi="Consolas"/>
+          <w:shd w:val="clear" w:fill="F0F2F4"/>
+          <w:sz w:val="18"/>
+          <w:color w:val="111111"/>
+        </w:rPr>
+        <w:t xml:space="preserve">evaluate</w:t>
+      </w:r>
+      <w:r>
+        <w:rPr>
+          <w:sz w:val="21"/>
+          <w:color w:val="111111"/>
+        </w:rPr>
+        <w:t xml:space="preserve"> and </w:t>
+      </w:r>
+      <w:r>
+        <w:rPr>
+          <w:rFonts w:ascii="Consolas" w:hAnsi="Consolas"/>
+          <w:shd w:val="clear" w:fill="F0F2F4"/>
+          <w:sz w:val="18"/>
+          <w:color w:val="111111"/>
+        </w:rPr>
+        <w:t xml:space="preserve">dispatch_action</w:t>
+      </w:r>
+      <w:r>
+        <w:rPr>
+          <w:sz w:val="21"/>
+          <w:color w:val="111111"/>
+        </w:rPr>
+        <w:t xml:space="preserve"> were separate calls and nothing in dispatch knew a mandate existed, so an agent could just not call </w:t>
+      </w:r>
+      <w:r>
+        <w:rPr>
+          <w:rFonts w:ascii="Consolas" w:hAnsi="Consolas"/>
+          <w:shd w:val="clear" w:fill="F0F2F4"/>
+          <w:sz w:val="18"/>
+          <w:color w:val="111111"/>
+        </w:rPr>
+        <w:t xml:space="preserve">evaluate</w:t>
+      </w:r>
+      <w:r>
+        <w:rPr>
+          <w:sz w:val="21"/>
+          <w:color w:val="111111"/>
+        </w:rPr>
+        <w:t xml:space="preserve">. The gate was advisory. </w:t>
+      </w:r>
+      <w:r>
+        <w:rPr>
+          <w:rFonts w:ascii="Consolas" w:hAnsi="Consolas"/>
+          <w:shd w:val="clear" w:fill="F0F2F4"/>
+          <w:sz w:val="18"/>
+          <w:color w:val="111111"/>
+        </w:rPr>
+        <w:t xml:space="preserve">execute_action</w:t>
+      </w:r>
+      <w:r>
+        <w:rPr>
+          <w:sz w:val="21"/>
+          <w:color w:val="111111"/>
+        </w:rPr>
+        <w:t xml:space="preserve"> makes the decision and the outbound call one invocation.</w:t>
+      </w:r>
+    </w:p>
+    <w:p>
+      <w:pPr>
+        <w:ind w:left="360"/>
+        <w:spacing w:before="60" w:after="60"/>
+      </w:pPr>
+      <w:r>
+        <w:rPr>
+          <w:sz w:val="21"/>
+          <w:color w:val="111111"/>
+        </w:rPr>
+        <w:t xml:space="preserve">3. </w:t>
+      </w:r>
+      <w:r>
+        <w:rPr>
+          <w:b/>
+          <w:sz w:val="21"/>
+          <w:color w:val="111111"/>
+        </w:rPr>
+        <w:t xml:space="preserve">The velocity window was caller-supplied.</w:t>
+      </w:r>
+      <w:r>
+        <w:rPr>
+          <w:sz w:val="21"/>
+          <w:color w:val="111111"/>
+        </w:rPr>
+        <w:t xml:space="preserve"> Pass a fresh string, the counter resets. It is now derived from the cluster clock inside the enclave.</w:t>
+      </w:r>
+    </w:p>
+    <w:p>
+      <w:pPr>
+        <w:ind w:left="360"/>
+        <w:spacing w:before="60" w:after="60"/>
+      </w:pPr>
+      <w:r>
+        <w:rPr>
+          <w:sz w:val="21"/>
+          <w:color w:val="111111"/>
+        </w:rPr>
+        <w:t xml:space="preserve">4. </w:t>
+      </w:r>
+      <w:r>
+        <w:rPr>
+          <w:b/>
+          <w:sz w:val="21"/>
+          <w:color w:val="111111"/>
+        </w:rPr>
+        <w:t xml:space="preserve">The gate trusted any issuer.</w:t>
+      </w:r>
+      <w:r>
+        <w:rPr>
+          <w:sz w:val="21"/>
+          <w:color w:val="111111"/>
+        </w:rPr>
+        <w:t xml:space="preserve"> A BBS+ signature proves the issuer signed — never that the issuer is anyone the fund trusts. Since the agent generates its own issuer key in the demo, it could mint its own accreditation and pass. The mandate now carries </w:t>
+      </w:r>
+      <w:r>
+        <w:rPr>
+          <w:rFonts w:ascii="Consolas" w:hAnsi="Consolas"/>
+          <w:shd w:val="clear" w:fill="F0F2F4"/>
+          <w:sz w:val="18"/>
+          <w:color w:val="111111"/>
+        </w:rPr>
+        <w:t xml:space="preserve">allowed_issuers</w:t>
+      </w:r>
+      <w:r>
+        <w:rPr>
+          <w:sz w:val="21"/>
+          <w:color w:val="111111"/>
+        </w:rPr>
+        <w:t xml:space="preserve">.</w:t>
+      </w:r>
+    </w:p>
+    <w:p>
+      <w:pPr>
+        <w:spacing w:before="120" w:after="120"/>
+      </w:pPr>
+      <w:r>
+        <w:rPr>
+          <w:sz w:val="21"/>
+          <w:color w:val="111111"/>
+        </w:rPr>
+        <w:t xml:space="preserve">The first two mean the pre-0.7.0 mandate held only while the agent cooperated, which is precisely the assumption this project exists to remove.</w:t>
+      </w:r>
+    </w:p>
+    <w:p>
+      <w:pPr>
+        <w:pBdr>
+          <w:bottom w:val="single" w:sz="6" w:color="CCCCCC"/>
+        </w:pBdr>
+      </w:pPr>
+    </w:p>
+    <w:p>
+      <w:pPr>
+        <w:spacing w:before="260" w:after="260"/>
+      </w:pPr>
+      <w:r>
+        <w:rPr>
+          <w:b/>
+          <w:sz w:val="26"/>
+          <w:color w:val="1a1a1a"/>
+        </w:rPr>
+        <w:t xml:space="preserve">9. Evidence</w:t>
+      </w:r>
+    </w:p>
+    <w:p>
+      <w:pPr>
+        <w:spacing w:before="180" w:after="180"/>
+      </w:pPr>
+      <w:r>
+        <w:rPr>
+          <w:b/>
+          <w:sz w:val="22"/>
+          <w:color w:val="1a1a1a"/>
+        </w:rPr>
+        <w:t xml:space="preserve">The wrong paths matter more than the happy one</w:t>
+      </w:r>
+    </w:p>
+    <w:p>
+      <w:pPr>
+        <w:spacing w:before="120" w:after="120"/>
+      </w:pPr>
+      <w:r>
+        <w:rPr>
+          <w:sz w:val="21"/>
+          <w:color w:val="111111"/>
+        </w:rPr>
+        <w:t xml:space="preserve">A gate that only proves it says yes is worthless. </w:t>
+      </w:r>
+      <w:r>
+        <w:rPr>
+          <w:rFonts w:ascii="Consolas" w:hAnsi="Consolas"/>
+          <w:shd w:val="clear" w:fill="F0F2F4"/>
+          <w:sz w:val="18"/>
+          <w:color w:val="111111"/>
+        </w:rPr>
+        <w:t xml:space="preserve">qa-console/</w:t>
+      </w:r>
+      <w:r>
+        <w:rPr>
+          <w:sz w:val="21"/>
+          <w:color w:val="111111"/>
+        </w:rPr>
+        <w:t xml:space="preserve"> is a browser console driven by Playwright that runs the contract's </w:t>
+      </w:r>
+      <w:r>
+        <w:rPr>
+          <w:b/>
+          <w:sz w:val="21"/>
+          <w:color w:val="111111"/>
+        </w:rPr>
+        <w:t xml:space="preserve">real Rust `decide()`</w:t>
+      </w:r>
+      <w:r>
+        <w:rPr>
+          <w:sz w:val="21"/>
+          <w:color w:val="111111"/>
+        </w:rPr>
+        <w:t xml:space="preserve"> via a host build — the rules are never reimplemented in JavaScript, because a JS copy would drift from the contract and prove nothing.</w:t>
+      </w:r>
+    </w:p>
+    <w:p>
+      <w:pPr>
+        <w:spacing w:before="80" w:after="80"/>
+      </w:pPr>
+      <w:r>
+        <w:rPr>
+          <w:b/>
+          <w:sz w:val="18"/>
+          <w:color w:val="444444"/>
+        </w:rPr>
+        <w:t xml:space="preserve">Screenshot 11 — `11-qa-console-approved.png`</w:t>
+      </w:r>
+      <w:r>
+        <w:rPr>
+          <w:sz w:val="18"/>
+          <w:color w:val="444444"/>
+        </w:rPr>
+        <w:t xml:space="preserve"> · 📷 </w:t>
+      </w:r>
+      <w:r>
+        <w:rPr>
+          <w:b/>
+          <w:sz w:val="18"/>
+          <w:color w:val="444444"/>
+        </w:rPr>
+        <w:t xml:space="preserve">Screenshot 12 — `12-qa-console-rejected.png`</w:t>
+      </w:r>
+      <w:r>
+        <w:rPr>
+          <w:sz w:val="18"/>
+          <w:color w:val="444444"/>
+        </w:rPr>
+        <w:t xml:space="preserve"> · 📷 </w:t>
+      </w:r>
+      <w:r>
+        <w:rPr>
+          <w:b/>
+          <w:sz w:val="18"/>
+          <w:color w:val="444444"/>
+        </w:rPr>
+        <w:t xml:space="preserve">Screenshot 13 — `13-qa-console-self-issued.png`</w:t>
+      </w:r>
+    </w:p>
+    <w:p>
+      <w:pPr>
         <w:jc w:val="center"/>
         <w:spacing w:before="80" w:after="200"/>
       </w:pPr>
@@ -8899,7 +8899,7 @@
               <a:graphicData uri="http://schemas.openxmlformats.org/drawingml/2006/picture">
                 <pic:pic xmlns:pic="http://schemas.openxmlformats.org/drawingml/2006/picture">
                   <pic:nvPicPr>
-                    <pic:cNvPr id="18" name="12-qa-console-rejected.png"/>
+                    <pic:cNvPr id="18" name="11-qa-console-approved.png"/>
                     <pic:cNvPicPr/>
                   </pic:nvPicPr>
                   <pic:blipFill>
@@ -8938,7 +8938,7 @@
               <a:graphicData uri="http://schemas.openxmlformats.org/drawingml/2006/picture">
                 <pic:pic xmlns:pic="http://schemas.openxmlformats.org/drawingml/2006/picture">
                   <pic:nvPicPr>
-                    <pic:cNvPr id="19" name="13-qa-console-self-issued.png"/>
+                    <pic:cNvPr id="19" name="12-qa-console-rejected.png"/>
                     <pic:cNvPicPr/>
                   </pic:nvPicPr>
                   <pic:blipFill>
@@ -8963,6 +8963,45 @@
         </w:drawing>
       </w:r>
     </w:p>
+    <w:p>
+      <w:pPr>
+        <w:jc w:val="center"/>
+        <w:spacing w:before="80" w:after="200"/>
+      </w:pPr>
+      <w:r>
+        <w:drawing>
+          <wp:inline distT="0" distB="0" distL="0" distR="0">
+            <wp:extent cx="5486400" cy="3591098"/>
+            <wp:docPr id="20" name="Picture 20"/>
+            <a:graphic xmlns:a="http://schemas.openxmlformats.org/drawingml/2006/main">
+              <a:graphicData uri="http://schemas.openxmlformats.org/drawingml/2006/picture">
+                <pic:pic xmlns:pic="http://schemas.openxmlformats.org/drawingml/2006/picture">
+                  <pic:nvPicPr>
+                    <pic:cNvPr id="20" name="13-qa-console-self-issued.png"/>
+                    <pic:cNvPicPr/>
+                  </pic:nvPicPr>
+                  <pic:blipFill>
+                    <a:blip r:embed="rId119"/>
+                    <a:stretch>
+                      <a:fillRect/>
+                    </a:stretch>
+                  </pic:blipFill>
+                  <pic:spPr>
+                    <a:xfrm>
+                      <a:off x="0" y="0"/>
+                      <a:ext cx="5486400" cy="3591098"/>
+                    </a:xfrm>
+                    <a:prstGeom prst="rect">
+                      <a:avLst/>
+                    </a:prstGeom>
+                  </pic:spPr>
+                </pic:pic>
+              </a:graphicData>
+            </a:graphic>
+          </wp:inline>
+        </w:drawing>
+      </w:r>
+    </w:p>
     <w:tbl>
       <w:tblPr>
         <w:tblW w:w="9360" w:type="dxa"/>

</xml_diff>

<commit_message>
screenshots: page chunks sized to never shrink on a Letter page
Co-Authored-By: Claude Opus 5 (1M context) <noreply@anthropic.com>
Claude-Session: https://claude.ai/code/session_018f6JwozcrnmDXmsxr9oiPb
</commit_message>
<xml_diff>
--- a/submission/submission.docx
+++ b/submission/submission.docx
@@ -3359,7 +3359,7 @@
       <w:r>
         <w:drawing>
           <wp:inline distT="0" distB="0" distL="0" distR="0">
-            <wp:extent cx="5486400" cy="8237178"/>
+            <wp:extent cx="5486400" cy="7388453"/>
             <wp:docPr id="6" name="Picture 6"/>
             <a:graphic xmlns:a="http://schemas.openxmlformats.org/drawingml/2006/main">
               <a:graphicData uri="http://schemas.openxmlformats.org/drawingml/2006/picture">
@@ -3377,7 +3377,7 @@
                   <pic:spPr>
                     <a:xfrm>
                       <a:off x="0" y="0"/>
-                      <a:ext cx="5486400" cy="8237178"/>
+                      <a:ext cx="5486400" cy="7388453"/>
                     </a:xfrm>
                     <a:prstGeom prst="rect">
                       <a:avLst/>
@@ -3398,7 +3398,7 @@
       <w:r>
         <w:drawing>
           <wp:inline distT="0" distB="0" distL="0" distR="0">
-            <wp:extent cx="5486400" cy="8184133"/>
+            <wp:extent cx="5486400" cy="6986824"/>
             <wp:docPr id="7" name="Picture 7"/>
             <a:graphic xmlns:a="http://schemas.openxmlformats.org/drawingml/2006/main">
               <a:graphicData uri="http://schemas.openxmlformats.org/drawingml/2006/picture">
@@ -3416,7 +3416,7 @@
                   <pic:spPr>
                     <a:xfrm>
                       <a:off x="0" y="0"/>
-                      <a:ext cx="5486400" cy="8184133"/>
+                      <a:ext cx="5486400" cy="6986824"/>
                     </a:xfrm>
                     <a:prstGeom prst="rect">
                       <a:avLst/>
@@ -3437,7 +3437,7 @@
       <w:r>
         <w:drawing>
           <wp:inline distT="0" distB="0" distL="0" distR="0">
-            <wp:extent cx="5486400" cy="7668835"/>
+            <wp:extent cx="5486400" cy="6138099"/>
             <wp:docPr id="8" name="Picture 8"/>
             <a:graphic xmlns:a="http://schemas.openxmlformats.org/drawingml/2006/main">
               <a:graphicData uri="http://schemas.openxmlformats.org/drawingml/2006/picture">
@@ -3455,7 +3455,7 @@
                   <pic:spPr>
                     <a:xfrm>
                       <a:off x="0" y="0"/>
-                      <a:ext cx="5486400" cy="7668835"/>
+                      <a:ext cx="5486400" cy="6138099"/>
                     </a:xfrm>
                     <a:prstGeom prst="rect">
                       <a:avLst/>
@@ -3476,7 +3476,7 @@
       <w:r>
         <w:drawing>
           <wp:inline distT="0" distB="0" distL="0" distR="0">
-            <wp:extent cx="5486400" cy="8009841"/>
+            <wp:extent cx="5486400" cy="7161116"/>
             <wp:docPr id="9" name="Picture 9"/>
             <a:graphic xmlns:a="http://schemas.openxmlformats.org/drawingml/2006/main">
               <a:graphicData uri="http://schemas.openxmlformats.org/drawingml/2006/picture">
@@ -3494,7 +3494,7 @@
                   <pic:spPr>
                     <a:xfrm>
                       <a:off x="0" y="0"/>
-                      <a:ext cx="5486400" cy="8009841"/>
+                      <a:ext cx="5486400" cy="7161116"/>
                     </a:xfrm>
                     <a:prstGeom prst="rect">
                       <a:avLst/>
@@ -3515,7 +3515,7 @@
       <w:r>
         <w:drawing>
           <wp:inline distT="0" distB="0" distL="0" distR="0">
-            <wp:extent cx="5486400" cy="6259346"/>
+            <wp:extent cx="5486400" cy="7327830"/>
             <wp:docPr id="10" name="Picture 10"/>
             <a:graphic xmlns:a="http://schemas.openxmlformats.org/drawingml/2006/main">
               <a:graphicData uri="http://schemas.openxmlformats.org/drawingml/2006/picture">
@@ -3533,7 +3533,7 @@
                   <pic:spPr>
                     <a:xfrm>
                       <a:off x="0" y="0"/>
-                      <a:ext cx="5486400" cy="6259346"/>
+                      <a:ext cx="5486400" cy="7327830"/>
                     </a:xfrm>
                     <a:prstGeom prst="rect">
                       <a:avLst/>
@@ -3548,202 +3548,241 @@
     </w:p>
     <w:p>
       <w:pPr>
-        <w:spacing w:before="120" w:after="120"/>
-      </w:pPr>
-      <w:r>
-        <w:rPr>
-          <w:sz w:val="21"/>
-          <w:color w:val="111111"/>
-        </w:rPr>
-        <w:t xml:space="preserve">buy that really dispatches, an over-mandate buy rejected, a disallowed asset and kind rejected, an approved counterparty, an unknown counterparty rejected, and a future-dated mandate rejected — each with the enclave's own reason strings.</w:t>
-      </w:r>
-    </w:p>
-    <w:p>
-      <w:pPr>
-        <w:spacing w:before="180" w:after="180"/>
-      </w:pPr>
-      <w:r>
-        <w:rPr>
-          <w:b/>
-          <w:sz w:val="22"/>
-          <w:color w:val="1a1a1a"/>
-        </w:rPr>
-        <w:t xml:space="preserve">4.1 Closing the gap the enclave could not close before</w:t>
-      </w:r>
-    </w:p>
-    <w:p>
-      <w:pPr>
-        <w:spacing w:before="120" w:after="120"/>
-      </w:pPr>
-      <w:r>
-        <w:rPr>
-          <w:sz w:val="21"/>
-          <w:color w:val="111111"/>
-        </w:rPr>
-        <w:t xml:space="preserve">The honest weakness in the previous submission was this: the enclave checked the credential's issuer against </w:t>
-      </w:r>
-      <w:r>
-        <w:rPr>
-          <w:rFonts w:ascii="Consolas" w:hAnsi="Consolas"/>
-          <w:shd w:val="clear" w:fill="F0F2F4"/>
-          <w:sz w:val="18"/>
-          <w:color w:val="111111"/>
-        </w:rPr>
-        <w:t xml:space="preserve">allowed_issuers</w:t>
-      </w:r>
-      <w:r>
-        <w:rPr>
-          <w:sz w:val="21"/>
-          <w:color w:val="111111"/>
-        </w:rPr>
-        <w:t xml:space="preserve">, but the issuer was a field the caller set, sitting next to a claim of "yes, I verified a credential" that was bound to nothing at all. An agent could verify a credential for a $500 purchase and then submit a $500,000 one.</w:t>
-      </w:r>
-    </w:p>
-    <w:p>
-      <w:pPr>
-        <w:spacing w:before="120" w:after="120"/>
-      </w:pPr>
-      <w:r>
-        <w:rPr>
-          <w:sz w:val="21"/>
-          <w:color w:val="111111"/>
-        </w:rPr>
-        <w:t xml:space="preserve">The agent now commits, </w:t>
-      </w:r>
-      <w:r>
-        <w:rPr>
-          <w:b/>
-          <w:sz w:val="21"/>
-          <w:color w:val="111111"/>
-        </w:rPr>
-        <w:t xml:space="preserve">before the decision</w:t>
-      </w:r>
-      <w:r>
-        <w:rPr>
-          <w:sz w:val="21"/>
-          <w:color w:val="111111"/>
-        </w:rPr>
-        <w:t xml:space="preserve">, to which credential it verified and which action it verified it for — issuer, subject, claims digest, action digest, nonce. The enclave recomputes that commitment from the action it is actually about to perform, using SHA-256 compiled into the component, so it needs no host interface and works on a node that does not serve </w:t>
-      </w:r>
-      <w:r>
-        <w:rPr>
-          <w:rFonts w:ascii="Consolas" w:hAnsi="Consolas"/>
-          <w:shd w:val="clear" w:fill="F0F2F4"/>
-          <w:sz w:val="18"/>
-          <w:color w:val="111111"/>
-        </w:rPr>
-        <w:t xml:space="preserve">vp</w:t>
-      </w:r>
-      <w:r>
-        <w:rPr>
-          <w:sz w:val="21"/>
-          <w:color w:val="111111"/>
-        </w:rPr>
-        <w:t xml:space="preserve">. A mismatch is a rejection carried in the reasons array. A mandate can require a binding, so omitting the field stops being the way around the check, and the issuer the mandate is tested against must be the one inside the commitment.</w:t>
-      </w:r>
-    </w:p>
-    <w:p>
-      <w:pPr>
-        <w:spacing w:before="120" w:after="120"/>
-      </w:pPr>
-      <w:r>
-        <w:rPr>
-          <w:b/>
-          <w:sz w:val="21"/>
-          <w:color w:val="111111"/>
-        </w:rPr>
-        <w:t xml:space="preserve">What this does not do</w:t>
-      </w:r>
-      <w:r>
-        <w:rPr>
-          <w:sz w:val="21"/>
-          <w:color w:val="111111"/>
-        </w:rPr>
-        <w:t xml:space="preserve">, because the distinction is the whole point: it does not prove the BBS+ proof was valid. A dishonest agent can still commit to a credential it never checked. Closing that needs in-contract </w:t>
-      </w:r>
-      <w:r>
-        <w:rPr>
-          <w:rFonts w:ascii="Consolas" w:hAnsi="Consolas"/>
-          <w:shd w:val="clear" w:fill="F0F2F4"/>
-          <w:sz w:val="18"/>
-          <w:color w:val="111111"/>
-        </w:rPr>
-        <w:t xml:space="preserve">vp.verify</w:t>
-      </w:r>
-      <w:r>
-        <w:rPr>
-          <w:sz w:val="21"/>
-          <w:color w:val="111111"/>
-        </w:rPr>
-        <w:t xml:space="preserve">, which this node does not serve (bug #7). What is gone is the ability to detach a real verification from what it authorised.</w:t>
-      </w:r>
-    </w:p>
-    <w:p>
-      <w:pPr>
-        <w:spacing w:before="120" w:after="120"/>
-      </w:pPr>
-      <w:r>
-        <w:rPr>
-          <w:sz w:val="21"/>
-          <w:color w:val="111111"/>
-        </w:rPr>
-        <w:t xml:space="preserve">The scheme exists in JavaScript and in Rust, which is how these things quietly become two schemes that each verify only against themselves. So the test suite runs the </w:t>
-      </w:r>
-      <w:r>
-        <w:rPr>
-          <w:b/>
-          <w:sz w:val="21"/>
-          <w:color w:val="111111"/>
-        </w:rPr>
-        <w:t xml:space="preserve">compiled Rust</w:t>
-      </w:r>
-      <w:r>
-        <w:rPr>
-          <w:sz w:val="21"/>
-          <w:color w:val="111111"/>
-        </w:rPr>
-        <w:t xml:space="preserve"> and asserts the two agree on every digest and commitment.</w:t>
-      </w:r>
-    </w:p>
-    <w:p>
-      <w:pPr>
-        <w:spacing w:before="80" w:after="80"/>
-      </w:pPr>
-      <w:r>
-        <w:rPr>
-          <w:b/>
-          <w:sz w:val="18"/>
-          <w:color w:val="444444"/>
-        </w:rPr>
-        <w:t xml:space="preserve">Screenshot 19 — `19-qa-console-binding-moved.png`</w:t>
-      </w:r>
-      <w:r>
-        <w:rPr>
-          <w:sz w:val="18"/>
-          <w:color w:val="444444"/>
-        </w:rPr>
-        <w:t xml:space="preserve"> — a real credential,</w:t>
-      </w:r>
-    </w:p>
-    <w:p>
-      <w:pPr>
         <w:jc w:val="center"/>
         <w:spacing w:before="80" w:after="200"/>
       </w:pPr>
       <w:r>
         <w:drawing>
           <wp:inline distT="0" distB="0" distL="0" distR="0">
-            <wp:extent cx="5486400" cy="3591098"/>
+            <wp:extent cx="5486400" cy="3357010"/>
             <wp:docPr id="11" name="Picture 11"/>
             <a:graphic xmlns:a="http://schemas.openxmlformats.org/drawingml/2006/main">
               <a:graphicData uri="http://schemas.openxmlformats.org/drawingml/2006/picture">
                 <pic:pic xmlns:pic="http://schemas.openxmlformats.org/drawingml/2006/picture">
                   <pic:nvPicPr>
-                    <pic:cNvPr id="11" name="19-qa-console-binding-moved.png"/>
+                    <pic:cNvPr id="11" name="05-full-flow.p6.png"/>
                     <pic:cNvPicPr/>
                   </pic:nvPicPr>
                   <pic:blipFill>
                     <a:blip r:embed="rId110"/>
+                    <a:stretch>
+                      <a:fillRect/>
+                    </a:stretch>
+                  </pic:blipFill>
+                  <pic:spPr>
+                    <a:xfrm>
+                      <a:off x="0" y="0"/>
+                      <a:ext cx="5486400" cy="3357010"/>
+                    </a:xfrm>
+                    <a:prstGeom prst="rect">
+                      <a:avLst/>
+                    </a:prstGeom>
+                  </pic:spPr>
+                </pic:pic>
+              </a:graphicData>
+            </a:graphic>
+          </wp:inline>
+        </w:drawing>
+      </w:r>
+    </w:p>
+    <w:p>
+      <w:pPr>
+        <w:spacing w:before="120" w:after="120"/>
+      </w:pPr>
+      <w:r>
+        <w:rPr>
+          <w:sz w:val="21"/>
+          <w:color w:val="111111"/>
+        </w:rPr>
+        <w:t xml:space="preserve">buy that really dispatches, an over-mandate buy rejected, a disallowed asset and kind rejected, an approved counterparty, an unknown counterparty rejected, and a future-dated mandate rejected — each with the enclave's own reason strings.</w:t>
+      </w:r>
+    </w:p>
+    <w:p>
+      <w:pPr>
+        <w:spacing w:before="180" w:after="180"/>
+      </w:pPr>
+      <w:r>
+        <w:rPr>
+          <w:b/>
+          <w:sz w:val="22"/>
+          <w:color w:val="1a1a1a"/>
+        </w:rPr>
+        <w:t xml:space="preserve">4.1 Closing the gap the enclave could not close before</w:t>
+      </w:r>
+    </w:p>
+    <w:p>
+      <w:pPr>
+        <w:spacing w:before="120" w:after="120"/>
+      </w:pPr>
+      <w:r>
+        <w:rPr>
+          <w:sz w:val="21"/>
+          <w:color w:val="111111"/>
+        </w:rPr>
+        <w:t xml:space="preserve">The honest weakness in the previous submission was this: the enclave checked the credential's issuer against </w:t>
+      </w:r>
+      <w:r>
+        <w:rPr>
+          <w:rFonts w:ascii="Consolas" w:hAnsi="Consolas"/>
+          <w:shd w:val="clear" w:fill="F0F2F4"/>
+          <w:sz w:val="18"/>
+          <w:color w:val="111111"/>
+        </w:rPr>
+        <w:t xml:space="preserve">allowed_issuers</w:t>
+      </w:r>
+      <w:r>
+        <w:rPr>
+          <w:sz w:val="21"/>
+          <w:color w:val="111111"/>
+        </w:rPr>
+        <w:t xml:space="preserve">, but the issuer was a field the caller set, sitting next to a claim of "yes, I verified a credential" that was bound to nothing at all. An agent could verify a credential for a $500 purchase and then submit a $500,000 one.</w:t>
+      </w:r>
+    </w:p>
+    <w:p>
+      <w:pPr>
+        <w:spacing w:before="120" w:after="120"/>
+      </w:pPr>
+      <w:r>
+        <w:rPr>
+          <w:sz w:val="21"/>
+          <w:color w:val="111111"/>
+        </w:rPr>
+        <w:t xml:space="preserve">The agent now commits, </w:t>
+      </w:r>
+      <w:r>
+        <w:rPr>
+          <w:b/>
+          <w:sz w:val="21"/>
+          <w:color w:val="111111"/>
+        </w:rPr>
+        <w:t xml:space="preserve">before the decision</w:t>
+      </w:r>
+      <w:r>
+        <w:rPr>
+          <w:sz w:val="21"/>
+          <w:color w:val="111111"/>
+        </w:rPr>
+        <w:t xml:space="preserve">, to which credential it verified and which action it verified it for — issuer, subject, claims digest, action digest, nonce. The enclave recomputes that commitment from the action it is actually about to perform, using SHA-256 compiled into the component, so it needs no host interface and works on a node that does not serve </w:t>
+      </w:r>
+      <w:r>
+        <w:rPr>
+          <w:rFonts w:ascii="Consolas" w:hAnsi="Consolas"/>
+          <w:shd w:val="clear" w:fill="F0F2F4"/>
+          <w:sz w:val="18"/>
+          <w:color w:val="111111"/>
+        </w:rPr>
+        <w:t xml:space="preserve">vp</w:t>
+      </w:r>
+      <w:r>
+        <w:rPr>
+          <w:sz w:val="21"/>
+          <w:color w:val="111111"/>
+        </w:rPr>
+        <w:t xml:space="preserve">. A mismatch is a rejection carried in the reasons array. A mandate can require a binding, so omitting the field stops being the way around the check, and the issuer the mandate is tested against must be the one inside the commitment.</w:t>
+      </w:r>
+    </w:p>
+    <w:p>
+      <w:pPr>
+        <w:spacing w:before="120" w:after="120"/>
+      </w:pPr>
+      <w:r>
+        <w:rPr>
+          <w:b/>
+          <w:sz w:val="21"/>
+          <w:color w:val="111111"/>
+        </w:rPr>
+        <w:t xml:space="preserve">What this does not do</w:t>
+      </w:r>
+      <w:r>
+        <w:rPr>
+          <w:sz w:val="21"/>
+          <w:color w:val="111111"/>
+        </w:rPr>
+        <w:t xml:space="preserve">, because the distinction is the whole point: it does not prove the BBS+ proof was valid. A dishonest agent can still commit to a credential it never checked. Closing that needs in-contract </w:t>
+      </w:r>
+      <w:r>
+        <w:rPr>
+          <w:rFonts w:ascii="Consolas" w:hAnsi="Consolas"/>
+          <w:shd w:val="clear" w:fill="F0F2F4"/>
+          <w:sz w:val="18"/>
+          <w:color w:val="111111"/>
+        </w:rPr>
+        <w:t xml:space="preserve">vp.verify</w:t>
+      </w:r>
+      <w:r>
+        <w:rPr>
+          <w:sz w:val="21"/>
+          <w:color w:val="111111"/>
+        </w:rPr>
+        <w:t xml:space="preserve">, which this node does not serve (bug #7). What is gone is the ability to detach a real verification from what it authorised.</w:t>
+      </w:r>
+    </w:p>
+    <w:p>
+      <w:pPr>
+        <w:spacing w:before="120" w:after="120"/>
+      </w:pPr>
+      <w:r>
+        <w:rPr>
+          <w:sz w:val="21"/>
+          <w:color w:val="111111"/>
+        </w:rPr>
+        <w:t xml:space="preserve">The scheme exists in JavaScript and in Rust, which is how these things quietly become two schemes that each verify only against themselves. So the test suite runs the </w:t>
+      </w:r>
+      <w:r>
+        <w:rPr>
+          <w:b/>
+          <w:sz w:val="21"/>
+          <w:color w:val="111111"/>
+        </w:rPr>
+        <w:t xml:space="preserve">compiled Rust</w:t>
+      </w:r>
+      <w:r>
+        <w:rPr>
+          <w:sz w:val="21"/>
+          <w:color w:val="111111"/>
+        </w:rPr>
+        <w:t xml:space="preserve"> and asserts the two agree on every digest and commitment.</w:t>
+      </w:r>
+    </w:p>
+    <w:p>
+      <w:pPr>
+        <w:spacing w:before="80" w:after="80"/>
+      </w:pPr>
+      <w:r>
+        <w:rPr>
+          <w:b/>
+          <w:sz w:val="18"/>
+          <w:color w:val="444444"/>
+        </w:rPr>
+        <w:t xml:space="preserve">Screenshot 19 — `19-qa-console-binding-moved.png`</w:t>
+      </w:r>
+      <w:r>
+        <w:rPr>
+          <w:sz w:val="18"/>
+          <w:color w:val="444444"/>
+        </w:rPr>
+        <w:t xml:space="preserve"> — a real credential,</w:t>
+      </w:r>
+    </w:p>
+    <w:p>
+      <w:pPr>
+        <w:jc w:val="center"/>
+        <w:spacing w:before="80" w:after="200"/>
+      </w:pPr>
+      <w:r>
+        <w:drawing>
+          <wp:inline distT="0" distB="0" distL="0" distR="0">
+            <wp:extent cx="5486400" cy="3591098"/>
+            <wp:docPr id="12" name="Picture 12"/>
+            <a:graphic xmlns:a="http://schemas.openxmlformats.org/drawingml/2006/main">
+              <a:graphicData uri="http://schemas.openxmlformats.org/drawingml/2006/picture">
+                <pic:pic xmlns:pic="http://schemas.openxmlformats.org/drawingml/2006/picture">
+                  <pic:nvPicPr>
+                    <pic:cNvPr id="12" name="19-qa-console-binding-moved.png"/>
+                    <pic:cNvPicPr/>
+                  </pic:nvPicPr>
+                  <pic:blipFill>
+                    <a:blip r:embed="rId111"/>
                     <a:stretch>
                       <a:fillRect/>
                     </a:stretch>
@@ -3939,16 +3978,16 @@
         <w:drawing>
           <wp:inline distT="0" distB="0" distL="0" distR="0">
             <wp:extent cx="5486400" cy="4114800"/>
-            <wp:docPr id="12" name="Picture 12"/>
+            <wp:docPr id="13" name="Picture 13"/>
             <a:graphic xmlns:a="http://schemas.openxmlformats.org/drawingml/2006/main">
               <a:graphicData uri="http://schemas.openxmlformats.org/drawingml/2006/picture">
                 <pic:pic xmlns:pic="http://schemas.openxmlformats.org/drawingml/2006/picture">
                   <pic:nvPicPr>
-                    <pic:cNvPr id="12" name="18-status-list.png"/>
+                    <pic:cNvPr id="13" name="18-status-list.png"/>
                     <pic:cNvPicPr/>
                   </pic:nvPicPr>
                   <pic:blipFill>
-                    <a:blip r:embed="rId111"/>
+                    <a:blip r:embed="rId112"/>
                     <a:stretch>
                       <a:fillRect/>
                     </a:stretch>
@@ -4336,52 +4375,13 @@
       <w:r>
         <w:drawing>
           <wp:inline distT="0" distB="0" distL="0" distR="0">
-            <wp:extent cx="5486400" cy="8237178"/>
-            <wp:docPr id="13" name="Picture 13"/>
-            <a:graphic xmlns:a="http://schemas.openxmlformats.org/drawingml/2006/main">
-              <a:graphicData uri="http://schemas.openxmlformats.org/drawingml/2006/picture">
-                <pic:pic xmlns:pic="http://schemas.openxmlformats.org/drawingml/2006/picture">
-                  <pic:nvPicPr>
-                    <pic:cNvPr id="13" name="16-erc8004-live.p1.png"/>
-                    <pic:cNvPicPr/>
-                  </pic:nvPicPr>
-                  <pic:blipFill>
-                    <a:blip r:embed="rId112"/>
-                    <a:stretch>
-                      <a:fillRect/>
-                    </a:stretch>
-                  </pic:blipFill>
-                  <pic:spPr>
-                    <a:xfrm>
-                      <a:off x="0" y="0"/>
-                      <a:ext cx="5486400" cy="8237178"/>
-                    </a:xfrm>
-                    <a:prstGeom prst="rect">
-                      <a:avLst/>
-                    </a:prstGeom>
-                  </pic:spPr>
-                </pic:pic>
-              </a:graphicData>
-            </a:graphic>
-          </wp:inline>
-        </w:drawing>
-      </w:r>
-    </w:p>
-    <w:p>
-      <w:pPr>
-        <w:jc w:val="center"/>
-        <w:spacing w:before="80" w:after="200"/>
-      </w:pPr>
-      <w:r>
-        <w:drawing>
-          <wp:inline distT="0" distB="0" distL="0" distR="0">
-            <wp:extent cx="5486400" cy="462252"/>
+            <wp:extent cx="5486400" cy="7214161"/>
             <wp:docPr id="14" name="Picture 14"/>
             <a:graphic xmlns:a="http://schemas.openxmlformats.org/drawingml/2006/main">
               <a:graphicData uri="http://schemas.openxmlformats.org/drawingml/2006/picture">
                 <pic:pic xmlns:pic="http://schemas.openxmlformats.org/drawingml/2006/picture">
                   <pic:nvPicPr>
-                    <pic:cNvPr id="14" name="16-erc8004-live.p2.png"/>
+                    <pic:cNvPr id="14" name="16-erc8004-live.p1.png"/>
                     <pic:cNvPicPr/>
                   </pic:nvPicPr>
                   <pic:blipFill>
@@ -4393,7 +4393,7 @@
                   <pic:spPr>
                     <a:xfrm>
                       <a:off x="0" y="0"/>
-                      <a:ext cx="5486400" cy="462252"/>
+                      <a:ext cx="5486400" cy="7214161"/>
                     </a:xfrm>
                     <a:prstGeom prst="rect">
                       <a:avLst/>
@@ -4408,161 +4408,200 @@
     </w:p>
     <w:p>
       <w:pPr>
-        <w:spacing w:before="180" w:after="180"/>
-      </w:pPr>
-      <w:r>
-        <w:rPr>
-          <w:b/>
-          <w:sz w:val="22"/>
-          <w:color w:val="1a1a1a"/>
-        </w:rPr>
-        <w:t xml:space="preserve">4.5 The audit trail is no longer just our word for it</w:t>
-      </w:r>
-    </w:p>
-    <w:p>
-      <w:pPr>
-        <w:spacing w:before="120" w:after="120"/>
-      </w:pPr>
-      <w:r>
-        <w:rPr>
-          <w:sz w:val="21"/>
-          <w:color w:val="111111"/>
-        </w:rPr>
-        <w:t xml:space="preserve">The agent prints a structured row per action — which is the </w:t>
-      </w:r>
-      <w:r>
-        <w:rPr>
-          <w:i/>
-          <w:sz w:val="21"/>
-          <w:color w:val="111111"/>
-        </w:rPr>
-        <w:t xml:space="preserve">agent's</w:t>
-      </w:r>
-      <w:r>
-        <w:rPr>
-          <w:sz w:val="21"/>
-          <w:color w:val="111111"/>
-        </w:rPr>
-        <w:t xml:space="preserve"> account of events, exactly the thing this project argues you should not have to take on faith. The node keeps its own record, and finding it became a bug report.</w:t>
-      </w:r>
-    </w:p>
-    <w:p>
-      <w:pPr>
-        <w:spacing w:before="120" w:after="120"/>
-      </w:pPr>
-      <w:r>
-        <w:rPr>
-          <w:rFonts w:ascii="Consolas" w:hAnsi="Consolas"/>
-          <w:shd w:val="clear" w:fill="F0F2F4"/>
-          <w:sz w:val="18"/>
-          <w:color w:val="111111"/>
-        </w:rPr>
-        <w:t xml:space="preserve">npm run audit</w:t>
-      </w:r>
-      <w:r>
-        <w:rPr>
-          <w:sz w:val="21"/>
-          <w:color w:val="111111"/>
-        </w:rPr>
-        <w:t xml:space="preserve"> read </w:t>
-      </w:r>
-      <w:r>
-        <w:rPr>
-          <w:rFonts w:ascii="Consolas" w:hAnsi="Consolas"/>
-          <w:shd w:val="clear" w:fill="F0F2F4"/>
-          <w:sz w:val="18"/>
-          <w:color w:val="111111"/>
-        </w:rPr>
-        <w:t xml:space="preserve">audit.get-mine</w:t>
-      </w:r>
-      <w:r>
-        <w:rPr>
-          <w:sz w:val="21"/>
-          <w:color w:val="111111"/>
-        </w:rPr>
-        <w:t xml:space="preserve"> — the documented audit read — for a month, and printed an explanation for why it was empty. It is still empty, after 39 real dispatches. The record is in </w:t>
-      </w:r>
-      <w:r>
-        <w:rPr>
-          <w:rFonts w:ascii="Consolas" w:hAnsi="Consolas"/>
-          <w:shd w:val="clear" w:fill="F0F2F4"/>
-          <w:sz w:val="18"/>
-          <w:color w:val="111111"/>
-        </w:rPr>
-        <w:t xml:space="preserve">activity.log</w:t>
-      </w:r>
-      <w:r>
-        <w:rPr>
-          <w:sz w:val="21"/>
-          <w:color w:val="111111"/>
-        </w:rPr>
-        <w:t xml:space="preserve">: every call this DID made, with contract, function, outcome, a sequence number and a hash the node assigned — the fuel-quota errors, the probes against the undocumented core contracts, the registration of the contract itself. That is bug #29. </w:t>
-      </w:r>
-      <w:r>
-        <w:rPr>
-          <w:rFonts w:ascii="Consolas" w:hAnsi="Consolas"/>
-          <w:shd w:val="clear" w:fill="F0F2F4"/>
-          <w:sz w:val="18"/>
-          <w:color w:val="111111"/>
-        </w:rPr>
-        <w:t xml:space="preserve">npm run audit</w:t>
-      </w:r>
-      <w:r>
-        <w:rPr>
-          <w:sz w:val="21"/>
-          <w:color w:val="111111"/>
-        </w:rPr>
-        <w:t xml:space="preserve"> now tallies the ledger that exists, keeps </w:t>
-      </w:r>
-      <w:r>
-        <w:rPr>
-          <w:rFonts w:ascii="Consolas" w:hAnsi="Consolas"/>
-          <w:shd w:val="clear" w:fill="F0F2F4"/>
-          <w:sz w:val="18"/>
-          <w:color w:val="111111"/>
-        </w:rPr>
-        <w:t xml:space="preserve">execute_action</w:t>
-      </w:r>
-      <w:r>
-        <w:rPr>
-          <w:sz w:val="21"/>
-          <w:color w:val="111111"/>
-        </w:rPr>
-        <w:t xml:space="preserve"> errors beside its successes rather than under them, reconciles the agent's claimed dispatches against it as a necessary condition rather than a verdict, and reports the documented read beside it, empty.</w:t>
-      </w:r>
-    </w:p>
-    <w:p>
-      <w:pPr>
-        <w:spacing w:before="80" w:after="80"/>
-      </w:pPr>
-      <w:r>
-        <w:rPr>
-          <w:b/>
-          <w:sz w:val="18"/>
-          <w:color w:val="444444"/>
-        </w:rPr>
-        <w:t xml:space="preserve">Screenshot 17 — `17-audit-ledger.png`</w:t>
-      </w:r>
-    </w:p>
-    <w:p>
-      <w:pPr>
         <w:jc w:val="center"/>
         <w:spacing w:before="80" w:after="200"/>
       </w:pPr>
       <w:r>
         <w:drawing>
           <wp:inline distT="0" distB="0" distL="0" distR="0">
-            <wp:extent cx="5486400" cy="3773794"/>
+            <wp:extent cx="5486400" cy="1485269"/>
             <wp:docPr id="15" name="Picture 15"/>
             <a:graphic xmlns:a="http://schemas.openxmlformats.org/drawingml/2006/main">
               <a:graphicData uri="http://schemas.openxmlformats.org/drawingml/2006/picture">
                 <pic:pic xmlns:pic="http://schemas.openxmlformats.org/drawingml/2006/picture">
                   <pic:nvPicPr>
-                    <pic:cNvPr id="15" name="17-audit-ledger.png"/>
+                    <pic:cNvPr id="15" name="16-erc8004-live.p2.png"/>
                     <pic:cNvPicPr/>
                   </pic:nvPicPr>
                   <pic:blipFill>
                     <a:blip r:embed="rId114"/>
+                    <a:stretch>
+                      <a:fillRect/>
+                    </a:stretch>
+                  </pic:blipFill>
+                  <pic:spPr>
+                    <a:xfrm>
+                      <a:off x="0" y="0"/>
+                      <a:ext cx="5486400" cy="1485269"/>
+                    </a:xfrm>
+                    <a:prstGeom prst="rect">
+                      <a:avLst/>
+                    </a:prstGeom>
+                  </pic:spPr>
+                </pic:pic>
+              </a:graphicData>
+            </a:graphic>
+          </wp:inline>
+        </w:drawing>
+      </w:r>
+    </w:p>
+    <w:p>
+      <w:pPr>
+        <w:spacing w:before="180" w:after="180"/>
+      </w:pPr>
+      <w:r>
+        <w:rPr>
+          <w:b/>
+          <w:sz w:val="22"/>
+          <w:color w:val="1a1a1a"/>
+        </w:rPr>
+        <w:t xml:space="preserve">4.5 The audit trail is no longer just our word for it</w:t>
+      </w:r>
+    </w:p>
+    <w:p>
+      <w:pPr>
+        <w:spacing w:before="120" w:after="120"/>
+      </w:pPr>
+      <w:r>
+        <w:rPr>
+          <w:sz w:val="21"/>
+          <w:color w:val="111111"/>
+        </w:rPr>
+        <w:t xml:space="preserve">The agent prints a structured row per action — which is the </w:t>
+      </w:r>
+      <w:r>
+        <w:rPr>
+          <w:i/>
+          <w:sz w:val="21"/>
+          <w:color w:val="111111"/>
+        </w:rPr>
+        <w:t xml:space="preserve">agent's</w:t>
+      </w:r>
+      <w:r>
+        <w:rPr>
+          <w:sz w:val="21"/>
+          <w:color w:val="111111"/>
+        </w:rPr>
+        <w:t xml:space="preserve"> account of events, exactly the thing this project argues you should not have to take on faith. The node keeps its own record, and finding it became a bug report.</w:t>
+      </w:r>
+    </w:p>
+    <w:p>
+      <w:pPr>
+        <w:spacing w:before="120" w:after="120"/>
+      </w:pPr>
+      <w:r>
+        <w:rPr>
+          <w:rFonts w:ascii="Consolas" w:hAnsi="Consolas"/>
+          <w:shd w:val="clear" w:fill="F0F2F4"/>
+          <w:sz w:val="18"/>
+          <w:color w:val="111111"/>
+        </w:rPr>
+        <w:t xml:space="preserve">npm run audit</w:t>
+      </w:r>
+      <w:r>
+        <w:rPr>
+          <w:sz w:val="21"/>
+          <w:color w:val="111111"/>
+        </w:rPr>
+        <w:t xml:space="preserve"> read </w:t>
+      </w:r>
+      <w:r>
+        <w:rPr>
+          <w:rFonts w:ascii="Consolas" w:hAnsi="Consolas"/>
+          <w:shd w:val="clear" w:fill="F0F2F4"/>
+          <w:sz w:val="18"/>
+          <w:color w:val="111111"/>
+        </w:rPr>
+        <w:t xml:space="preserve">audit.get-mine</w:t>
+      </w:r>
+      <w:r>
+        <w:rPr>
+          <w:sz w:val="21"/>
+          <w:color w:val="111111"/>
+        </w:rPr>
+        <w:t xml:space="preserve"> — the documented audit read — for a month, and printed an explanation for why it was empty. It is still empty, after 39 real dispatches. The record is in </w:t>
+      </w:r>
+      <w:r>
+        <w:rPr>
+          <w:rFonts w:ascii="Consolas" w:hAnsi="Consolas"/>
+          <w:shd w:val="clear" w:fill="F0F2F4"/>
+          <w:sz w:val="18"/>
+          <w:color w:val="111111"/>
+        </w:rPr>
+        <w:t xml:space="preserve">activity.log</w:t>
+      </w:r>
+      <w:r>
+        <w:rPr>
+          <w:sz w:val="21"/>
+          <w:color w:val="111111"/>
+        </w:rPr>
+        <w:t xml:space="preserve">: every call this DID made, with contract, function, outcome, a sequence number and a hash the node assigned — the fuel-quota errors, the probes against the undocumented core contracts, the registration of the contract itself. That is bug #29. </w:t>
+      </w:r>
+      <w:r>
+        <w:rPr>
+          <w:rFonts w:ascii="Consolas" w:hAnsi="Consolas"/>
+          <w:shd w:val="clear" w:fill="F0F2F4"/>
+          <w:sz w:val="18"/>
+          <w:color w:val="111111"/>
+        </w:rPr>
+        <w:t xml:space="preserve">npm run audit</w:t>
+      </w:r>
+      <w:r>
+        <w:rPr>
+          <w:sz w:val="21"/>
+          <w:color w:val="111111"/>
+        </w:rPr>
+        <w:t xml:space="preserve"> now tallies the ledger that exists, keeps </w:t>
+      </w:r>
+      <w:r>
+        <w:rPr>
+          <w:rFonts w:ascii="Consolas" w:hAnsi="Consolas"/>
+          <w:shd w:val="clear" w:fill="F0F2F4"/>
+          <w:sz w:val="18"/>
+          <w:color w:val="111111"/>
+        </w:rPr>
+        <w:t xml:space="preserve">execute_action</w:t>
+      </w:r>
+      <w:r>
+        <w:rPr>
+          <w:sz w:val="21"/>
+          <w:color w:val="111111"/>
+        </w:rPr>
+        <w:t xml:space="preserve"> errors beside its successes rather than under them, reconciles the agent's claimed dispatches against it as a necessary condition rather than a verdict, and reports the documented read beside it, empty.</w:t>
+      </w:r>
+    </w:p>
+    <w:p>
+      <w:pPr>
+        <w:spacing w:before="80" w:after="80"/>
+      </w:pPr>
+      <w:r>
+        <w:rPr>
+          <w:b/>
+          <w:sz w:val="18"/>
+          <w:color w:val="444444"/>
+        </w:rPr>
+        <w:t xml:space="preserve">Screenshot 17 — `17-audit-ledger.png`</w:t>
+      </w:r>
+    </w:p>
+    <w:p>
+      <w:pPr>
+        <w:jc w:val="center"/>
+        <w:spacing w:before="80" w:after="200"/>
+      </w:pPr>
+      <w:r>
+        <w:drawing>
+          <wp:inline distT="0" distB="0" distL="0" distR="0">
+            <wp:extent cx="5486400" cy="3773794"/>
+            <wp:docPr id="16" name="Picture 16"/>
+            <a:graphic xmlns:a="http://schemas.openxmlformats.org/drawingml/2006/main">
+              <a:graphicData uri="http://schemas.openxmlformats.org/drawingml/2006/picture">
+                <pic:pic xmlns:pic="http://schemas.openxmlformats.org/drawingml/2006/picture">
+                  <pic:nvPicPr>
+                    <pic:cNvPr id="16" name="17-audit-ledger.png"/>
+                    <pic:cNvPicPr/>
+                  </pic:nvPicPr>
+                  <pic:blipFill>
+                    <a:blip r:embed="rId115"/>
                     <a:stretch>
                       <a:fillRect/>
                     </a:stretch>
@@ -6979,16 +7018,16 @@
         <w:drawing>
           <wp:inline distT="0" distB="0" distL="0" distR="0">
             <wp:extent cx="5486400" cy="5304530"/>
-            <wp:docPr id="16" name="Picture 16"/>
+            <wp:docPr id="17" name="Picture 17"/>
             <a:graphic xmlns:a="http://schemas.openxmlformats.org/drawingml/2006/main">
               <a:graphicData uri="http://schemas.openxmlformats.org/drawingml/2006/picture">
                 <pic:pic xmlns:pic="http://schemas.openxmlformats.org/drawingml/2006/picture">
                   <pic:nvPicPr>
-                    <pic:cNvPr id="16" name="07-tests.png"/>
+                    <pic:cNvPr id="17" name="07-tests.png"/>
                     <pic:cNvPicPr/>
                   </pic:nvPicPr>
                   <pic:blipFill>
-                    <a:blip r:embed="rId115"/>
+                    <a:blip r:embed="rId116"/>
                     <a:stretch>
                       <a:fillRect/>
                     </a:stretch>
@@ -7478,16 +7517,16 @@
         <w:drawing>
           <wp:inline distT="0" distB="0" distL="0" distR="0">
             <wp:extent cx="5486400" cy="5645536"/>
-            <wp:docPr id="17" name="Picture 17"/>
+            <wp:docPr id="18" name="Picture 18"/>
             <a:graphic xmlns:a="http://schemas.openxmlformats.org/drawingml/2006/main">
               <a:graphicData uri="http://schemas.openxmlformats.org/drawingml/2006/picture">
                 <pic:pic xmlns:pic="http://schemas.openxmlformats.org/drawingml/2006/picture">
                   <pic:nvPicPr>
-                    <pic:cNvPr id="17" name="14-bug-trust-anchor.png"/>
+                    <pic:cNvPr id="18" name="14-bug-trust-anchor.png"/>
                     <pic:cNvPicPr/>
                   </pic:nvPicPr>
                   <pic:blipFill>
-                    <a:blip r:embed="rId116"/>
+                    <a:blip r:embed="rId117"/>
                     <a:stretch>
                       <a:fillRect/>
                     </a:stretch>
@@ -8193,16 +8232,16 @@
         <w:drawing>
           <wp:inline distT="0" distB="0" distL="0" distR="0">
             <wp:extent cx="5486400" cy="1727761"/>
-            <wp:docPr id="18" name="Picture 18"/>
+            <wp:docPr id="19" name="Picture 19"/>
             <a:graphic xmlns:a="http://schemas.openxmlformats.org/drawingml/2006/main">
               <a:graphicData uri="http://schemas.openxmlformats.org/drawingml/2006/picture">
                 <pic:pic xmlns:pic="http://schemas.openxmlformats.org/drawingml/2006/picture">
                   <pic:nvPicPr>
-                    <pic:cNvPr id="18" name="08-bug-token-balance.png"/>
+                    <pic:cNvPr id="19" name="08-bug-token-balance.png"/>
                     <pic:cNvPicPr/>
                   </pic:nvPicPr>
                   <pic:blipFill>
-                    <a:blip r:embed="rId117"/>
+                    <a:blip r:embed="rId118"/>
                     <a:stretch>
                       <a:fillRect/>
                     </a:stretch>
@@ -8232,16 +8271,16 @@
         <w:drawing>
           <wp:inline distT="0" distB="0" distL="0" distR="0">
             <wp:extent cx="5486400" cy="1045750"/>
-            <wp:docPr id="19" name="Picture 19"/>
+            <wp:docPr id="20" name="Picture 20"/>
             <a:graphic xmlns:a="http://schemas.openxmlformats.org/drawingml/2006/main">
               <a:graphicData uri="http://schemas.openxmlformats.org/drawingml/2006/picture">
                 <pic:pic xmlns:pic="http://schemas.openxmlformats.org/drawingml/2006/picture">
                   <pic:nvPicPr>
-                    <pic:cNvPr id="19" name="10-bug-node-version.png"/>
+                    <pic:cNvPr id="20" name="10-bug-node-version.png"/>
                     <pic:cNvPicPr/>
                   </pic:nvPicPr>
                   <pic:blipFill>
-                    <a:blip r:embed="rId118"/>
+                    <a:blip r:embed="rId119"/>
                     <a:stretch>
                       <a:fillRect/>
                     </a:stretch>
@@ -8271,372 +8310,12 @@
         <w:drawing>
           <wp:inline distT="0" distB="0" distL="0" distR="0">
             <wp:extent cx="5486400" cy="871459"/>
-            <wp:docPr id="20" name="Picture 20"/>
-            <a:graphic xmlns:a="http://schemas.openxmlformats.org/drawingml/2006/main">
-              <a:graphicData uri="http://schemas.openxmlformats.org/drawingml/2006/picture">
-                <pic:pic xmlns:pic="http://schemas.openxmlformats.org/drawingml/2006/picture">
-                  <pic:nvPicPr>
-                    <pic:cNvPr id="20" name="09-bug-host-card.png"/>
-                    <pic:cNvPicPr/>
-                  </pic:nvPicPr>
-                  <pic:blipFill>
-                    <a:blip r:embed="rId119"/>
-                    <a:stretch>
-                      <a:fillRect/>
-                    </a:stretch>
-                  </pic:blipFill>
-                  <pic:spPr>
-                    <a:xfrm>
-                      <a:off x="0" y="0"/>
-                      <a:ext cx="5486400" cy="871459"/>
-                    </a:xfrm>
-                    <a:prstGeom prst="rect">
-                      <a:avLst/>
-                    </a:prstGeom>
-                  </pic:spPr>
-                </pic:pic>
-              </a:graphicData>
-            </a:graphic>
-          </wp:inline>
-        </w:drawing>
-      </w:r>
-    </w:p>
-    <w:p>
-      <w:pPr>
-        <w:spacing w:before="120" w:after="120"/>
-      </w:pPr>
-      <w:r>
-        <w:rPr>
-          <w:b/>
-          <w:sz w:val="21"/>
-          <w:color w:val="111111"/>
-        </w:rPr>
-        <w:t xml:space="preserve">Still reproducing, checked 26 Aug:</w:t>
-      </w:r>
-      <w:r>
-        <w:rPr>
-          <w:sz w:val="21"/>
-          <w:color w:val="111111"/>
-        </w:rPr>
-        <w:t xml:space="preserve"> #1 the BBS+ verifier still interpolates an unset field into </w:t>
-      </w:r>
-      <w:r>
-        <w:rPr>
-          <w:rFonts w:ascii="Consolas" w:hAnsi="Consolas"/>
-          <w:shd w:val="clear" w:fill="F0F2F4"/>
-          <w:sz w:val="18"/>
-          <w:color w:val="111111"/>
-        </w:rPr>
-        <w:t xml:space="preserve">"verification failed: undefined"</w:t>
-      </w:r>
-      <w:r>
-        <w:rPr>
-          <w:sz w:val="21"/>
-          <w:color w:val="111111"/>
-        </w:rPr>
-        <w:t xml:space="preserve">; #2 </w:t>
-      </w:r>
-      <w:r>
-        <w:rPr>
-          <w:rFonts w:ascii="Consolas" w:hAnsi="Consolas"/>
-          <w:shd w:val="clear" w:fill="F0F2F4"/>
-          <w:sz w:val="18"/>
-          <w:color w:val="111111"/>
-        </w:rPr>
-        <w:t xml:space="preserve">getNodeUrl("testnet")</w:t>
-      </w:r>
-      <w:r>
-        <w:rPr>
-          <w:sz w:val="21"/>
-          <w:color w:val="111111"/>
-        </w:rPr>
-        <w:t xml:space="preserve"> still returns the string </w:t>
-      </w:r>
-      <w:r>
-        <w:rPr>
-          <w:rFonts w:ascii="Consolas" w:hAnsi="Consolas"/>
-          <w:shd w:val="clear" w:fill="F0F2F4"/>
-          <w:sz w:val="18"/>
-          <w:color w:val="111111"/>
-        </w:rPr>
-        <w:t xml:space="preserve">"testnet"</w:t>
-      </w:r>
-      <w:r>
-        <w:rPr>
-          <w:sz w:val="21"/>
-          <w:color w:val="111111"/>
-        </w:rPr>
-        <w:t xml:space="preserve"> while </w:t>
-      </w:r>
-      <w:r>
-        <w:rPr>
-          <w:rFonts w:ascii="Consolas" w:hAnsi="Consolas"/>
-          <w:shd w:val="clear" w:fill="F0F2F4"/>
-          <w:sz w:val="18"/>
-          <w:color w:val="111111"/>
-        </w:rPr>
-        <w:t xml:space="preserve">NODE_URLS</w:t>
-      </w:r>
-      <w:r>
-        <w:rPr>
-          <w:sz w:val="21"/>
-          <w:color w:val="111111"/>
-        </w:rPr>
-        <w:t xml:space="preserve"> in the same module holds the right value; #3 still no holder-side derive — </w:t>
-      </w:r>
-      <w:r>
-        <w:rPr>
-          <w:rFonts w:ascii="Consolas" w:hAnsi="Consolas"/>
-          <w:shd w:val="clear" w:fill="F0F2F4"/>
-          <w:sz w:val="18"/>
-          <w:color w:val="111111"/>
-        </w:rPr>
-        <w:t xml:space="preserve">makeBBSPlusW3cProof</w:t>
-      </w:r>
-      <w:r>
-        <w:rPr>
-          <w:sz w:val="21"/>
-          <w:color w:val="111111"/>
-        </w:rPr>
-        <w:t xml:space="preserve"> takes a private key and lives in </w:t>
-      </w:r>
-      <w:r>
-        <w:rPr>
-          <w:rFonts w:ascii="Consolas" w:hAnsi="Consolas"/>
-          <w:shd w:val="clear" w:fill="F0F2F4"/>
-          <w:sz w:val="18"/>
-          <w:color w:val="111111"/>
-        </w:rPr>
-        <w:t xml:space="preserve">issueBbsVc.ts</w:t>
-      </w:r>
-      <w:r>
-        <w:rPr>
-          <w:sz w:val="21"/>
-          <w:color w:val="111111"/>
-        </w:rPr>
-        <w:t xml:space="preserve">, so it is issuance, not disclosure; #4 the referenced onboarding repo is still empty, last pushed 6 June; #5, #10, #13, #16, #17, #18.</w:t>
-      </w:r>
-    </w:p>
-    <w:p>
-      <w:pPr>
-        <w:spacing w:before="120" w:after="120"/>
-      </w:pPr>
-      <w:r>
-        <w:rPr>
-          <w:b/>
-          <w:sz w:val="21"/>
-          <w:color w:val="111111"/>
-        </w:rPr>
-        <w:t xml:space="preserve">New this round:</w:t>
-      </w:r>
-    </w:p>
-    <w:p>
-      <w:pPr>
-        <w:ind w:left="360"/>
-        <w:spacing w:before="60" w:after="60"/>
-      </w:pPr>
-      <w:r>
-        <w:rPr>
-          <w:sz w:val="21"/>
-          <w:color w:val="111111"/>
-        </w:rPr>
-        <w:t xml:space="preserve">• </w:t>
-      </w:r>
-      <w:r>
-        <w:rPr>
-          <w:b/>
-          <w:sz w:val="21"/>
-          <w:color w:val="111111"/>
-        </w:rPr>
-        <w:t xml:space="preserve">#19 — the node dropped support for the SDK the old docs shipped</w:t>
-      </w:r>
-      <w:r>
-        <w:rPr>
-          <w:sz w:val="21"/>
-          <w:color w:val="111111"/>
-        </w:rPr>
-        <w:t xml:space="preserve">, silently (above). Highest impact of the three: it breaks existing integrations and gives them nothing to search for.</w:t>
-      </w:r>
-    </w:p>
-    <w:p>
-      <w:pPr>
-        <w:ind w:left="360"/>
-        <w:spacing w:before="60" w:after="60"/>
-      </w:pPr>
-      <w:r>
-        <w:rPr>
-          <w:sz w:val="21"/>
-          <w:color w:val="111111"/>
-        </w:rPr>
-        <w:t xml:space="preserve">• </w:t>
-      </w:r>
-      <w:r>
-        <w:rPr>
-          <w:b/>
-          <w:sz w:val="21"/>
-          <w:color w:val="111111"/>
-        </w:rPr>
-        <w:t xml:space="preserve">#20 — `trustAnchor` required from 5.x</w:t>
-      </w:r>
-      <w:r>
-        <w:rPr>
-          <w:sz w:val="21"/>
-          <w:color w:val="111111"/>
-        </w:rPr>
-        <w:t xml:space="preserve">, with no migration note (above).</w:t>
-      </w:r>
-    </w:p>
-    <w:p>
-      <w:pPr>
-        <w:ind w:left="360"/>
-        <w:spacing w:before="60" w:after="60"/>
-      </w:pPr>
-      <w:r>
-        <w:rPr>
-          <w:sz w:val="21"/>
-          <w:color w:val="111111"/>
-        </w:rPr>
-        <w:t xml:space="preserve">• </w:t>
-      </w:r>
-      <w:r>
-        <w:rPr>
-          <w:b/>
-          <w:sz w:val="21"/>
-          <w:color w:val="111111"/>
-        </w:rPr>
-        <w:t xml:space="preserve">#21 — metering is inconsistent and unpublished.</w:t>
-      </w:r>
-      <w:r>
-        <w:rPr>
-          <w:sz w:val="21"/>
-          <w:color w:val="111111"/>
-        </w:rPr>
-        <w:t xml:space="preserve"> At a balance of exactly zero, </w:t>
-      </w:r>
-      <w:r>
-        <w:rPr>
-          <w:rFonts w:ascii="Consolas" w:hAnsi="Consolas"/>
-          <w:shd w:val="clear" w:fill="F0F2F4"/>
-          <w:sz w:val="18"/>
-          <w:color w:val="111111"/>
-        </w:rPr>
-        <w:t xml:space="preserve">agent create --org</w:t>
-      </w:r>
-      <w:r>
-        <w:rPr>
-          <w:sz w:val="21"/>
-          <w:color w:val="111111"/>
-        </w:rPr>
-        <w:t xml:space="preserve"> minted a DID, issued an API key and hosted a card — three writes, free. In the same session </w:t>
-      </w:r>
-      <w:r>
-        <w:rPr>
-          <w:rFonts w:ascii="Consolas" w:hAnsi="Consolas"/>
-          <w:shd w:val="clear" w:fill="F0F2F4"/>
-          <w:sz w:val="18"/>
-          <w:color w:val="111111"/>
-        </w:rPr>
-        <w:t xml:space="preserve">agent card-publish</w:t>
-      </w:r>
-      <w:r>
-        <w:rPr>
-          <w:sz w:val="21"/>
-          <w:color w:val="111111"/>
-        </w:rPr>
-        <w:t xml:space="preserve"> and </w:t>
-      </w:r>
-      <w:r>
-        <w:rPr>
-          <w:rFonts w:ascii="Consolas" w:hAnsi="Consolas"/>
-          <w:shd w:val="clear" w:fill="F0F2F4"/>
-          <w:sz w:val="18"/>
-          <w:color w:val="111111"/>
-        </w:rPr>
-        <w:t xml:space="preserve">agent host-card</w:t>
-      </w:r>
-      <w:r>
-        <w:rPr>
-          <w:sz w:val="21"/>
-          <w:color w:val="111111"/>
-        </w:rPr>
-        <w:t xml:space="preserve"> demanded </w:t>
-      </w:r>
-      <w:r>
-        <w:rPr>
-          <w:rFonts w:ascii="Consolas" w:hAnsi="Consolas"/>
-          <w:shd w:val="clear" w:fill="F0F2F4"/>
-          <w:sz w:val="18"/>
-          <w:color w:val="111111"/>
-        </w:rPr>
-        <w:t xml:space="preserve">required=10000000000</w:t>
-      </w:r>
-      <w:r>
-        <w:rPr>
-          <w:sz w:val="21"/>
-          <w:color w:val="111111"/>
-        </w:rPr>
-        <w:t xml:space="preserve">, roughly </w:t>
-      </w:r>
-      <w:r>
-        <w:rPr>
-          <w:b/>
-          <w:sz w:val="21"/>
-          <w:color w:val="111111"/>
-        </w:rPr>
-        <w:t xml:space="preserve">6.7× the entire initial grant</w:t>
-      </w:r>
-      <w:r>
-        <w:rPr>
-          <w:sz w:val="21"/>
-          <w:color w:val="111111"/>
-        </w:rPr>
-        <w:t xml:space="preserve">. There is no price list, no pre-flight estimate, and because </w:t>
-      </w:r>
-      <w:r>
-        <w:rPr>
-          <w:rFonts w:ascii="Consolas" w:hAnsi="Consolas"/>
-          <w:shd w:val="clear" w:fill="F0F2F4"/>
-          <w:sz w:val="18"/>
-          <w:color w:val="111111"/>
-        </w:rPr>
-        <w:t xml:space="preserve">getUsage().entries</w:t>
-      </w:r>
-      <w:r>
-        <w:rPr>
-          <w:sz w:val="21"/>
-          <w:color w:val="111111"/>
-        </w:rPr>
-        <w:t xml:space="preserve"> is empty (#17) no way to see afterwards what was charged.</w:t>
-      </w:r>
-    </w:p>
-    <w:p>
-      <w:pPr>
-        <w:spacing w:before="80" w:after="80"/>
-      </w:pPr>
-      <w:r>
-        <w:rPr>
-          <w:b/>
-          <w:sz w:val="18"/>
-          <w:color w:val="444444"/>
-        </w:rPr>
-        <w:t xml:space="preserve">Screenshot 15 — `15-bug-metering.png`</w:t>
-      </w:r>
-    </w:p>
-    <w:p>
-      <w:pPr>
-        <w:jc w:val="center"/>
-        <w:spacing w:before="80" w:after="200"/>
-      </w:pPr>
-      <w:r>
-        <w:drawing>
-          <wp:inline distT="0" distB="0" distL="0" distR="0">
-            <wp:extent cx="5486400" cy="871459"/>
             <wp:docPr id="21" name="Picture 21"/>
             <a:graphic xmlns:a="http://schemas.openxmlformats.org/drawingml/2006/main">
               <a:graphicData uri="http://schemas.openxmlformats.org/drawingml/2006/picture">
                 <pic:pic xmlns:pic="http://schemas.openxmlformats.org/drawingml/2006/picture">
                   <pic:nvPicPr>
-                    <pic:cNvPr id="21" name="15-bug-metering.png"/>
+                    <pic:cNvPr id="21" name="09-bug-host-card.png"/>
                     <pic:cNvPicPr/>
                   </pic:nvPicPr>
                   <pic:blipFill>
@@ -8663,15 +8342,118 @@
     </w:p>
     <w:p>
       <w:pPr>
-        <w:spacing w:before="180" w:after="180"/>
+        <w:spacing w:before="120" w:after="120"/>
       </w:pPr>
       <w:r>
         <w:rPr>
           <w:b/>
-          <w:sz w:val="22"/>
-          <w:color w:val="1a1a1a"/>
-        </w:rPr>
-        <w:t xml:space="preserve">8.1 And four in my own contract</w:t>
+          <w:sz w:val="21"/>
+          <w:color w:val="111111"/>
+        </w:rPr>
+        <w:t xml:space="preserve">Still reproducing, checked 26 Aug:</w:t>
+      </w:r>
+      <w:r>
+        <w:rPr>
+          <w:sz w:val="21"/>
+          <w:color w:val="111111"/>
+        </w:rPr>
+        <w:t xml:space="preserve"> #1 the BBS+ verifier still interpolates an unset field into </w:t>
+      </w:r>
+      <w:r>
+        <w:rPr>
+          <w:rFonts w:ascii="Consolas" w:hAnsi="Consolas"/>
+          <w:shd w:val="clear" w:fill="F0F2F4"/>
+          <w:sz w:val="18"/>
+          <w:color w:val="111111"/>
+        </w:rPr>
+        <w:t xml:space="preserve">"verification failed: undefined"</w:t>
+      </w:r>
+      <w:r>
+        <w:rPr>
+          <w:sz w:val="21"/>
+          <w:color w:val="111111"/>
+        </w:rPr>
+        <w:t xml:space="preserve">; #2 </w:t>
+      </w:r>
+      <w:r>
+        <w:rPr>
+          <w:rFonts w:ascii="Consolas" w:hAnsi="Consolas"/>
+          <w:shd w:val="clear" w:fill="F0F2F4"/>
+          <w:sz w:val="18"/>
+          <w:color w:val="111111"/>
+        </w:rPr>
+        <w:t xml:space="preserve">getNodeUrl("testnet")</w:t>
+      </w:r>
+      <w:r>
+        <w:rPr>
+          <w:sz w:val="21"/>
+          <w:color w:val="111111"/>
+        </w:rPr>
+        <w:t xml:space="preserve"> still returns the string </w:t>
+      </w:r>
+      <w:r>
+        <w:rPr>
+          <w:rFonts w:ascii="Consolas" w:hAnsi="Consolas"/>
+          <w:shd w:val="clear" w:fill="F0F2F4"/>
+          <w:sz w:val="18"/>
+          <w:color w:val="111111"/>
+        </w:rPr>
+        <w:t xml:space="preserve">"testnet"</w:t>
+      </w:r>
+      <w:r>
+        <w:rPr>
+          <w:sz w:val="21"/>
+          <w:color w:val="111111"/>
+        </w:rPr>
+        <w:t xml:space="preserve"> while </w:t>
+      </w:r>
+      <w:r>
+        <w:rPr>
+          <w:rFonts w:ascii="Consolas" w:hAnsi="Consolas"/>
+          <w:shd w:val="clear" w:fill="F0F2F4"/>
+          <w:sz w:val="18"/>
+          <w:color w:val="111111"/>
+        </w:rPr>
+        <w:t xml:space="preserve">NODE_URLS</w:t>
+      </w:r>
+      <w:r>
+        <w:rPr>
+          <w:sz w:val="21"/>
+          <w:color w:val="111111"/>
+        </w:rPr>
+        <w:t xml:space="preserve"> in the same module holds the right value; #3 still no holder-side derive — </w:t>
+      </w:r>
+      <w:r>
+        <w:rPr>
+          <w:rFonts w:ascii="Consolas" w:hAnsi="Consolas"/>
+          <w:shd w:val="clear" w:fill="F0F2F4"/>
+          <w:sz w:val="18"/>
+          <w:color w:val="111111"/>
+        </w:rPr>
+        <w:t xml:space="preserve">makeBBSPlusW3cProof</w:t>
+      </w:r>
+      <w:r>
+        <w:rPr>
+          <w:sz w:val="21"/>
+          <w:color w:val="111111"/>
+        </w:rPr>
+        <w:t xml:space="preserve"> takes a private key and lives in </w:t>
+      </w:r>
+      <w:r>
+        <w:rPr>
+          <w:rFonts w:ascii="Consolas" w:hAnsi="Consolas"/>
+          <w:shd w:val="clear" w:fill="F0F2F4"/>
+          <w:sz w:val="18"/>
+          <w:color w:val="111111"/>
+        </w:rPr>
+        <w:t xml:space="preserve">issueBbsVc.ts</w:t>
+      </w:r>
+      <w:r>
+        <w:rPr>
+          <w:sz w:val="21"/>
+          <w:color w:val="111111"/>
+        </w:rPr>
+        <w:t xml:space="preserve">, so it is issuance, not disclosure; #4 the referenced onboarding repo is still empty, last pushed 6 June; #5, #10, #13, #16, #17, #18.</w:t>
       </w:r>
     </w:p>
     <w:p>
@@ -8680,10 +8462,11 @@
       </w:pPr>
       <w:r>
         <w:rPr>
-          <w:sz w:val="21"/>
-          <w:color w:val="111111"/>
-        </w:rPr>
-        <w:t xml:space="preserve">Auditing my own work turned up four real weaknesses. All are fixed:</w:t>
+          <w:b/>
+          <w:sz w:val="21"/>
+          <w:color w:val="111111"/>
+        </w:rPr>
+        <w:t xml:space="preserve">New this round:</w:t>
       </w:r>
     </w:p>
     <w:p>
@@ -8696,7 +8479,7 @@
           <w:sz w:val="21"/>
           <w:color w:val="111111"/>
         </w:rPr>
-        <w:t xml:space="preserve">1. </w:t>
+        <w:t xml:space="preserve">• </w:t>
       </w:r>
       <w:r>
         <w:rPr>
@@ -8704,46 +8487,14 @@
           <w:sz w:val="21"/>
           <w:color w:val="111111"/>
         </w:rPr>
-        <w:t xml:space="preserve">The mandate was forgeable.</w:t>
-      </w:r>
-      <w:r>
-        <w:rPr>
-          <w:sz w:val="21"/>
-          <w:color w:val="111111"/>
-        </w:rPr>
-        <w:t xml:space="preserve"> </w:t>
-      </w:r>
-      <w:r>
-        <w:rPr>
-          <w:rFonts w:ascii="Consolas" w:hAnsi="Consolas"/>
-          <w:shd w:val="clear" w:fill="F0F2F4"/>
-          <w:sz w:val="18"/>
-          <w:color w:val="111111"/>
-        </w:rPr>
-        <w:t xml:space="preserve">evaluate</w:t>
-      </w:r>
-      <w:r>
-        <w:rPr>
-          <w:sz w:val="21"/>
-          <w:color w:val="111111"/>
-        </w:rPr>
-        <w:t xml:space="preserve"> accepted an inline mandate and the demo passed one — the agent supplied the limits it was judged against. The KV path existed but was never exercised. </w:t>
-      </w:r>
-      <w:r>
-        <w:rPr>
-          <w:rFonts w:ascii="Consolas" w:hAnsi="Consolas"/>
-          <w:shd w:val="clear" w:fill="F0F2F4"/>
-          <w:sz w:val="18"/>
-          <w:color w:val="111111"/>
-        </w:rPr>
-        <w:t xml:space="preserve">execute_action</w:t>
-      </w:r>
-      <w:r>
-        <w:rPr>
-          <w:sz w:val="21"/>
-          <w:color w:val="111111"/>
-        </w:rPr>
-        <w:t xml:space="preserve"> reads from KV with no inline escape hatch.</w:t>
+        <w:t xml:space="preserve">#19 — the node dropped support for the SDK the old docs shipped</w:t>
+      </w:r>
+      <w:r>
+        <w:rPr>
+          <w:sz w:val="21"/>
+          <w:color w:val="111111"/>
+        </w:rPr>
+        <w:t xml:space="preserve">, silently (above). Highest impact of the three: it breaks existing integrations and gives them nothing to search for.</w:t>
       </w:r>
     </w:p>
     <w:p>
@@ -8756,7 +8507,7 @@
           <w:sz w:val="21"/>
           <w:color w:val="111111"/>
         </w:rPr>
-        <w:t xml:space="preserve">2. </w:t>
+        <w:t xml:space="preserve">• </w:t>
       </w:r>
       <w:r>
         <w:rPr>
@@ -8764,78 +8515,14 @@
           <w:sz w:val="21"/>
           <w:color w:val="111111"/>
         </w:rPr>
-        <w:t xml:space="preserve">The gate was skippable.</w:t>
-      </w:r>
-      <w:r>
-        <w:rPr>
-          <w:sz w:val="21"/>
-          <w:color w:val="111111"/>
-        </w:rPr>
-        <w:t xml:space="preserve"> </w:t>
-      </w:r>
-      <w:r>
-        <w:rPr>
-          <w:rFonts w:ascii="Consolas" w:hAnsi="Consolas"/>
-          <w:shd w:val="clear" w:fill="F0F2F4"/>
-          <w:sz w:val="18"/>
-          <w:color w:val="111111"/>
-        </w:rPr>
-        <w:t xml:space="preserve">evaluate</w:t>
-      </w:r>
-      <w:r>
-        <w:rPr>
-          <w:sz w:val="21"/>
-          <w:color w:val="111111"/>
-        </w:rPr>
-        <w:t xml:space="preserve"> and </w:t>
-      </w:r>
-      <w:r>
-        <w:rPr>
-          <w:rFonts w:ascii="Consolas" w:hAnsi="Consolas"/>
-          <w:shd w:val="clear" w:fill="F0F2F4"/>
-          <w:sz w:val="18"/>
-          <w:color w:val="111111"/>
-        </w:rPr>
-        <w:t xml:space="preserve">dispatch_action</w:t>
-      </w:r>
-      <w:r>
-        <w:rPr>
-          <w:sz w:val="21"/>
-          <w:color w:val="111111"/>
-        </w:rPr>
-        <w:t xml:space="preserve"> were separate calls and nothing in dispatch knew a mandate existed, so an agent could just not call </w:t>
-      </w:r>
-      <w:r>
-        <w:rPr>
-          <w:rFonts w:ascii="Consolas" w:hAnsi="Consolas"/>
-          <w:shd w:val="clear" w:fill="F0F2F4"/>
-          <w:sz w:val="18"/>
-          <w:color w:val="111111"/>
-        </w:rPr>
-        <w:t xml:space="preserve">evaluate</w:t>
-      </w:r>
-      <w:r>
-        <w:rPr>
-          <w:sz w:val="21"/>
-          <w:color w:val="111111"/>
-        </w:rPr>
-        <w:t xml:space="preserve">. The gate was advisory. </w:t>
-      </w:r>
-      <w:r>
-        <w:rPr>
-          <w:rFonts w:ascii="Consolas" w:hAnsi="Consolas"/>
-          <w:shd w:val="clear" w:fill="F0F2F4"/>
-          <w:sz w:val="18"/>
-          <w:color w:val="111111"/>
-        </w:rPr>
-        <w:t xml:space="preserve">execute_action</w:t>
-      </w:r>
-      <w:r>
-        <w:rPr>
-          <w:sz w:val="21"/>
-          <w:color w:val="111111"/>
-        </w:rPr>
-        <w:t xml:space="preserve"> makes the decision and the outbound call one invocation.</w:t>
+        <w:t xml:space="preserve">#20 — `trustAnchor` required from 5.x</w:t>
+      </w:r>
+      <w:r>
+        <w:rPr>
+          <w:sz w:val="21"/>
+          <w:color w:val="111111"/>
+        </w:rPr>
+        <w:t xml:space="preserve">, with no migration note (above).</w:t>
       </w:r>
     </w:p>
     <w:p>
@@ -8848,7 +8535,7 @@
           <w:sz w:val="21"/>
           <w:color w:val="111111"/>
         </w:rPr>
-        <w:t xml:space="preserve">3. </w:t>
+        <w:t xml:space="preserve">• </w:t>
       </w:r>
       <w:r>
         <w:rPr>
@@ -8856,27 +8543,78 @@
           <w:sz w:val="21"/>
           <w:color w:val="111111"/>
         </w:rPr>
-        <w:t xml:space="preserve">The velocity window was caller-supplied.</w:t>
-      </w:r>
-      <w:r>
-        <w:rPr>
-          <w:sz w:val="21"/>
-          <w:color w:val="111111"/>
-        </w:rPr>
-        <w:t xml:space="preserve"> Pass a fresh string, the counter resets. It is now derived from the cluster clock inside the enclave.</w:t>
-      </w:r>
-    </w:p>
-    <w:p>
-      <w:pPr>
-        <w:ind w:left="360"/>
-        <w:spacing w:before="60" w:after="60"/>
-      </w:pPr>
-      <w:r>
-        <w:rPr>
-          <w:sz w:val="21"/>
-          <w:color w:val="111111"/>
-        </w:rPr>
-        <w:t xml:space="preserve">4. </w:t>
+        <w:t xml:space="preserve">#21 — metering is inconsistent and unpublished.</w:t>
+      </w:r>
+      <w:r>
+        <w:rPr>
+          <w:sz w:val="21"/>
+          <w:color w:val="111111"/>
+        </w:rPr>
+        <w:t xml:space="preserve"> At a balance of exactly zero, </w:t>
+      </w:r>
+      <w:r>
+        <w:rPr>
+          <w:rFonts w:ascii="Consolas" w:hAnsi="Consolas"/>
+          <w:shd w:val="clear" w:fill="F0F2F4"/>
+          <w:sz w:val="18"/>
+          <w:color w:val="111111"/>
+        </w:rPr>
+        <w:t xml:space="preserve">agent create --org</w:t>
+      </w:r>
+      <w:r>
+        <w:rPr>
+          <w:sz w:val="21"/>
+          <w:color w:val="111111"/>
+        </w:rPr>
+        <w:t xml:space="preserve"> minted a DID, issued an API key and hosted a card — three writes, free. In the same session </w:t>
+      </w:r>
+      <w:r>
+        <w:rPr>
+          <w:rFonts w:ascii="Consolas" w:hAnsi="Consolas"/>
+          <w:shd w:val="clear" w:fill="F0F2F4"/>
+          <w:sz w:val="18"/>
+          <w:color w:val="111111"/>
+        </w:rPr>
+        <w:t xml:space="preserve">agent card-publish</w:t>
+      </w:r>
+      <w:r>
+        <w:rPr>
+          <w:sz w:val="21"/>
+          <w:color w:val="111111"/>
+        </w:rPr>
+        <w:t xml:space="preserve"> and </w:t>
+      </w:r>
+      <w:r>
+        <w:rPr>
+          <w:rFonts w:ascii="Consolas" w:hAnsi="Consolas"/>
+          <w:shd w:val="clear" w:fill="F0F2F4"/>
+          <w:sz w:val="18"/>
+          <w:color w:val="111111"/>
+        </w:rPr>
+        <w:t xml:space="preserve">agent host-card</w:t>
+      </w:r>
+      <w:r>
+        <w:rPr>
+          <w:sz w:val="21"/>
+          <w:color w:val="111111"/>
+        </w:rPr>
+        <w:t xml:space="preserve"> demanded </w:t>
+      </w:r>
+      <w:r>
+        <w:rPr>
+          <w:rFonts w:ascii="Consolas" w:hAnsi="Consolas"/>
+          <w:shd w:val="clear" w:fill="F0F2F4"/>
+          <w:sz w:val="18"/>
+          <w:color w:val="111111"/>
+        </w:rPr>
+        <w:t xml:space="preserve">required=10000000000</w:t>
+      </w:r>
+      <w:r>
+        <w:rPr>
+          <w:sz w:val="21"/>
+          <w:color w:val="111111"/>
+        </w:rPr>
+        <w:t xml:space="preserve">, roughly </w:t>
       </w:r>
       <w:r>
         <w:rPr>
@@ -8884,161 +8622,43 @@
           <w:sz w:val="21"/>
           <w:color w:val="111111"/>
         </w:rPr>
-        <w:t xml:space="preserve">The gate trusted any issuer.</w:t>
-      </w:r>
-      <w:r>
-        <w:rPr>
-          <w:sz w:val="21"/>
-          <w:color w:val="111111"/>
-        </w:rPr>
-        <w:t xml:space="preserve"> A BBS+ signature proves the issuer signed — never that the issuer is anyone the fund trusts. Since the agent generates its own issuer key in the demo, it could mint its own accreditation and pass. The mandate now carries </w:t>
-      </w:r>
-      <w:r>
-        <w:rPr>
-          <w:rFonts w:ascii="Consolas" w:hAnsi="Consolas"/>
-          <w:shd w:val="clear" w:fill="F0F2F4"/>
-          <w:sz w:val="18"/>
-          <w:color w:val="111111"/>
-        </w:rPr>
-        <w:t xml:space="preserve">allowed_issuers</w:t>
-      </w:r>
-      <w:r>
-        <w:rPr>
-          <w:sz w:val="21"/>
-          <w:color w:val="111111"/>
-        </w:rPr>
-        <w:t xml:space="preserve">.</w:t>
-      </w:r>
-    </w:p>
-    <w:p>
-      <w:pPr>
-        <w:spacing w:before="120" w:after="120"/>
-      </w:pPr>
-      <w:r>
-        <w:rPr>
-          <w:sz w:val="21"/>
-          <w:color w:val="111111"/>
-        </w:rPr>
-        <w:t xml:space="preserve">The first two mean the pre-0.7.0 mandate held only while the agent cooperated, which is precisely the assumption this project exists to remove.</w:t>
-      </w:r>
-    </w:p>
-    <w:p>
-      <w:pPr>
-        <w:pBdr>
-          <w:bottom w:val="single" w:sz="6" w:color="CCCCCC"/>
-        </w:pBdr>
-      </w:pPr>
-    </w:p>
-    <w:p>
-      <w:pPr>
-        <w:spacing w:before="260" w:after="260"/>
+        <w:t xml:space="preserve">6.7× the entire initial grant</w:t>
+      </w:r>
+      <w:r>
+        <w:rPr>
+          <w:sz w:val="21"/>
+          <w:color w:val="111111"/>
+        </w:rPr>
+        <w:t xml:space="preserve">. There is no price list, no pre-flight estimate, and because </w:t>
+      </w:r>
+      <w:r>
+        <w:rPr>
+          <w:rFonts w:ascii="Consolas" w:hAnsi="Consolas"/>
+          <w:shd w:val="clear" w:fill="F0F2F4"/>
+          <w:sz w:val="18"/>
+          <w:color w:val="111111"/>
+        </w:rPr>
+        <w:t xml:space="preserve">getUsage().entries</w:t>
+      </w:r>
+      <w:r>
+        <w:rPr>
+          <w:sz w:val="21"/>
+          <w:color w:val="111111"/>
+        </w:rPr>
+        <w:t xml:space="preserve"> is empty (#17) no way to see afterwards what was charged.</w:t>
+      </w:r>
+    </w:p>
+    <w:p>
+      <w:pPr>
+        <w:spacing w:before="80" w:after="80"/>
       </w:pPr>
       <w:r>
         <w:rPr>
           <w:b/>
-          <w:sz w:val="26"/>
-          <w:color w:val="1a1a1a"/>
-        </w:rPr>
-        <w:t xml:space="preserve">9. Evidence</w:t>
-      </w:r>
-    </w:p>
-    <w:p>
-      <w:pPr>
-        <w:spacing w:before="180" w:after="180"/>
-      </w:pPr>
-      <w:r>
-        <w:rPr>
-          <w:b/>
-          <w:sz w:val="22"/>
-          <w:color w:val="1a1a1a"/>
-        </w:rPr>
-        <w:t xml:space="preserve">The wrong paths matter more than the happy one</w:t>
-      </w:r>
-    </w:p>
-    <w:p>
-      <w:pPr>
-        <w:spacing w:before="120" w:after="120"/>
-      </w:pPr>
-      <w:r>
-        <w:rPr>
-          <w:sz w:val="21"/>
-          <w:color w:val="111111"/>
-        </w:rPr>
-        <w:t xml:space="preserve">A gate that only proves it says yes is worthless. </w:t>
-      </w:r>
-      <w:r>
-        <w:rPr>
-          <w:rFonts w:ascii="Consolas" w:hAnsi="Consolas"/>
-          <w:shd w:val="clear" w:fill="F0F2F4"/>
-          <w:sz w:val="18"/>
-          <w:color w:val="111111"/>
-        </w:rPr>
-        <w:t xml:space="preserve">qa-console/</w:t>
-      </w:r>
-      <w:r>
-        <w:rPr>
-          <w:sz w:val="21"/>
-          <w:color w:val="111111"/>
-        </w:rPr>
-        <w:t xml:space="preserve"> is a browser console driven by Playwright that runs the contract's </w:t>
-      </w:r>
-      <w:r>
-        <w:rPr>
-          <w:b/>
-          <w:sz w:val="21"/>
-          <w:color w:val="111111"/>
-        </w:rPr>
-        <w:t xml:space="preserve">real Rust `decide()`</w:t>
-      </w:r>
-      <w:r>
-        <w:rPr>
-          <w:sz w:val="21"/>
-          <w:color w:val="111111"/>
-        </w:rPr>
-        <w:t xml:space="preserve"> via a host build — the rules are never reimplemented in JavaScript, because a JS copy would drift from the contract and prove nothing.</w:t>
-      </w:r>
-    </w:p>
-    <w:p>
-      <w:pPr>
-        <w:spacing w:before="80" w:after="80"/>
-      </w:pPr>
-      <w:r>
-        <w:rPr>
-          <w:b/>
           <w:sz w:val="18"/>
           <w:color w:val="444444"/>
         </w:rPr>
-        <w:t xml:space="preserve">Screenshot 11 — `11-qa-console-approved.png`</w:t>
-      </w:r>
-      <w:r>
-        <w:rPr>
-          <w:sz w:val="18"/>
-          <w:color w:val="444444"/>
-        </w:rPr>
-        <w:t xml:space="preserve"> · 📷 </w:t>
-      </w:r>
-      <w:r>
-        <w:rPr>
-          <w:b/>
-          <w:sz w:val="18"/>
-          <w:color w:val="444444"/>
-        </w:rPr>
-        <w:t xml:space="preserve">Screenshot 12 — `12-qa-console-rejected.png`</w:t>
-      </w:r>
-      <w:r>
-        <w:rPr>
-          <w:sz w:val="18"/>
-          <w:color w:val="444444"/>
-        </w:rPr>
-        <w:t xml:space="preserve"> · 📷 </w:t>
-      </w:r>
-      <w:r>
-        <w:rPr>
-          <w:b/>
-          <w:sz w:val="18"/>
-          <w:color w:val="444444"/>
-        </w:rPr>
-        <w:t xml:space="preserve">Screenshot 13 — `13-qa-console-self-issued.png`</w:t>
+        <w:t xml:space="preserve">Screenshot 15 — `15-bug-metering.png`</w:t>
       </w:r>
     </w:p>
     <w:p>
@@ -9049,13 +8669,13 @@
       <w:r>
         <w:drawing>
           <wp:inline distT="0" distB="0" distL="0" distR="0">
-            <wp:extent cx="5486400" cy="3591098"/>
+            <wp:extent cx="5486400" cy="871459"/>
             <wp:docPr id="22" name="Picture 22"/>
             <a:graphic xmlns:a="http://schemas.openxmlformats.org/drawingml/2006/main">
               <a:graphicData uri="http://schemas.openxmlformats.org/drawingml/2006/picture">
                 <pic:pic xmlns:pic="http://schemas.openxmlformats.org/drawingml/2006/picture">
                   <pic:nvPicPr>
-                    <pic:cNvPr id="22" name="11-qa-console-approved.png"/>
+                    <pic:cNvPr id="22" name="15-bug-metering.png"/>
                     <pic:cNvPicPr/>
                   </pic:nvPicPr>
                   <pic:blipFill>
@@ -9067,7 +8687,7 @@
                   <pic:spPr>
                     <a:xfrm>
                       <a:off x="0" y="0"/>
-                      <a:ext cx="5486400" cy="3591098"/>
+                      <a:ext cx="5486400" cy="871459"/>
                     </a:xfrm>
                     <a:prstGeom prst="rect">
                       <a:avLst/>
@@ -9082,6 +8702,386 @@
     </w:p>
     <w:p>
       <w:pPr>
+        <w:spacing w:before="180" w:after="180"/>
+      </w:pPr>
+      <w:r>
+        <w:rPr>
+          <w:b/>
+          <w:sz w:val="22"/>
+          <w:color w:val="1a1a1a"/>
+        </w:rPr>
+        <w:t xml:space="preserve">8.1 And four in my own contract</w:t>
+      </w:r>
+    </w:p>
+    <w:p>
+      <w:pPr>
+        <w:spacing w:before="120" w:after="120"/>
+      </w:pPr>
+      <w:r>
+        <w:rPr>
+          <w:sz w:val="21"/>
+          <w:color w:val="111111"/>
+        </w:rPr>
+        <w:t xml:space="preserve">Auditing my own work turned up four real weaknesses. All are fixed:</w:t>
+      </w:r>
+    </w:p>
+    <w:p>
+      <w:pPr>
+        <w:ind w:left="360"/>
+        <w:spacing w:before="60" w:after="60"/>
+      </w:pPr>
+      <w:r>
+        <w:rPr>
+          <w:sz w:val="21"/>
+          <w:color w:val="111111"/>
+        </w:rPr>
+        <w:t xml:space="preserve">1. </w:t>
+      </w:r>
+      <w:r>
+        <w:rPr>
+          <w:b/>
+          <w:sz w:val="21"/>
+          <w:color w:val="111111"/>
+        </w:rPr>
+        <w:t xml:space="preserve">The mandate was forgeable.</w:t>
+      </w:r>
+      <w:r>
+        <w:rPr>
+          <w:sz w:val="21"/>
+          <w:color w:val="111111"/>
+        </w:rPr>
+        <w:t xml:space="preserve"> </w:t>
+      </w:r>
+      <w:r>
+        <w:rPr>
+          <w:rFonts w:ascii="Consolas" w:hAnsi="Consolas"/>
+          <w:shd w:val="clear" w:fill="F0F2F4"/>
+          <w:sz w:val="18"/>
+          <w:color w:val="111111"/>
+        </w:rPr>
+        <w:t xml:space="preserve">evaluate</w:t>
+      </w:r>
+      <w:r>
+        <w:rPr>
+          <w:sz w:val="21"/>
+          <w:color w:val="111111"/>
+        </w:rPr>
+        <w:t xml:space="preserve"> accepted an inline mandate and the demo passed one — the agent supplied the limits it was judged against. The KV path existed but was never exercised. </w:t>
+      </w:r>
+      <w:r>
+        <w:rPr>
+          <w:rFonts w:ascii="Consolas" w:hAnsi="Consolas"/>
+          <w:shd w:val="clear" w:fill="F0F2F4"/>
+          <w:sz w:val="18"/>
+          <w:color w:val="111111"/>
+        </w:rPr>
+        <w:t xml:space="preserve">execute_action</w:t>
+      </w:r>
+      <w:r>
+        <w:rPr>
+          <w:sz w:val="21"/>
+          <w:color w:val="111111"/>
+        </w:rPr>
+        <w:t xml:space="preserve"> reads from KV with no inline escape hatch.</w:t>
+      </w:r>
+    </w:p>
+    <w:p>
+      <w:pPr>
+        <w:ind w:left="360"/>
+        <w:spacing w:before="60" w:after="60"/>
+      </w:pPr>
+      <w:r>
+        <w:rPr>
+          <w:sz w:val="21"/>
+          <w:color w:val="111111"/>
+        </w:rPr>
+        <w:t xml:space="preserve">2. </w:t>
+      </w:r>
+      <w:r>
+        <w:rPr>
+          <w:b/>
+          <w:sz w:val="21"/>
+          <w:color w:val="111111"/>
+        </w:rPr>
+        <w:t xml:space="preserve">The gate was skippable.</w:t>
+      </w:r>
+      <w:r>
+        <w:rPr>
+          <w:sz w:val="21"/>
+          <w:color w:val="111111"/>
+        </w:rPr>
+        <w:t xml:space="preserve"> </w:t>
+      </w:r>
+      <w:r>
+        <w:rPr>
+          <w:rFonts w:ascii="Consolas" w:hAnsi="Consolas"/>
+          <w:shd w:val="clear" w:fill="F0F2F4"/>
+          <w:sz w:val="18"/>
+          <w:color w:val="111111"/>
+        </w:rPr>
+        <w:t xml:space="preserve">evaluate</w:t>
+      </w:r>
+      <w:r>
+        <w:rPr>
+          <w:sz w:val="21"/>
+          <w:color w:val="111111"/>
+        </w:rPr>
+        <w:t xml:space="preserve"> and </w:t>
+      </w:r>
+      <w:r>
+        <w:rPr>
+          <w:rFonts w:ascii="Consolas" w:hAnsi="Consolas"/>
+          <w:shd w:val="clear" w:fill="F0F2F4"/>
+          <w:sz w:val="18"/>
+          <w:color w:val="111111"/>
+        </w:rPr>
+        <w:t xml:space="preserve">dispatch_action</w:t>
+      </w:r>
+      <w:r>
+        <w:rPr>
+          <w:sz w:val="21"/>
+          <w:color w:val="111111"/>
+        </w:rPr>
+        <w:t xml:space="preserve"> were separate calls and nothing in dispatch knew a mandate existed, so an agent could just not call </w:t>
+      </w:r>
+      <w:r>
+        <w:rPr>
+          <w:rFonts w:ascii="Consolas" w:hAnsi="Consolas"/>
+          <w:shd w:val="clear" w:fill="F0F2F4"/>
+          <w:sz w:val="18"/>
+          <w:color w:val="111111"/>
+        </w:rPr>
+        <w:t xml:space="preserve">evaluate</w:t>
+      </w:r>
+      <w:r>
+        <w:rPr>
+          <w:sz w:val="21"/>
+          <w:color w:val="111111"/>
+        </w:rPr>
+        <w:t xml:space="preserve">. The gate was advisory. </w:t>
+      </w:r>
+      <w:r>
+        <w:rPr>
+          <w:rFonts w:ascii="Consolas" w:hAnsi="Consolas"/>
+          <w:shd w:val="clear" w:fill="F0F2F4"/>
+          <w:sz w:val="18"/>
+          <w:color w:val="111111"/>
+        </w:rPr>
+        <w:t xml:space="preserve">execute_action</w:t>
+      </w:r>
+      <w:r>
+        <w:rPr>
+          <w:sz w:val="21"/>
+          <w:color w:val="111111"/>
+        </w:rPr>
+        <w:t xml:space="preserve"> makes the decision and the outbound call one invocation.</w:t>
+      </w:r>
+    </w:p>
+    <w:p>
+      <w:pPr>
+        <w:ind w:left="360"/>
+        <w:spacing w:before="60" w:after="60"/>
+      </w:pPr>
+      <w:r>
+        <w:rPr>
+          <w:sz w:val="21"/>
+          <w:color w:val="111111"/>
+        </w:rPr>
+        <w:t xml:space="preserve">3. </w:t>
+      </w:r>
+      <w:r>
+        <w:rPr>
+          <w:b/>
+          <w:sz w:val="21"/>
+          <w:color w:val="111111"/>
+        </w:rPr>
+        <w:t xml:space="preserve">The velocity window was caller-supplied.</w:t>
+      </w:r>
+      <w:r>
+        <w:rPr>
+          <w:sz w:val="21"/>
+          <w:color w:val="111111"/>
+        </w:rPr>
+        <w:t xml:space="preserve"> Pass a fresh string, the counter resets. It is now derived from the cluster clock inside the enclave.</w:t>
+      </w:r>
+    </w:p>
+    <w:p>
+      <w:pPr>
+        <w:ind w:left="360"/>
+        <w:spacing w:before="60" w:after="60"/>
+      </w:pPr>
+      <w:r>
+        <w:rPr>
+          <w:sz w:val="21"/>
+          <w:color w:val="111111"/>
+        </w:rPr>
+        <w:t xml:space="preserve">4. </w:t>
+      </w:r>
+      <w:r>
+        <w:rPr>
+          <w:b/>
+          <w:sz w:val="21"/>
+          <w:color w:val="111111"/>
+        </w:rPr>
+        <w:t xml:space="preserve">The gate trusted any issuer.</w:t>
+      </w:r>
+      <w:r>
+        <w:rPr>
+          <w:sz w:val="21"/>
+          <w:color w:val="111111"/>
+        </w:rPr>
+        <w:t xml:space="preserve"> A BBS+ signature proves the issuer signed — never that the issuer is anyone the fund trusts. Since the agent generates its own issuer key in the demo, it could mint its own accreditation and pass. The mandate now carries </w:t>
+      </w:r>
+      <w:r>
+        <w:rPr>
+          <w:rFonts w:ascii="Consolas" w:hAnsi="Consolas"/>
+          <w:shd w:val="clear" w:fill="F0F2F4"/>
+          <w:sz w:val="18"/>
+          <w:color w:val="111111"/>
+        </w:rPr>
+        <w:t xml:space="preserve">allowed_issuers</w:t>
+      </w:r>
+      <w:r>
+        <w:rPr>
+          <w:sz w:val="21"/>
+          <w:color w:val="111111"/>
+        </w:rPr>
+        <w:t xml:space="preserve">.</w:t>
+      </w:r>
+    </w:p>
+    <w:p>
+      <w:pPr>
+        <w:spacing w:before="120" w:after="120"/>
+      </w:pPr>
+      <w:r>
+        <w:rPr>
+          <w:sz w:val="21"/>
+          <w:color w:val="111111"/>
+        </w:rPr>
+        <w:t xml:space="preserve">The first two mean the pre-0.7.0 mandate held only while the agent cooperated, which is precisely the assumption this project exists to remove.</w:t>
+      </w:r>
+    </w:p>
+    <w:p>
+      <w:pPr>
+        <w:pBdr>
+          <w:bottom w:val="single" w:sz="6" w:color="CCCCCC"/>
+        </w:pBdr>
+      </w:pPr>
+    </w:p>
+    <w:p>
+      <w:pPr>
+        <w:spacing w:before="260" w:after="260"/>
+      </w:pPr>
+      <w:r>
+        <w:rPr>
+          <w:b/>
+          <w:sz w:val="26"/>
+          <w:color w:val="1a1a1a"/>
+        </w:rPr>
+        <w:t xml:space="preserve">9. Evidence</w:t>
+      </w:r>
+    </w:p>
+    <w:p>
+      <w:pPr>
+        <w:spacing w:before="180" w:after="180"/>
+      </w:pPr>
+      <w:r>
+        <w:rPr>
+          <w:b/>
+          <w:sz w:val="22"/>
+          <w:color w:val="1a1a1a"/>
+        </w:rPr>
+        <w:t xml:space="preserve">The wrong paths matter more than the happy one</w:t>
+      </w:r>
+    </w:p>
+    <w:p>
+      <w:pPr>
+        <w:spacing w:before="120" w:after="120"/>
+      </w:pPr>
+      <w:r>
+        <w:rPr>
+          <w:sz w:val="21"/>
+          <w:color w:val="111111"/>
+        </w:rPr>
+        <w:t xml:space="preserve">A gate that only proves it says yes is worthless. </w:t>
+      </w:r>
+      <w:r>
+        <w:rPr>
+          <w:rFonts w:ascii="Consolas" w:hAnsi="Consolas"/>
+          <w:shd w:val="clear" w:fill="F0F2F4"/>
+          <w:sz w:val="18"/>
+          <w:color w:val="111111"/>
+        </w:rPr>
+        <w:t xml:space="preserve">qa-console/</w:t>
+      </w:r>
+      <w:r>
+        <w:rPr>
+          <w:sz w:val="21"/>
+          <w:color w:val="111111"/>
+        </w:rPr>
+        <w:t xml:space="preserve"> is a browser console driven by Playwright that runs the contract's </w:t>
+      </w:r>
+      <w:r>
+        <w:rPr>
+          <w:b/>
+          <w:sz w:val="21"/>
+          <w:color w:val="111111"/>
+        </w:rPr>
+        <w:t xml:space="preserve">real Rust `decide()`</w:t>
+      </w:r>
+      <w:r>
+        <w:rPr>
+          <w:sz w:val="21"/>
+          <w:color w:val="111111"/>
+        </w:rPr>
+        <w:t xml:space="preserve"> via a host build — the rules are never reimplemented in JavaScript, because a JS copy would drift from the contract and prove nothing.</w:t>
+      </w:r>
+    </w:p>
+    <w:p>
+      <w:pPr>
+        <w:spacing w:before="80" w:after="80"/>
+      </w:pPr>
+      <w:r>
+        <w:rPr>
+          <w:b/>
+          <w:sz w:val="18"/>
+          <w:color w:val="444444"/>
+        </w:rPr>
+        <w:t xml:space="preserve">Screenshot 11 — `11-qa-console-approved.png`</w:t>
+      </w:r>
+      <w:r>
+        <w:rPr>
+          <w:sz w:val="18"/>
+          <w:color w:val="444444"/>
+        </w:rPr>
+        <w:t xml:space="preserve"> · 📷 </w:t>
+      </w:r>
+      <w:r>
+        <w:rPr>
+          <w:b/>
+          <w:sz w:val="18"/>
+          <w:color w:val="444444"/>
+        </w:rPr>
+        <w:t xml:space="preserve">Screenshot 12 — `12-qa-console-rejected.png`</w:t>
+      </w:r>
+      <w:r>
+        <w:rPr>
+          <w:sz w:val="18"/>
+          <w:color w:val="444444"/>
+        </w:rPr>
+        <w:t xml:space="preserve"> · 📷 </w:t>
+      </w:r>
+      <w:r>
+        <w:rPr>
+          <w:b/>
+          <w:sz w:val="18"/>
+          <w:color w:val="444444"/>
+        </w:rPr>
+        <w:t xml:space="preserve">Screenshot 13 — `13-qa-console-self-issued.png`</w:t>
+      </w:r>
+    </w:p>
+    <w:p>
+      <w:pPr>
         <w:jc w:val="center"/>
         <w:spacing w:before="80" w:after="200"/>
       </w:pPr>
@@ -9094,7 +9094,7 @@
               <a:graphicData uri="http://schemas.openxmlformats.org/drawingml/2006/picture">
                 <pic:pic xmlns:pic="http://schemas.openxmlformats.org/drawingml/2006/picture">
                   <pic:nvPicPr>
-                    <pic:cNvPr id="23" name="12-qa-console-rejected.png"/>
+                    <pic:cNvPr id="23" name="11-qa-console-approved.png"/>
                     <pic:cNvPicPr/>
                   </pic:nvPicPr>
                   <pic:blipFill>
@@ -9133,7 +9133,7 @@
               <a:graphicData uri="http://schemas.openxmlformats.org/drawingml/2006/picture">
                 <pic:pic xmlns:pic="http://schemas.openxmlformats.org/drawingml/2006/picture">
                   <pic:nvPicPr>
-                    <pic:cNvPr id="24" name="13-qa-console-self-issued.png"/>
+                    <pic:cNvPr id="24" name="12-qa-console-rejected.png"/>
                     <pic:cNvPicPr/>
                   </pic:nvPicPr>
                   <pic:blipFill>
@@ -9158,6 +9158,45 @@
         </w:drawing>
       </w:r>
     </w:p>
+    <w:p>
+      <w:pPr>
+        <w:jc w:val="center"/>
+        <w:spacing w:before="80" w:after="200"/>
+      </w:pPr>
+      <w:r>
+        <w:drawing>
+          <wp:inline distT="0" distB="0" distL="0" distR="0">
+            <wp:extent cx="5486400" cy="3591098"/>
+            <wp:docPr id="25" name="Picture 25"/>
+            <a:graphic xmlns:a="http://schemas.openxmlformats.org/drawingml/2006/main">
+              <a:graphicData uri="http://schemas.openxmlformats.org/drawingml/2006/picture">
+                <pic:pic xmlns:pic="http://schemas.openxmlformats.org/drawingml/2006/picture">
+                  <pic:nvPicPr>
+                    <pic:cNvPr id="25" name="13-qa-console-self-issued.png"/>
+                    <pic:cNvPicPr/>
+                  </pic:nvPicPr>
+                  <pic:blipFill>
+                    <a:blip r:embed="rId124"/>
+                    <a:stretch>
+                      <a:fillRect/>
+                    </a:stretch>
+                  </pic:blipFill>
+                  <pic:spPr>
+                    <a:xfrm>
+                      <a:off x="0" y="0"/>
+                      <a:ext cx="5486400" cy="3591098"/>
+                    </a:xfrm>
+                    <a:prstGeom prst="rect">
+                      <a:avLst/>
+                    </a:prstGeom>
+                  </pic:spPr>
+                </pic:pic>
+              </a:graphicData>
+            </a:graphic>
+          </wp:inline>
+        </w:drawing>
+      </w:r>
+    </w:p>
     <w:tbl>
       <w:tblPr>
         <w:tblW w:w="9360" w:type="dxa"/>

</xml_diff>